<commit_message>
doc: requirements change and daily diary
</commit_message>
<xml_diff>
--- a/3_Documentazione/Documentazione_X2SevenVault_Christian_Arzani.docx
+++ b/3_Documentazione/Documentazione_X2SevenVault_Christian_Arzani.docx
@@ -102,6 +102,7 @@
           <w:noProof/>
           <w:lang w:val="it-IT"/>
         </w:rPr>
+        <w:lastRenderedPageBreak/>
         <w:t>1</w:t>
       </w:r>
       <w:r>
@@ -3047,13 +3048,7 @@
         <w:spacing w:after="240"/>
       </w:pPr>
       <w:r>
-        <w:t xml:space="preserve">Il prodotto X2SevenVault è un </w:t>
-      </w:r>
-      <w:r>
-        <w:t xml:space="preserve">sistema di gestione di un </w:t>
-      </w:r>
-      <w:r>
-        <w:t>magazzino intelligente progettato per addetti scolastici o aziendali che gestiscono piccoli</w:t>
+        <w:t>Il prodotto X2SevenVault è un sistema di gestione di un magazzino intelligente progettato per addetti scolastici o aziendali che gestiscono piccoli</w:t>
       </w:r>
       <w:r>
         <w:t>/medi</w:t>
@@ -3395,6 +3390,7 @@
                 <w:sz w:val="16"/>
                 <w:szCs w:val="16"/>
               </w:rPr>
+              <w:lastRenderedPageBreak/>
               <w:t xml:space="preserve">ID: </w:t>
             </w:r>
             <w:r>
@@ -3647,22 +3643,26 @@
               <w:rPr>
                 <w:sz w:val="16"/>
                 <w:szCs w:val="16"/>
-                <w:lang w:val="fr-CH"/>
               </w:rPr>
             </w:pPr>
             <w:r>
               <w:rPr>
                 <w:sz w:val="16"/>
                 <w:szCs w:val="16"/>
-                <w:lang w:val="fr-CH"/>
-              </w:rPr>
-              <w:t>T</w:t>
-            </w:r>
-            <w:r>
-              <w:rPr>
-                <w:sz w:val="16"/>
-                <w:szCs w:val="16"/>
-                <w:lang w:val="fr-CH"/>
+              </w:rPr>
+              <w:t>Sviluppo su dispositivi mo</w:t>
+            </w:r>
+            <w:r>
+              <w:rPr>
+                <w:sz w:val="16"/>
+                <w:szCs w:val="16"/>
+              </w:rPr>
+              <w:t>bile, e t</w:t>
+            </w:r>
+            <w:r>
+              <w:rPr>
+                <w:sz w:val="16"/>
+                <w:szCs w:val="16"/>
               </w:rPr>
               <w:t>est su vari device (iOS/Android/Quest)</w:t>
             </w:r>
@@ -3758,21 +3758,14 @@
                 <w:sz w:val="16"/>
                 <w:szCs w:val="16"/>
               </w:rPr>
-              <w:t xml:space="preserve">Supporto camera </w:t>
-            </w:r>
-            <w:r>
-              <w:rPr>
-                <w:sz w:val="16"/>
-                <w:szCs w:val="16"/>
-              </w:rPr>
-              <w:t xml:space="preserve">fronte/retro </w:t>
-            </w:r>
-            <w:r>
-              <w:rPr>
-                <w:sz w:val="16"/>
-                <w:szCs w:val="16"/>
-              </w:rPr>
-              <w:t>mobile</w:t>
+              <w:t>L’utente deve poter selezionare la camera</w:t>
+            </w:r>
+            <w:r>
+              <w:rPr>
+                <w:sz w:val="16"/>
+                <w:szCs w:val="16"/>
+              </w:rPr>
+              <w:t xml:space="preserve"> (fronte/retro)</w:t>
             </w:r>
           </w:p>
         </w:tc>
@@ -3832,78 +3825,28 @@
                 <w:sz w:val="16"/>
                 <w:szCs w:val="16"/>
               </w:rPr>
-              <w:t>30 FPS minimi per un real-time streaming</w:t>
-            </w:r>
-          </w:p>
-        </w:tc>
-      </w:tr>
-      <w:tr>
-        <w:trPr>
-          <w:tblCellSpacing w:w="0" w:type="dxa"/>
-        </w:trPr>
-        <w:tc>
-          <w:tcPr>
-            <w:tcW w:w="1895" w:type="dxa"/>
-            <w:tcBorders>
-              <w:top w:val="outset" w:sz="6" w:space="0" w:color="000000"/>
-              <w:bottom w:val="outset" w:sz="6" w:space="0" w:color="000000"/>
-              <w:right w:val="outset" w:sz="6" w:space="0" w:color="000000"/>
-            </w:tcBorders>
-          </w:tcPr>
-          <w:p>
-            <w:pPr>
-              <w:spacing w:before="100" w:beforeAutospacing="1"/>
-              <w:rPr>
-                <w:b/>
-                <w:sz w:val="16"/>
-                <w:szCs w:val="16"/>
-              </w:rPr>
-            </w:pPr>
-            <w:r>
-              <w:rPr>
-                <w:b/>
-                <w:bCs/>
-                <w:sz w:val="16"/>
-                <w:szCs w:val="16"/>
-              </w:rPr>
-              <w:t>003</w:t>
-            </w:r>
-          </w:p>
-        </w:tc>
-        <w:tc>
-          <w:tcPr>
-            <w:tcW w:w="7685" w:type="dxa"/>
-            <w:tcBorders>
-              <w:top w:val="outset" w:sz="6" w:space="0" w:color="000000"/>
-              <w:left w:val="outset" w:sz="6" w:space="0" w:color="000000"/>
-              <w:bottom w:val="outset" w:sz="6" w:space="0" w:color="000000"/>
-            </w:tcBorders>
-          </w:tcPr>
-          <w:p>
-            <w:pPr>
-              <w:spacing w:before="100" w:beforeAutospacing="1"/>
-              <w:rPr>
-                <w:i/>
-                <w:iCs/>
-                <w:sz w:val="16"/>
-                <w:szCs w:val="16"/>
-              </w:rPr>
-            </w:pPr>
-            <w:r>
-              <w:rPr>
-                <w:sz w:val="16"/>
-                <w:szCs w:val="16"/>
-              </w:rPr>
-              <w:t xml:space="preserve">Torcia/Flash automatico per bassa luminosità - </w:t>
-            </w:r>
-            <w:r>
-              <w:rPr>
-                <w:i/>
-                <w:iCs/>
-                <w:sz w:val="16"/>
-                <w:szCs w:val="16"/>
-              </w:rPr>
-              <w:t>opzionale</w:t>
+              <w:t>A</w:t>
+            </w:r>
+            <w:r>
+              <w:rPr>
+                <w:sz w:val="16"/>
+                <w:szCs w:val="16"/>
+              </w:rPr>
+              <w:t xml:space="preserve">cquisizione </w:t>
+            </w:r>
+            <w:r>
+              <w:rPr>
+                <w:sz w:val="16"/>
+                <w:szCs w:val="16"/>
+              </w:rPr>
+              <w:t xml:space="preserve">dell’oggetto </w:t>
+            </w:r>
+            <w:r>
+              <w:rPr>
+                <w:sz w:val="16"/>
+                <w:szCs w:val="16"/>
+              </w:rPr>
+              <w:t>deve essere sufficientemente fluida</w:t>
             </w:r>
           </w:p>
         </w:tc>
@@ -4315,21 +4258,7 @@
                 <w:sz w:val="16"/>
                 <w:szCs w:val="16"/>
               </w:rPr>
-              <w:t xml:space="preserve">Modello YOLO/TFLite con </w:t>
-            </w:r>
-            <w:r>
-              <w:rPr>
-                <w:sz w:val="16"/>
-                <w:szCs w:val="16"/>
-              </w:rPr>
-              <w:t xml:space="preserve">un’affidabilità maggiore al </w:t>
-            </w:r>
-            <w:r>
-              <w:rPr>
-                <w:sz w:val="16"/>
-                <w:szCs w:val="16"/>
-              </w:rPr>
-              <w:t>85% su custom dataset</w:t>
+              <w:t>Il modello AI deve essere addestrato su un dataset di oggetti appartenenti al magazzino</w:t>
             </w:r>
           </w:p>
         </w:tc>
@@ -4389,7 +4318,68 @@
                 <w:sz w:val="16"/>
                 <w:szCs w:val="16"/>
               </w:rPr>
-              <w:t>Multi-classe detection (20-50 oggetti magazzino)</w:t>
+              <w:t>Il modello deve raggiungere almeno l’85% di accuratezza media per il riconoscimento dell’oggetto</w:t>
+            </w:r>
+          </w:p>
+        </w:tc>
+      </w:tr>
+      <w:tr>
+        <w:trPr>
+          <w:tblCellSpacing w:w="0" w:type="dxa"/>
+        </w:trPr>
+        <w:tc>
+          <w:tcPr>
+            <w:tcW w:w="1895" w:type="dxa"/>
+            <w:tcBorders>
+              <w:top w:val="outset" w:sz="6" w:space="0" w:color="000000"/>
+              <w:bottom w:val="outset" w:sz="6" w:space="0" w:color="000000"/>
+              <w:right w:val="outset" w:sz="6" w:space="0" w:color="000000"/>
+            </w:tcBorders>
+          </w:tcPr>
+          <w:p>
+            <w:pPr>
+              <w:spacing w:before="100" w:beforeAutospacing="1"/>
+              <w:rPr>
+                <w:b/>
+                <w:bCs/>
+                <w:sz w:val="16"/>
+                <w:szCs w:val="16"/>
+              </w:rPr>
+            </w:pPr>
+            <w:r>
+              <w:rPr>
+                <w:b/>
+                <w:bCs/>
+                <w:sz w:val="16"/>
+                <w:szCs w:val="16"/>
+              </w:rPr>
+              <w:t>003</w:t>
+            </w:r>
+          </w:p>
+        </w:tc>
+        <w:tc>
+          <w:tcPr>
+            <w:tcW w:w="7685" w:type="dxa"/>
+            <w:tcBorders>
+              <w:top w:val="outset" w:sz="6" w:space="0" w:color="000000"/>
+              <w:left w:val="outset" w:sz="6" w:space="0" w:color="000000"/>
+              <w:bottom w:val="outset" w:sz="6" w:space="0" w:color="000000"/>
+            </w:tcBorders>
+          </w:tcPr>
+          <w:p>
+            <w:pPr>
+              <w:spacing w:before="100" w:beforeAutospacing="1"/>
+              <w:rPr>
+                <w:sz w:val="16"/>
+                <w:szCs w:val="16"/>
+              </w:rPr>
+            </w:pPr>
+            <w:r>
+              <w:rPr>
+                <w:sz w:val="16"/>
+                <w:szCs w:val="16"/>
+              </w:rPr>
+              <w:t>Il sistema deve gestire i casi in cui il riconoscimento non avviene correttamente</w:t>
             </w:r>
           </w:p>
         </w:tc>
@@ -4861,7 +4851,75 @@
                 <w:sz w:val="16"/>
                 <w:szCs w:val="16"/>
               </w:rPr>
-              <w:t>Popolamento dati</w:t>
+              <w:t>Ogni oggetto deve avere: nome, descrizione, magazzino, scaffale ed eventuali informazioni aggiuntive</w:t>
+            </w:r>
+          </w:p>
+        </w:tc>
+      </w:tr>
+      <w:tr>
+        <w:trPr>
+          <w:tblCellSpacing w:w="0" w:type="dxa"/>
+        </w:trPr>
+        <w:tc>
+          <w:tcPr>
+            <w:tcW w:w="1895" w:type="dxa"/>
+            <w:tcBorders>
+              <w:top w:val="outset" w:sz="6" w:space="0" w:color="000000"/>
+              <w:bottom w:val="outset" w:sz="6" w:space="0" w:color="000000"/>
+              <w:right w:val="outset" w:sz="6" w:space="0" w:color="000000"/>
+            </w:tcBorders>
+          </w:tcPr>
+          <w:p>
+            <w:pPr>
+              <w:spacing w:before="100" w:beforeAutospacing="1"/>
+              <w:rPr>
+                <w:b/>
+                <w:bCs/>
+                <w:sz w:val="16"/>
+                <w:szCs w:val="16"/>
+              </w:rPr>
+            </w:pPr>
+            <w:r>
+              <w:rPr>
+                <w:b/>
+                <w:bCs/>
+                <w:sz w:val="16"/>
+                <w:szCs w:val="16"/>
+              </w:rPr>
+              <w:t>003</w:t>
+            </w:r>
+          </w:p>
+        </w:tc>
+        <w:tc>
+          <w:tcPr>
+            <w:tcW w:w="7685" w:type="dxa"/>
+            <w:tcBorders>
+              <w:top w:val="outset" w:sz="6" w:space="0" w:color="000000"/>
+              <w:left w:val="outset" w:sz="6" w:space="0" w:color="000000"/>
+              <w:bottom w:val="outset" w:sz="6" w:space="0" w:color="000000"/>
+            </w:tcBorders>
+          </w:tcPr>
+          <w:p>
+            <w:pPr>
+              <w:spacing w:before="100" w:beforeAutospacing="1"/>
+              <w:rPr>
+                <w:sz w:val="16"/>
+                <w:szCs w:val="16"/>
+              </w:rPr>
+            </w:pPr>
+            <w:r>
+              <w:rPr>
+                <w:sz w:val="16"/>
+                <w:szCs w:val="16"/>
+              </w:rPr>
+              <w:t xml:space="preserve">Un oggetto può esistere nel DB anche se non è </w:t>
+            </w:r>
+            <w:r>
+              <w:rPr>
+                <w:sz w:val="16"/>
+                <w:szCs w:val="16"/>
+              </w:rPr>
+              <w:t>riconosciuto dal modello AI</w:t>
             </w:r>
           </w:p>
         </w:tc>
@@ -4925,6 +4983,7 @@
                 <w:sz w:val="16"/>
                 <w:szCs w:val="16"/>
               </w:rPr>
+              <w:lastRenderedPageBreak/>
               <w:t xml:space="preserve">ID: </w:t>
             </w:r>
             <w:r>
@@ -5179,7 +5238,7 @@
                 <w:szCs w:val="16"/>
                 <w:lang w:val="fr-CH"/>
               </w:rPr>
-              <w:t>-</w:t>
+              <w:t>Visualizzazione su applicazione mobile</w:t>
             </w:r>
           </w:p>
         </w:tc>
@@ -5551,7 +5610,14 @@
                 <w:sz w:val="16"/>
                 <w:szCs w:val="16"/>
               </w:rPr>
-              <w:t>Interfaccia utente intuitiva</w:t>
+              <w:t>Gestione del magazzino</w:t>
+            </w:r>
+            <w:r>
+              <w:rPr>
+                <w:sz w:val="16"/>
+                <w:szCs w:val="16"/>
+              </w:rPr>
+              <w:t xml:space="preserve"> tramite interfaccia web</w:t>
             </w:r>
           </w:p>
         </w:tc>
@@ -5610,7 +5676,7 @@
                 <w:sz w:val="16"/>
                 <w:szCs w:val="16"/>
               </w:rPr>
-              <w:t>2</w:t>
+              <w:t>1</w:t>
             </w:r>
           </w:p>
         </w:tc>
@@ -5824,14 +5890,28 @@
                 <w:sz w:val="16"/>
                 <w:szCs w:val="16"/>
               </w:rPr>
-              <w:t>Design responsive</w:t>
-            </w:r>
-            <w:r>
-              <w:rPr>
-                <w:sz w:val="16"/>
-                <w:szCs w:val="16"/>
-              </w:rPr>
-              <w:t xml:space="preserve"> e intuitivo</w:t>
+              <w:t>Visualizzazione</w:t>
+            </w:r>
+            <w:r>
+              <w:rPr>
+                <w:sz w:val="16"/>
+                <w:szCs w:val="16"/>
+              </w:rPr>
+              <w:t xml:space="preserve"> </w:t>
+            </w:r>
+            <w:r>
+              <w:rPr>
+                <w:sz w:val="16"/>
+                <w:szCs w:val="16"/>
+              </w:rPr>
+              <w:t>del</w:t>
+            </w:r>
+            <w:r>
+              <w:rPr>
+                <w:sz w:val="16"/>
+                <w:szCs w:val="16"/>
+              </w:rPr>
+              <w:t>l’elenco degli oggetti presenti nel magazzino con le relative informazioni</w:t>
             </w:r>
           </w:p>
         </w:tc>
@@ -5854,6 +5934,7 @@
               <w:spacing w:before="100" w:beforeAutospacing="1"/>
               <w:rPr>
                 <w:b/>
+                <w:bCs/>
                 <w:sz w:val="16"/>
                 <w:szCs w:val="16"/>
               </w:rPr>
@@ -5891,16 +5972,84 @@
                 <w:sz w:val="16"/>
                 <w:szCs w:val="16"/>
               </w:rPr>
-              <w:t>Feedback vibrazione su detection</w:t>
+              <w:t>Operazioni CRUD sugli oggetti</w:t>
+            </w:r>
+            <w:r>
+              <w:rPr>
+                <w:sz w:val="16"/>
+                <w:szCs w:val="16"/>
+              </w:rPr>
+              <w:t>, scaffali e magazzini</w:t>
+            </w:r>
+          </w:p>
+        </w:tc>
+      </w:tr>
+      <w:tr>
+        <w:trPr>
+          <w:tblCellSpacing w:w="0" w:type="dxa"/>
+        </w:trPr>
+        <w:tc>
+          <w:tcPr>
+            <w:tcW w:w="1895" w:type="dxa"/>
+            <w:tcBorders>
+              <w:top w:val="outset" w:sz="6" w:space="0" w:color="000000"/>
+              <w:bottom w:val="outset" w:sz="6" w:space="0" w:color="000000"/>
+              <w:right w:val="outset" w:sz="6" w:space="0" w:color="000000"/>
+            </w:tcBorders>
+          </w:tcPr>
+          <w:p>
+            <w:pPr>
+              <w:spacing w:before="100" w:beforeAutospacing="1"/>
+              <w:rPr>
+                <w:b/>
+                <w:bCs/>
+                <w:sz w:val="16"/>
+                <w:szCs w:val="16"/>
+              </w:rPr>
+            </w:pPr>
+            <w:r>
+              <w:rPr>
+                <w:b/>
+                <w:bCs/>
+                <w:sz w:val="16"/>
+                <w:szCs w:val="16"/>
+              </w:rPr>
+              <w:t>003</w:t>
+            </w:r>
+          </w:p>
+        </w:tc>
+        <w:tc>
+          <w:tcPr>
+            <w:tcW w:w="7685" w:type="dxa"/>
+            <w:tcBorders>
+              <w:top w:val="outset" w:sz="6" w:space="0" w:color="000000"/>
+              <w:left w:val="outset" w:sz="6" w:space="0" w:color="000000"/>
+              <w:bottom w:val="outset" w:sz="6" w:space="0" w:color="000000"/>
+            </w:tcBorders>
+          </w:tcPr>
+          <w:p>
+            <w:pPr>
+              <w:spacing w:before="100" w:beforeAutospacing="1"/>
+              <w:rPr>
+                <w:sz w:val="16"/>
+                <w:szCs w:val="16"/>
+              </w:rPr>
+            </w:pPr>
+            <w:r>
+              <w:rPr>
+                <w:sz w:val="16"/>
+                <w:szCs w:val="16"/>
+              </w:rPr>
+              <w:t>Ricerca degli oggetti</w:t>
             </w:r>
           </w:p>
         </w:tc>
       </w:tr>
     </w:tbl>
     <w:p>
-      <w:pPr>
-        <w:spacing w:after="240"/>
-      </w:pPr>
+      <w:r>
+        <w:br w:type="page"/>
+      </w:r>
     </w:p>
     <w:tbl>
       <w:tblPr>
@@ -5955,6 +6104,7 @@
                 <w:sz w:val="16"/>
                 <w:szCs w:val="16"/>
               </w:rPr>
+              <w:lastRenderedPageBreak/>
               <w:t xml:space="preserve">ID: </w:t>
             </w:r>
             <w:r>
@@ -6030,7 +6180,7 @@
                 <w:sz w:val="16"/>
                 <w:szCs w:val="16"/>
               </w:rPr>
-              <w:t>Gestione del magazzino</w:t>
+              <w:t>Sistema di autenticazione utenti</w:t>
             </w:r>
           </w:p>
         </w:tc>
@@ -6089,7 +6239,7 @@
                 <w:sz w:val="16"/>
                 <w:szCs w:val="16"/>
               </w:rPr>
-              <w:t>2</w:t>
+              <w:t>1</w:t>
             </w:r>
           </w:p>
         </w:tc>
@@ -6303,16 +6453,77 @@
                 <w:sz w:val="16"/>
                 <w:szCs w:val="16"/>
               </w:rPr>
-              <w:t>Dashboard web admin per inventario</w:t>
+              <w:t>Autenticazione tramite credenziali</w:t>
+            </w:r>
+          </w:p>
+        </w:tc>
+      </w:tr>
+      <w:tr>
+        <w:trPr>
+          <w:tblCellSpacing w:w="0" w:type="dxa"/>
+        </w:trPr>
+        <w:tc>
+          <w:tcPr>
+            <w:tcW w:w="1895" w:type="dxa"/>
+            <w:tcBorders>
+              <w:top w:val="outset" w:sz="6" w:space="0" w:color="000000"/>
+              <w:bottom w:val="outset" w:sz="6" w:space="0" w:color="000000"/>
+              <w:right w:val="outset" w:sz="6" w:space="0" w:color="000000"/>
+            </w:tcBorders>
+          </w:tcPr>
+          <w:p>
+            <w:pPr>
+              <w:spacing w:before="100" w:beforeAutospacing="1"/>
+              <w:rPr>
+                <w:b/>
+                <w:bCs/>
+                <w:sz w:val="16"/>
+                <w:szCs w:val="16"/>
+              </w:rPr>
+            </w:pPr>
+            <w:r>
+              <w:rPr>
+                <w:b/>
+                <w:bCs/>
+                <w:sz w:val="16"/>
+                <w:szCs w:val="16"/>
+              </w:rPr>
+              <w:t>002</w:t>
+            </w:r>
+          </w:p>
+        </w:tc>
+        <w:tc>
+          <w:tcPr>
+            <w:tcW w:w="7685" w:type="dxa"/>
+            <w:tcBorders>
+              <w:top w:val="outset" w:sz="6" w:space="0" w:color="000000"/>
+              <w:left w:val="outset" w:sz="6" w:space="0" w:color="000000"/>
+              <w:bottom w:val="outset" w:sz="6" w:space="0" w:color="000000"/>
+            </w:tcBorders>
+          </w:tcPr>
+          <w:p>
+            <w:pPr>
+              <w:spacing w:before="100" w:beforeAutospacing="1"/>
+              <w:rPr>
+                <w:sz w:val="16"/>
+                <w:szCs w:val="16"/>
+              </w:rPr>
+            </w:pPr>
+            <w:r>
+              <w:rPr>
+                <w:sz w:val="16"/>
+                <w:szCs w:val="16"/>
+              </w:rPr>
+              <w:t>Il sistema deve avere utenti admin e utenti base</w:t>
             </w:r>
           </w:p>
         </w:tc>
       </w:tr>
     </w:tbl>
     <w:p>
-      <w:r>
-        <w:br w:type="page"/>
-      </w:r>
+      <w:pPr>
+        <w:spacing w:after="240"/>
+      </w:pPr>
     </w:p>
     <w:tbl>
       <w:tblPr>
@@ -6442,7 +6653,7 @@
                 <w:sz w:val="16"/>
                 <w:szCs w:val="16"/>
               </w:rPr>
-              <w:t>Sistema di autenticazione utenti</w:t>
+              <w:t>Integrazione VR opzionale</w:t>
             </w:r>
           </w:p>
         </w:tc>
@@ -6501,7 +6712,7 @@
                 <w:sz w:val="16"/>
                 <w:szCs w:val="16"/>
               </w:rPr>
-              <w:t>3</w:t>
+              <w:t>2</w:t>
             </w:r>
           </w:p>
         </w:tc>
@@ -6715,14 +6926,7 @@
                 <w:sz w:val="16"/>
                 <w:szCs w:val="16"/>
               </w:rPr>
-              <w:t>Login con email e passwo</w:t>
-            </w:r>
-            <w:r>
-              <w:rPr>
-                <w:sz w:val="16"/>
-                <w:szCs w:val="16"/>
-              </w:rPr>
-              <w:t>rd</w:t>
+              <w:t>Riconoscimento oggetti con le relative informazioni</w:t>
             </w:r>
           </w:p>
         </w:tc>
@@ -6783,899 +6987,7 @@
                 <w:sz w:val="16"/>
                 <w:szCs w:val="16"/>
               </w:rPr>
-              <w:t>Ruoli admin/superadmin</w:t>
-            </w:r>
-          </w:p>
-        </w:tc>
-      </w:tr>
-    </w:tbl>
-    <w:p>
-      <w:pPr>
-        <w:spacing w:after="240"/>
-      </w:pPr>
-    </w:p>
-    <w:tbl>
-      <w:tblPr>
-        <w:tblW w:w="9580" w:type="dxa"/>
-        <w:tblCellSpacing w:w="0" w:type="dxa"/>
-        <w:tblInd w:w="-8" w:type="dxa"/>
-        <w:tblBorders>
-          <w:top w:val="outset" w:sz="6" w:space="0" w:color="000000"/>
-          <w:left w:val="outset" w:sz="6" w:space="0" w:color="000000"/>
-          <w:bottom w:val="outset" w:sz="6" w:space="0" w:color="000000"/>
-          <w:right w:val="outset" w:sz="6" w:space="0" w:color="000000"/>
-        </w:tblBorders>
-        <w:tblCellMar>
-          <w:top w:w="60" w:type="dxa"/>
-          <w:left w:w="60" w:type="dxa"/>
-          <w:bottom w:w="60" w:type="dxa"/>
-          <w:right w:w="60" w:type="dxa"/>
-        </w:tblCellMar>
-        <w:tblLook w:val="00A0" w:firstRow="1" w:lastRow="0" w:firstColumn="1" w:lastColumn="0" w:noHBand="0" w:noVBand="0"/>
-      </w:tblPr>
-      <w:tblGrid>
-        <w:gridCol w:w="1895"/>
-        <w:gridCol w:w="7685"/>
-      </w:tblGrid>
-      <w:tr>
-        <w:trPr>
-          <w:trHeight w:val="251"/>
-          <w:tblCellSpacing w:w="0" w:type="dxa"/>
-        </w:trPr>
-        <w:tc>
-          <w:tcPr>
-            <w:tcW w:w="9580" w:type="dxa"/>
-            <w:gridSpan w:val="2"/>
-            <w:tcBorders>
-              <w:top w:val="outset" w:sz="6" w:space="0" w:color="000000"/>
-              <w:bottom w:val="outset" w:sz="6" w:space="0" w:color="000000"/>
-            </w:tcBorders>
-          </w:tcPr>
-          <w:p>
-            <w:pPr>
-              <w:spacing w:before="100" w:beforeAutospacing="1"/>
-              <w:jc w:val="center"/>
-              <w:rPr>
-                <w:b/>
-                <w:sz w:val="16"/>
-                <w:szCs w:val="16"/>
-              </w:rPr>
-            </w:pPr>
-            <w:r>
-              <w:rPr>
-                <w:b/>
-                <w:sz w:val="16"/>
-                <w:szCs w:val="16"/>
-              </w:rPr>
-              <w:t xml:space="preserve">ID: </w:t>
-            </w:r>
-            <w:r>
-              <w:rPr>
-                <w:b/>
-                <w:sz w:val="16"/>
-                <w:szCs w:val="16"/>
-              </w:rPr>
-              <w:t>REQ-0</w:t>
-            </w:r>
-            <w:r>
-              <w:rPr>
-                <w:b/>
-                <w:sz w:val="16"/>
-                <w:szCs w:val="16"/>
-              </w:rPr>
-              <w:t>8</w:t>
-            </w:r>
-          </w:p>
-        </w:tc>
-      </w:tr>
-      <w:tr>
-        <w:trPr>
-          <w:tblCellSpacing w:w="0" w:type="dxa"/>
-        </w:trPr>
-        <w:tc>
-          <w:tcPr>
-            <w:tcW w:w="1895" w:type="dxa"/>
-            <w:tcBorders>
-              <w:top w:val="outset" w:sz="6" w:space="0" w:color="000000"/>
-              <w:bottom w:val="outset" w:sz="6" w:space="0" w:color="000000"/>
-              <w:right w:val="outset" w:sz="6" w:space="0" w:color="000000"/>
-            </w:tcBorders>
-          </w:tcPr>
-          <w:p>
-            <w:pPr>
-              <w:spacing w:before="100" w:beforeAutospacing="1"/>
-              <w:rPr>
-                <w:b/>
-                <w:sz w:val="16"/>
-                <w:szCs w:val="16"/>
-              </w:rPr>
-            </w:pPr>
-            <w:r>
-              <w:rPr>
-                <w:b/>
-                <w:sz w:val="16"/>
-                <w:szCs w:val="16"/>
-              </w:rPr>
-              <w:t>Nome</w:t>
-            </w:r>
-          </w:p>
-        </w:tc>
-        <w:tc>
-          <w:tcPr>
-            <w:tcW w:w="7685" w:type="dxa"/>
-            <w:tcBorders>
-              <w:top w:val="outset" w:sz="6" w:space="0" w:color="000000"/>
-              <w:left w:val="outset" w:sz="6" w:space="0" w:color="000000"/>
-              <w:bottom w:val="outset" w:sz="6" w:space="0" w:color="000000"/>
-            </w:tcBorders>
-          </w:tcPr>
-          <w:p>
-            <w:pPr>
-              <w:spacing w:before="100" w:beforeAutospacing="1"/>
-              <w:rPr>
-                <w:sz w:val="16"/>
-                <w:szCs w:val="16"/>
-              </w:rPr>
-            </w:pPr>
-            <w:r>
-              <w:rPr>
-                <w:sz w:val="16"/>
-                <w:szCs w:val="16"/>
-              </w:rPr>
-              <w:t>Gestione degli errori</w:t>
-            </w:r>
-          </w:p>
-        </w:tc>
-      </w:tr>
-      <w:tr>
-        <w:trPr>
-          <w:tblCellSpacing w:w="0" w:type="dxa"/>
-        </w:trPr>
-        <w:tc>
-          <w:tcPr>
-            <w:tcW w:w="1895" w:type="dxa"/>
-            <w:tcBorders>
-              <w:top w:val="outset" w:sz="6" w:space="0" w:color="000000"/>
-              <w:bottom w:val="outset" w:sz="6" w:space="0" w:color="000000"/>
-              <w:right w:val="outset" w:sz="6" w:space="0" w:color="000000"/>
-            </w:tcBorders>
-          </w:tcPr>
-          <w:p>
-            <w:pPr>
-              <w:spacing w:before="100" w:beforeAutospacing="1"/>
-              <w:rPr>
-                <w:b/>
-                <w:sz w:val="16"/>
-                <w:szCs w:val="16"/>
-              </w:rPr>
-            </w:pPr>
-            <w:r>
-              <w:rPr>
-                <w:b/>
-                <w:sz w:val="16"/>
-                <w:szCs w:val="16"/>
-              </w:rPr>
-              <w:t>Priorità</w:t>
-            </w:r>
-          </w:p>
-        </w:tc>
-        <w:tc>
-          <w:tcPr>
-            <w:tcW w:w="7685" w:type="dxa"/>
-            <w:tcBorders>
-              <w:top w:val="outset" w:sz="6" w:space="0" w:color="000000"/>
-              <w:left w:val="outset" w:sz="6" w:space="0" w:color="000000"/>
-              <w:bottom w:val="outset" w:sz="6" w:space="0" w:color="000000"/>
-            </w:tcBorders>
-          </w:tcPr>
-          <w:p>
-            <w:pPr>
-              <w:spacing w:before="100" w:beforeAutospacing="1"/>
-              <w:rPr>
-                <w:sz w:val="16"/>
-                <w:szCs w:val="16"/>
-              </w:rPr>
-            </w:pPr>
-            <w:r>
-              <w:rPr>
-                <w:sz w:val="16"/>
-                <w:szCs w:val="16"/>
-              </w:rPr>
-              <w:t>2</w:t>
-            </w:r>
-          </w:p>
-        </w:tc>
-      </w:tr>
-      <w:tr>
-        <w:trPr>
-          <w:tblCellSpacing w:w="0" w:type="dxa"/>
-        </w:trPr>
-        <w:tc>
-          <w:tcPr>
-            <w:tcW w:w="1895" w:type="dxa"/>
-            <w:tcBorders>
-              <w:top w:val="outset" w:sz="6" w:space="0" w:color="000000"/>
-              <w:bottom w:val="outset" w:sz="6" w:space="0" w:color="000000"/>
-              <w:right w:val="outset" w:sz="6" w:space="0" w:color="000000"/>
-            </w:tcBorders>
-          </w:tcPr>
-          <w:p>
-            <w:pPr>
-              <w:spacing w:before="100" w:beforeAutospacing="1"/>
-              <w:rPr>
-                <w:b/>
-                <w:sz w:val="16"/>
-                <w:szCs w:val="16"/>
-              </w:rPr>
-            </w:pPr>
-            <w:r>
-              <w:rPr>
-                <w:b/>
-                <w:sz w:val="16"/>
-                <w:szCs w:val="16"/>
-              </w:rPr>
-              <w:t>Versione</w:t>
-            </w:r>
-          </w:p>
-        </w:tc>
-        <w:tc>
-          <w:tcPr>
-            <w:tcW w:w="7685" w:type="dxa"/>
-            <w:tcBorders>
-              <w:top w:val="outset" w:sz="6" w:space="0" w:color="000000"/>
-              <w:left w:val="outset" w:sz="6" w:space="0" w:color="000000"/>
-              <w:bottom w:val="outset" w:sz="6" w:space="0" w:color="000000"/>
-            </w:tcBorders>
-          </w:tcPr>
-          <w:p>
-            <w:pPr>
-              <w:spacing w:before="100" w:beforeAutospacing="1"/>
-              <w:rPr>
-                <w:sz w:val="16"/>
-                <w:szCs w:val="16"/>
-              </w:rPr>
-            </w:pPr>
-            <w:r>
-              <w:rPr>
-                <w:sz w:val="16"/>
-                <w:szCs w:val="16"/>
-              </w:rPr>
-              <w:t>1.0</w:t>
-            </w:r>
-          </w:p>
-        </w:tc>
-      </w:tr>
-      <w:tr>
-        <w:trPr>
-          <w:tblCellSpacing w:w="0" w:type="dxa"/>
-        </w:trPr>
-        <w:tc>
-          <w:tcPr>
-            <w:tcW w:w="1895" w:type="dxa"/>
-            <w:tcBorders>
-              <w:top w:val="outset" w:sz="6" w:space="0" w:color="000000"/>
-              <w:bottom w:val="outset" w:sz="6" w:space="0" w:color="000000"/>
-              <w:right w:val="outset" w:sz="6" w:space="0" w:color="000000"/>
-            </w:tcBorders>
-          </w:tcPr>
-          <w:p>
-            <w:pPr>
-              <w:spacing w:before="100" w:beforeAutospacing="1"/>
-              <w:rPr>
-                <w:b/>
-                <w:sz w:val="16"/>
-                <w:szCs w:val="16"/>
-              </w:rPr>
-            </w:pPr>
-            <w:r>
-              <w:rPr>
-                <w:b/>
-                <w:sz w:val="16"/>
-                <w:szCs w:val="16"/>
-              </w:rPr>
-              <w:t>Note</w:t>
-            </w:r>
-          </w:p>
-        </w:tc>
-        <w:tc>
-          <w:tcPr>
-            <w:tcW w:w="7685" w:type="dxa"/>
-            <w:tcBorders>
-              <w:top w:val="outset" w:sz="6" w:space="0" w:color="000000"/>
-              <w:left w:val="outset" w:sz="6" w:space="0" w:color="000000"/>
-              <w:bottom w:val="outset" w:sz="6" w:space="0" w:color="000000"/>
-            </w:tcBorders>
-          </w:tcPr>
-          <w:p>
-            <w:pPr>
-              <w:spacing w:before="100" w:beforeAutospacing="1"/>
-              <w:rPr>
-                <w:sz w:val="16"/>
-                <w:szCs w:val="16"/>
-                <w:lang w:val="fr-CH"/>
-              </w:rPr>
-            </w:pPr>
-            <w:r>
-              <w:rPr>
-                <w:sz w:val="16"/>
-                <w:szCs w:val="16"/>
-                <w:lang w:val="fr-CH"/>
-              </w:rPr>
-              <w:t>-</w:t>
-            </w:r>
-          </w:p>
-        </w:tc>
-      </w:tr>
-      <w:tr>
-        <w:trPr>
-          <w:tblCellSpacing w:w="0" w:type="dxa"/>
-        </w:trPr>
-        <w:tc>
-          <w:tcPr>
-            <w:tcW w:w="9580" w:type="dxa"/>
-            <w:gridSpan w:val="2"/>
-            <w:tcBorders>
-              <w:top w:val="outset" w:sz="6" w:space="0" w:color="000000"/>
-              <w:bottom w:val="outset" w:sz="6" w:space="0" w:color="000000"/>
-            </w:tcBorders>
-          </w:tcPr>
-          <w:p>
-            <w:pPr>
-              <w:spacing w:before="100" w:beforeAutospacing="1"/>
-              <w:jc w:val="center"/>
-              <w:rPr>
-                <w:sz w:val="16"/>
-                <w:szCs w:val="16"/>
-              </w:rPr>
-            </w:pPr>
-            <w:r>
-              <w:rPr>
-                <w:b/>
-                <w:bCs/>
-                <w:sz w:val="16"/>
-                <w:szCs w:val="16"/>
-              </w:rPr>
-              <w:t>Sotto requisiti</w:t>
-            </w:r>
-          </w:p>
-        </w:tc>
-      </w:tr>
-      <w:tr>
-        <w:trPr>
-          <w:tblCellSpacing w:w="0" w:type="dxa"/>
-        </w:trPr>
-        <w:tc>
-          <w:tcPr>
-            <w:tcW w:w="1895" w:type="dxa"/>
-            <w:tcBorders>
-              <w:top w:val="outset" w:sz="6" w:space="0" w:color="000000"/>
-              <w:bottom w:val="outset" w:sz="6" w:space="0" w:color="000000"/>
-              <w:right w:val="outset" w:sz="6" w:space="0" w:color="000000"/>
-            </w:tcBorders>
-          </w:tcPr>
-          <w:p>
-            <w:pPr>
-              <w:spacing w:before="100" w:beforeAutospacing="1"/>
-              <w:rPr>
-                <w:b/>
-                <w:sz w:val="16"/>
-                <w:szCs w:val="16"/>
-              </w:rPr>
-            </w:pPr>
-            <w:r>
-              <w:rPr>
-                <w:b/>
-                <w:bCs/>
-                <w:sz w:val="16"/>
-                <w:szCs w:val="16"/>
-              </w:rPr>
-              <w:t>001</w:t>
-            </w:r>
-          </w:p>
-        </w:tc>
-        <w:tc>
-          <w:tcPr>
-            <w:tcW w:w="7685" w:type="dxa"/>
-            <w:tcBorders>
-              <w:top w:val="outset" w:sz="6" w:space="0" w:color="000000"/>
-              <w:left w:val="outset" w:sz="6" w:space="0" w:color="000000"/>
-              <w:bottom w:val="outset" w:sz="6" w:space="0" w:color="000000"/>
-            </w:tcBorders>
-          </w:tcPr>
-          <w:p>
-            <w:pPr>
-              <w:spacing w:before="100" w:beforeAutospacing="1"/>
-              <w:rPr>
-                <w:sz w:val="16"/>
-                <w:szCs w:val="16"/>
-              </w:rPr>
-            </w:pPr>
-            <w:r>
-              <w:rPr>
-                <w:sz w:val="16"/>
-                <w:szCs w:val="16"/>
-              </w:rPr>
-              <w:t>Messaggi chiari all’utente</w:t>
-            </w:r>
-          </w:p>
-        </w:tc>
-      </w:tr>
-    </w:tbl>
-    <w:p>
-      <w:pPr>
-        <w:spacing w:after="240"/>
-      </w:pPr>
-    </w:p>
-    <w:tbl>
-      <w:tblPr>
-        <w:tblW w:w="9580" w:type="dxa"/>
-        <w:tblCellSpacing w:w="0" w:type="dxa"/>
-        <w:tblInd w:w="-8" w:type="dxa"/>
-        <w:tblBorders>
-          <w:top w:val="outset" w:sz="6" w:space="0" w:color="000000"/>
-          <w:left w:val="outset" w:sz="6" w:space="0" w:color="000000"/>
-          <w:bottom w:val="outset" w:sz="6" w:space="0" w:color="000000"/>
-          <w:right w:val="outset" w:sz="6" w:space="0" w:color="000000"/>
-        </w:tblBorders>
-        <w:tblCellMar>
-          <w:top w:w="60" w:type="dxa"/>
-          <w:left w:w="60" w:type="dxa"/>
-          <w:bottom w:w="60" w:type="dxa"/>
-          <w:right w:w="60" w:type="dxa"/>
-        </w:tblCellMar>
-        <w:tblLook w:val="00A0" w:firstRow="1" w:lastRow="0" w:firstColumn="1" w:lastColumn="0" w:noHBand="0" w:noVBand="0"/>
-      </w:tblPr>
-      <w:tblGrid>
-        <w:gridCol w:w="1895"/>
-        <w:gridCol w:w="7685"/>
-      </w:tblGrid>
-      <w:tr>
-        <w:trPr>
-          <w:trHeight w:val="251"/>
-          <w:tblCellSpacing w:w="0" w:type="dxa"/>
-        </w:trPr>
-        <w:tc>
-          <w:tcPr>
-            <w:tcW w:w="9580" w:type="dxa"/>
-            <w:gridSpan w:val="2"/>
-            <w:tcBorders>
-              <w:top w:val="outset" w:sz="6" w:space="0" w:color="000000"/>
-              <w:bottom w:val="outset" w:sz="6" w:space="0" w:color="000000"/>
-            </w:tcBorders>
-          </w:tcPr>
-          <w:p>
-            <w:pPr>
-              <w:spacing w:before="100" w:beforeAutospacing="1"/>
-              <w:jc w:val="center"/>
-              <w:rPr>
-                <w:b/>
-                <w:sz w:val="16"/>
-                <w:szCs w:val="16"/>
-              </w:rPr>
-            </w:pPr>
-            <w:r>
-              <w:rPr>
-                <w:b/>
-                <w:sz w:val="16"/>
-                <w:szCs w:val="16"/>
-              </w:rPr>
-              <w:t xml:space="preserve">ID: </w:t>
-            </w:r>
-            <w:r>
-              <w:rPr>
-                <w:b/>
-                <w:sz w:val="16"/>
-                <w:szCs w:val="16"/>
-              </w:rPr>
-              <w:t>REQ-0</w:t>
-            </w:r>
-            <w:r>
-              <w:rPr>
-                <w:b/>
-                <w:sz w:val="16"/>
-                <w:szCs w:val="16"/>
-              </w:rPr>
-              <w:t>9</w:t>
-            </w:r>
-          </w:p>
-        </w:tc>
-      </w:tr>
-      <w:tr>
-        <w:trPr>
-          <w:tblCellSpacing w:w="0" w:type="dxa"/>
-        </w:trPr>
-        <w:tc>
-          <w:tcPr>
-            <w:tcW w:w="1895" w:type="dxa"/>
-            <w:tcBorders>
-              <w:top w:val="outset" w:sz="6" w:space="0" w:color="000000"/>
-              <w:bottom w:val="outset" w:sz="6" w:space="0" w:color="000000"/>
-              <w:right w:val="outset" w:sz="6" w:space="0" w:color="000000"/>
-            </w:tcBorders>
-          </w:tcPr>
-          <w:p>
-            <w:pPr>
-              <w:spacing w:before="100" w:beforeAutospacing="1"/>
-              <w:rPr>
-                <w:b/>
-                <w:sz w:val="16"/>
-                <w:szCs w:val="16"/>
-              </w:rPr>
-            </w:pPr>
-            <w:r>
-              <w:rPr>
-                <w:b/>
-                <w:sz w:val="16"/>
-                <w:szCs w:val="16"/>
-              </w:rPr>
-              <w:t>Nome</w:t>
-            </w:r>
-          </w:p>
-        </w:tc>
-        <w:tc>
-          <w:tcPr>
-            <w:tcW w:w="7685" w:type="dxa"/>
-            <w:tcBorders>
-              <w:top w:val="outset" w:sz="6" w:space="0" w:color="000000"/>
-              <w:left w:val="outset" w:sz="6" w:space="0" w:color="000000"/>
-              <w:bottom w:val="outset" w:sz="6" w:space="0" w:color="000000"/>
-            </w:tcBorders>
-          </w:tcPr>
-          <w:p>
-            <w:pPr>
-              <w:spacing w:before="100" w:beforeAutospacing="1"/>
-              <w:rPr>
-                <w:sz w:val="16"/>
-                <w:szCs w:val="16"/>
-              </w:rPr>
-            </w:pPr>
-            <w:r>
-              <w:rPr>
-                <w:sz w:val="16"/>
-                <w:szCs w:val="16"/>
-              </w:rPr>
-              <w:t>Integrazione VR opzionale</w:t>
-            </w:r>
-          </w:p>
-        </w:tc>
-      </w:tr>
-      <w:tr>
-        <w:trPr>
-          <w:tblCellSpacing w:w="0" w:type="dxa"/>
-        </w:trPr>
-        <w:tc>
-          <w:tcPr>
-            <w:tcW w:w="1895" w:type="dxa"/>
-            <w:tcBorders>
-              <w:top w:val="outset" w:sz="6" w:space="0" w:color="000000"/>
-              <w:bottom w:val="outset" w:sz="6" w:space="0" w:color="000000"/>
-              <w:right w:val="outset" w:sz="6" w:space="0" w:color="000000"/>
-            </w:tcBorders>
-          </w:tcPr>
-          <w:p>
-            <w:pPr>
-              <w:spacing w:before="100" w:beforeAutospacing="1"/>
-              <w:rPr>
-                <w:b/>
-                <w:sz w:val="16"/>
-                <w:szCs w:val="16"/>
-              </w:rPr>
-            </w:pPr>
-            <w:r>
-              <w:rPr>
-                <w:b/>
-                <w:sz w:val="16"/>
-                <w:szCs w:val="16"/>
-              </w:rPr>
-              <w:t>Priorità</w:t>
-            </w:r>
-          </w:p>
-        </w:tc>
-        <w:tc>
-          <w:tcPr>
-            <w:tcW w:w="7685" w:type="dxa"/>
-            <w:tcBorders>
-              <w:top w:val="outset" w:sz="6" w:space="0" w:color="000000"/>
-              <w:left w:val="outset" w:sz="6" w:space="0" w:color="000000"/>
-              <w:bottom w:val="outset" w:sz="6" w:space="0" w:color="000000"/>
-            </w:tcBorders>
-          </w:tcPr>
-          <w:p>
-            <w:pPr>
-              <w:spacing w:before="100" w:beforeAutospacing="1"/>
-              <w:rPr>
-                <w:sz w:val="16"/>
-                <w:szCs w:val="16"/>
-              </w:rPr>
-            </w:pPr>
-            <w:r>
-              <w:rPr>
-                <w:sz w:val="16"/>
-                <w:szCs w:val="16"/>
-              </w:rPr>
-              <w:t>4</w:t>
-            </w:r>
-          </w:p>
-        </w:tc>
-      </w:tr>
-      <w:tr>
-        <w:trPr>
-          <w:tblCellSpacing w:w="0" w:type="dxa"/>
-        </w:trPr>
-        <w:tc>
-          <w:tcPr>
-            <w:tcW w:w="1895" w:type="dxa"/>
-            <w:tcBorders>
-              <w:top w:val="outset" w:sz="6" w:space="0" w:color="000000"/>
-              <w:bottom w:val="outset" w:sz="6" w:space="0" w:color="000000"/>
-              <w:right w:val="outset" w:sz="6" w:space="0" w:color="000000"/>
-            </w:tcBorders>
-          </w:tcPr>
-          <w:p>
-            <w:pPr>
-              <w:spacing w:before="100" w:beforeAutospacing="1"/>
-              <w:rPr>
-                <w:b/>
-                <w:sz w:val="16"/>
-                <w:szCs w:val="16"/>
-              </w:rPr>
-            </w:pPr>
-            <w:r>
-              <w:rPr>
-                <w:b/>
-                <w:sz w:val="16"/>
-                <w:szCs w:val="16"/>
-              </w:rPr>
-              <w:t>Versione</w:t>
-            </w:r>
-          </w:p>
-        </w:tc>
-        <w:tc>
-          <w:tcPr>
-            <w:tcW w:w="7685" w:type="dxa"/>
-            <w:tcBorders>
-              <w:top w:val="outset" w:sz="6" w:space="0" w:color="000000"/>
-              <w:left w:val="outset" w:sz="6" w:space="0" w:color="000000"/>
-              <w:bottom w:val="outset" w:sz="6" w:space="0" w:color="000000"/>
-            </w:tcBorders>
-          </w:tcPr>
-          <w:p>
-            <w:pPr>
-              <w:spacing w:before="100" w:beforeAutospacing="1"/>
-              <w:rPr>
-                <w:sz w:val="16"/>
-                <w:szCs w:val="16"/>
-              </w:rPr>
-            </w:pPr>
-            <w:r>
-              <w:rPr>
-                <w:sz w:val="16"/>
-                <w:szCs w:val="16"/>
-              </w:rPr>
-              <w:t>1.0</w:t>
-            </w:r>
-          </w:p>
-        </w:tc>
-      </w:tr>
-      <w:tr>
-        <w:trPr>
-          <w:tblCellSpacing w:w="0" w:type="dxa"/>
-        </w:trPr>
-        <w:tc>
-          <w:tcPr>
-            <w:tcW w:w="1895" w:type="dxa"/>
-            <w:tcBorders>
-              <w:top w:val="outset" w:sz="6" w:space="0" w:color="000000"/>
-              <w:bottom w:val="outset" w:sz="6" w:space="0" w:color="000000"/>
-              <w:right w:val="outset" w:sz="6" w:space="0" w:color="000000"/>
-            </w:tcBorders>
-          </w:tcPr>
-          <w:p>
-            <w:pPr>
-              <w:spacing w:before="100" w:beforeAutospacing="1"/>
-              <w:rPr>
-                <w:b/>
-                <w:sz w:val="16"/>
-                <w:szCs w:val="16"/>
-              </w:rPr>
-            </w:pPr>
-            <w:r>
-              <w:rPr>
-                <w:b/>
-                <w:sz w:val="16"/>
-                <w:szCs w:val="16"/>
-              </w:rPr>
-              <w:t>Note</w:t>
-            </w:r>
-          </w:p>
-        </w:tc>
-        <w:tc>
-          <w:tcPr>
-            <w:tcW w:w="7685" w:type="dxa"/>
-            <w:tcBorders>
-              <w:top w:val="outset" w:sz="6" w:space="0" w:color="000000"/>
-              <w:left w:val="outset" w:sz="6" w:space="0" w:color="000000"/>
-              <w:bottom w:val="outset" w:sz="6" w:space="0" w:color="000000"/>
-            </w:tcBorders>
-          </w:tcPr>
-          <w:p>
-            <w:pPr>
-              <w:spacing w:before="100" w:beforeAutospacing="1"/>
-              <w:rPr>
-                <w:sz w:val="16"/>
-                <w:szCs w:val="16"/>
-                <w:lang w:val="fr-CH"/>
-              </w:rPr>
-            </w:pPr>
-            <w:r>
-              <w:rPr>
-                <w:sz w:val="16"/>
-                <w:szCs w:val="16"/>
-                <w:lang w:val="fr-CH"/>
-              </w:rPr>
-              <w:t>-</w:t>
-            </w:r>
-          </w:p>
-        </w:tc>
-      </w:tr>
-      <w:tr>
-        <w:trPr>
-          <w:tblCellSpacing w:w="0" w:type="dxa"/>
-        </w:trPr>
-        <w:tc>
-          <w:tcPr>
-            <w:tcW w:w="9580" w:type="dxa"/>
-            <w:gridSpan w:val="2"/>
-            <w:tcBorders>
-              <w:top w:val="outset" w:sz="6" w:space="0" w:color="000000"/>
-              <w:bottom w:val="outset" w:sz="6" w:space="0" w:color="000000"/>
-            </w:tcBorders>
-          </w:tcPr>
-          <w:p>
-            <w:pPr>
-              <w:spacing w:before="100" w:beforeAutospacing="1"/>
-              <w:jc w:val="center"/>
-              <w:rPr>
-                <w:sz w:val="16"/>
-                <w:szCs w:val="16"/>
-              </w:rPr>
-            </w:pPr>
-            <w:r>
-              <w:rPr>
-                <w:b/>
-                <w:bCs/>
-                <w:sz w:val="16"/>
-                <w:szCs w:val="16"/>
-              </w:rPr>
-              <w:t>Sotto requisiti</w:t>
-            </w:r>
-          </w:p>
-        </w:tc>
-      </w:tr>
-      <w:tr>
-        <w:trPr>
-          <w:tblCellSpacing w:w="0" w:type="dxa"/>
-        </w:trPr>
-        <w:tc>
-          <w:tcPr>
-            <w:tcW w:w="1895" w:type="dxa"/>
-            <w:tcBorders>
-              <w:top w:val="outset" w:sz="6" w:space="0" w:color="000000"/>
-              <w:bottom w:val="outset" w:sz="6" w:space="0" w:color="000000"/>
-              <w:right w:val="outset" w:sz="6" w:space="0" w:color="000000"/>
-            </w:tcBorders>
-          </w:tcPr>
-          <w:p>
-            <w:pPr>
-              <w:spacing w:before="100" w:beforeAutospacing="1"/>
-              <w:rPr>
-                <w:b/>
-                <w:sz w:val="16"/>
-                <w:szCs w:val="16"/>
-              </w:rPr>
-            </w:pPr>
-            <w:r>
-              <w:rPr>
-                <w:b/>
-                <w:bCs/>
-                <w:sz w:val="16"/>
-                <w:szCs w:val="16"/>
-              </w:rPr>
-              <w:t>001</w:t>
-            </w:r>
-          </w:p>
-        </w:tc>
-        <w:tc>
-          <w:tcPr>
-            <w:tcW w:w="7685" w:type="dxa"/>
-            <w:tcBorders>
-              <w:top w:val="outset" w:sz="6" w:space="0" w:color="000000"/>
-              <w:left w:val="outset" w:sz="6" w:space="0" w:color="000000"/>
-              <w:bottom w:val="outset" w:sz="6" w:space="0" w:color="000000"/>
-            </w:tcBorders>
-          </w:tcPr>
-          <w:p>
-            <w:pPr>
-              <w:spacing w:before="100" w:beforeAutospacing="1"/>
-              <w:rPr>
-                <w:sz w:val="16"/>
-                <w:szCs w:val="16"/>
-              </w:rPr>
-            </w:pPr>
-            <w:r>
-              <w:rPr>
-                <w:sz w:val="16"/>
-                <w:szCs w:val="16"/>
-              </w:rPr>
-              <w:t>Hand-tracking per trigger foto/sca</w:t>
-            </w:r>
-            <w:r>
-              <w:rPr>
-                <w:sz w:val="16"/>
-                <w:szCs w:val="16"/>
-              </w:rPr>
-              <w:t>n</w:t>
-            </w:r>
-          </w:p>
-        </w:tc>
-      </w:tr>
-      <w:tr>
-        <w:trPr>
-          <w:tblCellSpacing w:w="0" w:type="dxa"/>
-        </w:trPr>
-        <w:tc>
-          <w:tcPr>
-            <w:tcW w:w="1895" w:type="dxa"/>
-            <w:tcBorders>
-              <w:top w:val="outset" w:sz="6" w:space="0" w:color="000000"/>
-              <w:bottom w:val="outset" w:sz="6" w:space="0" w:color="000000"/>
-              <w:right w:val="outset" w:sz="6" w:space="0" w:color="000000"/>
-            </w:tcBorders>
-          </w:tcPr>
-          <w:p>
-            <w:pPr>
-              <w:spacing w:before="100" w:beforeAutospacing="1"/>
-              <w:rPr>
-                <w:b/>
-                <w:bCs/>
-                <w:sz w:val="16"/>
-                <w:szCs w:val="16"/>
-              </w:rPr>
-            </w:pPr>
-            <w:r>
-              <w:rPr>
-                <w:b/>
-                <w:bCs/>
-                <w:sz w:val="16"/>
-                <w:szCs w:val="16"/>
-              </w:rPr>
-              <w:t>002</w:t>
-            </w:r>
-          </w:p>
-        </w:tc>
-        <w:tc>
-          <w:tcPr>
-            <w:tcW w:w="7685" w:type="dxa"/>
-            <w:tcBorders>
-              <w:top w:val="outset" w:sz="6" w:space="0" w:color="000000"/>
-              <w:left w:val="outset" w:sz="6" w:space="0" w:color="000000"/>
-              <w:bottom w:val="outset" w:sz="6" w:space="0" w:color="000000"/>
-            </w:tcBorders>
-          </w:tcPr>
-          <w:p>
-            <w:pPr>
-              <w:spacing w:before="100" w:beforeAutospacing="1"/>
-              <w:rPr>
-                <w:sz w:val="16"/>
-                <w:szCs w:val="16"/>
-              </w:rPr>
-            </w:pPr>
-            <w:r>
-              <w:rPr>
-                <w:sz w:val="16"/>
-                <w:szCs w:val="16"/>
-              </w:rPr>
-              <w:t>Scene anchoring su scaffali reali</w:t>
+              <w:t>Indicazioni visive per guidare l’utente verso la posizione del magazzino</w:t>
             </w:r>
           </w:p>
         </w:tc>
@@ -7826,6 +7138,7 @@
                 <w:noProof/>
                 <w:lang w:val="it-IT"/>
               </w:rPr>
+              <w:lastRenderedPageBreak/>
               <w:drawing>
                 <wp:inline distT="0" distB="0" distL="0" distR="0" wp14:anchorId="3C988473" wp14:editId="421E0D4A">
                   <wp:extent cx="5972175" cy="2876550"/>
@@ -8012,7 +7325,6 @@
       <w:bookmarkStart w:id="9" w:name="_Toc413411419"/>
       <w:bookmarkStart w:id="10" w:name="_Toc94790452"/>
       <w:r>
-        <w:lastRenderedPageBreak/>
         <w:t>Software</w:t>
       </w:r>
       <w:bookmarkEnd w:id="9"/>
@@ -8540,6 +7852,7 @@
       <w:bookmarkStart w:id="23" w:name="_Toc461179222"/>
       <w:bookmarkStart w:id="24" w:name="_Toc94790459"/>
       <w:r>
+        <w:lastRenderedPageBreak/>
         <w:t>Implementazione</w:t>
       </w:r>
       <w:bookmarkEnd w:id="23"/>
@@ -9331,6 +8644,7 @@
       </w:pPr>
       <w:bookmarkStart w:id="30" w:name="_Toc94790462"/>
       <w:r>
+        <w:lastRenderedPageBreak/>
         <w:t>Risultati test</w:t>
       </w:r>
       <w:bookmarkEnd w:id="29"/>
@@ -9831,6 +9145,7 @@
         <w:rPr>
           <w:lang w:val="it-IT"/>
         </w:rPr>
+        <w:lastRenderedPageBreak/>
         <w:t>Bibliografia</w:t>
       </w:r>
       <w:bookmarkEnd w:id="43"/>

</xml_diff>

<commit_message>
doc: planning chapther and SW&HW analys
</commit_message>
<xml_diff>
--- a/3_Documentazione/Documentazione_X2SevenVault_Christian_Arzani.docx
+++ b/3_Documentazione/Documentazione_X2SevenVault_Christian_Arzani.docx
@@ -2980,8 +2980,16 @@
         <w:rPr>
           <w:lang w:val="it-IT"/>
         </w:rPr>
-        <w:t>mobile o headset</w:t>
-      </w:r>
+        <w:t xml:space="preserve">mobile o </w:t>
+      </w:r>
+      <w:proofErr w:type="spellStart"/>
+      <w:r>
+        <w:rPr>
+          <w:lang w:val="it-IT"/>
+        </w:rPr>
+        <w:t>headset</w:t>
+      </w:r>
+      <w:proofErr w:type="spellEnd"/>
       <w:r>
         <w:rPr>
           <w:lang w:val="it-IT"/>
@@ -3104,7 +3112,15 @@
         <w:t xml:space="preserve">piccolo/medio </w:t>
       </w:r>
       <w:r>
-        <w:t xml:space="preserve">magazzino scolastico o aziendale, organizzato in scaffali/magazzini fisici con oggetti etichettati manualmente, dove attualmente il problema è risolto tramite liste cartacee o fogli Excel, causando errori di posizionamento e perdite di tempo. Non esistono soluzioni AI integrate pronte per questo ambito, anche se app commerciali come Google Lens offrono riconoscimento generico senza </w:t>
+        <w:t xml:space="preserve">magazzino scolastico o aziendale, organizzato in scaffali/magazzini fisici con oggetti etichettati manualmente, dove attualmente il problema è risolto tramite liste cartacee o fogli Excel, causando errori di posizionamento e perdite di tempo. Non esistono soluzioni </w:t>
+      </w:r>
+      <w:proofErr w:type="gramStart"/>
+      <w:r>
+        <w:t>AI integrate</w:t>
+      </w:r>
+      <w:proofErr w:type="gramEnd"/>
+      <w:r>
+        <w:t xml:space="preserve"> pronte per questo ambito, anche se app commerciali come Google Lens offrono riconoscimento generico senza </w:t>
       </w:r>
       <w:r>
         <w:t xml:space="preserve">però </w:t>
@@ -3295,8 +3311,13 @@
       <w:r>
         <w:t xml:space="preserve">un </w:t>
       </w:r>
-      <w:r>
-        <w:t>bounding box colorato sull'oggetto</w:t>
+      <w:proofErr w:type="spellStart"/>
+      <w:r>
+        <w:t>bounding</w:t>
+      </w:r>
+      <w:proofErr w:type="spellEnd"/>
+      <w:r>
+        <w:t xml:space="preserve"> box colorato sull'oggetto</w:t>
       </w:r>
       <w:r>
         <w:t xml:space="preserve"> e del </w:t>
@@ -3657,14 +3678,7 @@
                 <w:sz w:val="16"/>
                 <w:szCs w:val="16"/>
               </w:rPr>
-              <w:t>bile, e t</w:t>
-            </w:r>
-            <w:r>
-              <w:rPr>
-                <w:sz w:val="16"/>
-                <w:szCs w:val="16"/>
-              </w:rPr>
-              <w:t>est su vari device (iOS/Android/Quest)</w:t>
+              <w:t>bile</w:t>
             </w:r>
           </w:p>
         </w:tc>
@@ -3847,6 +3861,78 @@
                 <w:szCs w:val="16"/>
               </w:rPr>
               <w:t>deve essere sufficientemente fluida</w:t>
+            </w:r>
+          </w:p>
+        </w:tc>
+      </w:tr>
+      <w:tr>
+        <w:trPr>
+          <w:tblCellSpacing w:w="0" w:type="dxa"/>
+        </w:trPr>
+        <w:tc>
+          <w:tcPr>
+            <w:tcW w:w="1895" w:type="dxa"/>
+            <w:tcBorders>
+              <w:top w:val="outset" w:sz="6" w:space="0" w:color="000000"/>
+              <w:bottom w:val="outset" w:sz="6" w:space="0" w:color="000000"/>
+              <w:right w:val="outset" w:sz="6" w:space="0" w:color="000000"/>
+            </w:tcBorders>
+          </w:tcPr>
+          <w:p>
+            <w:pPr>
+              <w:spacing w:before="100" w:beforeAutospacing="1"/>
+              <w:rPr>
+                <w:b/>
+                <w:bCs/>
+                <w:sz w:val="16"/>
+                <w:szCs w:val="16"/>
+              </w:rPr>
+            </w:pPr>
+            <w:r>
+              <w:rPr>
+                <w:b/>
+                <w:bCs/>
+                <w:sz w:val="16"/>
+                <w:szCs w:val="16"/>
+              </w:rPr>
+              <w:t>003</w:t>
+            </w:r>
+          </w:p>
+        </w:tc>
+        <w:tc>
+          <w:tcPr>
+            <w:tcW w:w="7685" w:type="dxa"/>
+            <w:tcBorders>
+              <w:top w:val="outset" w:sz="6" w:space="0" w:color="000000"/>
+              <w:left w:val="outset" w:sz="6" w:space="0" w:color="000000"/>
+              <w:bottom w:val="outset" w:sz="6" w:space="0" w:color="000000"/>
+            </w:tcBorders>
+          </w:tcPr>
+          <w:p>
+            <w:pPr>
+              <w:spacing w:before="100" w:beforeAutospacing="1"/>
+              <w:rPr>
+                <w:i/>
+                <w:iCs/>
+                <w:sz w:val="16"/>
+                <w:szCs w:val="16"/>
+              </w:rPr>
+            </w:pPr>
+            <w:r>
+              <w:rPr>
+                <w:sz w:val="16"/>
+                <w:szCs w:val="16"/>
+              </w:rPr>
+              <w:t xml:space="preserve">Test su vari sistemi operativi - </w:t>
+            </w:r>
+            <w:r>
+              <w:rPr>
+                <w:i/>
+                <w:iCs/>
+                <w:sz w:val="16"/>
+                <w:szCs w:val="16"/>
+              </w:rPr>
+              <w:t>opzionale</w:t>
             </w:r>
           </w:p>
         </w:tc>
@@ -4164,8 +4250,36 @@
                 <w:szCs w:val="16"/>
                 <w:lang w:val="fr-CH"/>
               </w:rPr>
-              <w:t>Training dell’AI su Colab</w:t>
-            </w:r>
+              <w:t xml:space="preserve">Training </w:t>
+            </w:r>
+            <w:proofErr w:type="spellStart"/>
+            <w:r>
+              <w:rPr>
+                <w:sz w:val="16"/>
+                <w:szCs w:val="16"/>
+                <w:lang w:val="fr-CH"/>
+              </w:rPr>
+              <w:t>dell’AI</w:t>
+            </w:r>
+            <w:proofErr w:type="spellEnd"/>
+            <w:r>
+              <w:rPr>
+                <w:sz w:val="16"/>
+                <w:szCs w:val="16"/>
+                <w:lang w:val="fr-CH"/>
+              </w:rPr>
+              <w:t xml:space="preserve"> su </w:t>
+            </w:r>
+            <w:proofErr w:type="spellStart"/>
+            <w:r>
+              <w:rPr>
+                <w:sz w:val="16"/>
+                <w:szCs w:val="16"/>
+                <w:lang w:val="fr-CH"/>
+              </w:rPr>
+              <w:t>Colab</w:t>
+            </w:r>
+            <w:proofErr w:type="spellEnd"/>
           </w:p>
         </w:tc>
       </w:tr>
@@ -5232,13 +5346,41 @@
                 <w:lang w:val="fr-CH"/>
               </w:rPr>
             </w:pPr>
+            <w:proofErr w:type="spellStart"/>
             <w:r>
               <w:rPr>
                 <w:sz w:val="16"/>
                 <w:szCs w:val="16"/>
                 <w:lang w:val="fr-CH"/>
               </w:rPr>
-              <w:t>Visualizzazione su applicazione mobile</w:t>
+              <w:t>Visualizzazione</w:t>
+            </w:r>
+            <w:proofErr w:type="spellEnd"/>
+            <w:r>
+              <w:rPr>
+                <w:sz w:val="16"/>
+                <w:szCs w:val="16"/>
+                <w:lang w:val="fr-CH"/>
+              </w:rPr>
+              <w:t xml:space="preserve"> su </w:t>
+            </w:r>
+            <w:proofErr w:type="spellStart"/>
+            <w:r>
+              <w:rPr>
+                <w:sz w:val="16"/>
+                <w:szCs w:val="16"/>
+                <w:lang w:val="fr-CH"/>
+              </w:rPr>
+              <w:t>applicazione</w:t>
+            </w:r>
+            <w:proofErr w:type="spellEnd"/>
+            <w:r>
+              <w:rPr>
+                <w:sz w:val="16"/>
+                <w:szCs w:val="16"/>
+                <w:lang w:val="fr-CH"/>
+              </w:rPr>
+              <w:t xml:space="preserve"> mobile</w:t>
             </w:r>
           </w:p>
         </w:tc>
@@ -5327,12 +5469,21 @@
                 <w:szCs w:val="16"/>
               </w:rPr>
             </w:pPr>
-            <w:r>
-              <w:rPr>
-                <w:sz w:val="16"/>
-                <w:szCs w:val="16"/>
-              </w:rPr>
-              <w:t>Bounding box colorati con label</w:t>
+            <w:proofErr w:type="spellStart"/>
+            <w:r>
+              <w:rPr>
+                <w:sz w:val="16"/>
+                <w:szCs w:val="16"/>
+              </w:rPr>
+              <w:t>Bounding</w:t>
+            </w:r>
+            <w:proofErr w:type="spellEnd"/>
+            <w:r>
+              <w:rPr>
+                <w:sz w:val="16"/>
+                <w:szCs w:val="16"/>
+              </w:rPr>
+              <w:t xml:space="preserve"> box colorati con label</w:t>
             </w:r>
             <w:r>
               <w:rPr>
@@ -6995,12 +7146,18 @@
     </w:tbl>
     <w:p/>
     <w:p>
+      <w:r>
+        <w:br w:type="page"/>
+      </w:r>
+    </w:p>
+    <w:p>
       <w:pPr>
         <w:pStyle w:val="Titolo2"/>
         <w:ind w:left="578" w:hanging="578"/>
       </w:pPr>
       <w:bookmarkStart w:id="6" w:name="_Toc94790449"/>
       <w:r>
+        <w:lastRenderedPageBreak/>
         <w:t>Use case</w:t>
       </w:r>
       <w:bookmarkEnd w:id="6"/>
@@ -7042,6 +7199,12 @@
           <w:lang w:val="it-IT"/>
         </w:rPr>
       </w:pPr>
+      <w:r>
+        <w:rPr>
+          <w:lang w:val="it-IT"/>
+        </w:rPr>
+        <w:br w:type="page"/>
+      </w:r>
     </w:p>
     <w:p>
       <w:pPr>
@@ -7049,214 +7212,115 @@
       </w:pPr>
       <w:bookmarkStart w:id="7" w:name="_Toc94790450"/>
       <w:r>
+        <w:lastRenderedPageBreak/>
         <w:t>Pianificazione</w:t>
       </w:r>
       <w:bookmarkEnd w:id="7"/>
     </w:p>
     <w:p>
-      <w:pPr>
-        <w:rPr>
-          <w:lang w:val="it-IT"/>
-        </w:rPr>
-      </w:pPr>
-      <w:r>
-        <w:rPr>
-          <w:lang w:val="it-IT"/>
-        </w:rPr>
-        <w:t xml:space="preserve">Prima di stabilire una pianificazione bisogna avere almeno una vaga idea del modello di sviluppo che si intende adottare. </w:t>
-      </w:r>
-      <w:r>
-        <w:rPr>
-          <w:lang w:val="it-IT"/>
-        </w:rPr>
-        <w:t xml:space="preserve">In questa sezione bisognerà inserire il modello concettuale di sviluppo che si seguirà durante il progetto. </w:t>
-      </w:r>
-      <w:r>
-        <w:rPr>
-          <w:lang w:val="it-IT"/>
-        </w:rPr>
-        <w:t>Gli elementi di riferimento per una buona pianificazione derivano da una scomposizione top-down della problematica del progetto.</w:t>
-      </w:r>
-    </w:p>
-    <w:p>
-      <w:pPr>
-        <w:rPr>
-          <w:lang w:val="it-IT"/>
-        </w:rPr>
-      </w:pPr>
-    </w:p>
-    <w:p>
-      <w:pPr>
-        <w:rPr>
-          <w:lang w:val="it-IT"/>
-        </w:rPr>
-      </w:pPr>
-      <w:r>
-        <w:rPr>
-          <w:lang w:val="it-IT"/>
-        </w:rPr>
-        <w:t>La pianificazione può essere rappresentata mediante un diagramma di Gantt:</w:t>
-      </w:r>
-    </w:p>
-    <w:p>
-      <w:pPr>
-        <w:rPr>
-          <w:lang w:val="it-IT"/>
-        </w:rPr>
-      </w:pPr>
-    </w:p>
-    <w:tbl>
-      <w:tblPr>
-        <w:tblW w:w="0" w:type="auto"/>
-        <w:tblBorders>
-          <w:top w:val="single" w:sz="4" w:space="0" w:color="auto"/>
-          <w:left w:val="single" w:sz="4" w:space="0" w:color="auto"/>
-          <w:bottom w:val="single" w:sz="4" w:space="0" w:color="auto"/>
-          <w:right w:val="single" w:sz="4" w:space="0" w:color="auto"/>
-          <w:insideH w:val="single" w:sz="4" w:space="0" w:color="auto"/>
-          <w:insideV w:val="single" w:sz="4" w:space="0" w:color="auto"/>
-        </w:tblBorders>
-        <w:tblLook w:val="00A0" w:firstRow="1" w:lastRow="0" w:firstColumn="1" w:lastColumn="0" w:noHBand="0" w:noVBand="0"/>
-      </w:tblPr>
-      <w:tblGrid>
-        <w:gridCol w:w="9628"/>
-      </w:tblGrid>
-      <w:tr>
-        <w:tc>
-          <w:tcPr>
-            <w:tcW w:w="9628" w:type="dxa"/>
-            <w:shd w:val="clear" w:color="auto" w:fill="auto"/>
-          </w:tcPr>
-          <w:p>
-            <w:pPr>
-              <w:rPr>
-                <w:lang w:val="it-IT"/>
-              </w:rPr>
-            </w:pPr>
-            <w:r>
-              <w:rPr>
-                <w:noProof/>
-                <w:lang w:val="it-IT"/>
-              </w:rPr>
-              <w:lastRenderedPageBreak/>
-              <w:drawing>
-                <wp:inline distT="0" distB="0" distL="0" distR="0" wp14:anchorId="3C988473" wp14:editId="421E0D4A">
-                  <wp:extent cx="5972175" cy="2876550"/>
-                  <wp:effectExtent l="0" t="0" r="0" b="0"/>
-                  <wp:docPr id="1" name="Immagine 1"/>
-                  <wp:cNvGraphicFramePr>
-                    <a:graphicFrameLocks xmlns:a="http://schemas.openxmlformats.org/drawingml/2006/main" noChangeAspect="1"/>
-                  </wp:cNvGraphicFramePr>
-                  <a:graphic xmlns:a="http://schemas.openxmlformats.org/drawingml/2006/main">
-                    <a:graphicData uri="http://schemas.openxmlformats.org/drawingml/2006/picture">
-                      <pic:pic xmlns:pic="http://schemas.openxmlformats.org/drawingml/2006/picture">
-                        <pic:nvPicPr>
-                          <pic:cNvPr id="0" name="Picture 1"/>
-                          <pic:cNvPicPr>
-                            <a:picLocks noChangeAspect="1" noChangeArrowheads="1"/>
-                          </pic:cNvPicPr>
-                        </pic:nvPicPr>
-                        <pic:blipFill>
-                          <a:blip r:embed="rId8">
-                            <a:extLst>
-                              <a:ext uri="{28A0092B-C50C-407E-A947-70E740481C1C}">
-                                <a14:useLocalDpi xmlns:a14="http://schemas.microsoft.com/office/drawing/2010/main" val="0"/>
-                              </a:ext>
-                            </a:extLst>
-                          </a:blip>
-                          <a:srcRect r="6310"/>
-                          <a:stretch>
-                            <a:fillRect/>
-                          </a:stretch>
-                        </pic:blipFill>
-                        <pic:spPr bwMode="auto">
-                          <a:xfrm>
-                            <a:off x="0" y="0"/>
-                            <a:ext cx="5972175" cy="2876550"/>
-                          </a:xfrm>
-                          <a:prstGeom prst="rect">
-                            <a:avLst/>
-                          </a:prstGeom>
-                          <a:noFill/>
-                          <a:ln>
-                            <a:noFill/>
-                          </a:ln>
-                        </pic:spPr>
-                      </pic:pic>
-                    </a:graphicData>
-                  </a:graphic>
-                </wp:inline>
-              </w:drawing>
-            </w:r>
-          </w:p>
-          <w:p>
-            <w:pPr>
-              <w:pStyle w:val="Didascalia"/>
-              <w:rPr>
-                <w:lang w:val="it-IT"/>
-              </w:rPr>
-            </w:pPr>
-            <w:r>
-              <w:t xml:space="preserve">Figura </w:t>
-            </w:r>
-            <w:r>
-              <w:fldChar w:fldCharType="begin"/>
-            </w:r>
-            <w:r>
-              <w:instrText xml:space="preserve"> SEQ Figura \* ARABIC </w:instrText>
-            </w:r>
-            <w:r>
-              <w:fldChar w:fldCharType="separate"/>
-            </w:r>
-            <w:r>
-              <w:rPr>
-                <w:noProof/>
-              </w:rPr>
-              <w:t>1</w:t>
-            </w:r>
-            <w:r>
-              <w:rPr>
-                <w:noProof/>
-              </w:rPr>
-              <w:fldChar w:fldCharType="end"/>
-            </w:r>
-            <w:r>
-              <w:t>: Esempio di diagramma di Gantt.</w:t>
-            </w:r>
-          </w:p>
-        </w:tc>
-      </w:tr>
-    </w:tbl>
-    <w:p>
-      <w:pPr>
-        <w:rPr>
-          <w:lang w:val="it-IT"/>
-        </w:rPr>
-      </w:pPr>
-    </w:p>
-    <w:p>
-      <w:pPr>
-        <w:rPr>
-          <w:lang w:val="it-IT"/>
-        </w:rPr>
-      </w:pPr>
-      <w:r>
-        <w:rPr>
-          <w:lang w:val="it-IT"/>
-        </w:rPr>
-        <w:t>Se si usano altri metodi di pianificazione (</w:t>
-      </w:r>
-      <w:r>
-        <w:rPr>
-          <w:lang w:val="it-IT"/>
-        </w:rPr>
-        <w:t>p.</w:t>
-      </w:r>
-      <w:r>
-        <w:rPr>
-          <w:lang w:val="it-IT"/>
-        </w:rPr>
-        <w:t>es</w:t>
+      <w:r>
+        <w:t xml:space="preserve">Per la gestione del progetto è stato adottato il metodo Agile, </w:t>
+      </w:r>
+      <w:r>
+        <w:t xml:space="preserve">questo perché è un metodo molto adattabile al cambiamento, </w:t>
+      </w:r>
+      <w:r>
+        <w:t xml:space="preserve">fattore fondamentale per quello che riguarda il machine learning dell’AI che è un processo ricorrente nello sviluppo del progetto. </w:t>
+      </w:r>
+      <w:r>
+        <w:t xml:space="preserve">In particolare si utilizza </w:t>
+      </w:r>
+      <w:proofErr w:type="spellStart"/>
+      <w:r>
+        <w:t>Kanban</w:t>
+      </w:r>
+      <w:proofErr w:type="spellEnd"/>
+      <w:r>
+        <w:t xml:space="preserve">, con una board visuale divisa in colonne (Backlog, To Do, In Progress, </w:t>
+      </w:r>
+      <w:r>
+        <w:t xml:space="preserve">Testing, Review, </w:t>
+      </w:r>
+      <w:proofErr w:type="spellStart"/>
+      <w:r>
+        <w:t>Blocking</w:t>
+      </w:r>
+      <w:proofErr w:type="spellEnd"/>
+      <w:r>
+        <w:t xml:space="preserve">, </w:t>
+      </w:r>
+      <w:proofErr w:type="spellStart"/>
+      <w:r>
+        <w:t>Done</w:t>
+      </w:r>
+      <w:proofErr w:type="spellEnd"/>
+      <w:r>
+        <w:t xml:space="preserve">) dove i task </w:t>
+      </w:r>
+      <w:r>
+        <w:t>sono rappresentati da carte con etichette che definiscono lo sprint e la categoria del task (Implementazione, Documentazione, Test, etc..).</w:t>
+      </w:r>
+    </w:p>
+    <w:p>
+      <w:pPr>
+        <w:spacing w:before="240"/>
+      </w:pPr>
+      <w:r>
+        <w:t xml:space="preserve">La pianificazione del progetto è stata suddivisa in 2 fasi e 3 sprint. Le 2 fasi sono suddivise in preliminare e aggiustamento dove quella preliminare ha lo scopo di definire un piano generale del progetto e i primi schemi di progettazione mentre quella di assestamento di rifinire gli ultimi dettagli del progetto come documentazione, test finali e dettagli grafici. I 3 sprint, invece, sono incentrati </w:t>
+      </w:r>
+      <w:r>
+        <w:t xml:space="preserve">sullo sviluppo di funzionalità ben precise del progetto, ovviamente comprendenti di </w:t>
+      </w:r>
+      <w:r>
+        <w:t>un’analisi</w:t>
+      </w:r>
+      <w:r>
+        <w:t xml:space="preserve"> iniziale (in parte avvenuta nella fase preliminare), documentazione e test.</w:t>
+      </w:r>
+    </w:p>
+    <w:p>
+      <w:pPr>
+        <w:pStyle w:val="Titolo3"/>
+      </w:pPr>
+      <w:r>
+        <w:t>Fase preliminare – Analisi e progettazione</w:t>
+      </w:r>
+    </w:p>
+    <w:p>
+      <w:pPr>
+        <w:rPr>
+          <w:lang w:val="it-IT"/>
+        </w:rPr>
+      </w:pPr>
+      <w:r>
+        <w:rPr>
+          <w:lang w:val="it-IT"/>
+        </w:rPr>
+        <w:t xml:space="preserve">La fase preliminare punta a definire un piano generale del progetto e dei primi schemi di progettazione con una prima fase di analisi della tecnologia da utilizzare. Le mie aspettative alla conclusione di questa fase sono di avere una progettazione solida con schemi completi e avere una base robusta </w:t>
+      </w:r>
+      <w:r>
+        <w:rPr>
+          <w:lang w:val="it-IT"/>
+        </w:rPr>
+        <w:t>sulle</w:t>
+      </w:r>
+      <w:r>
+        <w:rPr>
+          <w:lang w:val="it-IT"/>
+        </w:rPr>
+        <w:t xml:space="preserve"> tecnologie </w:t>
+      </w:r>
+      <w:r>
+        <w:rPr>
+          <w:lang w:val="it-IT"/>
+        </w:rPr>
+        <w:t xml:space="preserve">da utilizzare </w:t>
+      </w:r>
+      <w:r>
+        <w:rPr>
+          <w:lang w:val="it-IT"/>
+        </w:rPr>
+        <w:t>per non perdere troppo tempo negli sprint</w:t>
       </w:r>
       <w:r>
         <w:rPr>
@@ -7264,11 +7328,848 @@
         </w:rPr>
         <w:t>.</w:t>
       </w:r>
-      <w:r>
-        <w:rPr>
-          <w:lang w:val="it-IT"/>
-        </w:rPr>
-        <w:t xml:space="preserve"> scrum), dovranno apparire in questo capitolo.</w:t>
+    </w:p>
+    <w:p>
+      <w:pPr>
+        <w:keepNext/>
+        <w:spacing w:before="240"/>
+        <w:jc w:val="center"/>
+      </w:pPr>
+      <w:r>
+        <w:rPr>
+          <w:lang w:val="it-IT"/>
+        </w:rPr>
+        <w:drawing>
+          <wp:inline distT="0" distB="0" distL="0" distR="0" wp14:anchorId="56015641" wp14:editId="217CCDD7">
+            <wp:extent cx="5878286" cy="2758001"/>
+            <wp:effectExtent l="114300" t="95250" r="122555" b="99695"/>
+            <wp:docPr id="1" name="Immagine 1"/>
+            <wp:cNvGraphicFramePr>
+              <a:graphicFrameLocks xmlns:a="http://schemas.openxmlformats.org/drawingml/2006/main" noChangeAspect="1"/>
+            </wp:cNvGraphicFramePr>
+            <a:graphic xmlns:a="http://schemas.openxmlformats.org/drawingml/2006/main">
+              <a:graphicData uri="http://schemas.openxmlformats.org/drawingml/2006/picture">
+                <pic:pic xmlns:pic="http://schemas.openxmlformats.org/drawingml/2006/picture">
+                  <pic:nvPicPr>
+                    <pic:cNvPr id="1" name=""/>
+                    <pic:cNvPicPr/>
+                  </pic:nvPicPr>
+                  <pic:blipFill>
+                    <a:blip r:embed="rId8"/>
+                    <a:stretch>
+                      <a:fillRect/>
+                    </a:stretch>
+                  </pic:blipFill>
+                  <pic:spPr>
+                    <a:xfrm>
+                      <a:off x="0" y="0"/>
+                      <a:ext cx="5887871" cy="2762498"/>
+                    </a:xfrm>
+                    <a:prstGeom prst="rect">
+                      <a:avLst/>
+                    </a:prstGeom>
+                    <a:effectLst>
+                      <a:outerShdw blurRad="63500" sx="102000" sy="102000" algn="ctr" rotWithShape="0">
+                        <a:prstClr val="black">
+                          <a:alpha val="40000"/>
+                        </a:prstClr>
+                      </a:outerShdw>
+                    </a:effectLst>
+                  </pic:spPr>
+                </pic:pic>
+              </a:graphicData>
+            </a:graphic>
+          </wp:inline>
+        </w:drawing>
+      </w:r>
+    </w:p>
+    <w:p>
+      <w:pPr>
+        <w:pStyle w:val="Didascalia"/>
+        <w:jc w:val="center"/>
+        <w:rPr>
+          <w:i/>
+          <w:iCs/>
+        </w:rPr>
+      </w:pPr>
+      <w:r>
+        <w:rPr>
+          <w:i/>
+          <w:iCs/>
+        </w:rPr>
+        <w:t xml:space="preserve">Figura </w:t>
+      </w:r>
+      <w:r>
+        <w:rPr>
+          <w:i/>
+          <w:iCs/>
+        </w:rPr>
+        <w:fldChar w:fldCharType="begin"/>
+      </w:r>
+      <w:r>
+        <w:rPr>
+          <w:i/>
+          <w:iCs/>
+        </w:rPr>
+        <w:instrText xml:space="preserve"> SEQ Figura \* ARABIC </w:instrText>
+      </w:r>
+      <w:r>
+        <w:rPr>
+          <w:i/>
+          <w:iCs/>
+        </w:rPr>
+        <w:fldChar w:fldCharType="separate"/>
+      </w:r>
+      <w:r>
+        <w:rPr>
+          <w:i/>
+          <w:iCs/>
+          <w:noProof/>
+        </w:rPr>
+        <w:t>1</w:t>
+      </w:r>
+      <w:r>
+        <w:rPr>
+          <w:i/>
+          <w:iCs/>
+        </w:rPr>
+        <w:fldChar w:fldCharType="end"/>
+      </w:r>
+      <w:r>
+        <w:rPr>
+          <w:i/>
+          <w:iCs/>
+        </w:rPr>
+        <w:t xml:space="preserve"> - </w:t>
+      </w:r>
+      <w:proofErr w:type="spellStart"/>
+      <w:r>
+        <w:rPr>
+          <w:i/>
+          <w:iCs/>
+        </w:rPr>
+        <w:t>Gantt</w:t>
+      </w:r>
+      <w:proofErr w:type="spellEnd"/>
+      <w:r>
+        <w:rPr>
+          <w:i/>
+          <w:iCs/>
+        </w:rPr>
+        <w:t xml:space="preserve"> fase preliminare</w:t>
+      </w:r>
+    </w:p>
+    <w:p>
+      <w:pPr>
+        <w:rPr>
+          <w:lang w:val="it-IT"/>
+        </w:rPr>
+      </w:pPr>
+      <w:r>
+        <w:rPr>
+          <w:lang w:val="it-IT"/>
+        </w:rPr>
+        <w:br w:type="page"/>
+      </w:r>
+    </w:p>
+    <w:p>
+      <w:pPr>
+        <w:pStyle w:val="Titolo3"/>
+      </w:pPr>
+      <w:r>
+        <w:lastRenderedPageBreak/>
+        <w:t>Sprint 1 – Riconoscimento oggetti</w:t>
+      </w:r>
+    </w:p>
+    <w:p>
+      <w:pPr>
+        <w:rPr>
+          <w:lang w:val="it-IT"/>
+        </w:rPr>
+      </w:pPr>
+      <w:r>
+        <w:rPr>
+          <w:lang w:val="it-IT"/>
+        </w:rPr>
+        <w:t xml:space="preserve">Lo sprint 1 ha come obbiettivo quello di insegnare </w:t>
+      </w:r>
+      <w:r>
+        <w:rPr>
+          <w:lang w:val="it-IT"/>
+        </w:rPr>
+        <w:t>e allenare</w:t>
+      </w:r>
+      <w:r>
+        <w:rPr>
+          <w:lang w:val="it-IT"/>
+        </w:rPr>
+        <w:t xml:space="preserve"> un modello AI </w:t>
+      </w:r>
+      <w:r>
+        <w:rPr>
+          <w:lang w:val="it-IT"/>
+        </w:rPr>
+        <w:t xml:space="preserve">a riconoscere </w:t>
+      </w:r>
+      <w:r>
+        <w:rPr>
+          <w:lang w:val="it-IT"/>
+        </w:rPr>
+        <w:t>20-50 oggetti</w:t>
+      </w:r>
+      <w:r>
+        <w:rPr>
+          <w:lang w:val="it-IT"/>
+        </w:rPr>
+        <w:t>. Le mie aspettative alla fine dello sprint sono di avere un modello AI allenato che mi permetta di avere un livello di accuratezza sufficientemente elevata.</w:t>
+      </w:r>
+    </w:p>
+    <w:p>
+      <w:pPr>
+        <w:keepNext/>
+        <w:spacing w:before="240"/>
+        <w:jc w:val="center"/>
+      </w:pPr>
+      <w:r>
+        <w:rPr>
+          <w:lang w:val="it-IT"/>
+        </w:rPr>
+        <w:drawing>
+          <wp:inline distT="0" distB="0" distL="0" distR="0" wp14:anchorId="502ABA9E" wp14:editId="3FBFF663">
+            <wp:extent cx="5872348" cy="2016754"/>
+            <wp:effectExtent l="114300" t="95250" r="109855" b="98425"/>
+            <wp:docPr id="4" name="Immagine 4"/>
+            <wp:cNvGraphicFramePr>
+              <a:graphicFrameLocks xmlns:a="http://schemas.openxmlformats.org/drawingml/2006/main" noChangeAspect="1"/>
+            </wp:cNvGraphicFramePr>
+            <a:graphic xmlns:a="http://schemas.openxmlformats.org/drawingml/2006/main">
+              <a:graphicData uri="http://schemas.openxmlformats.org/drawingml/2006/picture">
+                <pic:pic xmlns:pic="http://schemas.openxmlformats.org/drawingml/2006/picture">
+                  <pic:nvPicPr>
+                    <pic:cNvPr id="1" name=""/>
+                    <pic:cNvPicPr/>
+                  </pic:nvPicPr>
+                  <pic:blipFill>
+                    <a:blip r:embed="rId9"/>
+                    <a:stretch>
+                      <a:fillRect/>
+                    </a:stretch>
+                  </pic:blipFill>
+                  <pic:spPr>
+                    <a:xfrm>
+                      <a:off x="0" y="0"/>
+                      <a:ext cx="5880731" cy="2019633"/>
+                    </a:xfrm>
+                    <a:prstGeom prst="rect">
+                      <a:avLst/>
+                    </a:prstGeom>
+                    <a:effectLst>
+                      <a:outerShdw blurRad="63500" sx="102000" sy="102000" algn="ctr" rotWithShape="0">
+                        <a:prstClr val="black">
+                          <a:alpha val="40000"/>
+                        </a:prstClr>
+                      </a:outerShdw>
+                    </a:effectLst>
+                  </pic:spPr>
+                </pic:pic>
+              </a:graphicData>
+            </a:graphic>
+          </wp:inline>
+        </w:drawing>
+      </w:r>
+    </w:p>
+    <w:p>
+      <w:pPr>
+        <w:pStyle w:val="Didascalia"/>
+        <w:jc w:val="center"/>
+        <w:rPr>
+          <w:i/>
+          <w:iCs/>
+        </w:rPr>
+      </w:pPr>
+      <w:r>
+        <w:rPr>
+          <w:i/>
+          <w:iCs/>
+        </w:rPr>
+        <w:t xml:space="preserve">Figura </w:t>
+      </w:r>
+      <w:r>
+        <w:rPr>
+          <w:i/>
+          <w:iCs/>
+        </w:rPr>
+        <w:fldChar w:fldCharType="begin"/>
+      </w:r>
+      <w:r>
+        <w:rPr>
+          <w:i/>
+          <w:iCs/>
+        </w:rPr>
+        <w:instrText xml:space="preserve"> SEQ Figura \* ARABIC </w:instrText>
+      </w:r>
+      <w:r>
+        <w:rPr>
+          <w:i/>
+          <w:iCs/>
+        </w:rPr>
+        <w:fldChar w:fldCharType="separate"/>
+      </w:r>
+      <w:r>
+        <w:rPr>
+          <w:i/>
+          <w:iCs/>
+          <w:noProof/>
+        </w:rPr>
+        <w:t>2</w:t>
+      </w:r>
+      <w:r>
+        <w:rPr>
+          <w:i/>
+          <w:iCs/>
+        </w:rPr>
+        <w:fldChar w:fldCharType="end"/>
+      </w:r>
+      <w:r>
+        <w:rPr>
+          <w:i/>
+          <w:iCs/>
+        </w:rPr>
+        <w:t xml:space="preserve"> </w:t>
+      </w:r>
+      <w:r>
+        <w:rPr>
+          <w:i/>
+          <w:iCs/>
+        </w:rPr>
+        <w:t>–</w:t>
+      </w:r>
+      <w:r>
+        <w:rPr>
+          <w:i/>
+          <w:iCs/>
+        </w:rPr>
+        <w:t xml:space="preserve"> </w:t>
+      </w:r>
+      <w:proofErr w:type="spellStart"/>
+      <w:r>
+        <w:rPr>
+          <w:i/>
+          <w:iCs/>
+        </w:rPr>
+        <w:t>Gantt</w:t>
+      </w:r>
+      <w:proofErr w:type="spellEnd"/>
+      <w:r>
+        <w:rPr>
+          <w:i/>
+          <w:iCs/>
+        </w:rPr>
+        <w:t xml:space="preserve"> </w:t>
+      </w:r>
+      <w:r>
+        <w:rPr>
+          <w:i/>
+          <w:iCs/>
+        </w:rPr>
+        <w:t>Sprint 1</w:t>
+      </w:r>
+      <w:r>
+        <w:rPr>
+          <w:i/>
+          <w:iCs/>
+        </w:rPr>
+        <w:t>,</w:t>
+      </w:r>
+      <w:r>
+        <w:rPr>
+          <w:i/>
+          <w:iCs/>
+        </w:rPr>
+        <w:t xml:space="preserve"> riconoscimento oggetti</w:t>
+      </w:r>
+    </w:p>
+    <w:p>
+      <w:pPr>
+        <w:pStyle w:val="Titolo3"/>
+      </w:pPr>
+      <w:r>
+        <w:t>Sprint 2 – Applicazione mobile</w:t>
+      </w:r>
+    </w:p>
+    <w:p>
+      <w:pPr>
+        <w:rPr>
+          <w:lang w:val="it-IT"/>
+        </w:rPr>
+      </w:pPr>
+      <w:r>
+        <w:rPr>
+          <w:lang w:val="it-IT"/>
+        </w:rPr>
+        <w:t>Lo sprint 2 ha l’obbiettivo di sviluppare un’applicazione mobile con lo scopo di fornire all’utente uno strumento per riconoscere gli oggetti e mostrare i dettagli dell’oggetto. Le mie aspettative alla fine dello sprint 2 sono di avere un’applicazione ben strutturata, semplice e intuitiva all’utente.</w:t>
+      </w:r>
+    </w:p>
+    <w:p>
+      <w:pPr>
+        <w:keepNext/>
+        <w:spacing w:before="240"/>
+        <w:jc w:val="center"/>
+      </w:pPr>
+      <w:r>
+        <w:rPr>
+          <w:lang w:val="it-IT"/>
+        </w:rPr>
+        <w:drawing>
+          <wp:inline distT="0" distB="0" distL="0" distR="0" wp14:anchorId="73F4195B" wp14:editId="1B8D7574">
+            <wp:extent cx="5804246" cy="2832265"/>
+            <wp:effectExtent l="133350" t="95250" r="139700" b="101600"/>
+            <wp:docPr id="5" name="Immagine 5"/>
+            <wp:cNvGraphicFramePr>
+              <a:graphicFrameLocks xmlns:a="http://schemas.openxmlformats.org/drawingml/2006/main" noChangeAspect="1"/>
+            </wp:cNvGraphicFramePr>
+            <a:graphic xmlns:a="http://schemas.openxmlformats.org/drawingml/2006/main">
+              <a:graphicData uri="http://schemas.openxmlformats.org/drawingml/2006/picture">
+                <pic:pic xmlns:pic="http://schemas.openxmlformats.org/drawingml/2006/picture">
+                  <pic:nvPicPr>
+                    <pic:cNvPr id="1" name=""/>
+                    <pic:cNvPicPr/>
+                  </pic:nvPicPr>
+                  <pic:blipFill>
+                    <a:blip r:embed="rId10"/>
+                    <a:stretch>
+                      <a:fillRect/>
+                    </a:stretch>
+                  </pic:blipFill>
+                  <pic:spPr>
+                    <a:xfrm>
+                      <a:off x="0" y="0"/>
+                      <a:ext cx="5810643" cy="2835387"/>
+                    </a:xfrm>
+                    <a:prstGeom prst="rect">
+                      <a:avLst/>
+                    </a:prstGeom>
+                    <a:effectLst>
+                      <a:outerShdw blurRad="63500" sx="102000" sy="102000" algn="ctr" rotWithShape="0">
+                        <a:prstClr val="black">
+                          <a:alpha val="40000"/>
+                        </a:prstClr>
+                      </a:outerShdw>
+                    </a:effectLst>
+                  </pic:spPr>
+                </pic:pic>
+              </a:graphicData>
+            </a:graphic>
+          </wp:inline>
+        </w:drawing>
+      </w:r>
+    </w:p>
+    <w:p>
+      <w:pPr>
+        <w:pStyle w:val="Didascalia"/>
+        <w:jc w:val="center"/>
+        <w:rPr>
+          <w:i/>
+          <w:iCs/>
+        </w:rPr>
+      </w:pPr>
+      <w:r>
+        <w:rPr>
+          <w:i/>
+          <w:iCs/>
+        </w:rPr>
+        <w:t xml:space="preserve">Figura </w:t>
+      </w:r>
+      <w:r>
+        <w:rPr>
+          <w:i/>
+          <w:iCs/>
+        </w:rPr>
+        <w:fldChar w:fldCharType="begin"/>
+      </w:r>
+      <w:r>
+        <w:rPr>
+          <w:i/>
+          <w:iCs/>
+        </w:rPr>
+        <w:instrText xml:space="preserve"> SEQ Figura \* ARABIC </w:instrText>
+      </w:r>
+      <w:r>
+        <w:rPr>
+          <w:i/>
+          <w:iCs/>
+        </w:rPr>
+        <w:fldChar w:fldCharType="separate"/>
+      </w:r>
+      <w:r>
+        <w:rPr>
+          <w:i/>
+          <w:iCs/>
+          <w:noProof/>
+        </w:rPr>
+        <w:t>3</w:t>
+      </w:r>
+      <w:r>
+        <w:rPr>
+          <w:i/>
+          <w:iCs/>
+        </w:rPr>
+        <w:fldChar w:fldCharType="end"/>
+      </w:r>
+      <w:r>
+        <w:rPr>
+          <w:i/>
+          <w:iCs/>
+        </w:rPr>
+        <w:t xml:space="preserve"> - </w:t>
+      </w:r>
+      <w:proofErr w:type="spellStart"/>
+      <w:r>
+        <w:rPr>
+          <w:i/>
+          <w:iCs/>
+        </w:rPr>
+        <w:t>Gantt</w:t>
+      </w:r>
+      <w:proofErr w:type="spellEnd"/>
+      <w:r>
+        <w:rPr>
+          <w:i/>
+          <w:iCs/>
+        </w:rPr>
+        <w:t xml:space="preserve"> Sprint 2, applicazione mobile</w:t>
+      </w:r>
+    </w:p>
+    <w:p>
+      <w:pPr>
+        <w:rPr>
+          <w:lang w:val="it-IT"/>
+        </w:rPr>
+      </w:pPr>
+      <w:r>
+        <w:rPr>
+          <w:lang w:val="it-IT"/>
+        </w:rPr>
+        <w:br w:type="page"/>
+      </w:r>
+    </w:p>
+    <w:p>
+      <w:pPr>
+        <w:pStyle w:val="Titolo3"/>
+      </w:pPr>
+      <w:r>
+        <w:lastRenderedPageBreak/>
+        <w:t>Sprint 3 – Web dashboard</w:t>
+      </w:r>
+    </w:p>
+    <w:p>
+      <w:pPr>
+        <w:rPr>
+          <w:lang w:val="it-IT"/>
+        </w:rPr>
+      </w:pPr>
+      <w:r>
+        <w:rPr>
+          <w:lang w:val="it-IT"/>
+        </w:rPr>
+        <w:t>Lo sprint 3 ha l’obbiettivo di sviluppare una web dashboard per la gestione del magazzino da parte degli amministratori del sistema. Le mie aspettative alla fine dello sprint 3 sono di avere un applicativo web facile e intuitivo per permettere agli amministratori del sistema di essere più efficienti rispetto a un sistema di gestione basato su fogli Excel o simili.</w:t>
+      </w:r>
+    </w:p>
+    <w:p>
+      <w:pPr>
+        <w:keepNext/>
+        <w:spacing w:before="240"/>
+        <w:jc w:val="center"/>
+      </w:pPr>
+      <w:r>
+        <w:rPr>
+          <w:lang w:val="it-IT"/>
+        </w:rPr>
+        <w:drawing>
+          <wp:inline distT="0" distB="0" distL="0" distR="0" wp14:anchorId="5DBC967A" wp14:editId="357ED277">
+            <wp:extent cx="5937662" cy="2312103"/>
+            <wp:effectExtent l="114300" t="95250" r="120650" b="88265"/>
+            <wp:docPr id="6" name="Immagine 6"/>
+            <wp:cNvGraphicFramePr>
+              <a:graphicFrameLocks xmlns:a="http://schemas.openxmlformats.org/drawingml/2006/main" noChangeAspect="1"/>
+            </wp:cNvGraphicFramePr>
+            <a:graphic xmlns:a="http://schemas.openxmlformats.org/drawingml/2006/main">
+              <a:graphicData uri="http://schemas.openxmlformats.org/drawingml/2006/picture">
+                <pic:pic xmlns:pic="http://schemas.openxmlformats.org/drawingml/2006/picture">
+                  <pic:nvPicPr>
+                    <pic:cNvPr id="1" name=""/>
+                    <pic:cNvPicPr/>
+                  </pic:nvPicPr>
+                  <pic:blipFill>
+                    <a:blip r:embed="rId11"/>
+                    <a:stretch>
+                      <a:fillRect/>
+                    </a:stretch>
+                  </pic:blipFill>
+                  <pic:spPr>
+                    <a:xfrm>
+                      <a:off x="0" y="0"/>
+                      <a:ext cx="5949715" cy="2316796"/>
+                    </a:xfrm>
+                    <a:prstGeom prst="rect">
+                      <a:avLst/>
+                    </a:prstGeom>
+                    <a:effectLst>
+                      <a:outerShdw blurRad="63500" sx="102000" sy="102000" algn="ctr" rotWithShape="0">
+                        <a:prstClr val="black">
+                          <a:alpha val="40000"/>
+                        </a:prstClr>
+                      </a:outerShdw>
+                    </a:effectLst>
+                  </pic:spPr>
+                </pic:pic>
+              </a:graphicData>
+            </a:graphic>
+          </wp:inline>
+        </w:drawing>
+      </w:r>
+    </w:p>
+    <w:p>
+      <w:pPr>
+        <w:pStyle w:val="Didascalia"/>
+        <w:jc w:val="center"/>
+        <w:rPr>
+          <w:i/>
+          <w:iCs/>
+          <w:lang w:val="de-CH"/>
+        </w:rPr>
+      </w:pPr>
+      <w:r>
+        <w:rPr>
+          <w:i/>
+          <w:iCs/>
+          <w:lang w:val="de-CH"/>
+        </w:rPr>
+        <w:t xml:space="preserve">Figura </w:t>
+      </w:r>
+      <w:r>
+        <w:rPr>
+          <w:i/>
+          <w:iCs/>
+        </w:rPr>
+        <w:fldChar w:fldCharType="begin"/>
+      </w:r>
+      <w:r>
+        <w:rPr>
+          <w:i/>
+          <w:iCs/>
+          <w:lang w:val="de-CH"/>
+        </w:rPr>
+        <w:instrText xml:space="preserve"> SEQ Figura \* ARABIC </w:instrText>
+      </w:r>
+      <w:r>
+        <w:rPr>
+          <w:i/>
+          <w:iCs/>
+        </w:rPr>
+        <w:fldChar w:fldCharType="separate"/>
+      </w:r>
+      <w:r>
+        <w:rPr>
+          <w:i/>
+          <w:iCs/>
+          <w:noProof/>
+          <w:lang w:val="de-CH"/>
+        </w:rPr>
+        <w:t>4</w:t>
+      </w:r>
+      <w:r>
+        <w:rPr>
+          <w:i/>
+          <w:iCs/>
+        </w:rPr>
+        <w:fldChar w:fldCharType="end"/>
+      </w:r>
+      <w:r>
+        <w:rPr>
+          <w:i/>
+          <w:iCs/>
+          <w:lang w:val="de-CH"/>
+        </w:rPr>
+        <w:t xml:space="preserve"> - Gantt Sprint 3, Web </w:t>
+      </w:r>
+      <w:proofErr w:type="spellStart"/>
+      <w:r>
+        <w:rPr>
+          <w:i/>
+          <w:iCs/>
+          <w:lang w:val="de-CH"/>
+        </w:rPr>
+        <w:t>dashboard</w:t>
+      </w:r>
+      <w:proofErr w:type="spellEnd"/>
+    </w:p>
+    <w:p>
+      <w:pPr>
+        <w:pStyle w:val="Titolo3"/>
+      </w:pPr>
+      <w:r>
+        <w:t>Fase di assestamento – Documentazione e test</w:t>
+      </w:r>
+    </w:p>
+    <w:p>
+      <w:r>
+        <w:t>La fase di a</w:t>
+      </w:r>
+      <w:r>
+        <w:t xml:space="preserve">ssestamento </w:t>
+      </w:r>
+      <w:r>
+        <w:t xml:space="preserve">punta a </w:t>
+      </w:r>
+      <w:r>
+        <w:t>rifinire gli ultimi dettagli del progetto come documentazione, test finali e dettagli grafici</w:t>
+      </w:r>
+      <w:r>
+        <w:t>. Le mie aspettative alla fine di questa fase sono un prodotto strutturato bene e curato anche nei dettagli con una documentazione completa.</w:t>
+      </w:r>
+    </w:p>
+    <w:p>
+      <w:pPr>
+        <w:keepNext/>
+        <w:spacing w:before="240"/>
+        <w:jc w:val="center"/>
+      </w:pPr>
+      <w:r>
+        <w:rPr>
+          <w:lang w:val="it-IT"/>
+        </w:rPr>
+        <w:drawing>
+          <wp:inline distT="0" distB="0" distL="0" distR="0" wp14:anchorId="6836B3E6" wp14:editId="7DA853EE">
+            <wp:extent cx="5848598" cy="1708825"/>
+            <wp:effectExtent l="114300" t="95250" r="114300" b="100965"/>
+            <wp:docPr id="7" name="Immagine 7"/>
+            <wp:cNvGraphicFramePr>
+              <a:graphicFrameLocks xmlns:a="http://schemas.openxmlformats.org/drawingml/2006/main" noChangeAspect="1"/>
+            </wp:cNvGraphicFramePr>
+            <a:graphic xmlns:a="http://schemas.openxmlformats.org/drawingml/2006/main">
+              <a:graphicData uri="http://schemas.openxmlformats.org/drawingml/2006/picture">
+                <pic:pic xmlns:pic="http://schemas.openxmlformats.org/drawingml/2006/picture">
+                  <pic:nvPicPr>
+                    <pic:cNvPr id="1" name=""/>
+                    <pic:cNvPicPr/>
+                  </pic:nvPicPr>
+                  <pic:blipFill>
+                    <a:blip r:embed="rId12"/>
+                    <a:stretch>
+                      <a:fillRect/>
+                    </a:stretch>
+                  </pic:blipFill>
+                  <pic:spPr>
+                    <a:xfrm>
+                      <a:off x="0" y="0"/>
+                      <a:ext cx="5854562" cy="1710568"/>
+                    </a:xfrm>
+                    <a:prstGeom prst="rect">
+                      <a:avLst/>
+                    </a:prstGeom>
+                    <a:effectLst>
+                      <a:outerShdw blurRad="63500" sx="102000" sy="102000" algn="ctr" rotWithShape="0">
+                        <a:prstClr val="black">
+                          <a:alpha val="40000"/>
+                        </a:prstClr>
+                      </a:outerShdw>
+                    </a:effectLst>
+                  </pic:spPr>
+                </pic:pic>
+              </a:graphicData>
+            </a:graphic>
+          </wp:inline>
+        </w:drawing>
+      </w:r>
+    </w:p>
+    <w:p>
+      <w:pPr>
+        <w:pStyle w:val="Didascalia"/>
+        <w:jc w:val="center"/>
+        <w:rPr>
+          <w:i/>
+          <w:iCs/>
+        </w:rPr>
+      </w:pPr>
+      <w:r>
+        <w:rPr>
+          <w:i/>
+          <w:iCs/>
+        </w:rPr>
+        <w:t xml:space="preserve">Figura </w:t>
+      </w:r>
+      <w:r>
+        <w:rPr>
+          <w:i/>
+          <w:iCs/>
+        </w:rPr>
+        <w:fldChar w:fldCharType="begin"/>
+      </w:r>
+      <w:r>
+        <w:rPr>
+          <w:i/>
+          <w:iCs/>
+        </w:rPr>
+        <w:instrText xml:space="preserve"> SEQ Figura \* ARABIC </w:instrText>
+      </w:r>
+      <w:r>
+        <w:rPr>
+          <w:i/>
+          <w:iCs/>
+        </w:rPr>
+        <w:fldChar w:fldCharType="separate"/>
+      </w:r>
+      <w:r>
+        <w:rPr>
+          <w:i/>
+          <w:iCs/>
+          <w:noProof/>
+        </w:rPr>
+        <w:t>5</w:t>
+      </w:r>
+      <w:r>
+        <w:rPr>
+          <w:i/>
+          <w:iCs/>
+        </w:rPr>
+        <w:fldChar w:fldCharType="end"/>
+      </w:r>
+      <w:r>
+        <w:rPr>
+          <w:i/>
+          <w:iCs/>
+        </w:rPr>
+        <w:t xml:space="preserve"> - </w:t>
+      </w:r>
+      <w:proofErr w:type="spellStart"/>
+      <w:r>
+        <w:rPr>
+          <w:i/>
+          <w:iCs/>
+        </w:rPr>
+        <w:t>Gantt</w:t>
+      </w:r>
+      <w:proofErr w:type="spellEnd"/>
+      <w:r>
+        <w:rPr>
+          <w:i/>
+          <w:iCs/>
+        </w:rPr>
+        <w:t xml:space="preserve"> Fase di assestamento, Documentazione e test</w:t>
+      </w:r>
+    </w:p>
+    <w:p>
+      <w:pPr>
+        <w:rPr>
+          <w:lang w:val="it-IT"/>
+        </w:rPr>
+      </w:pPr>
+      <w:r>
+        <w:rPr>
+          <w:lang w:val="it-IT"/>
+        </w:rPr>
+        <w:br w:type="page"/>
       </w:r>
     </w:p>
     <w:p>
@@ -7277,46 +8178,10 @@
       </w:pPr>
       <w:bookmarkStart w:id="8" w:name="_Toc94790451"/>
       <w:r>
+        <w:lastRenderedPageBreak/>
         <w:t>Analisi dei mezzi</w:t>
       </w:r>
       <w:bookmarkEnd w:id="8"/>
-    </w:p>
-    <w:p>
-      <w:pPr>
-        <w:rPr>
-          <w:lang w:val="it-IT"/>
-        </w:rPr>
-      </w:pPr>
-      <w:r>
-        <w:rPr>
-          <w:lang w:val="it-IT"/>
-        </w:rPr>
-        <w:t xml:space="preserve">Elencare e </w:t>
-      </w:r>
-      <w:r>
-        <w:rPr>
-          <w:lang w:val="it-IT"/>
-        </w:rPr>
-        <w:t>descrivere</w:t>
-      </w:r>
-      <w:r>
-        <w:rPr>
-          <w:lang w:val="it-IT"/>
-        </w:rPr>
-        <w:t xml:space="preserve"> i </w:t>
-      </w:r>
-      <w:r>
-        <w:rPr>
-          <w:lang w:val="it-IT"/>
-        </w:rPr>
-        <w:t>mezzi disponibili pe</w:t>
-      </w:r>
-      <w:r>
-        <w:rPr>
-          <w:lang w:val="it-IT"/>
-        </w:rPr>
-        <w:t>r la realizzazione del progetto. Ricordarsi di sempre descrivere nel dettaglio le versioni e il modello di riferimento.</w:t>
-      </w:r>
     </w:p>
     <w:p>
       <w:pPr>
@@ -7332,33 +8197,417 @@
     </w:p>
     <w:p>
       <w:pPr>
-        <w:rPr>
-          <w:lang w:val="it-IT"/>
-        </w:rPr>
-      </w:pPr>
-      <w:r>
-        <w:rPr>
-          <w:lang w:val="it-IT"/>
-        </w:rPr>
-        <w:t>SDK, librerie, tools utilizzati pe</w:t>
-      </w:r>
-      <w:r>
-        <w:rPr>
-          <w:lang w:val="it-IT"/>
-        </w:rPr>
-        <w:t>r la realizzazione del progetto</w:t>
-      </w:r>
-      <w:r>
-        <w:rPr>
-          <w:lang w:val="it-IT"/>
-        </w:rPr>
-        <w:t xml:space="preserve"> e eventuali dipendenze</w:t>
-      </w:r>
-      <w:r>
-        <w:rPr>
-          <w:lang w:val="it-IT"/>
-        </w:rPr>
-        <w:t>.</w:t>
+        <w:spacing w:after="240"/>
+        <w:rPr>
+          <w:b/>
+          <w:bCs/>
+          <w:lang w:val="it-IT"/>
+        </w:rPr>
+      </w:pPr>
+      <w:r>
+        <w:rPr>
+          <w:b/>
+          <w:bCs/>
+          <w:lang w:val="it-IT"/>
+        </w:rPr>
+        <w:t>Sviluppo e Training AI:</w:t>
+      </w:r>
+    </w:p>
+    <w:p>
+      <w:pPr>
+        <w:pStyle w:val="Paragrafoelenco"/>
+        <w:numPr>
+          <w:ilvl w:val="0"/>
+          <w:numId w:val="28"/>
+        </w:numPr>
+        <w:rPr>
+          <w:lang w:val="it-IT"/>
+        </w:rPr>
+      </w:pPr>
+      <w:r>
+        <w:rPr>
+          <w:lang w:val="it-IT"/>
+        </w:rPr>
+        <w:t>Visual Studio Code v1.</w:t>
+      </w:r>
+      <w:r>
+        <w:rPr>
+          <w:lang w:val="it-IT"/>
+        </w:rPr>
+        <w:t>10</w:t>
+      </w:r>
+      <w:r>
+        <w:rPr>
+          <w:lang w:val="it-IT"/>
+        </w:rPr>
+        <w:t>8.</w:t>
+      </w:r>
+      <w:r>
+        <w:rPr>
+          <w:lang w:val="it-IT"/>
+        </w:rPr>
+        <w:t>1</w:t>
+      </w:r>
+      <w:r>
+        <w:rPr>
+          <w:lang w:val="it-IT"/>
+        </w:rPr>
+        <w:t xml:space="preserve"> (Editor principale)</w:t>
+      </w:r>
+    </w:p>
+    <w:p>
+      <w:pPr>
+        <w:pStyle w:val="Paragrafoelenco"/>
+        <w:numPr>
+          <w:ilvl w:val="0"/>
+          <w:numId w:val="28"/>
+        </w:numPr>
+        <w:rPr>
+          <w:lang w:val="fr-CH"/>
+        </w:rPr>
+      </w:pPr>
+      <w:r>
+        <w:rPr>
+          <w:lang w:val="fr-CH"/>
+        </w:rPr>
+        <w:t xml:space="preserve">Google </w:t>
+      </w:r>
+      <w:proofErr w:type="spellStart"/>
+      <w:r>
+        <w:rPr>
+          <w:lang w:val="fr-CH"/>
+        </w:rPr>
+        <w:t>Colab</w:t>
+      </w:r>
+      <w:proofErr w:type="spellEnd"/>
+      <w:r>
+        <w:rPr>
+          <w:lang w:val="fr-CH"/>
+        </w:rPr>
+        <w:t xml:space="preserve"> (Training YOLOv8/</w:t>
+      </w:r>
+      <w:proofErr w:type="spellStart"/>
+      <w:r>
+        <w:rPr>
+          <w:lang w:val="fr-CH"/>
+        </w:rPr>
+        <w:t>TensorFlow</w:t>
+      </w:r>
+      <w:proofErr w:type="spellEnd"/>
+      <w:r>
+        <w:rPr>
+          <w:lang w:val="fr-CH"/>
+        </w:rPr>
+        <w:t xml:space="preserve"> Lite)</w:t>
+      </w:r>
+    </w:p>
+    <w:p>
+      <w:pPr>
+        <w:pStyle w:val="Paragrafoelenco"/>
+        <w:numPr>
+          <w:ilvl w:val="0"/>
+          <w:numId w:val="28"/>
+        </w:numPr>
+        <w:rPr>
+          <w:lang w:val="it-IT"/>
+        </w:rPr>
+      </w:pPr>
+      <w:proofErr w:type="spellStart"/>
+      <w:r>
+        <w:rPr>
+          <w:lang w:val="it-IT"/>
+        </w:rPr>
+        <w:t>Roboflow</w:t>
+      </w:r>
+      <w:proofErr w:type="spellEnd"/>
+      <w:r>
+        <w:rPr>
+          <w:lang w:val="it-IT"/>
+        </w:rPr>
+        <w:t xml:space="preserve"> (Annotazione dataset)</w:t>
+      </w:r>
+    </w:p>
+    <w:p>
+      <w:pPr>
+        <w:pStyle w:val="Paragrafoelenco"/>
+        <w:numPr>
+          <w:ilvl w:val="0"/>
+          <w:numId w:val="28"/>
+        </w:numPr>
+        <w:rPr>
+          <w:lang w:val="it-IT"/>
+        </w:rPr>
+      </w:pPr>
+      <w:proofErr w:type="spellStart"/>
+      <w:r>
+        <w:rPr>
+          <w:lang w:val="it-IT"/>
+        </w:rPr>
+        <w:t>Git</w:t>
+      </w:r>
+      <w:proofErr w:type="spellEnd"/>
+      <w:r>
+        <w:rPr>
+          <w:lang w:val="it-IT"/>
+        </w:rPr>
+        <w:t>/GitHub (</w:t>
+      </w:r>
+      <w:proofErr w:type="spellStart"/>
+      <w:r>
+        <w:rPr>
+          <w:lang w:val="it-IT"/>
+        </w:rPr>
+        <w:t>Versionamento</w:t>
+      </w:r>
+      <w:proofErr w:type="spellEnd"/>
+      <w:r>
+        <w:rPr>
+          <w:lang w:val="it-IT"/>
+        </w:rPr>
+        <w:t xml:space="preserve"> codice)</w:t>
+      </w:r>
+    </w:p>
+    <w:p>
+      <w:pPr>
+        <w:pStyle w:val="Paragrafoelenco"/>
+        <w:numPr>
+          <w:ilvl w:val="0"/>
+          <w:numId w:val="28"/>
+        </w:numPr>
+        <w:rPr>
+          <w:lang w:val="it-IT"/>
+        </w:rPr>
+      </w:pPr>
+      <w:proofErr w:type="spellStart"/>
+      <w:r>
+        <w:rPr>
+          <w:lang w:val="it-IT"/>
+        </w:rPr>
+        <w:t>Jupyter</w:t>
+      </w:r>
+      <w:proofErr w:type="spellEnd"/>
+      <w:r>
+        <w:rPr>
+          <w:lang w:val="it-IT"/>
+        </w:rPr>
+        <w:t xml:space="preserve"> Notebook (Documentazione esperimenti ML)</w:t>
+      </w:r>
+    </w:p>
+    <w:p>
+      <w:pPr>
+        <w:spacing w:before="240"/>
+        <w:rPr>
+          <w:b/>
+          <w:bCs/>
+          <w:lang w:val="it-IT"/>
+        </w:rPr>
+      </w:pPr>
+      <w:r>
+        <w:rPr>
+          <w:b/>
+          <w:bCs/>
+          <w:lang w:val="it-IT"/>
+        </w:rPr>
+        <w:t>Sviluppo App Mobile:</w:t>
+      </w:r>
+    </w:p>
+    <w:p>
+      <w:pPr>
+        <w:pStyle w:val="Paragrafoelenco"/>
+        <w:numPr>
+          <w:ilvl w:val="0"/>
+          <w:numId w:val="29"/>
+        </w:numPr>
+        <w:spacing w:before="240"/>
+        <w:rPr>
+          <w:lang w:val="it-IT"/>
+        </w:rPr>
+      </w:pPr>
+      <w:r>
+        <w:rPr>
+          <w:lang w:val="it-IT"/>
+        </w:rPr>
+        <w:t>Expo CLI v10.1.4 / React Native v0.75.4</w:t>
+      </w:r>
+    </w:p>
+    <w:p>
+      <w:pPr>
+        <w:pStyle w:val="Paragrafoelenco"/>
+        <w:numPr>
+          <w:ilvl w:val="0"/>
+          <w:numId w:val="29"/>
+        </w:numPr>
+        <w:spacing w:before="240"/>
+        <w:rPr>
+          <w:lang w:val="it-IT"/>
+        </w:rPr>
+      </w:pPr>
+      <w:r>
+        <w:rPr>
+          <w:lang w:val="it-IT"/>
+        </w:rPr>
+        <w:t>Android Studio (Build APK)</w:t>
+      </w:r>
+    </w:p>
+    <w:p>
+      <w:pPr>
+        <w:pStyle w:val="Paragrafoelenco"/>
+        <w:numPr>
+          <w:ilvl w:val="0"/>
+          <w:numId w:val="29"/>
+        </w:numPr>
+        <w:spacing w:before="240"/>
+        <w:rPr>
+          <w:lang w:val="it-IT"/>
+        </w:rPr>
+      </w:pPr>
+      <w:proofErr w:type="spellStart"/>
+      <w:r>
+        <w:rPr>
+          <w:lang w:val="it-IT"/>
+        </w:rPr>
+        <w:t>Firebase</w:t>
+      </w:r>
+      <w:proofErr w:type="spellEnd"/>
+      <w:r>
+        <w:rPr>
+          <w:lang w:val="it-IT"/>
+        </w:rPr>
+        <w:t xml:space="preserve"> Console (</w:t>
+      </w:r>
+      <w:proofErr w:type="spellStart"/>
+      <w:r>
+        <w:rPr>
+          <w:lang w:val="it-IT"/>
+        </w:rPr>
+        <w:t>Firestore</w:t>
+      </w:r>
+      <w:proofErr w:type="spellEnd"/>
+      <w:r>
+        <w:rPr>
+          <w:lang w:val="it-IT"/>
+        </w:rPr>
+        <w:t xml:space="preserve"> + Authentication)</w:t>
+      </w:r>
+    </w:p>
+    <w:p>
+      <w:pPr>
+        <w:spacing w:before="240"/>
+        <w:rPr>
+          <w:b/>
+          <w:bCs/>
+          <w:lang w:val="it-IT"/>
+        </w:rPr>
+      </w:pPr>
+      <w:r>
+        <w:rPr>
+          <w:b/>
+          <w:bCs/>
+          <w:lang w:val="it-IT"/>
+        </w:rPr>
+        <w:t>Sviluppo Dashboard Web:</w:t>
+      </w:r>
+    </w:p>
+    <w:p>
+      <w:pPr>
+        <w:pStyle w:val="Paragrafoelenco"/>
+        <w:numPr>
+          <w:ilvl w:val="0"/>
+          <w:numId w:val="30"/>
+        </w:numPr>
+        <w:spacing w:before="240"/>
+        <w:rPr>
+          <w:lang w:val="fr-CH"/>
+        </w:rPr>
+      </w:pPr>
+      <w:r>
+        <w:rPr>
+          <w:lang w:val="fr-CH"/>
+        </w:rPr>
+        <w:t xml:space="preserve">Vite + </w:t>
+      </w:r>
+      <w:proofErr w:type="spellStart"/>
+      <w:r>
+        <w:rPr>
+          <w:lang w:val="fr-CH"/>
+        </w:rPr>
+        <w:t>React</w:t>
+      </w:r>
+      <w:proofErr w:type="spellEnd"/>
+      <w:r>
+        <w:rPr>
+          <w:lang w:val="fr-CH"/>
+        </w:rPr>
+        <w:t xml:space="preserve"> v18.3.1 + </w:t>
+      </w:r>
+      <w:proofErr w:type="spellStart"/>
+      <w:r>
+        <w:rPr>
+          <w:lang w:val="fr-CH"/>
+        </w:rPr>
+        <w:t>TailwindCSS</w:t>
+      </w:r>
+      <w:proofErr w:type="spellEnd"/>
+      <w:r>
+        <w:rPr>
+          <w:lang w:val="fr-CH"/>
+        </w:rPr>
+        <w:t xml:space="preserve"> v3.4.10</w:t>
+      </w:r>
+    </w:p>
+    <w:p>
+      <w:pPr>
+        <w:pStyle w:val="Paragrafoelenco"/>
+        <w:numPr>
+          <w:ilvl w:val="0"/>
+          <w:numId w:val="30"/>
+        </w:numPr>
+        <w:spacing w:before="240"/>
+        <w:rPr>
+          <w:lang w:val="fr-CH"/>
+        </w:rPr>
+      </w:pPr>
+      <w:proofErr w:type="spellStart"/>
+      <w:r>
+        <w:rPr>
+          <w:lang w:val="fr-CH"/>
+        </w:rPr>
+        <w:t>Firebase</w:t>
+      </w:r>
+      <w:proofErr w:type="spellEnd"/>
+      <w:r>
+        <w:rPr>
+          <w:lang w:val="fr-CH"/>
+        </w:rPr>
+        <w:t xml:space="preserve"> </w:t>
+      </w:r>
+      <w:proofErr w:type="spellStart"/>
+      <w:r>
+        <w:rPr>
+          <w:lang w:val="fr-CH"/>
+        </w:rPr>
+        <w:t>Hosting</w:t>
+      </w:r>
+      <w:proofErr w:type="spellEnd"/>
+      <w:r>
+        <w:rPr>
+          <w:lang w:val="fr-CH"/>
+        </w:rPr>
+        <w:t xml:space="preserve"> (</w:t>
+      </w:r>
+      <w:proofErr w:type="spellStart"/>
+      <w:r>
+        <w:rPr>
+          <w:lang w:val="fr-CH"/>
+        </w:rPr>
+        <w:t>Deploy</w:t>
+      </w:r>
+      <w:proofErr w:type="spellEnd"/>
+      <w:r>
+        <w:rPr>
+          <w:lang w:val="fr-CH"/>
+        </w:rPr>
+        <w:t xml:space="preserve"> production)</w:t>
       </w:r>
     </w:p>
     <w:p>
@@ -7376,33 +8625,249 @@
     <w:p>
       <w:pPr>
         <w:rPr>
-          <w:lang w:val="it-IT"/>
-        </w:rPr>
-      </w:pPr>
-    </w:p>
-    <w:p>
-      <w:pPr>
-        <w:rPr>
-          <w:lang w:val="it-IT"/>
-        </w:rPr>
-      </w:pPr>
-      <w:r>
-        <w:rPr>
-          <w:lang w:val="it-IT"/>
-        </w:rPr>
-        <w:t xml:space="preserve">Su quale piattaforma dovrà essere eseguito il prodotto? Che hardware particolare è coinvolto nel progetto? Che particolarità e limitazioni presenta? Che </w:t>
-      </w:r>
-      <w:r>
-        <w:rPr>
-          <w:lang w:val="it-IT"/>
-        </w:rPr>
-        <w:t>HW</w:t>
-      </w:r>
-      <w:r>
-        <w:rPr>
-          <w:lang w:val="it-IT"/>
-        </w:rPr>
-        <w:t xml:space="preserve"> sarà disponibile durante lo sviluppo?</w:t>
+          <w:b/>
+          <w:bCs/>
+          <w:lang w:val="it-IT"/>
+        </w:rPr>
+      </w:pPr>
+      <w:r>
+        <w:rPr>
+          <w:b/>
+          <w:bCs/>
+          <w:lang w:val="it-IT"/>
+        </w:rPr>
+        <w:t>Workstation Principale</w:t>
+      </w:r>
+      <w:r>
+        <w:rPr>
+          <w:b/>
+          <w:bCs/>
+          <w:lang w:val="it-IT"/>
+        </w:rPr>
+        <w:t>:</w:t>
+      </w:r>
+    </w:p>
+    <w:p>
+      <w:pPr>
+        <w:pStyle w:val="Paragrafoelenco"/>
+        <w:numPr>
+          <w:ilvl w:val="0"/>
+          <w:numId w:val="31"/>
+        </w:numPr>
+        <w:spacing w:before="240" w:after="240"/>
+        <w:rPr>
+          <w:lang w:val="it-IT"/>
+        </w:rPr>
+      </w:pPr>
+      <w:r>
+        <w:rPr>
+          <w:lang w:val="it-IT"/>
+        </w:rPr>
+        <w:t xml:space="preserve">CPU: Intel(R) </w:t>
+      </w:r>
+      <w:proofErr w:type="gramStart"/>
+      <w:r>
+        <w:rPr>
+          <w:lang w:val="it-IT"/>
+        </w:rPr>
+        <w:t>Core(</w:t>
+      </w:r>
+      <w:proofErr w:type="gramEnd"/>
+      <w:r>
+        <w:rPr>
+          <w:lang w:val="it-IT"/>
+        </w:rPr>
+        <w:t>TM) i7-9700 CPU @ 3.00GHz</w:t>
+      </w:r>
+    </w:p>
+    <w:p>
+      <w:pPr>
+        <w:pStyle w:val="Paragrafoelenco"/>
+        <w:numPr>
+          <w:ilvl w:val="0"/>
+          <w:numId w:val="31"/>
+        </w:numPr>
+        <w:spacing w:before="240" w:after="240"/>
+        <w:rPr>
+          <w:lang w:val="it-IT"/>
+        </w:rPr>
+      </w:pPr>
+      <w:r>
+        <w:rPr>
+          <w:lang w:val="it-IT"/>
+        </w:rPr>
+        <w:t>RAM: 32.0 GB Disco: 500GB</w:t>
+      </w:r>
+    </w:p>
+    <w:p>
+      <w:pPr>
+        <w:pStyle w:val="Paragrafoelenco"/>
+        <w:numPr>
+          <w:ilvl w:val="0"/>
+          <w:numId w:val="31"/>
+        </w:numPr>
+        <w:spacing w:before="240" w:after="240"/>
+        <w:rPr>
+          <w:lang w:val="it-IT"/>
+        </w:rPr>
+      </w:pPr>
+      <w:r>
+        <w:rPr>
+          <w:lang w:val="it-IT"/>
+        </w:rPr>
+        <w:t xml:space="preserve">GPU: NVIDIA </w:t>
+      </w:r>
+      <w:proofErr w:type="spellStart"/>
+      <w:r>
+        <w:rPr>
+          <w:lang w:val="it-IT"/>
+        </w:rPr>
+        <w:t>GeForce</w:t>
+      </w:r>
+      <w:proofErr w:type="spellEnd"/>
+      <w:r>
+        <w:rPr>
+          <w:lang w:val="it-IT"/>
+        </w:rPr>
+        <w:t xml:space="preserve"> RTX 2060</w:t>
+      </w:r>
+    </w:p>
+    <w:p>
+      <w:pPr>
+        <w:rPr>
+          <w:b/>
+          <w:bCs/>
+          <w:lang w:val="fr-CH"/>
+        </w:rPr>
+      </w:pPr>
+      <w:proofErr w:type="spellStart"/>
+      <w:r>
+        <w:rPr>
+          <w:b/>
+          <w:bCs/>
+          <w:lang w:val="fr-CH"/>
+        </w:rPr>
+        <w:t>Dispositivi</w:t>
+      </w:r>
+      <w:proofErr w:type="spellEnd"/>
+      <w:r>
+        <w:rPr>
+          <w:b/>
+          <w:bCs/>
+          <w:lang w:val="fr-CH"/>
+        </w:rPr>
+        <w:t xml:space="preserve"> Mobile </w:t>
+      </w:r>
+      <w:proofErr w:type="gramStart"/>
+      <w:r>
+        <w:rPr>
+          <w:b/>
+          <w:bCs/>
+          <w:lang w:val="fr-CH"/>
+        </w:rPr>
+        <w:t>Test</w:t>
+      </w:r>
+      <w:r>
+        <w:rPr>
+          <w:b/>
+          <w:bCs/>
+          <w:lang w:val="fr-CH"/>
+        </w:rPr>
+        <w:t>:</w:t>
+      </w:r>
+      <w:proofErr w:type="gramEnd"/>
+    </w:p>
+    <w:p>
+      <w:pPr>
+        <w:spacing w:before="240"/>
+        <w:rPr>
+          <w:lang w:val="fr-CH"/>
+        </w:rPr>
+      </w:pPr>
+      <w:r>
+        <w:rPr>
+          <w:lang w:val="fr-CH"/>
+        </w:rPr>
+        <w:t>Samsung Galaxy Tab A8 (10.5")</w:t>
+      </w:r>
+    </w:p>
+    <w:p>
+      <w:pPr>
+        <w:spacing w:before="240"/>
+        <w:rPr>
+          <w:b/>
+          <w:bCs/>
+          <w:lang w:val="fr-CH"/>
+        </w:rPr>
+      </w:pPr>
+      <w:r>
+        <w:rPr>
+          <w:b/>
+          <w:bCs/>
+          <w:lang w:val="fr-CH"/>
+        </w:rPr>
+        <w:t xml:space="preserve">VR </w:t>
+      </w:r>
+      <w:proofErr w:type="spellStart"/>
+      <w:proofErr w:type="gramStart"/>
+      <w:r>
+        <w:rPr>
+          <w:b/>
+          <w:bCs/>
+          <w:lang w:val="fr-CH"/>
+        </w:rPr>
+        <w:t>Development</w:t>
+      </w:r>
+      <w:proofErr w:type="spellEnd"/>
+      <w:r>
+        <w:rPr>
+          <w:b/>
+          <w:bCs/>
+          <w:lang w:val="fr-CH"/>
+        </w:rPr>
+        <w:t>:</w:t>
+      </w:r>
+      <w:proofErr w:type="gramEnd"/>
+    </w:p>
+    <w:p>
+      <w:pPr>
+        <w:spacing w:before="240"/>
+        <w:rPr>
+          <w:lang w:val="fr-CH"/>
+        </w:rPr>
+      </w:pPr>
+      <w:r>
+        <w:rPr>
+          <w:lang w:val="fr-CH"/>
+        </w:rPr>
+        <w:t xml:space="preserve">Meta </w:t>
+      </w:r>
+      <w:proofErr w:type="spellStart"/>
+      <w:r>
+        <w:rPr>
+          <w:lang w:val="fr-CH"/>
+        </w:rPr>
+        <w:t>Quest</w:t>
+      </w:r>
+      <w:proofErr w:type="spellEnd"/>
+      <w:r>
+        <w:rPr>
+          <w:lang w:val="fr-CH"/>
+        </w:rPr>
+        <w:t xml:space="preserve"> 3 (128GB)</w:t>
+      </w:r>
+    </w:p>
+    <w:p>
+      <w:pPr>
+        <w:rPr>
+          <w:lang w:val="fr-CH"/>
+        </w:rPr>
+      </w:pPr>
+      <w:r>
+        <w:rPr>
+          <w:lang w:val="fr-CH"/>
+        </w:rPr>
+        <w:br w:type="page"/>
       </w:r>
     </w:p>
     <w:p>
@@ -7412,6 +8877,7 @@
       <w:bookmarkStart w:id="13" w:name="_Toc429059808"/>
       <w:bookmarkStart w:id="14" w:name="_Toc94790454"/>
       <w:r>
+        <w:lastRenderedPageBreak/>
         <w:t>Progettazione</w:t>
       </w:r>
       <w:bookmarkEnd w:id="13"/>
@@ -7570,8 +9036,16 @@
         <w:rPr>
           <w:lang w:val="it-IT"/>
         </w:rPr>
-        <w:t>Eventuale sitemap</w:t>
-      </w:r>
+        <w:t xml:space="preserve">Eventuale </w:t>
+      </w:r>
+      <w:proofErr w:type="spellStart"/>
+      <w:r>
+        <w:rPr>
+          <w:lang w:val="it-IT"/>
+        </w:rPr>
+        <w:t>sitemap</w:t>
+      </w:r>
+      <w:proofErr w:type="spellEnd"/>
     </w:p>
     <w:p>
       <w:pPr>
@@ -7668,7 +9142,21 @@
         <w:rPr>
           <w:lang w:val="it-IT"/>
         </w:rPr>
-        <w:t>vate durante la fase di analisi e realizzata tramite mockups.</w:t>
+        <w:t xml:space="preserve">vate durante la fase di analisi e realizzata tramite </w:t>
+      </w:r>
+      <w:proofErr w:type="spellStart"/>
+      <w:r>
+        <w:rPr>
+          <w:lang w:val="it-IT"/>
+        </w:rPr>
+        <w:t>mockups</w:t>
+      </w:r>
+      <w:proofErr w:type="spellEnd"/>
+      <w:r>
+        <w:rPr>
+          <w:lang w:val="it-IT"/>
+        </w:rPr>
+        <w:t>.</w:t>
       </w:r>
     </w:p>
     <w:p>
@@ -7773,8 +9261,16 @@
         <w:rPr>
           <w:lang w:val="it-IT"/>
         </w:rPr>
-        <w:t>Tabelle di routing</w:t>
-      </w:r>
+        <w:t xml:space="preserve">Tabelle di </w:t>
+      </w:r>
+      <w:proofErr w:type="spellStart"/>
+      <w:r>
+        <w:rPr>
+          <w:lang w:val="it-IT"/>
+        </w:rPr>
+        <w:t>routing</w:t>
+      </w:r>
+      <w:proofErr w:type="spellEnd"/>
     </w:p>
     <w:p>
       <w:pPr>
@@ -8019,6 +9515,7 @@
                 <w:lang w:val="en-GB" w:eastAsia="en-US"/>
               </w:rPr>
             </w:pPr>
+            <w:proofErr w:type="spellStart"/>
             <w:r>
               <w:rPr>
                 <w:b/>
@@ -8028,6 +9525,7 @@
               </w:rPr>
               <w:t>Riferimento</w:t>
             </w:r>
+            <w:proofErr w:type="spellEnd"/>
             <w:r>
               <w:rPr>
                 <w:sz w:val="18"/>
@@ -8159,6 +9657,7 @@
                 <w:szCs w:val="18"/>
               </w:rPr>
             </w:pPr>
+            <w:proofErr w:type="spellStart"/>
             <w:r>
               <w:rPr>
                 <w:b/>
@@ -8167,6 +9666,7 @@
               </w:rPr>
               <w:t>Descrizione</w:t>
             </w:r>
+            <w:proofErr w:type="spellEnd"/>
             <w:r>
               <w:rPr>
                 <w:b/>
@@ -8221,6 +9721,7 @@
                 <w:szCs w:val="18"/>
               </w:rPr>
             </w:pPr>
+            <w:proofErr w:type="spellStart"/>
             <w:r>
               <w:rPr>
                 <w:b/>
@@ -8229,6 +9730,7 @@
               </w:rPr>
               <w:t>Prerequisiti</w:t>
             </w:r>
+            <w:proofErr w:type="spellEnd"/>
             <w:r>
               <w:rPr>
                 <w:b/>
@@ -8262,6 +9764,7 @@
               </w:rPr>
               <w:t xml:space="preserve">Store on local PC: Profile_1.2.001.xml (appendix </w:t>
             </w:r>
+            <w:proofErr w:type="spellStart"/>
             <w:r>
               <w:rPr>
                 <w:sz w:val="18"/>
@@ -8270,6 +9773,7 @@
               </w:rPr>
               <w:t>n_n</w:t>
             </w:r>
+            <w:proofErr w:type="spellEnd"/>
             <w:r>
               <w:rPr>
                 <w:sz w:val="18"/>
@@ -8277,6 +9781,7 @@
               </w:rPr>
               <w:t xml:space="preserve">) and Cards_1.2.001.txt (appendix </w:t>
             </w:r>
+            <w:proofErr w:type="spellStart"/>
             <w:r>
               <w:rPr>
                 <w:sz w:val="18"/>
@@ -8285,6 +9790,7 @@
               </w:rPr>
               <w:t>n_n</w:t>
             </w:r>
+            <w:proofErr w:type="spellEnd"/>
             <w:r>
               <w:rPr>
                 <w:sz w:val="18"/>
@@ -8329,6 +9835,7 @@
                 <w:szCs w:val="18"/>
               </w:rPr>
             </w:pPr>
+            <w:proofErr w:type="spellStart"/>
             <w:r>
               <w:rPr>
                 <w:b/>
@@ -8337,6 +9844,7 @@
               </w:rPr>
               <w:t>Procedura</w:t>
             </w:r>
+            <w:proofErr w:type="spellEnd"/>
             <w:r>
               <w:rPr>
                 <w:b/>
@@ -8503,7 +10011,23 @@
                 <w:szCs w:val="18"/>
               </w:rPr>
               <w:br/>
-              <w:t>Click the imsi card link</w:t>
+              <w:t xml:space="preserve">Click the </w:t>
+            </w:r>
+            <w:proofErr w:type="spellStart"/>
+            <w:r>
+              <w:rPr>
+                <w:sz w:val="18"/>
+                <w:szCs w:val="18"/>
+              </w:rPr>
+              <w:t>imsi</w:t>
+            </w:r>
+            <w:proofErr w:type="spellEnd"/>
+            <w:r>
+              <w:rPr>
+                <w:sz w:val="18"/>
+                <w:szCs w:val="18"/>
+              </w:rPr>
+              <w:t xml:space="preserve"> card link</w:t>
             </w:r>
             <w:r>
               <w:rPr>
@@ -8551,7 +10075,287 @@
                 <w:szCs w:val="16"/>
                 <w:lang w:eastAsia="ja-JP"/>
               </w:rPr>
-              <w:t>SELECT imsi, dir, keyset, cntr, rawtohex(kickey), rawtohex(kidkey), rawtohex(kikkey), rawtohex(chv), rawtohex(dap)FROM otacardkey a where imsi='340041795924770' ORDER BY keyset;</w:t>
+              <w:t xml:space="preserve">SELECT </w:t>
+            </w:r>
+            <w:proofErr w:type="spellStart"/>
+            <w:r>
+              <w:rPr>
+                <w:rFonts w:ascii="Courier New" w:eastAsia="MS Mincho" w:hAnsi="Courier New" w:cs="Courier New"/>
+                <w:sz w:val="16"/>
+                <w:szCs w:val="16"/>
+                <w:lang w:eastAsia="ja-JP"/>
+              </w:rPr>
+              <w:t>imsi</w:t>
+            </w:r>
+            <w:proofErr w:type="spellEnd"/>
+            <w:r>
+              <w:rPr>
+                <w:rFonts w:ascii="Courier New" w:eastAsia="MS Mincho" w:hAnsi="Courier New" w:cs="Courier New"/>
+                <w:sz w:val="16"/>
+                <w:szCs w:val="16"/>
+                <w:lang w:eastAsia="ja-JP"/>
+              </w:rPr>
+              <w:t xml:space="preserve">, </w:t>
+            </w:r>
+            <w:proofErr w:type="spellStart"/>
+            <w:r>
+              <w:rPr>
+                <w:rFonts w:ascii="Courier New" w:eastAsia="MS Mincho" w:hAnsi="Courier New" w:cs="Courier New"/>
+                <w:sz w:val="16"/>
+                <w:szCs w:val="16"/>
+                <w:lang w:eastAsia="ja-JP"/>
+              </w:rPr>
+              <w:t>dir</w:t>
+            </w:r>
+            <w:proofErr w:type="spellEnd"/>
+            <w:r>
+              <w:rPr>
+                <w:rFonts w:ascii="Courier New" w:eastAsia="MS Mincho" w:hAnsi="Courier New" w:cs="Courier New"/>
+                <w:sz w:val="16"/>
+                <w:szCs w:val="16"/>
+                <w:lang w:eastAsia="ja-JP"/>
+              </w:rPr>
+              <w:t xml:space="preserve">, keyset, </w:t>
+            </w:r>
+            <w:proofErr w:type="spellStart"/>
+            <w:r>
+              <w:rPr>
+                <w:rFonts w:ascii="Courier New" w:eastAsia="MS Mincho" w:hAnsi="Courier New" w:cs="Courier New"/>
+                <w:sz w:val="16"/>
+                <w:szCs w:val="16"/>
+                <w:lang w:eastAsia="ja-JP"/>
+              </w:rPr>
+              <w:t>cntr</w:t>
+            </w:r>
+            <w:proofErr w:type="spellEnd"/>
+            <w:r>
+              <w:rPr>
+                <w:rFonts w:ascii="Courier New" w:eastAsia="MS Mincho" w:hAnsi="Courier New" w:cs="Courier New"/>
+                <w:sz w:val="16"/>
+                <w:szCs w:val="16"/>
+                <w:lang w:eastAsia="ja-JP"/>
+              </w:rPr>
+              <w:t xml:space="preserve">, </w:t>
+            </w:r>
+            <w:proofErr w:type="spellStart"/>
+            <w:r>
+              <w:rPr>
+                <w:rFonts w:ascii="Courier New" w:eastAsia="MS Mincho" w:hAnsi="Courier New" w:cs="Courier New"/>
+                <w:sz w:val="16"/>
+                <w:szCs w:val="16"/>
+                <w:lang w:eastAsia="ja-JP"/>
+              </w:rPr>
+              <w:t>rawtohex</w:t>
+            </w:r>
+            <w:proofErr w:type="spellEnd"/>
+            <w:r>
+              <w:rPr>
+                <w:rFonts w:ascii="Courier New" w:eastAsia="MS Mincho" w:hAnsi="Courier New" w:cs="Courier New"/>
+                <w:sz w:val="16"/>
+                <w:szCs w:val="16"/>
+                <w:lang w:eastAsia="ja-JP"/>
+              </w:rPr>
+              <w:t>(</w:t>
+            </w:r>
+            <w:proofErr w:type="spellStart"/>
+            <w:r>
+              <w:rPr>
+                <w:rFonts w:ascii="Courier New" w:eastAsia="MS Mincho" w:hAnsi="Courier New" w:cs="Courier New"/>
+                <w:sz w:val="16"/>
+                <w:szCs w:val="16"/>
+                <w:lang w:eastAsia="ja-JP"/>
+              </w:rPr>
+              <w:t>kickey</w:t>
+            </w:r>
+            <w:proofErr w:type="spellEnd"/>
+            <w:r>
+              <w:rPr>
+                <w:rFonts w:ascii="Courier New" w:eastAsia="MS Mincho" w:hAnsi="Courier New" w:cs="Courier New"/>
+                <w:sz w:val="16"/>
+                <w:szCs w:val="16"/>
+                <w:lang w:eastAsia="ja-JP"/>
+              </w:rPr>
+              <w:t xml:space="preserve">), </w:t>
+            </w:r>
+            <w:proofErr w:type="spellStart"/>
+            <w:r>
+              <w:rPr>
+                <w:rFonts w:ascii="Courier New" w:eastAsia="MS Mincho" w:hAnsi="Courier New" w:cs="Courier New"/>
+                <w:sz w:val="16"/>
+                <w:szCs w:val="16"/>
+                <w:lang w:eastAsia="ja-JP"/>
+              </w:rPr>
+              <w:t>rawtohex</w:t>
+            </w:r>
+            <w:proofErr w:type="spellEnd"/>
+            <w:r>
+              <w:rPr>
+                <w:rFonts w:ascii="Courier New" w:eastAsia="MS Mincho" w:hAnsi="Courier New" w:cs="Courier New"/>
+                <w:sz w:val="16"/>
+                <w:szCs w:val="16"/>
+                <w:lang w:eastAsia="ja-JP"/>
+              </w:rPr>
+              <w:t>(</w:t>
+            </w:r>
+            <w:proofErr w:type="spellStart"/>
+            <w:r>
+              <w:rPr>
+                <w:rFonts w:ascii="Courier New" w:eastAsia="MS Mincho" w:hAnsi="Courier New" w:cs="Courier New"/>
+                <w:sz w:val="16"/>
+                <w:szCs w:val="16"/>
+                <w:lang w:eastAsia="ja-JP"/>
+              </w:rPr>
+              <w:t>kidkey</w:t>
+            </w:r>
+            <w:proofErr w:type="spellEnd"/>
+            <w:r>
+              <w:rPr>
+                <w:rFonts w:ascii="Courier New" w:eastAsia="MS Mincho" w:hAnsi="Courier New" w:cs="Courier New"/>
+                <w:sz w:val="16"/>
+                <w:szCs w:val="16"/>
+                <w:lang w:eastAsia="ja-JP"/>
+              </w:rPr>
+              <w:t xml:space="preserve">), </w:t>
+            </w:r>
+            <w:proofErr w:type="spellStart"/>
+            <w:r>
+              <w:rPr>
+                <w:rFonts w:ascii="Courier New" w:eastAsia="MS Mincho" w:hAnsi="Courier New" w:cs="Courier New"/>
+                <w:sz w:val="16"/>
+                <w:szCs w:val="16"/>
+                <w:lang w:eastAsia="ja-JP"/>
+              </w:rPr>
+              <w:t>rawtohex</w:t>
+            </w:r>
+            <w:proofErr w:type="spellEnd"/>
+            <w:r>
+              <w:rPr>
+                <w:rFonts w:ascii="Courier New" w:eastAsia="MS Mincho" w:hAnsi="Courier New" w:cs="Courier New"/>
+                <w:sz w:val="16"/>
+                <w:szCs w:val="16"/>
+                <w:lang w:eastAsia="ja-JP"/>
+              </w:rPr>
+              <w:t>(</w:t>
+            </w:r>
+            <w:proofErr w:type="spellStart"/>
+            <w:r>
+              <w:rPr>
+                <w:rFonts w:ascii="Courier New" w:eastAsia="MS Mincho" w:hAnsi="Courier New" w:cs="Courier New"/>
+                <w:sz w:val="16"/>
+                <w:szCs w:val="16"/>
+                <w:lang w:eastAsia="ja-JP"/>
+              </w:rPr>
+              <w:t>kikkey</w:t>
+            </w:r>
+            <w:proofErr w:type="spellEnd"/>
+            <w:r>
+              <w:rPr>
+                <w:rFonts w:ascii="Courier New" w:eastAsia="MS Mincho" w:hAnsi="Courier New" w:cs="Courier New"/>
+                <w:sz w:val="16"/>
+                <w:szCs w:val="16"/>
+                <w:lang w:eastAsia="ja-JP"/>
+              </w:rPr>
+              <w:t xml:space="preserve">), </w:t>
+            </w:r>
+            <w:proofErr w:type="spellStart"/>
+            <w:r>
+              <w:rPr>
+                <w:rFonts w:ascii="Courier New" w:eastAsia="MS Mincho" w:hAnsi="Courier New" w:cs="Courier New"/>
+                <w:sz w:val="16"/>
+                <w:szCs w:val="16"/>
+                <w:lang w:eastAsia="ja-JP"/>
+              </w:rPr>
+              <w:t>rawtohex</w:t>
+            </w:r>
+            <w:proofErr w:type="spellEnd"/>
+            <w:r>
+              <w:rPr>
+                <w:rFonts w:ascii="Courier New" w:eastAsia="MS Mincho" w:hAnsi="Courier New" w:cs="Courier New"/>
+                <w:sz w:val="16"/>
+                <w:szCs w:val="16"/>
+                <w:lang w:eastAsia="ja-JP"/>
+              </w:rPr>
+              <w:t>(</w:t>
+            </w:r>
+            <w:proofErr w:type="spellStart"/>
+            <w:r>
+              <w:rPr>
+                <w:rFonts w:ascii="Courier New" w:eastAsia="MS Mincho" w:hAnsi="Courier New" w:cs="Courier New"/>
+                <w:sz w:val="16"/>
+                <w:szCs w:val="16"/>
+                <w:lang w:eastAsia="ja-JP"/>
+              </w:rPr>
+              <w:t>chv</w:t>
+            </w:r>
+            <w:proofErr w:type="spellEnd"/>
+            <w:r>
+              <w:rPr>
+                <w:rFonts w:ascii="Courier New" w:eastAsia="MS Mincho" w:hAnsi="Courier New" w:cs="Courier New"/>
+                <w:sz w:val="16"/>
+                <w:szCs w:val="16"/>
+                <w:lang w:eastAsia="ja-JP"/>
+              </w:rPr>
+              <w:t xml:space="preserve">), </w:t>
+            </w:r>
+            <w:proofErr w:type="spellStart"/>
+            <w:r>
+              <w:rPr>
+                <w:rFonts w:ascii="Courier New" w:eastAsia="MS Mincho" w:hAnsi="Courier New" w:cs="Courier New"/>
+                <w:sz w:val="16"/>
+                <w:szCs w:val="16"/>
+                <w:lang w:eastAsia="ja-JP"/>
+              </w:rPr>
+              <w:t>rawtohex</w:t>
+            </w:r>
+            <w:proofErr w:type="spellEnd"/>
+            <w:r>
+              <w:rPr>
+                <w:rFonts w:ascii="Courier New" w:eastAsia="MS Mincho" w:hAnsi="Courier New" w:cs="Courier New"/>
+                <w:sz w:val="16"/>
+                <w:szCs w:val="16"/>
+                <w:lang w:eastAsia="ja-JP"/>
+              </w:rPr>
+              <w:t xml:space="preserve">(dap)FROM </w:t>
+            </w:r>
+            <w:proofErr w:type="spellStart"/>
+            <w:r>
+              <w:rPr>
+                <w:rFonts w:ascii="Courier New" w:eastAsia="MS Mincho" w:hAnsi="Courier New" w:cs="Courier New"/>
+                <w:sz w:val="16"/>
+                <w:szCs w:val="16"/>
+                <w:lang w:eastAsia="ja-JP"/>
+              </w:rPr>
+              <w:t>otacardkey</w:t>
+            </w:r>
+            <w:proofErr w:type="spellEnd"/>
+            <w:r>
+              <w:rPr>
+                <w:rFonts w:ascii="Courier New" w:eastAsia="MS Mincho" w:hAnsi="Courier New" w:cs="Courier New"/>
+                <w:sz w:val="16"/>
+                <w:szCs w:val="16"/>
+                <w:lang w:eastAsia="ja-JP"/>
+              </w:rPr>
+              <w:t xml:space="preserve"> a where </w:t>
+            </w:r>
+            <w:proofErr w:type="spellStart"/>
+            <w:r>
+              <w:rPr>
+                <w:rFonts w:ascii="Courier New" w:eastAsia="MS Mincho" w:hAnsi="Courier New" w:cs="Courier New"/>
+                <w:sz w:val="16"/>
+                <w:szCs w:val="16"/>
+                <w:lang w:eastAsia="ja-JP"/>
+              </w:rPr>
+              <w:t>imsi</w:t>
+            </w:r>
+            <w:proofErr w:type="spellEnd"/>
+            <w:r>
+              <w:rPr>
+                <w:rFonts w:ascii="Courier New" w:eastAsia="MS Mincho" w:hAnsi="Courier New" w:cs="Courier New"/>
+                <w:sz w:val="16"/>
+                <w:szCs w:val="16"/>
+                <w:lang w:eastAsia="ja-JP"/>
+              </w:rPr>
+              <w:t>='340041795924770' ORDER BY keyset;</w:t>
             </w:r>
           </w:p>
         </w:tc>
@@ -8574,14 +10378,34 @@
                 <w:szCs w:val="18"/>
               </w:rPr>
             </w:pPr>
+            <w:proofErr w:type="spellStart"/>
             <w:r>
               <w:rPr>
                 <w:b/>
                 <w:sz w:val="18"/>
                 <w:szCs w:val="18"/>
               </w:rPr>
-              <w:t>Risultati attesi</w:t>
-            </w:r>
+              <w:t>Risultati</w:t>
+            </w:r>
+            <w:proofErr w:type="spellEnd"/>
+            <w:r>
+              <w:rPr>
+                <w:b/>
+                <w:sz w:val="18"/>
+                <w:szCs w:val="18"/>
+              </w:rPr>
+              <w:t xml:space="preserve"> </w:t>
+            </w:r>
+            <w:proofErr w:type="spellStart"/>
+            <w:r>
+              <w:rPr>
+                <w:b/>
+                <w:sz w:val="18"/>
+                <w:szCs w:val="18"/>
+              </w:rPr>
+              <w:t>attesi</w:t>
+            </w:r>
+            <w:proofErr w:type="spellEnd"/>
             <w:r>
               <w:rPr>
                 <w:b/>
@@ -8613,7 +10437,23 @@
                 <w:sz w:val="18"/>
                 <w:szCs w:val="18"/>
               </w:rPr>
-              <w:t>Keys visible in the DB (OtaCardKey) but not visible in the GUI (Card details)</w:t>
+              <w:t>Keys visible in the DB (</w:t>
+            </w:r>
+            <w:proofErr w:type="spellStart"/>
+            <w:r>
+              <w:rPr>
+                <w:sz w:val="18"/>
+                <w:szCs w:val="18"/>
+              </w:rPr>
+              <w:t>OtaCardKey</w:t>
+            </w:r>
+            <w:proofErr w:type="spellEnd"/>
+            <w:r>
+              <w:rPr>
+                <w:sz w:val="18"/>
+                <w:szCs w:val="18"/>
+              </w:rPr>
+              <w:t>) but not visible in the GUI (Card details)</w:t>
             </w:r>
           </w:p>
         </w:tc>
@@ -8731,7 +10571,14 @@
         <w:rPr>
           <w:lang w:val="it-IT"/>
         </w:rPr>
-        <w:t xml:space="preserve"> 1.7) (ad esempio Gan</w:t>
+        <w:t xml:space="preserve"> 1.7) (ad esempio </w:t>
+      </w:r>
+      <w:proofErr w:type="spellStart"/>
+      <w:r>
+        <w:rPr>
+          <w:lang w:val="it-IT"/>
+        </w:rPr>
+        <w:t>Gan</w:t>
       </w:r>
       <w:r>
         <w:rPr>
@@ -8743,7 +10590,14 @@
         <w:rPr>
           <w:lang w:val="it-IT"/>
         </w:rPr>
-        <w:t>t consuntivo).</w:t>
+        <w:t>t</w:t>
+      </w:r>
+      <w:proofErr w:type="spellEnd"/>
+      <w:r>
+        <w:rPr>
+          <w:lang w:val="it-IT"/>
+        </w:rPr>
+        <w:t xml:space="preserve"> consuntivo).</w:t>
       </w:r>
     </w:p>
     <w:p>
@@ -9040,6 +10894,7 @@
             <w:pPr>
               <w:jc w:val="both"/>
             </w:pPr>
+            <w:proofErr w:type="spellStart"/>
             <w:r>
               <w:rPr>
                 <w:b/>
@@ -9047,6 +10902,7 @@
               </w:rPr>
               <w:t>Asynchronous</w:t>
             </w:r>
+            <w:proofErr w:type="spellEnd"/>
             <w:r>
               <w:rPr>
                 <w:b/>
@@ -9092,13 +10948,31 @@
                 <w:bCs/>
               </w:rPr>
             </w:pPr>
+            <w:proofErr w:type="spellStart"/>
             <w:r>
               <w:rPr>
                 <w:b/>
                 <w:bCs/>
               </w:rPr>
-              <w:t>Cascading Style Sheets</w:t>
-            </w:r>
+              <w:t>Cascading</w:t>
+            </w:r>
+            <w:proofErr w:type="spellEnd"/>
+            <w:r>
+              <w:rPr>
+                <w:b/>
+                <w:bCs/>
+              </w:rPr>
+              <w:t xml:space="preserve"> Style </w:t>
+            </w:r>
+            <w:proofErr w:type="spellStart"/>
+            <w:r>
+              <w:rPr>
+                <w:b/>
+                <w:bCs/>
+              </w:rPr>
+              <w:t>Sheets</w:t>
+            </w:r>
+            <w:proofErr w:type="spellEnd"/>
             <w:r>
               <w:t>: linguaggio che per</w:t>
             </w:r>
@@ -9320,11 +11194,19 @@
           <w:lang w:val="it-IT"/>
         </w:rPr>
       </w:pPr>
-      <w:r>
-        <w:rPr>
-          <w:lang w:val="it-IT"/>
-        </w:rPr>
-        <w:t>ev. Numero di edizione,</w:t>
+      <w:proofErr w:type="spellStart"/>
+      <w:r>
+        <w:rPr>
+          <w:lang w:val="it-IT"/>
+        </w:rPr>
+        <w:t>ev</w:t>
+      </w:r>
+      <w:proofErr w:type="spellEnd"/>
+      <w:r>
+        <w:rPr>
+          <w:lang w:val="it-IT"/>
+        </w:rPr>
+        <w:t>. Numero di edizione,</w:t>
       </w:r>
     </w:p>
     <w:p>
@@ -9424,7 +11306,21 @@
         <w:rPr>
           <w:lang w:val="it-IT"/>
         </w:rPr>
-        <w:t xml:space="preserve"> (se troppo lungo solo dominio, evt completo nel diario)</w:t>
+        <w:t xml:space="preserve"> (se troppo lungo solo dominio, </w:t>
+      </w:r>
+      <w:proofErr w:type="spellStart"/>
+      <w:r>
+        <w:rPr>
+          <w:lang w:val="it-IT"/>
+        </w:rPr>
+        <w:t>evt</w:t>
+      </w:r>
+      <w:proofErr w:type="spellEnd"/>
+      <w:r>
+        <w:rPr>
+          <w:lang w:val="it-IT"/>
+        </w:rPr>
+        <w:t xml:space="preserve"> completo nel diario)</w:t>
       </w:r>
       <w:r>
         <w:rPr>
@@ -9687,7 +11583,14 @@
         <w:rPr>
           <w:lang w:val="it-IT"/>
         </w:rPr>
-        <w:t>Mandato e/o Qd</w:t>
+        <w:t xml:space="preserve">Mandato e/o </w:t>
+      </w:r>
+      <w:proofErr w:type="spellStart"/>
+      <w:r>
+        <w:rPr>
+          <w:lang w:val="it-IT"/>
+        </w:rPr>
+        <w:t>Qd</w:t>
       </w:r>
       <w:r>
         <w:rPr>
@@ -9695,6 +11598,7 @@
         </w:rPr>
         <w:t>C</w:t>
       </w:r>
+      <w:proofErr w:type="spellEnd"/>
     </w:p>
     <w:p>
       <w:pPr>
@@ -9728,10 +11632,10 @@
       </w:pPr>
     </w:p>
     <w:sectPr>
-      <w:headerReference w:type="default" r:id="rId9"/>
-      <w:footerReference w:type="default" r:id="rId10"/>
-      <w:headerReference w:type="first" r:id="rId11"/>
-      <w:footerReference w:type="first" r:id="rId12"/>
+      <w:headerReference w:type="default" r:id="rId13"/>
+      <w:footerReference w:type="default" r:id="rId14"/>
+      <w:headerReference w:type="first" r:id="rId15"/>
+      <w:footerReference w:type="first" r:id="rId16"/>
       <w:pgSz w:w="11906" w:h="16838"/>
       <w:pgMar w:top="1985" w:right="1134" w:bottom="1418" w:left="1134" w:header="567" w:footer="567" w:gutter="0"/>
       <w:pgNumType w:start="1"/>
@@ -11840,6 +13744,119 @@
     </w:lvl>
   </w:abstractNum>
   <w:abstractNum w:abstractNumId="9" w15:restartNumberingAfterBreak="0">
+    <w:nsid w:val="266945D7"/>
+    <w:multiLevelType w:val="hybridMultilevel"/>
+    <w:tmpl w:val="F2EAA512"/>
+    <w:lvl w:ilvl="0" w:tplc="08100001">
+      <w:start w:val="1"/>
+      <w:numFmt w:val="bullet"/>
+      <w:lvlText w:val=""/>
+      <w:lvlJc w:val="left"/>
+      <w:pPr>
+        <w:ind w:left="720" w:hanging="360"/>
+      </w:pPr>
+      <w:rPr>
+        <w:rFonts w:ascii="Symbol" w:hAnsi="Symbol" w:hint="default"/>
+      </w:rPr>
+    </w:lvl>
+    <w:lvl w:ilvl="1" w:tplc="08100003" w:tentative="1">
+      <w:start w:val="1"/>
+      <w:numFmt w:val="bullet"/>
+      <w:lvlText w:val="o"/>
+      <w:lvlJc w:val="left"/>
+      <w:pPr>
+        <w:ind w:left="1440" w:hanging="360"/>
+      </w:pPr>
+      <w:rPr>
+        <w:rFonts w:ascii="Courier New" w:hAnsi="Courier New" w:cs="Courier New" w:hint="default"/>
+      </w:rPr>
+    </w:lvl>
+    <w:lvl w:ilvl="2" w:tplc="08100005" w:tentative="1">
+      <w:start w:val="1"/>
+      <w:numFmt w:val="bullet"/>
+      <w:lvlText w:val=""/>
+      <w:lvlJc w:val="left"/>
+      <w:pPr>
+        <w:ind w:left="2160" w:hanging="360"/>
+      </w:pPr>
+      <w:rPr>
+        <w:rFonts w:ascii="Wingdings" w:hAnsi="Wingdings" w:hint="default"/>
+      </w:rPr>
+    </w:lvl>
+    <w:lvl w:ilvl="3" w:tplc="08100001" w:tentative="1">
+      <w:start w:val="1"/>
+      <w:numFmt w:val="bullet"/>
+      <w:lvlText w:val=""/>
+      <w:lvlJc w:val="left"/>
+      <w:pPr>
+        <w:ind w:left="2880" w:hanging="360"/>
+      </w:pPr>
+      <w:rPr>
+        <w:rFonts w:ascii="Symbol" w:hAnsi="Symbol" w:hint="default"/>
+      </w:rPr>
+    </w:lvl>
+    <w:lvl w:ilvl="4" w:tplc="08100003" w:tentative="1">
+      <w:start w:val="1"/>
+      <w:numFmt w:val="bullet"/>
+      <w:lvlText w:val="o"/>
+      <w:lvlJc w:val="left"/>
+      <w:pPr>
+        <w:ind w:left="3600" w:hanging="360"/>
+      </w:pPr>
+      <w:rPr>
+        <w:rFonts w:ascii="Courier New" w:hAnsi="Courier New" w:cs="Courier New" w:hint="default"/>
+      </w:rPr>
+    </w:lvl>
+    <w:lvl w:ilvl="5" w:tplc="08100005" w:tentative="1">
+      <w:start w:val="1"/>
+      <w:numFmt w:val="bullet"/>
+      <w:lvlText w:val=""/>
+      <w:lvlJc w:val="left"/>
+      <w:pPr>
+        <w:ind w:left="4320" w:hanging="360"/>
+      </w:pPr>
+      <w:rPr>
+        <w:rFonts w:ascii="Wingdings" w:hAnsi="Wingdings" w:hint="default"/>
+      </w:rPr>
+    </w:lvl>
+    <w:lvl w:ilvl="6" w:tplc="08100001" w:tentative="1">
+      <w:start w:val="1"/>
+      <w:numFmt w:val="bullet"/>
+      <w:lvlText w:val=""/>
+      <w:lvlJc w:val="left"/>
+      <w:pPr>
+        <w:ind w:left="5040" w:hanging="360"/>
+      </w:pPr>
+      <w:rPr>
+        <w:rFonts w:ascii="Symbol" w:hAnsi="Symbol" w:hint="default"/>
+      </w:rPr>
+    </w:lvl>
+    <w:lvl w:ilvl="7" w:tplc="08100003" w:tentative="1">
+      <w:start w:val="1"/>
+      <w:numFmt w:val="bullet"/>
+      <w:lvlText w:val="o"/>
+      <w:lvlJc w:val="left"/>
+      <w:pPr>
+        <w:ind w:left="5760" w:hanging="360"/>
+      </w:pPr>
+      <w:rPr>
+        <w:rFonts w:ascii="Courier New" w:hAnsi="Courier New" w:cs="Courier New" w:hint="default"/>
+      </w:rPr>
+    </w:lvl>
+    <w:lvl w:ilvl="8" w:tplc="08100005" w:tentative="1">
+      <w:start w:val="1"/>
+      <w:numFmt w:val="bullet"/>
+      <w:lvlText w:val=""/>
+      <w:lvlJc w:val="left"/>
+      <w:pPr>
+        <w:ind w:left="6480" w:hanging="360"/>
+      </w:pPr>
+      <w:rPr>
+        <w:rFonts w:ascii="Wingdings" w:hAnsi="Wingdings" w:hint="default"/>
+      </w:rPr>
+    </w:lvl>
+  </w:abstractNum>
+  <w:abstractNum w:abstractNumId="10" w15:restartNumberingAfterBreak="0">
     <w:nsid w:val="26AB21E0"/>
     <w:multiLevelType w:val="multilevel"/>
     <w:tmpl w:val="9A3C8102"/>
@@ -11988,7 +14005,233 @@
       </w:rPr>
     </w:lvl>
   </w:abstractNum>
-  <w:abstractNum w:abstractNumId="10" w15:restartNumberingAfterBreak="0">
+  <w:abstractNum w:abstractNumId="11" w15:restartNumberingAfterBreak="0">
+    <w:nsid w:val="28AC0398"/>
+    <w:multiLevelType w:val="hybridMultilevel"/>
+    <w:tmpl w:val="41664086"/>
+    <w:lvl w:ilvl="0" w:tplc="08100001">
+      <w:start w:val="1"/>
+      <w:numFmt w:val="bullet"/>
+      <w:lvlText w:val=""/>
+      <w:lvlJc w:val="left"/>
+      <w:pPr>
+        <w:ind w:left="720" w:hanging="360"/>
+      </w:pPr>
+      <w:rPr>
+        <w:rFonts w:ascii="Symbol" w:hAnsi="Symbol" w:hint="default"/>
+      </w:rPr>
+    </w:lvl>
+    <w:lvl w:ilvl="1" w:tplc="08100003" w:tentative="1">
+      <w:start w:val="1"/>
+      <w:numFmt w:val="bullet"/>
+      <w:lvlText w:val="o"/>
+      <w:lvlJc w:val="left"/>
+      <w:pPr>
+        <w:ind w:left="1440" w:hanging="360"/>
+      </w:pPr>
+      <w:rPr>
+        <w:rFonts w:ascii="Courier New" w:hAnsi="Courier New" w:cs="Courier New" w:hint="default"/>
+      </w:rPr>
+    </w:lvl>
+    <w:lvl w:ilvl="2" w:tplc="08100005" w:tentative="1">
+      <w:start w:val="1"/>
+      <w:numFmt w:val="bullet"/>
+      <w:lvlText w:val=""/>
+      <w:lvlJc w:val="left"/>
+      <w:pPr>
+        <w:ind w:left="2160" w:hanging="360"/>
+      </w:pPr>
+      <w:rPr>
+        <w:rFonts w:ascii="Wingdings" w:hAnsi="Wingdings" w:hint="default"/>
+      </w:rPr>
+    </w:lvl>
+    <w:lvl w:ilvl="3" w:tplc="08100001" w:tentative="1">
+      <w:start w:val="1"/>
+      <w:numFmt w:val="bullet"/>
+      <w:lvlText w:val=""/>
+      <w:lvlJc w:val="left"/>
+      <w:pPr>
+        <w:ind w:left="2880" w:hanging="360"/>
+      </w:pPr>
+      <w:rPr>
+        <w:rFonts w:ascii="Symbol" w:hAnsi="Symbol" w:hint="default"/>
+      </w:rPr>
+    </w:lvl>
+    <w:lvl w:ilvl="4" w:tplc="08100003" w:tentative="1">
+      <w:start w:val="1"/>
+      <w:numFmt w:val="bullet"/>
+      <w:lvlText w:val="o"/>
+      <w:lvlJc w:val="left"/>
+      <w:pPr>
+        <w:ind w:left="3600" w:hanging="360"/>
+      </w:pPr>
+      <w:rPr>
+        <w:rFonts w:ascii="Courier New" w:hAnsi="Courier New" w:cs="Courier New" w:hint="default"/>
+      </w:rPr>
+    </w:lvl>
+    <w:lvl w:ilvl="5" w:tplc="08100005" w:tentative="1">
+      <w:start w:val="1"/>
+      <w:numFmt w:val="bullet"/>
+      <w:lvlText w:val=""/>
+      <w:lvlJc w:val="left"/>
+      <w:pPr>
+        <w:ind w:left="4320" w:hanging="360"/>
+      </w:pPr>
+      <w:rPr>
+        <w:rFonts w:ascii="Wingdings" w:hAnsi="Wingdings" w:hint="default"/>
+      </w:rPr>
+    </w:lvl>
+    <w:lvl w:ilvl="6" w:tplc="08100001" w:tentative="1">
+      <w:start w:val="1"/>
+      <w:numFmt w:val="bullet"/>
+      <w:lvlText w:val=""/>
+      <w:lvlJc w:val="left"/>
+      <w:pPr>
+        <w:ind w:left="5040" w:hanging="360"/>
+      </w:pPr>
+      <w:rPr>
+        <w:rFonts w:ascii="Symbol" w:hAnsi="Symbol" w:hint="default"/>
+      </w:rPr>
+    </w:lvl>
+    <w:lvl w:ilvl="7" w:tplc="08100003" w:tentative="1">
+      <w:start w:val="1"/>
+      <w:numFmt w:val="bullet"/>
+      <w:lvlText w:val="o"/>
+      <w:lvlJc w:val="left"/>
+      <w:pPr>
+        <w:ind w:left="5760" w:hanging="360"/>
+      </w:pPr>
+      <w:rPr>
+        <w:rFonts w:ascii="Courier New" w:hAnsi="Courier New" w:cs="Courier New" w:hint="default"/>
+      </w:rPr>
+    </w:lvl>
+    <w:lvl w:ilvl="8" w:tplc="08100005" w:tentative="1">
+      <w:start w:val="1"/>
+      <w:numFmt w:val="bullet"/>
+      <w:lvlText w:val=""/>
+      <w:lvlJc w:val="left"/>
+      <w:pPr>
+        <w:ind w:left="6480" w:hanging="360"/>
+      </w:pPr>
+      <w:rPr>
+        <w:rFonts w:ascii="Wingdings" w:hAnsi="Wingdings" w:hint="default"/>
+      </w:rPr>
+    </w:lvl>
+  </w:abstractNum>
+  <w:abstractNum w:abstractNumId="12" w15:restartNumberingAfterBreak="0">
+    <w:nsid w:val="315014C7"/>
+    <w:multiLevelType w:val="hybridMultilevel"/>
+    <w:tmpl w:val="8EF271A0"/>
+    <w:lvl w:ilvl="0" w:tplc="08100001">
+      <w:start w:val="1"/>
+      <w:numFmt w:val="bullet"/>
+      <w:lvlText w:val=""/>
+      <w:lvlJc w:val="left"/>
+      <w:pPr>
+        <w:ind w:left="720" w:hanging="360"/>
+      </w:pPr>
+      <w:rPr>
+        <w:rFonts w:ascii="Symbol" w:hAnsi="Symbol" w:hint="default"/>
+      </w:rPr>
+    </w:lvl>
+    <w:lvl w:ilvl="1" w:tplc="08100003" w:tentative="1">
+      <w:start w:val="1"/>
+      <w:numFmt w:val="bullet"/>
+      <w:lvlText w:val="o"/>
+      <w:lvlJc w:val="left"/>
+      <w:pPr>
+        <w:ind w:left="1440" w:hanging="360"/>
+      </w:pPr>
+      <w:rPr>
+        <w:rFonts w:ascii="Courier New" w:hAnsi="Courier New" w:cs="Courier New" w:hint="default"/>
+      </w:rPr>
+    </w:lvl>
+    <w:lvl w:ilvl="2" w:tplc="08100005" w:tentative="1">
+      <w:start w:val="1"/>
+      <w:numFmt w:val="bullet"/>
+      <w:lvlText w:val=""/>
+      <w:lvlJc w:val="left"/>
+      <w:pPr>
+        <w:ind w:left="2160" w:hanging="360"/>
+      </w:pPr>
+      <w:rPr>
+        <w:rFonts w:ascii="Wingdings" w:hAnsi="Wingdings" w:hint="default"/>
+      </w:rPr>
+    </w:lvl>
+    <w:lvl w:ilvl="3" w:tplc="08100001" w:tentative="1">
+      <w:start w:val="1"/>
+      <w:numFmt w:val="bullet"/>
+      <w:lvlText w:val=""/>
+      <w:lvlJc w:val="left"/>
+      <w:pPr>
+        <w:ind w:left="2880" w:hanging="360"/>
+      </w:pPr>
+      <w:rPr>
+        <w:rFonts w:ascii="Symbol" w:hAnsi="Symbol" w:hint="default"/>
+      </w:rPr>
+    </w:lvl>
+    <w:lvl w:ilvl="4" w:tplc="08100003" w:tentative="1">
+      <w:start w:val="1"/>
+      <w:numFmt w:val="bullet"/>
+      <w:lvlText w:val="o"/>
+      <w:lvlJc w:val="left"/>
+      <w:pPr>
+        <w:ind w:left="3600" w:hanging="360"/>
+      </w:pPr>
+      <w:rPr>
+        <w:rFonts w:ascii="Courier New" w:hAnsi="Courier New" w:cs="Courier New" w:hint="default"/>
+      </w:rPr>
+    </w:lvl>
+    <w:lvl w:ilvl="5" w:tplc="08100005" w:tentative="1">
+      <w:start w:val="1"/>
+      <w:numFmt w:val="bullet"/>
+      <w:lvlText w:val=""/>
+      <w:lvlJc w:val="left"/>
+      <w:pPr>
+        <w:ind w:left="4320" w:hanging="360"/>
+      </w:pPr>
+      <w:rPr>
+        <w:rFonts w:ascii="Wingdings" w:hAnsi="Wingdings" w:hint="default"/>
+      </w:rPr>
+    </w:lvl>
+    <w:lvl w:ilvl="6" w:tplc="08100001" w:tentative="1">
+      <w:start w:val="1"/>
+      <w:numFmt w:val="bullet"/>
+      <w:lvlText w:val=""/>
+      <w:lvlJc w:val="left"/>
+      <w:pPr>
+        <w:ind w:left="5040" w:hanging="360"/>
+      </w:pPr>
+      <w:rPr>
+        <w:rFonts w:ascii="Symbol" w:hAnsi="Symbol" w:hint="default"/>
+      </w:rPr>
+    </w:lvl>
+    <w:lvl w:ilvl="7" w:tplc="08100003" w:tentative="1">
+      <w:start w:val="1"/>
+      <w:numFmt w:val="bullet"/>
+      <w:lvlText w:val="o"/>
+      <w:lvlJc w:val="left"/>
+      <w:pPr>
+        <w:ind w:left="5760" w:hanging="360"/>
+      </w:pPr>
+      <w:rPr>
+        <w:rFonts w:ascii="Courier New" w:hAnsi="Courier New" w:cs="Courier New" w:hint="default"/>
+      </w:rPr>
+    </w:lvl>
+    <w:lvl w:ilvl="8" w:tplc="08100005" w:tentative="1">
+      <w:start w:val="1"/>
+      <w:numFmt w:val="bullet"/>
+      <w:lvlText w:val=""/>
+      <w:lvlJc w:val="left"/>
+      <w:pPr>
+        <w:ind w:left="6480" w:hanging="360"/>
+      </w:pPr>
+      <w:rPr>
+        <w:rFonts w:ascii="Wingdings" w:hAnsi="Wingdings" w:hint="default"/>
+      </w:rPr>
+    </w:lvl>
+  </w:abstractNum>
+  <w:abstractNum w:abstractNumId="13" w15:restartNumberingAfterBreak="0">
     <w:nsid w:val="57C86EE7"/>
     <w:multiLevelType w:val="multilevel"/>
     <w:tmpl w:val="4DE6CDEC"/>
@@ -12137,7 +14380,7 @@
       </w:rPr>
     </w:lvl>
   </w:abstractNum>
-  <w:abstractNum w:abstractNumId="11" w15:restartNumberingAfterBreak="0">
+  <w:abstractNum w:abstractNumId="14" w15:restartNumberingAfterBreak="0">
     <w:nsid w:val="652809B9"/>
     <w:multiLevelType w:val="hybridMultilevel"/>
     <w:tmpl w:val="C10EC632"/>
@@ -12250,7 +14493,7 @@
       </w:rPr>
     </w:lvl>
   </w:abstractNum>
-  <w:abstractNum w:abstractNumId="12" w15:restartNumberingAfterBreak="0">
+  <w:abstractNum w:abstractNumId="15" w15:restartNumberingAfterBreak="0">
     <w:nsid w:val="66871ECE"/>
     <w:multiLevelType w:val="hybridMultilevel"/>
     <w:tmpl w:val="7F74FC56"/>
@@ -12366,7 +14609,120 @@
       </w:pPr>
     </w:lvl>
   </w:abstractNum>
-  <w:abstractNum w:abstractNumId="13" w15:restartNumberingAfterBreak="0">
+  <w:abstractNum w:abstractNumId="16" w15:restartNumberingAfterBreak="0">
+    <w:nsid w:val="685C5D5D"/>
+    <w:multiLevelType w:val="hybridMultilevel"/>
+    <w:tmpl w:val="26F286B8"/>
+    <w:lvl w:ilvl="0" w:tplc="08100001">
+      <w:start w:val="1"/>
+      <w:numFmt w:val="bullet"/>
+      <w:lvlText w:val=""/>
+      <w:lvlJc w:val="left"/>
+      <w:pPr>
+        <w:ind w:left="720" w:hanging="360"/>
+      </w:pPr>
+      <w:rPr>
+        <w:rFonts w:ascii="Symbol" w:hAnsi="Symbol" w:hint="default"/>
+      </w:rPr>
+    </w:lvl>
+    <w:lvl w:ilvl="1" w:tplc="08100003" w:tentative="1">
+      <w:start w:val="1"/>
+      <w:numFmt w:val="bullet"/>
+      <w:lvlText w:val="o"/>
+      <w:lvlJc w:val="left"/>
+      <w:pPr>
+        <w:ind w:left="1440" w:hanging="360"/>
+      </w:pPr>
+      <w:rPr>
+        <w:rFonts w:ascii="Courier New" w:hAnsi="Courier New" w:cs="Courier New" w:hint="default"/>
+      </w:rPr>
+    </w:lvl>
+    <w:lvl w:ilvl="2" w:tplc="08100005" w:tentative="1">
+      <w:start w:val="1"/>
+      <w:numFmt w:val="bullet"/>
+      <w:lvlText w:val=""/>
+      <w:lvlJc w:val="left"/>
+      <w:pPr>
+        <w:ind w:left="2160" w:hanging="360"/>
+      </w:pPr>
+      <w:rPr>
+        <w:rFonts w:ascii="Wingdings" w:hAnsi="Wingdings" w:hint="default"/>
+      </w:rPr>
+    </w:lvl>
+    <w:lvl w:ilvl="3" w:tplc="08100001" w:tentative="1">
+      <w:start w:val="1"/>
+      <w:numFmt w:val="bullet"/>
+      <w:lvlText w:val=""/>
+      <w:lvlJc w:val="left"/>
+      <w:pPr>
+        <w:ind w:left="2880" w:hanging="360"/>
+      </w:pPr>
+      <w:rPr>
+        <w:rFonts w:ascii="Symbol" w:hAnsi="Symbol" w:hint="default"/>
+      </w:rPr>
+    </w:lvl>
+    <w:lvl w:ilvl="4" w:tplc="08100003" w:tentative="1">
+      <w:start w:val="1"/>
+      <w:numFmt w:val="bullet"/>
+      <w:lvlText w:val="o"/>
+      <w:lvlJc w:val="left"/>
+      <w:pPr>
+        <w:ind w:left="3600" w:hanging="360"/>
+      </w:pPr>
+      <w:rPr>
+        <w:rFonts w:ascii="Courier New" w:hAnsi="Courier New" w:cs="Courier New" w:hint="default"/>
+      </w:rPr>
+    </w:lvl>
+    <w:lvl w:ilvl="5" w:tplc="08100005" w:tentative="1">
+      <w:start w:val="1"/>
+      <w:numFmt w:val="bullet"/>
+      <w:lvlText w:val=""/>
+      <w:lvlJc w:val="left"/>
+      <w:pPr>
+        <w:ind w:left="4320" w:hanging="360"/>
+      </w:pPr>
+      <w:rPr>
+        <w:rFonts w:ascii="Wingdings" w:hAnsi="Wingdings" w:hint="default"/>
+      </w:rPr>
+    </w:lvl>
+    <w:lvl w:ilvl="6" w:tplc="08100001" w:tentative="1">
+      <w:start w:val="1"/>
+      <w:numFmt w:val="bullet"/>
+      <w:lvlText w:val=""/>
+      <w:lvlJc w:val="left"/>
+      <w:pPr>
+        <w:ind w:left="5040" w:hanging="360"/>
+      </w:pPr>
+      <w:rPr>
+        <w:rFonts w:ascii="Symbol" w:hAnsi="Symbol" w:hint="default"/>
+      </w:rPr>
+    </w:lvl>
+    <w:lvl w:ilvl="7" w:tplc="08100003" w:tentative="1">
+      <w:start w:val="1"/>
+      <w:numFmt w:val="bullet"/>
+      <w:lvlText w:val="o"/>
+      <w:lvlJc w:val="left"/>
+      <w:pPr>
+        <w:ind w:left="5760" w:hanging="360"/>
+      </w:pPr>
+      <w:rPr>
+        <w:rFonts w:ascii="Courier New" w:hAnsi="Courier New" w:cs="Courier New" w:hint="default"/>
+      </w:rPr>
+    </w:lvl>
+    <w:lvl w:ilvl="8" w:tplc="08100005" w:tentative="1">
+      <w:start w:val="1"/>
+      <w:numFmt w:val="bullet"/>
+      <w:lvlText w:val=""/>
+      <w:lvlJc w:val="left"/>
+      <w:pPr>
+        <w:ind w:left="6480" w:hanging="360"/>
+      </w:pPr>
+      <w:rPr>
+        <w:rFonts w:ascii="Wingdings" w:hAnsi="Wingdings" w:hint="default"/>
+      </w:rPr>
+    </w:lvl>
+  </w:abstractNum>
+  <w:abstractNum w:abstractNumId="17" w15:restartNumberingAfterBreak="0">
     <w:nsid w:val="6ABE5228"/>
     <w:multiLevelType w:val="hybridMultilevel"/>
     <w:tmpl w:val="089EE6D8"/>
@@ -12482,7 +14838,7 @@
       </w:pPr>
     </w:lvl>
   </w:abstractNum>
-  <w:abstractNum w:abstractNumId="14" w15:restartNumberingAfterBreak="0">
+  <w:abstractNum w:abstractNumId="18" w15:restartNumberingAfterBreak="0">
     <w:nsid w:val="6C1D7334"/>
     <w:multiLevelType w:val="hybridMultilevel"/>
     <w:tmpl w:val="7F20929C"/>
@@ -12598,7 +14954,7 @@
       </w:pPr>
     </w:lvl>
   </w:abstractNum>
-  <w:abstractNum w:abstractNumId="15" w15:restartNumberingAfterBreak="0">
+  <w:abstractNum w:abstractNumId="19" w15:restartNumberingAfterBreak="0">
     <w:nsid w:val="72904C79"/>
     <w:multiLevelType w:val="hybridMultilevel"/>
     <w:tmpl w:val="EB328896"/>
@@ -12738,7 +15094,7 @@
       </w:rPr>
     </w:lvl>
   </w:abstractNum>
-  <w:abstractNum w:abstractNumId="16" w15:restartNumberingAfterBreak="0">
+  <w:abstractNum w:abstractNumId="20" w15:restartNumberingAfterBreak="0">
     <w:nsid w:val="7ACC392C"/>
     <w:multiLevelType w:val="hybridMultilevel"/>
     <w:tmpl w:val="F282F7F0"/>
@@ -12878,7 +15234,7 @@
       </w:rPr>
     </w:lvl>
   </w:abstractNum>
-  <w:abstractNum w:abstractNumId="17" w15:restartNumberingAfterBreak="0">
+  <w:abstractNum w:abstractNumId="21" w15:restartNumberingAfterBreak="0">
     <w:nsid w:val="7CD54937"/>
     <w:multiLevelType w:val="hybridMultilevel"/>
     <w:tmpl w:val="1AB0305A"/>
@@ -13018,8 +15374,121 @@
       </w:rPr>
     </w:lvl>
   </w:abstractNum>
+  <w:abstractNum w:abstractNumId="22" w15:restartNumberingAfterBreak="0">
+    <w:nsid w:val="7D5574AA"/>
+    <w:multiLevelType w:val="hybridMultilevel"/>
+    <w:tmpl w:val="D5A0E058"/>
+    <w:lvl w:ilvl="0" w:tplc="08100001">
+      <w:start w:val="1"/>
+      <w:numFmt w:val="bullet"/>
+      <w:lvlText w:val=""/>
+      <w:lvlJc w:val="left"/>
+      <w:pPr>
+        <w:ind w:left="720" w:hanging="360"/>
+      </w:pPr>
+      <w:rPr>
+        <w:rFonts w:ascii="Symbol" w:hAnsi="Symbol" w:hint="default"/>
+      </w:rPr>
+    </w:lvl>
+    <w:lvl w:ilvl="1" w:tplc="08100003" w:tentative="1">
+      <w:start w:val="1"/>
+      <w:numFmt w:val="bullet"/>
+      <w:lvlText w:val="o"/>
+      <w:lvlJc w:val="left"/>
+      <w:pPr>
+        <w:ind w:left="1440" w:hanging="360"/>
+      </w:pPr>
+      <w:rPr>
+        <w:rFonts w:ascii="Courier New" w:hAnsi="Courier New" w:cs="Courier New" w:hint="default"/>
+      </w:rPr>
+    </w:lvl>
+    <w:lvl w:ilvl="2" w:tplc="08100005" w:tentative="1">
+      <w:start w:val="1"/>
+      <w:numFmt w:val="bullet"/>
+      <w:lvlText w:val=""/>
+      <w:lvlJc w:val="left"/>
+      <w:pPr>
+        <w:ind w:left="2160" w:hanging="360"/>
+      </w:pPr>
+      <w:rPr>
+        <w:rFonts w:ascii="Wingdings" w:hAnsi="Wingdings" w:hint="default"/>
+      </w:rPr>
+    </w:lvl>
+    <w:lvl w:ilvl="3" w:tplc="08100001" w:tentative="1">
+      <w:start w:val="1"/>
+      <w:numFmt w:val="bullet"/>
+      <w:lvlText w:val=""/>
+      <w:lvlJc w:val="left"/>
+      <w:pPr>
+        <w:ind w:left="2880" w:hanging="360"/>
+      </w:pPr>
+      <w:rPr>
+        <w:rFonts w:ascii="Symbol" w:hAnsi="Symbol" w:hint="default"/>
+      </w:rPr>
+    </w:lvl>
+    <w:lvl w:ilvl="4" w:tplc="08100003" w:tentative="1">
+      <w:start w:val="1"/>
+      <w:numFmt w:val="bullet"/>
+      <w:lvlText w:val="o"/>
+      <w:lvlJc w:val="left"/>
+      <w:pPr>
+        <w:ind w:left="3600" w:hanging="360"/>
+      </w:pPr>
+      <w:rPr>
+        <w:rFonts w:ascii="Courier New" w:hAnsi="Courier New" w:cs="Courier New" w:hint="default"/>
+      </w:rPr>
+    </w:lvl>
+    <w:lvl w:ilvl="5" w:tplc="08100005" w:tentative="1">
+      <w:start w:val="1"/>
+      <w:numFmt w:val="bullet"/>
+      <w:lvlText w:val=""/>
+      <w:lvlJc w:val="left"/>
+      <w:pPr>
+        <w:ind w:left="4320" w:hanging="360"/>
+      </w:pPr>
+      <w:rPr>
+        <w:rFonts w:ascii="Wingdings" w:hAnsi="Wingdings" w:hint="default"/>
+      </w:rPr>
+    </w:lvl>
+    <w:lvl w:ilvl="6" w:tplc="08100001" w:tentative="1">
+      <w:start w:val="1"/>
+      <w:numFmt w:val="bullet"/>
+      <w:lvlText w:val=""/>
+      <w:lvlJc w:val="left"/>
+      <w:pPr>
+        <w:ind w:left="5040" w:hanging="360"/>
+      </w:pPr>
+      <w:rPr>
+        <w:rFonts w:ascii="Symbol" w:hAnsi="Symbol" w:hint="default"/>
+      </w:rPr>
+    </w:lvl>
+    <w:lvl w:ilvl="7" w:tplc="08100003" w:tentative="1">
+      <w:start w:val="1"/>
+      <w:numFmt w:val="bullet"/>
+      <w:lvlText w:val="o"/>
+      <w:lvlJc w:val="left"/>
+      <w:pPr>
+        <w:ind w:left="5760" w:hanging="360"/>
+      </w:pPr>
+      <w:rPr>
+        <w:rFonts w:ascii="Courier New" w:hAnsi="Courier New" w:cs="Courier New" w:hint="default"/>
+      </w:rPr>
+    </w:lvl>
+    <w:lvl w:ilvl="8" w:tplc="08100005" w:tentative="1">
+      <w:start w:val="1"/>
+      <w:numFmt w:val="bullet"/>
+      <w:lvlText w:val=""/>
+      <w:lvlJc w:val="left"/>
+      <w:pPr>
+        <w:ind w:left="6480" w:hanging="360"/>
+      </w:pPr>
+      <w:rPr>
+        <w:rFonts w:ascii="Wingdings" w:hAnsi="Wingdings" w:hint="default"/>
+      </w:rPr>
+    </w:lvl>
+  </w:abstractNum>
   <w:num w:numId="1" w16cid:durableId="1807433898">
-    <w:abstractNumId w:val="10"/>
+    <w:abstractNumId w:val="13"/>
   </w:num>
   <w:num w:numId="2" w16cid:durableId="1229416228">
     <w:abstractNumId w:val="3"/>
@@ -13034,22 +15503,22 @@
     <w:abstractNumId w:val="4"/>
   </w:num>
   <w:num w:numId="6" w16cid:durableId="716659202">
-    <w:abstractNumId w:val="12"/>
+    <w:abstractNumId w:val="15"/>
   </w:num>
   <w:num w:numId="7" w16cid:durableId="231933957">
     <w:abstractNumId w:val="8"/>
   </w:num>
   <w:num w:numId="8" w16cid:durableId="633213171">
-    <w:abstractNumId w:val="13"/>
+    <w:abstractNumId w:val="17"/>
   </w:num>
   <w:num w:numId="9" w16cid:durableId="11107505">
     <w:abstractNumId w:val="0"/>
   </w:num>
   <w:num w:numId="10" w16cid:durableId="789469116">
-    <w:abstractNumId w:val="15"/>
+    <w:abstractNumId w:val="19"/>
   </w:num>
   <w:num w:numId="11" w16cid:durableId="329798610">
-    <w:abstractNumId w:val="16"/>
+    <w:abstractNumId w:val="20"/>
   </w:num>
   <w:num w:numId="12" w16cid:durableId="1410468206">
     <w:abstractNumId w:val="5"/>
@@ -13058,42 +15527,57 @@
     <w:abstractNumId w:val="2"/>
   </w:num>
   <w:num w:numId="14" w16cid:durableId="2015449096">
-    <w:abstractNumId w:val="17"/>
+    <w:abstractNumId w:val="21"/>
   </w:num>
   <w:num w:numId="15" w16cid:durableId="735469310">
     <w:abstractNumId w:val="6"/>
   </w:num>
   <w:num w:numId="16" w16cid:durableId="1502694927">
+    <w:abstractNumId w:val="13"/>
+  </w:num>
+  <w:num w:numId="17" w16cid:durableId="1431507366">
+    <w:abstractNumId w:val="18"/>
+  </w:num>
+  <w:num w:numId="18" w16cid:durableId="1965844199">
+    <w:abstractNumId w:val="13"/>
+  </w:num>
+  <w:num w:numId="19" w16cid:durableId="1358971171">
+    <w:abstractNumId w:val="13"/>
+  </w:num>
+  <w:num w:numId="20" w16cid:durableId="356810042">
+    <w:abstractNumId w:val="13"/>
+  </w:num>
+  <w:num w:numId="21" w16cid:durableId="1186866037">
+    <w:abstractNumId w:val="13"/>
+  </w:num>
+  <w:num w:numId="22" w16cid:durableId="2096321288">
+    <w:abstractNumId w:val="13"/>
+  </w:num>
+  <w:num w:numId="23" w16cid:durableId="1157069902">
+    <w:abstractNumId w:val="14"/>
+  </w:num>
+  <w:num w:numId="24" w16cid:durableId="65689514">
+    <w:abstractNumId w:val="13"/>
+  </w:num>
+  <w:num w:numId="25" w16cid:durableId="716979287">
+    <w:abstractNumId w:val="13"/>
+  </w:num>
+  <w:num w:numId="26" w16cid:durableId="1218320756">
     <w:abstractNumId w:val="10"/>
   </w:num>
-  <w:num w:numId="17" w16cid:durableId="1431507366">
-    <w:abstractNumId w:val="14"/>
+  <w:num w:numId="27" w16cid:durableId="41252139">
+    <w:abstractNumId w:val="12"/>
   </w:num>
-  <w:num w:numId="18" w16cid:durableId="1965844199">
-    <w:abstractNumId w:val="10"/>
-  </w:num>
-  <w:num w:numId="19" w16cid:durableId="1358971171">
-    <w:abstractNumId w:val="10"/>
-  </w:num>
-  <w:num w:numId="20" w16cid:durableId="356810042">
-    <w:abstractNumId w:val="10"/>
-  </w:num>
-  <w:num w:numId="21" w16cid:durableId="1186866037">
-    <w:abstractNumId w:val="10"/>
-  </w:num>
-  <w:num w:numId="22" w16cid:durableId="2096321288">
-    <w:abstractNumId w:val="10"/>
-  </w:num>
-  <w:num w:numId="23" w16cid:durableId="1157069902">
+  <w:num w:numId="28" w16cid:durableId="1495098295">
     <w:abstractNumId w:val="11"/>
   </w:num>
-  <w:num w:numId="24" w16cid:durableId="65689514">
-    <w:abstractNumId w:val="10"/>
+  <w:num w:numId="29" w16cid:durableId="1416171833">
+    <w:abstractNumId w:val="16"/>
   </w:num>
-  <w:num w:numId="25" w16cid:durableId="716979287">
-    <w:abstractNumId w:val="10"/>
+  <w:num w:numId="30" w16cid:durableId="1380089303">
+    <w:abstractNumId w:val="22"/>
   </w:num>
-  <w:num w:numId="26" w16cid:durableId="1218320756">
+  <w:num w:numId="31" w16cid:durableId="1125347636">
     <w:abstractNumId w:val="9"/>
   </w:num>
   <w:numIdMacAtCleanup w:val="14"/>
@@ -14029,6 +16513,17 @@
       <w:lang w:eastAsia="it-IT"/>
     </w:rPr>
   </w:style>
+  <w:style w:type="paragraph" w:styleId="Paragrafoelenco">
+    <w:name w:val="List Paragraph"/>
+    <w:basedOn w:val="Normale"/>
+    <w:uiPriority w:val="34"/>
+    <w:qFormat/>
+    <w:rsid w:val="00802A75"/>
+    <w:pPr>
+      <w:ind w:left="720"/>
+      <w:contextualSpacing/>
+    </w:pPr>
+  </w:style>
 </w:styles>
 </file>
 

</xml_diff>

<commit_message>
doc: use case diagram
</commit_message>
<xml_diff>
--- a/3_Documentazione/Documentazione_X2SevenVault_Christian_Arzani.docx
+++ b/3_Documentazione/Documentazione_X2SevenVault_Christian_Arzani.docx
@@ -7163,34 +7163,138 @@
       <w:bookmarkEnd w:id="6"/>
     </w:p>
     <w:p>
-      <w:pPr>
-        <w:rPr>
-          <w:lang w:val="it-IT"/>
-        </w:rPr>
-      </w:pPr>
-      <w:r>
-        <w:rPr>
-          <w:lang w:val="it-IT"/>
-        </w:rPr>
-        <w:t xml:space="preserve">I casi d’uso rappresentano l’interazione tra i vari </w:t>
-      </w:r>
-      <w:r>
-        <w:rPr>
-          <w:lang w:val="it-IT"/>
-        </w:rPr>
-        <w:t>attori e le funzionalità</w:t>
-      </w:r>
-      <w:r>
-        <w:rPr>
-          <w:lang w:val="it-IT"/>
-        </w:rPr>
-        <w:t xml:space="preserve"> del prodotto</w:t>
-      </w:r>
-      <w:r>
-        <w:rPr>
-          <w:lang w:val="it-IT"/>
-        </w:rPr>
-        <w:t>.</w:t>
+      <w:r>
+        <w:t>Dal seguente schema possiamo osservare i casi d’uso principali del sistema X2SevenVault, che coinvolge tre attori umani (admin, magazziniere, guest) e il componente IA per il riconoscimento degli oggetti.</w:t>
+      </w:r>
+      <w:r>
+        <w:t xml:space="preserve"> Gli utenti autenticati (admin e magazziniere) possono accedere ai sistemi di gestione mentre gli utenti non registrati (guest) possono scansionare oggetti, visualizzarne il risultato e visualizzare tutti gli oggetti.</w:t>
+      </w:r>
+    </w:p>
+    <w:p>
+      <w:pPr>
+        <w:keepNext/>
+        <w:spacing w:before="240"/>
+        <w:jc w:val="center"/>
+      </w:pPr>
+      <w:r>
+        <w:rPr>
+          <w:noProof/>
+        </w:rPr>
+        <w:drawing>
+          <wp:inline distT="0" distB="0" distL="0" distR="0" wp14:anchorId="0DFD9109" wp14:editId="02C55DEC">
+            <wp:extent cx="5923966" cy="3922218"/>
+            <wp:effectExtent l="114300" t="114300" r="114935" b="116840"/>
+            <wp:docPr id="8" name="Immagine 8"/>
+            <wp:cNvGraphicFramePr>
+              <a:graphicFrameLocks xmlns:a="http://schemas.openxmlformats.org/drawingml/2006/main" noChangeAspect="1"/>
+            </wp:cNvGraphicFramePr>
+            <a:graphic xmlns:a="http://schemas.openxmlformats.org/drawingml/2006/main">
+              <a:graphicData uri="http://schemas.openxmlformats.org/drawingml/2006/picture">
+                <pic:pic xmlns:pic="http://schemas.openxmlformats.org/drawingml/2006/picture">
+                  <pic:nvPicPr>
+                    <pic:cNvPr id="0" name="Picture 1"/>
+                    <pic:cNvPicPr>
+                      <a:picLocks noChangeAspect="1" noChangeArrowheads="1"/>
+                    </pic:cNvPicPr>
+                  </pic:nvPicPr>
+                  <pic:blipFill>
+                    <a:blip r:embed="rId8">
+                      <a:extLst>
+                        <a:ext uri="{28A0092B-C50C-407E-A947-70E740481C1C}">
+                          <a14:useLocalDpi xmlns:a14="http://schemas.microsoft.com/office/drawing/2010/main" val="0"/>
+                        </a:ext>
+                      </a:extLst>
+                    </a:blip>
+                    <a:srcRect/>
+                    <a:stretch>
+                      <a:fillRect/>
+                    </a:stretch>
+                  </pic:blipFill>
+                  <pic:spPr bwMode="auto">
+                    <a:xfrm>
+                      <a:off x="0" y="0"/>
+                      <a:ext cx="5925739" cy="3923392"/>
+                    </a:xfrm>
+                    <a:prstGeom prst="rect">
+                      <a:avLst/>
+                    </a:prstGeom>
+                    <a:noFill/>
+                    <a:ln>
+                      <a:noFill/>
+                    </a:ln>
+                    <a:effectLst>
+                      <a:outerShdw blurRad="63500" sx="102000" sy="102000" algn="ctr" rotWithShape="0">
+                        <a:prstClr val="black">
+                          <a:alpha val="40000"/>
+                        </a:prstClr>
+                      </a:outerShdw>
+                    </a:effectLst>
+                  </pic:spPr>
+                </pic:pic>
+              </a:graphicData>
+            </a:graphic>
+          </wp:inline>
+        </w:drawing>
+      </w:r>
+    </w:p>
+    <w:p>
+      <w:pPr>
+        <w:pStyle w:val="Didascalia"/>
+        <w:jc w:val="center"/>
+        <w:rPr>
+          <w:i/>
+          <w:iCs/>
+        </w:rPr>
+      </w:pPr>
+      <w:r>
+        <w:rPr>
+          <w:i/>
+          <w:iCs/>
+        </w:rPr>
+        <w:t xml:space="preserve">Figura </w:t>
+      </w:r>
+      <w:r>
+        <w:rPr>
+          <w:i/>
+          <w:iCs/>
+        </w:rPr>
+        <w:fldChar w:fldCharType="begin"/>
+      </w:r>
+      <w:r>
+        <w:rPr>
+          <w:i/>
+          <w:iCs/>
+        </w:rPr>
+        <w:instrText xml:space="preserve"> SEQ Figura \* ARABIC </w:instrText>
+      </w:r>
+      <w:r>
+        <w:rPr>
+          <w:i/>
+          <w:iCs/>
+        </w:rPr>
+        <w:fldChar w:fldCharType="separate"/>
+      </w:r>
+      <w:r>
+        <w:rPr>
+          <w:i/>
+          <w:iCs/>
+          <w:noProof/>
+        </w:rPr>
+        <w:t>1</w:t>
+      </w:r>
+      <w:r>
+        <w:rPr>
+          <w:i/>
+          <w:iCs/>
+        </w:rPr>
+        <w:fldChar w:fldCharType="end"/>
+      </w:r>
+      <w:r>
+        <w:rPr>
+          <w:i/>
+          <w:iCs/>
+        </w:rPr>
+        <w:t xml:space="preserve"> - Use case</w:t>
       </w:r>
     </w:p>
     <w:p>
@@ -7355,7 +7459,7 @@
                     <pic:cNvPicPr/>
                   </pic:nvPicPr>
                   <pic:blipFill>
-                    <a:blip r:embed="rId8"/>
+                    <a:blip r:embed="rId9"/>
                     <a:stretch>
                       <a:fillRect/>
                     </a:stretch>
@@ -7426,7 +7530,7 @@
           <w:iCs/>
           <w:noProof/>
         </w:rPr>
-        <w:t>1</w:t>
+        <w:t>2</w:t>
       </w:r>
       <w:r>
         <w:rPr>
@@ -7550,7 +7654,7 @@
                     <pic:cNvPicPr/>
                   </pic:nvPicPr>
                   <pic:blipFill>
-                    <a:blip r:embed="rId9"/>
+                    <a:blip r:embed="rId10"/>
                     <a:stretch>
                       <a:fillRect/>
                     </a:stretch>
@@ -7621,7 +7725,7 @@
           <w:iCs/>
           <w:noProof/>
         </w:rPr>
-        <w:t>2</w:t>
+        <w:t>3</w:t>
       </w:r>
       <w:r>
         <w:rPr>
@@ -7736,7 +7840,7 @@
                     <pic:cNvPicPr/>
                   </pic:nvPicPr>
                   <pic:blipFill>
-                    <a:blip r:embed="rId10"/>
+                    <a:blip r:embed="rId11"/>
                     <a:stretch>
                       <a:fillRect/>
                     </a:stretch>
@@ -7807,7 +7911,7 @@
           <w:iCs/>
           <w:noProof/>
         </w:rPr>
-        <w:t>3</w:t>
+        <w:t>4</w:t>
       </w:r>
       <w:r>
         <w:rPr>
@@ -7901,7 +8005,7 @@
                     <pic:cNvPicPr/>
                   </pic:nvPicPr>
                   <pic:blipFill>
-                    <a:blip r:embed="rId11"/>
+                    <a:blip r:embed="rId12"/>
                     <a:stretch>
                       <a:fillRect/>
                     </a:stretch>
@@ -7976,7 +8080,7 @@
           <w:noProof/>
           <w:lang w:val="de-CH"/>
         </w:rPr>
-        <w:t>4</w:t>
+        <w:t>5</w:t>
       </w:r>
       <w:r>
         <w:rPr>
@@ -8055,7 +8159,7 @@
                     <pic:cNvPicPr/>
                   </pic:nvPicPr>
                   <pic:blipFill>
-                    <a:blip r:embed="rId12"/>
+                    <a:blip r:embed="rId13"/>
                     <a:stretch>
                       <a:fillRect/>
                     </a:stretch>
@@ -8126,7 +8230,7 @@
           <w:iCs/>
           <w:noProof/>
         </w:rPr>
-        <w:t>5</w:t>
+        <w:t>6</w:t>
       </w:r>
       <w:r>
         <w:rPr>
@@ -11632,10 +11736,10 @@
       </w:pPr>
     </w:p>
     <w:sectPr>
-      <w:headerReference w:type="default" r:id="rId13"/>
-      <w:footerReference w:type="default" r:id="rId14"/>
-      <w:headerReference w:type="first" r:id="rId15"/>
-      <w:footerReference w:type="first" r:id="rId16"/>
+      <w:headerReference w:type="default" r:id="rId14"/>
+      <w:footerReference w:type="default" r:id="rId15"/>
+      <w:headerReference w:type="first" r:id="rId16"/>
+      <w:footerReference w:type="first" r:id="rId17"/>
       <w:pgSz w:w="11906" w:h="16838"/>
       <w:pgMar w:top="1985" w:right="1134" w:bottom="1418" w:left="1134" w:header="567" w:footer="567" w:gutter="0"/>
       <w:pgNumType w:start="1"/>

</xml_diff>

<commit_message>
doc: complete ER diagram and class diagram
</commit_message>
<xml_diff>
--- a/3_Documentazione/Documentazione_X2SevenVault_Christian_Arzani.docx
+++ b/3_Documentazione/Documentazione_X2SevenVault_Christian_Arzani.docx
@@ -67,7 +67,11 @@
     <w:sdt>
       <w:sdtPr>
         <w:rPr>
-          <w:lang w:val="it-IT"/>
+          <w:rFonts w:ascii="Arial" w:eastAsia="Times New Roman" w:hAnsi="Arial" w:cs="Times New Roman"/>
+          <w:color w:val="auto"/>
+          <w:sz w:val="20"/>
+          <w:szCs w:val="20"/>
+          <w:lang w:val="it-IT" w:eastAsia="it-IT"/>
         </w:rPr>
         <w:id w:val="-496493174"/>
         <w:docPartObj>
@@ -77,13 +81,8 @@
       </w:sdtPr>
       <w:sdtEndPr>
         <w:rPr>
-          <w:rFonts w:ascii="Arial" w:eastAsia="Times New Roman" w:hAnsi="Arial" w:cs="Times New Roman"/>
           <w:b/>
           <w:bCs/>
-          <w:color w:val="auto"/>
-          <w:sz w:val="20"/>
-          <w:szCs w:val="20"/>
-          <w:lang w:eastAsia="it-IT"/>
         </w:rPr>
       </w:sdtEndPr>
       <w:sdtContent>
@@ -9476,39 +9475,304 @@
         <w:rPr>
           <w:lang w:val="it-IT"/>
         </w:rPr>
-        <w:t xml:space="preserve">Descrizione delle strutture di dati utilizzate dal programma in base agli attributi e le </w:t>
-      </w:r>
-      <w:r>
-        <w:rPr>
-          <w:lang w:val="it-IT"/>
-        </w:rPr>
-        <w:t>relazioni degli oggetti in uso.</w:t>
-      </w:r>
-    </w:p>
-    <w:p>
-      <w:pPr>
-        <w:rPr>
-          <w:lang w:val="it-IT"/>
-        </w:rPr>
-      </w:pPr>
-      <w:r>
-        <w:rPr>
-          <w:lang w:val="it-IT"/>
-        </w:rPr>
-        <w:t>Schema E-R, schema logico e descrizione.</w:t>
-      </w:r>
-    </w:p>
-    <w:p>
-      <w:pPr>
-        <w:rPr>
-          <w:lang w:val="it-IT"/>
-        </w:rPr>
-      </w:pPr>
-      <w:r>
-        <w:rPr>
-          <w:lang w:val="it-IT"/>
-        </w:rPr>
-        <w:t>Se il diagramma E-R viene modificato, sulla doc dovrà apparire l’ultima versione, mentre le vecchie saranno sui diari.</w:t>
+        <w:t>Per la gestione dei dati è stato adottato Firestore, ovvero un database non relazionale a oggetti. Inizialmente, in fase di progettazione, la struttura del database è stata concepita come relazionale definendo uno schema ER per poi passare a un diagramma di classi, siccome Firestore lavora con file JSON e quindi a oggetti.</w:t>
+      </w:r>
+    </w:p>
+    <w:p>
+      <w:pPr>
+        <w:spacing w:before="240"/>
+        <w:rPr>
+          <w:b/>
+          <w:bCs/>
+          <w:lang w:val="it-IT"/>
+        </w:rPr>
+      </w:pPr>
+      <w:r>
+        <w:rPr>
+          <w:b/>
+          <w:bCs/>
+          <w:lang w:val="it-IT"/>
+        </w:rPr>
+        <w:t xml:space="preserve">Diagramma ER con database </w:t>
+      </w:r>
+      <w:r>
+        <w:rPr>
+          <w:b/>
+          <w:bCs/>
+          <w:lang w:val="it-IT"/>
+        </w:rPr>
+        <w:t>SQL</w:t>
+      </w:r>
+      <w:r>
+        <w:rPr>
+          <w:b/>
+          <w:bCs/>
+          <w:lang w:val="it-IT"/>
+        </w:rPr>
+        <w:t>:</w:t>
+      </w:r>
+    </w:p>
+    <w:p>
+      <w:pPr>
+        <w:spacing w:before="240"/>
+        <w:jc w:val="center"/>
+        <w:rPr>
+          <w:b/>
+          <w:bCs/>
+          <w:lang w:val="it-IT"/>
+        </w:rPr>
+      </w:pPr>
+      <w:r>
+        <w:rPr>
+          <w:b/>
+          <w:bCs/>
+          <w:noProof/>
+          <w:lang w:val="it-IT"/>
+        </w:rPr>
+        <w:drawing>
+          <wp:inline distT="0" distB="0" distL="0" distR="0" wp14:anchorId="3E1CA906" wp14:editId="6ED880A9">
+            <wp:extent cx="5583741" cy="4257675"/>
+            <wp:effectExtent l="114300" t="114300" r="112395" b="104775"/>
+            <wp:docPr id="9" name="Immagine 9"/>
+            <wp:cNvGraphicFramePr>
+              <a:graphicFrameLocks xmlns:a="http://schemas.openxmlformats.org/drawingml/2006/main" noChangeAspect="1"/>
+            </wp:cNvGraphicFramePr>
+            <a:graphic xmlns:a="http://schemas.openxmlformats.org/drawingml/2006/main">
+              <a:graphicData uri="http://schemas.openxmlformats.org/drawingml/2006/picture">
+                <pic:pic xmlns:pic="http://schemas.openxmlformats.org/drawingml/2006/picture">
+                  <pic:nvPicPr>
+                    <pic:cNvPr id="0" name="Picture 1"/>
+                    <pic:cNvPicPr>
+                      <a:picLocks noChangeAspect="1" noChangeArrowheads="1"/>
+                    </pic:cNvPicPr>
+                  </pic:nvPicPr>
+                  <pic:blipFill>
+                    <a:blip r:embed="rId14">
+                      <a:extLst>
+                        <a:ext uri="{28A0092B-C50C-407E-A947-70E740481C1C}">
+                          <a14:useLocalDpi xmlns:a14="http://schemas.microsoft.com/office/drawing/2010/main" val="0"/>
+                        </a:ext>
+                      </a:extLst>
+                    </a:blip>
+                    <a:srcRect/>
+                    <a:stretch>
+                      <a:fillRect/>
+                    </a:stretch>
+                  </pic:blipFill>
+                  <pic:spPr bwMode="auto">
+                    <a:xfrm>
+                      <a:off x="0" y="0"/>
+                      <a:ext cx="5586577" cy="4259838"/>
+                    </a:xfrm>
+                    <a:prstGeom prst="rect">
+                      <a:avLst/>
+                    </a:prstGeom>
+                    <a:noFill/>
+                    <a:ln>
+                      <a:noFill/>
+                    </a:ln>
+                    <a:effectLst>
+                      <a:outerShdw blurRad="63500" sx="102000" sy="102000" algn="ctr" rotWithShape="0">
+                        <a:prstClr val="black">
+                          <a:alpha val="40000"/>
+                        </a:prstClr>
+                      </a:outerShdw>
+                    </a:effectLst>
+                  </pic:spPr>
+                </pic:pic>
+              </a:graphicData>
+            </a:graphic>
+          </wp:inline>
+        </w:drawing>
+      </w:r>
+    </w:p>
+    <w:p>
+      <w:pPr>
+        <w:rPr>
+          <w:lang w:val="it-IT"/>
+        </w:rPr>
+      </w:pPr>
+      <w:r>
+        <w:rPr>
+          <w:lang w:val="it-IT"/>
+        </w:rPr>
+        <w:br w:type="page"/>
+      </w:r>
+    </w:p>
+    <w:p>
+      <w:pPr>
+        <w:rPr>
+          <w:b/>
+          <w:bCs/>
+          <w:lang w:val="it-IT"/>
+        </w:rPr>
+      </w:pPr>
+      <w:r>
+        <w:rPr>
+          <w:b/>
+          <w:bCs/>
+          <w:lang w:val="it-IT"/>
+        </w:rPr>
+        <w:lastRenderedPageBreak/>
+        <w:t>Diagramma per database NoSQL:</w:t>
+      </w:r>
+    </w:p>
+    <w:p>
+      <w:pPr>
+        <w:spacing w:before="240"/>
+        <w:jc w:val="center"/>
+        <w:rPr>
+          <w:lang w:val="it-IT"/>
+        </w:rPr>
+      </w:pPr>
+      <w:r>
+        <w:rPr>
+          <w:noProof/>
+          <w:lang w:val="it-IT"/>
+        </w:rPr>
+        <w:drawing>
+          <wp:inline distT="0" distB="0" distL="0" distR="0" wp14:anchorId="7F1DDF83" wp14:editId="4321BE45">
+            <wp:extent cx="5581650" cy="2940763"/>
+            <wp:effectExtent l="133350" t="95250" r="114300" b="88265"/>
+            <wp:docPr id="12" name="Immagine 12"/>
+            <wp:cNvGraphicFramePr>
+              <a:graphicFrameLocks xmlns:a="http://schemas.openxmlformats.org/drawingml/2006/main" noChangeAspect="1"/>
+            </wp:cNvGraphicFramePr>
+            <a:graphic xmlns:a="http://schemas.openxmlformats.org/drawingml/2006/main">
+              <a:graphicData uri="http://schemas.openxmlformats.org/drawingml/2006/picture">
+                <pic:pic xmlns:pic="http://schemas.openxmlformats.org/drawingml/2006/picture">
+                  <pic:nvPicPr>
+                    <pic:cNvPr id="0" name="Picture 4"/>
+                    <pic:cNvPicPr>
+                      <a:picLocks noChangeAspect="1" noChangeArrowheads="1"/>
+                    </pic:cNvPicPr>
+                  </pic:nvPicPr>
+                  <pic:blipFill>
+                    <a:blip r:embed="rId15">
+                      <a:extLst>
+                        <a:ext uri="{28A0092B-C50C-407E-A947-70E740481C1C}">
+                          <a14:useLocalDpi xmlns:a14="http://schemas.microsoft.com/office/drawing/2010/main" val="0"/>
+                        </a:ext>
+                      </a:extLst>
+                    </a:blip>
+                    <a:srcRect/>
+                    <a:stretch>
+                      <a:fillRect/>
+                    </a:stretch>
+                  </pic:blipFill>
+                  <pic:spPr bwMode="auto">
+                    <a:xfrm>
+                      <a:off x="0" y="0"/>
+                      <a:ext cx="5587621" cy="2943909"/>
+                    </a:xfrm>
+                    <a:prstGeom prst="rect">
+                      <a:avLst/>
+                    </a:prstGeom>
+                    <a:noFill/>
+                    <a:ln>
+                      <a:noFill/>
+                    </a:ln>
+                    <a:effectLst>
+                      <a:outerShdw blurRad="63500" sx="102000" sy="102000" algn="ctr" rotWithShape="0">
+                        <a:prstClr val="black">
+                          <a:alpha val="40000"/>
+                        </a:prstClr>
+                      </a:outerShdw>
+                    </a:effectLst>
+                  </pic:spPr>
+                </pic:pic>
+              </a:graphicData>
+            </a:graphic>
+          </wp:inline>
+        </w:drawing>
+      </w:r>
+    </w:p>
+    <w:p>
+      <w:pPr>
+        <w:spacing w:before="240"/>
+        <w:rPr>
+          <w:b/>
+          <w:bCs/>
+          <w:lang w:val="it-IT"/>
+        </w:rPr>
+      </w:pPr>
+      <w:r>
+        <w:rPr>
+          <w:b/>
+          <w:bCs/>
+          <w:lang w:val="it-IT"/>
+        </w:rPr>
+        <w:t>Esempio della struttura dei dati:</w:t>
+      </w:r>
+    </w:p>
+    <w:p>
+      <w:pPr>
+        <w:spacing w:before="240"/>
+        <w:jc w:val="center"/>
+        <w:rPr>
+          <w:lang w:val="it-IT"/>
+        </w:rPr>
+      </w:pPr>
+      <w:r>
+        <w:rPr>
+          <w:noProof/>
+          <w:lang w:val="it-IT"/>
+        </w:rPr>
+        <w:drawing>
+          <wp:inline distT="0" distB="0" distL="0" distR="0" wp14:anchorId="69450BF3" wp14:editId="1E43A1A3">
+            <wp:extent cx="5657850" cy="1946023"/>
+            <wp:effectExtent l="114300" t="95250" r="114300" b="92710"/>
+            <wp:docPr id="11" name="Immagine 11"/>
+            <wp:cNvGraphicFramePr>
+              <a:graphicFrameLocks xmlns:a="http://schemas.openxmlformats.org/drawingml/2006/main" noChangeAspect="1"/>
+            </wp:cNvGraphicFramePr>
+            <a:graphic xmlns:a="http://schemas.openxmlformats.org/drawingml/2006/main">
+              <a:graphicData uri="http://schemas.openxmlformats.org/drawingml/2006/picture">
+                <pic:pic xmlns:pic="http://schemas.openxmlformats.org/drawingml/2006/picture">
+                  <pic:nvPicPr>
+                    <pic:cNvPr id="0" name="Picture 3"/>
+                    <pic:cNvPicPr>
+                      <a:picLocks noChangeAspect="1" noChangeArrowheads="1"/>
+                    </pic:cNvPicPr>
+                  </pic:nvPicPr>
+                  <pic:blipFill>
+                    <a:blip r:embed="rId16" cstate="print">
+                      <a:extLst>
+                        <a:ext uri="{28A0092B-C50C-407E-A947-70E740481C1C}">
+                          <a14:useLocalDpi xmlns:a14="http://schemas.microsoft.com/office/drawing/2010/main" val="0"/>
+                        </a:ext>
+                      </a:extLst>
+                    </a:blip>
+                    <a:srcRect/>
+                    <a:stretch>
+                      <a:fillRect/>
+                    </a:stretch>
+                  </pic:blipFill>
+                  <pic:spPr bwMode="auto">
+                    <a:xfrm>
+                      <a:off x="0" y="0"/>
+                      <a:ext cx="5671698" cy="1950786"/>
+                    </a:xfrm>
+                    <a:prstGeom prst="rect">
+                      <a:avLst/>
+                    </a:prstGeom>
+                    <a:noFill/>
+                    <a:ln>
+                      <a:noFill/>
+                    </a:ln>
+                    <a:effectLst>
+                      <a:outerShdw blurRad="63500" sx="102000" sy="102000" algn="ctr" rotWithShape="0">
+                        <a:prstClr val="black">
+                          <a:alpha val="40000"/>
+                        </a:prstClr>
+                      </a:outerShdw>
+                    </a:effectLst>
+                  </pic:spPr>
+                </pic:pic>
+              </a:graphicData>
+            </a:graphic>
+          </wp:inline>
+        </w:drawing>
       </w:r>
     </w:p>
     <w:p>
@@ -10820,8 +11084,8 @@
         </w:rPr>
       </w:pPr>
       <w:bookmarkStart w:id="70" w:name="_Toc94790468"/>
-      <w:bookmarkStart w:id="71" w:name="_Toc461179232"/>
-      <w:bookmarkStart w:id="72" w:name="_Toc221000583"/>
+      <w:bookmarkStart w:id="71" w:name="_Toc221000583"/>
+      <w:bookmarkStart w:id="72" w:name="_Toc461179232"/>
       <w:r>
         <w:rPr>
           <w:lang w:val="it-IT"/>
@@ -10829,7 +11093,7 @@
         <w:t>Glossario</w:t>
       </w:r>
       <w:bookmarkEnd w:id="70"/>
-      <w:bookmarkEnd w:id="72"/>
+      <w:bookmarkEnd w:id="71"/>
     </w:p>
     <w:p>
       <w:pPr>
@@ -11070,7 +11334,7 @@
       <w:r>
         <w:t>Bibliografia per articoli di riviste:</w:t>
       </w:r>
-      <w:bookmarkEnd w:id="71"/>
+      <w:bookmarkEnd w:id="72"/>
       <w:bookmarkEnd w:id="75"/>
       <w:bookmarkEnd w:id="76"/>
     </w:p>
@@ -11647,10 +11911,10 @@
       </w:pPr>
     </w:p>
     <w:sectPr>
-      <w:headerReference w:type="default" r:id="rId14"/>
-      <w:footerReference w:type="default" r:id="rId15"/>
-      <w:headerReference w:type="first" r:id="rId16"/>
-      <w:footerReference w:type="first" r:id="rId17"/>
+      <w:headerReference w:type="default" r:id="rId17"/>
+      <w:footerReference w:type="default" r:id="rId18"/>
+      <w:headerReference w:type="first" r:id="rId19"/>
+      <w:footerReference w:type="first" r:id="rId20"/>
       <w:pgSz w:w="11906" w:h="16838"/>
       <w:pgMar w:top="1985" w:right="1134" w:bottom="1418" w:left="1134" w:header="567" w:footer="567" w:gutter="0"/>
       <w:pgNumType w:start="1"/>

</xml_diff>

<commit_message>
doc: base swimlanes and architecture diagrams
</commit_message>
<xml_diff>
--- a/3_Documentazione/Documentazione_X2SevenVault_Christian_Arzani.docx
+++ b/3_Documentazione/Documentazione_X2SevenVault_Christian_Arzani.docx
@@ -9514,13 +9514,9 @@
     </w:p>
     <w:p>
       <w:pPr>
+        <w:keepNext/>
         <w:spacing w:before="240"/>
         <w:jc w:val="center"/>
-        <w:rPr>
-          <w:b/>
-          <w:bCs/>
-          <w:lang w:val="it-IT"/>
-        </w:rPr>
       </w:pPr>
       <w:r>
         <w:rPr>
@@ -9588,42 +9584,103 @@
     </w:p>
     <w:p>
       <w:pPr>
-        <w:rPr>
-          <w:lang w:val="it-IT"/>
-        </w:rPr>
-      </w:pPr>
-      <w:r>
-        <w:rPr>
-          <w:lang w:val="it-IT"/>
-        </w:rPr>
-        <w:br w:type="page"/>
-      </w:r>
-    </w:p>
-    <w:p>
-      <w:pPr>
+        <w:pStyle w:val="Didascalia"/>
+        <w:jc w:val="center"/>
         <w:rPr>
           <w:b/>
           <w:bCs/>
-          <w:lang w:val="it-IT"/>
-        </w:rPr>
-      </w:pPr>
-      <w:r>
+          <w:i/>
+          <w:iCs/>
+          <w:lang w:val="it-IT"/>
+        </w:rPr>
+      </w:pPr>
+      <w:r>
+        <w:rPr>
+          <w:i/>
+          <w:iCs/>
+        </w:rPr>
+        <w:t xml:space="preserve">Figura </w:t>
+      </w:r>
+      <w:r>
+        <w:rPr>
+          <w:i/>
+          <w:iCs/>
+        </w:rPr>
+        <w:fldChar w:fldCharType="begin"/>
+      </w:r>
+      <w:r>
+        <w:rPr>
+          <w:i/>
+          <w:iCs/>
+        </w:rPr>
+        <w:instrText xml:space="preserve"> SEQ Figura \* ARABIC </w:instrText>
+      </w:r>
+      <w:r>
+        <w:rPr>
+          <w:i/>
+          <w:iCs/>
+        </w:rPr>
+        <w:fldChar w:fldCharType="separate"/>
+      </w:r>
+      <w:r>
+        <w:rPr>
+          <w:i/>
+          <w:iCs/>
+          <w:noProof/>
+        </w:rPr>
+        <w:t>7</w:t>
+      </w:r>
+      <w:r>
+        <w:rPr>
+          <w:i/>
+          <w:iCs/>
+        </w:rPr>
+        <w:fldChar w:fldCharType="end"/>
+      </w:r>
+      <w:r>
+        <w:rPr>
+          <w:i/>
+          <w:iCs/>
+        </w:rPr>
+        <w:t xml:space="preserve"> - Diagramma ER NoSQL</w:t>
+      </w:r>
+    </w:p>
+    <w:p>
+      <w:pPr>
+        <w:rPr>
+          <w:lang w:val="it-IT"/>
+        </w:rPr>
+      </w:pPr>
+      <w:r>
+        <w:rPr>
+          <w:lang w:val="it-IT"/>
+        </w:rPr>
+        <w:br w:type="page"/>
+      </w:r>
+    </w:p>
+    <w:p>
+      <w:pPr>
         <w:rPr>
           <w:b/>
           <w:bCs/>
           <w:lang w:val="it-IT"/>
         </w:rPr>
+      </w:pPr>
+      <w:r>
+        <w:rPr>
+          <w:b/>
+          <w:bCs/>
+          <w:lang w:val="it-IT"/>
+        </w:rPr>
         <w:lastRenderedPageBreak/>
         <w:t>Diagramma per database NoSQL:</w:t>
       </w:r>
     </w:p>
     <w:p>
       <w:pPr>
+        <w:keepNext/>
         <w:spacing w:before="240"/>
         <w:jc w:val="center"/>
-        <w:rPr>
-          <w:lang w:val="it-IT"/>
-        </w:rPr>
       </w:pPr>
       <w:r>
         <w:rPr>
@@ -9689,6 +9746,67 @@
     </w:p>
     <w:p>
       <w:pPr>
+        <w:pStyle w:val="Didascalia"/>
+        <w:jc w:val="center"/>
+        <w:rPr>
+          <w:i/>
+          <w:iCs/>
+          <w:lang w:val="it-IT"/>
+        </w:rPr>
+      </w:pPr>
+      <w:r>
+        <w:rPr>
+          <w:i/>
+          <w:iCs/>
+        </w:rPr>
+        <w:t xml:space="preserve">Figura </w:t>
+      </w:r>
+      <w:r>
+        <w:rPr>
+          <w:i/>
+          <w:iCs/>
+        </w:rPr>
+        <w:fldChar w:fldCharType="begin"/>
+      </w:r>
+      <w:r>
+        <w:rPr>
+          <w:i/>
+          <w:iCs/>
+        </w:rPr>
+        <w:instrText xml:space="preserve"> SEQ Figura \* ARABIC </w:instrText>
+      </w:r>
+      <w:r>
+        <w:rPr>
+          <w:i/>
+          <w:iCs/>
+        </w:rPr>
+        <w:fldChar w:fldCharType="separate"/>
+      </w:r>
+      <w:r>
+        <w:rPr>
+          <w:i/>
+          <w:iCs/>
+          <w:noProof/>
+        </w:rPr>
+        <w:t>8</w:t>
+      </w:r>
+      <w:r>
+        <w:rPr>
+          <w:i/>
+          <w:iCs/>
+        </w:rPr>
+        <w:fldChar w:fldCharType="end"/>
+      </w:r>
+      <w:r>
+        <w:rPr>
+          <w:i/>
+          <w:iCs/>
+        </w:rPr>
+        <w:t xml:space="preserve"> - Diagramma a classi NoSQL</w:t>
+      </w:r>
+    </w:p>
+    <w:p>
+      <w:pPr>
         <w:spacing w:before="240"/>
         <w:rPr>
           <w:b/>
@@ -9707,11 +9825,9 @@
     </w:p>
     <w:p>
       <w:pPr>
+        <w:keepNext/>
         <w:spacing w:before="240"/>
         <w:jc w:val="center"/>
-        <w:rPr>
-          <w:lang w:val="it-IT"/>
-        </w:rPr>
       </w:pPr>
       <w:r>
         <w:rPr>
@@ -9777,6 +9893,75 @@
     </w:p>
     <w:p>
       <w:pPr>
+        <w:pStyle w:val="Didascalia"/>
+        <w:jc w:val="center"/>
+        <w:rPr>
+          <w:i/>
+          <w:iCs/>
+          <w:lang w:val="it-IT"/>
+        </w:rPr>
+      </w:pPr>
+      <w:r>
+        <w:rPr>
+          <w:i/>
+          <w:iCs/>
+        </w:rPr>
+        <w:t xml:space="preserve">Figura </w:t>
+      </w:r>
+      <w:r>
+        <w:rPr>
+          <w:i/>
+          <w:iCs/>
+        </w:rPr>
+        <w:fldChar w:fldCharType="begin"/>
+      </w:r>
+      <w:r>
+        <w:rPr>
+          <w:i/>
+          <w:iCs/>
+        </w:rPr>
+        <w:instrText xml:space="preserve"> SEQ Figura \* ARABIC </w:instrText>
+      </w:r>
+      <w:r>
+        <w:rPr>
+          <w:i/>
+          <w:iCs/>
+        </w:rPr>
+        <w:fldChar w:fldCharType="separate"/>
+      </w:r>
+      <w:r>
+        <w:rPr>
+          <w:i/>
+          <w:iCs/>
+          <w:noProof/>
+        </w:rPr>
+        <w:t>9</w:t>
+      </w:r>
+      <w:r>
+        <w:rPr>
+          <w:i/>
+          <w:iCs/>
+        </w:rPr>
+        <w:fldChar w:fldCharType="end"/>
+      </w:r>
+      <w:r>
+        <w:rPr>
+          <w:i/>
+          <w:iCs/>
+        </w:rPr>
+        <w:t xml:space="preserve"> - Diagramma della</w:t>
+      </w:r>
+      <w:r>
+        <w:rPr>
+          <w:i/>
+          <w:iCs/>
+          <w:noProof/>
+        </w:rPr>
+        <w:t xml:space="preserve"> struttura dei dati</w:t>
+      </w:r>
+    </w:p>
+    <w:p>
+      <w:pPr>
         <w:rPr>
           <w:lang w:val="it-IT"/>
         </w:rPr>
@@ -9824,12 +10009,26 @@
     </w:p>
     <w:p>
       <w:pPr>
+        <w:rPr>
+          <w:lang w:val="it-IT"/>
+        </w:rPr>
+      </w:pPr>
+      <w:r>
+        <w:rPr>
+          <w:lang w:val="it-IT"/>
+        </w:rPr>
+        <w:br w:type="page"/>
+      </w:r>
+    </w:p>
+    <w:p>
+      <w:pPr>
         <w:pStyle w:val="Titolo2"/>
       </w:pPr>
       <w:bookmarkStart w:id="40" w:name="_Toc429059812"/>
       <w:bookmarkStart w:id="41" w:name="_Toc94790458"/>
       <w:bookmarkStart w:id="42" w:name="_Toc221000573"/>
       <w:r>
+        <w:lastRenderedPageBreak/>
         <w:t>Design procedurale</w:t>
       </w:r>
       <w:bookmarkEnd w:id="40"/>

</xml_diff>

<commit_message>
doc: swimlane and architecture modify
</commit_message>
<xml_diff>
--- a/3_Documentazione/Documentazione_X2SevenVault_Christian_Arzani.docx
+++ b/3_Documentazione/Documentazione_X2SevenVault_Christian_Arzani.docx
@@ -7301,7 +7301,21 @@
                 <w:sz w:val="16"/>
                 <w:szCs w:val="16"/>
               </w:rPr>
-              <w:t>Il sistema deve avere utenti admin e utenti base</w:t>
+              <w:t>Il sistema deve avere utenti admin</w:t>
+            </w:r>
+            <w:r>
+              <w:rPr>
+                <w:sz w:val="16"/>
+                <w:szCs w:val="16"/>
+              </w:rPr>
+              <w:t xml:space="preserve">, magazzinieri </w:t>
+            </w:r>
+            <w:r>
+              <w:rPr>
+                <w:sz w:val="16"/>
+                <w:szCs w:val="16"/>
+              </w:rPr>
+              <w:t>e utenti base</w:t>
             </w:r>
           </w:p>
         </w:tc>
@@ -9835,7 +9849,7 @@
           <w:lang w:val="it-IT"/>
         </w:rPr>
         <w:drawing>
-          <wp:inline distT="0" distB="0" distL="0" distR="0" wp14:anchorId="69450BF3" wp14:editId="1E43A1A3">
+          <wp:inline distT="0" distB="0" distL="0" distR="0" wp14:anchorId="69450BF3" wp14:editId="3583AC92">
             <wp:extent cx="5657850" cy="1946023"/>
             <wp:effectExtent l="114300" t="95250" r="114300" b="92710"/>
             <wp:docPr id="11" name="Immagine 11"/>

</xml_diff>

<commit_message>
doc: architecture documentation and swimlanes images
</commit_message>
<xml_diff>
--- a/3_Documentazione/Documentazione_X2SevenVault_Christian_Arzani.docx
+++ b/3_Documentazione/Documentazione_X2SevenVault_Christian_Arzani.docx
@@ -1,6 +1,6 @@
 
 <file path=word/document.xml><?xml version="1.0" encoding="utf-8"?>
-<w:document xmlns:wpc="http://schemas.microsoft.com/office/word/2010/wordprocessingCanvas" xmlns:cx="http://schemas.microsoft.com/office/drawing/2014/chartex" xmlns:cx1="http://schemas.microsoft.com/office/drawing/2015/9/8/chartex" xmlns:cx2="http://schemas.microsoft.com/office/drawing/2015/10/21/chartex" xmlns:cx3="http://schemas.microsoft.com/office/drawing/2016/5/9/chartex" xmlns:cx4="http://schemas.microsoft.com/office/drawing/2016/5/10/chartex" xmlns:cx5="http://schemas.microsoft.com/office/drawing/2016/5/11/chartex" xmlns:cx6="http://schemas.microsoft.com/office/drawing/2016/5/12/chartex" xmlns:cx7="http://schemas.microsoft.com/office/drawing/2016/5/13/chartex" xmlns:cx8="http://schemas.microsoft.com/office/drawing/2016/5/14/chartex" xmlns:mc="http://schemas.openxmlformats.org/markup-compatibility/2006" xmlns:aink="http://schemas.microsoft.com/office/drawing/2016/ink" xmlns:am3d="http://schemas.microsoft.com/office/drawing/2017/model3d" xmlns:o="urn:schemas-microsoft-com:office:office" xmlns:oel="http://schemas.microsoft.com/office/2019/extlst" xmlns:r="http://schemas.openxmlformats.org/officeDocument/2006/relationships" xmlns:m="http://schemas.openxmlformats.org/officeDocument/2006/math" xmlns:v="urn:schemas-microsoft-com:vml" xmlns:wp14="http://schemas.microsoft.com/office/word/2010/wordprocessingDrawing" xmlns:wp="http://schemas.openxmlformats.org/drawingml/2006/wordprocessingDrawing" xmlns:w10="urn:schemas-microsoft-com:office:word" xmlns:w="http://schemas.openxmlformats.org/wordprocessingml/2006/main" xmlns:w14="http://schemas.microsoft.com/office/word/2010/wordml" xmlns:w15="http://schemas.microsoft.com/office/word/2012/wordml" xmlns:w16cex="http://schemas.microsoft.com/office/word/2018/wordml/cex" xmlns:w16cid="http://schemas.microsoft.com/office/word/2016/wordml/cid" xmlns:w16="http://schemas.microsoft.com/office/word/2018/wordml" xmlns:w16sdtdh="http://schemas.microsoft.com/office/word/2020/wordml/sdtdatahash" xmlns:w16se="http://schemas.microsoft.com/office/word/2015/wordml/symex" xmlns:wpg="http://schemas.microsoft.com/office/word/2010/wordprocessingGroup" xmlns:wpi="http://schemas.microsoft.com/office/word/2010/wordprocessingInk" xmlns:wne="http://schemas.microsoft.com/office/word/2006/wordml" xmlns:wps="http://schemas.microsoft.com/office/word/2010/wordprocessingShape" mc:Ignorable="w14 w15 w16se w16cid w16 w16cex w16sdtdh wp14">
+<w:document xmlns:wpc="http://schemas.microsoft.com/office/word/2010/wordprocessingCanvas" xmlns:cx="http://schemas.microsoft.com/office/drawing/2014/chartex" xmlns:cx1="http://schemas.microsoft.com/office/drawing/2015/9/8/chartex" xmlns:cx2="http://schemas.microsoft.com/office/drawing/2015/10/21/chartex" xmlns:cx3="http://schemas.microsoft.com/office/drawing/2016/5/9/chartex" xmlns:cx4="http://schemas.microsoft.com/office/drawing/2016/5/10/chartex" xmlns:cx5="http://schemas.microsoft.com/office/drawing/2016/5/11/chartex" xmlns:cx6="http://schemas.microsoft.com/office/drawing/2016/5/12/chartex" xmlns:cx7="http://schemas.microsoft.com/office/drawing/2016/5/13/chartex" xmlns:cx8="http://schemas.microsoft.com/office/drawing/2016/5/14/chartex" xmlns:mc="http://schemas.openxmlformats.org/markup-compatibility/2006" xmlns:aink="http://schemas.microsoft.com/office/drawing/2016/ink" xmlns:am3d="http://schemas.microsoft.com/office/drawing/2017/model3d" xmlns:o="urn:schemas-microsoft-com:office:office" xmlns:oel="http://schemas.microsoft.com/office/2019/extlst" xmlns:r="http://schemas.openxmlformats.org/officeDocument/2006/relationships" xmlns:m="http://schemas.openxmlformats.org/officeDocument/2006/math" xmlns:v="urn:schemas-microsoft-com:vml" xmlns:wp14="http://schemas.microsoft.com/office/word/2010/wordprocessingDrawing" xmlns:wp="http://schemas.openxmlformats.org/drawingml/2006/wordprocessingDrawing" xmlns:w10="urn:schemas-microsoft-com:office:word" xmlns:w="http://schemas.openxmlformats.org/wordprocessingml/2006/main" xmlns:w14="http://schemas.microsoft.com/office/word/2010/wordml" xmlns:w15="http://schemas.microsoft.com/office/word/2012/wordml" xmlns:w16cex="http://schemas.microsoft.com/office/word/2018/wordml/cex" xmlns:w16cid="http://schemas.microsoft.com/office/word/2016/wordml/cid" xmlns:w16="http://schemas.microsoft.com/office/word/2018/wordml" xmlns:w16du="http://schemas.microsoft.com/office/word/2023/wordml/word16du" xmlns:w16sdtdh="http://schemas.microsoft.com/office/word/2020/wordml/sdtdatahash" xmlns:w16sdtfl="http://schemas.microsoft.com/office/word/2024/wordml/sdtformatlock" xmlns:w16se="http://schemas.microsoft.com/office/word/2015/wordml/symex" xmlns:wpg="http://schemas.microsoft.com/office/word/2010/wordprocessingGroup" xmlns:wpi="http://schemas.microsoft.com/office/word/2010/wordprocessingInk" xmlns:wne="http://schemas.microsoft.com/office/word/2006/wordml" xmlns:wps="http://schemas.microsoft.com/office/word/2010/wordprocessingShape" mc:Ignorable="w14 w15 w16se w16cid w16 w16cex w16sdtdh w16sdtfl w16du wp14">
   <w:body>
     <w:p>
       <w:pPr>
@@ -7986,7 +7986,10 @@
         <w:t xml:space="preserve">fattore fondamentale per quello che riguarda il machine learning dell’AI che è un processo ricorrente nello sviluppo del progetto. </w:t>
       </w:r>
       <w:r>
-        <w:t xml:space="preserve">In particolare si utilizza Kanban, con una board visuale divisa in colonne (Backlog, To Do, In Progress, </w:t>
+        <w:t>In particolare,</w:t>
+      </w:r>
+      <w:r>
+        <w:t xml:space="preserve"> si utilizza Kanban, con una board visuale divisa in colonne (Backlog, To Do, In Progress, </w:t>
       </w:r>
       <w:r>
         <w:t xml:space="preserve">Testing, Review, Blocking, </w:t>
@@ -9292,26 +9295,6 @@
     </w:p>
     <w:p>
       <w:pPr>
-        <w:rPr>
-          <w:lang w:val="it-IT"/>
-        </w:rPr>
-      </w:pPr>
-      <w:r>
-        <w:rPr>
-          <w:lang w:val="it-IT"/>
-        </w:rPr>
-        <w:t>Questo capitolo descrive esaustivamente come deve essere realizzato il prodotto fin nei suoi dettagli. Una buona progettazione permette all’esecutore di evitare fraintendimenti e imprecisioni nell’implementazione del prodotto.</w:t>
-      </w:r>
-    </w:p>
-    <w:p>
-      <w:pPr>
-        <w:rPr>
-          <w:lang w:val="it-IT"/>
-        </w:rPr>
-      </w:pPr>
-    </w:p>
-    <w:p>
-      <w:pPr>
         <w:pStyle w:val="Titolo2"/>
       </w:pPr>
       <w:bookmarkStart w:id="31" w:name="_Toc429059809"/>
@@ -9334,118 +9317,388 @@
         <w:rPr>
           <w:lang w:val="it-IT"/>
         </w:rPr>
-        <w:t>Descrive:</w:t>
-      </w:r>
-    </w:p>
-    <w:p>
-      <w:pPr>
+        <w:t xml:space="preserve">L'architettura è composta da </w:t>
+      </w:r>
+      <w:r>
+        <w:rPr>
+          <w:lang w:val="it-IT"/>
+        </w:rPr>
+        <w:t>un applicativo w</w:t>
+      </w:r>
+      <w:r>
+        <w:rPr>
+          <w:lang w:val="it-IT"/>
+        </w:rPr>
+        <w:t>eb per la gestione</w:t>
+      </w:r>
+      <w:r>
+        <w:rPr>
+          <w:lang w:val="it-IT"/>
+        </w:rPr>
+        <w:t xml:space="preserve"> e la visualizzazione degli oggetti</w:t>
+      </w:r>
+      <w:r>
+        <w:rPr>
+          <w:lang w:val="it-IT"/>
+        </w:rPr>
+        <w:t xml:space="preserve"> e una componente Mobil</w:t>
+      </w:r>
+      <w:r>
+        <w:rPr>
+          <w:lang w:val="it-IT"/>
+        </w:rPr>
+        <w:t>e per il riconoscimento</w:t>
+      </w:r>
+      <w:r>
+        <w:rPr>
+          <w:lang w:val="it-IT"/>
+        </w:rPr>
+        <w:t xml:space="preserve">, entrambe </w:t>
+      </w:r>
+      <w:r>
+        <w:rPr>
+          <w:lang w:val="it-IT"/>
+        </w:rPr>
+        <w:t xml:space="preserve">sono </w:t>
+      </w:r>
+      <w:r>
+        <w:rPr>
+          <w:lang w:val="it-IT"/>
+        </w:rPr>
+        <w:t xml:space="preserve">interfacciate </w:t>
+      </w:r>
+      <w:r>
+        <w:rPr>
+          <w:lang w:val="it-IT"/>
+        </w:rPr>
+        <w:t xml:space="preserve">con </w:t>
+      </w:r>
+      <w:r>
+        <w:rPr>
+          <w:lang w:val="it-IT"/>
+        </w:rPr>
+        <w:t>un database NoSQL.</w:t>
+      </w:r>
+    </w:p>
+    <w:p>
+      <w:pPr>
+        <w:spacing w:before="240"/>
+        <w:rPr>
+          <w:lang w:val="it-IT"/>
+        </w:rPr>
+      </w:pPr>
+      <w:r>
+        <w:rPr>
+          <w:lang w:val="it-IT"/>
+        </w:rPr>
+        <w:t>La pagina web e l'applicazione mobile rappresentano le interfacce principali attraverso le quali gli utenti</w:t>
+      </w:r>
+      <w:r>
+        <w:rPr>
+          <w:lang w:val="it-IT"/>
+        </w:rPr>
+        <w:t xml:space="preserve"> </w:t>
+      </w:r>
+      <w:r>
+        <w:rPr>
+          <w:lang w:val="it-IT"/>
+        </w:rPr>
+        <w:t>interagiscono con il servizio. Il modello AI viene integrato direttamente nell'ecosistema mobile per l'elaborazione de</w:t>
+      </w:r>
+      <w:r>
+        <w:rPr>
+          <w:lang w:val="it-IT"/>
+        </w:rPr>
+        <w:t>lle immagini</w:t>
+      </w:r>
+      <w:r>
+        <w:rPr>
+          <w:lang w:val="it-IT"/>
+        </w:rPr>
+        <w:t>.</w:t>
+      </w:r>
+    </w:p>
+    <w:p>
+      <w:pPr>
+        <w:keepNext/>
+        <w:spacing w:before="240"/>
+        <w:jc w:val="center"/>
+      </w:pPr>
+      <w:r>
+        <w:rPr>
+          <w:noProof/>
+          <w:lang w:val="it-IT"/>
+        </w:rPr>
+        <w:drawing>
+          <wp:inline distT="0" distB="0" distL="0" distR="0" wp14:anchorId="76E23DFB" wp14:editId="48424B3C">
+            <wp:extent cx="5041900" cy="3544437"/>
+            <wp:effectExtent l="114300" t="114300" r="120650" b="113665"/>
+            <wp:docPr id="26652517" name="Immagine 1"/>
+            <wp:cNvGraphicFramePr>
+              <a:graphicFrameLocks xmlns:a="http://schemas.openxmlformats.org/drawingml/2006/main" noChangeAspect="1"/>
+            </wp:cNvGraphicFramePr>
+            <a:graphic xmlns:a="http://schemas.openxmlformats.org/drawingml/2006/main">
+              <a:graphicData uri="http://schemas.openxmlformats.org/drawingml/2006/picture">
+                <pic:pic xmlns:pic="http://schemas.openxmlformats.org/drawingml/2006/picture">
+                  <pic:nvPicPr>
+                    <pic:cNvPr id="0" name="Picture 1"/>
+                    <pic:cNvPicPr>
+                      <a:picLocks noChangeAspect="1" noChangeArrowheads="1"/>
+                    </pic:cNvPicPr>
+                  </pic:nvPicPr>
+                  <pic:blipFill rotWithShape="1">
+                    <a:blip r:embed="rId14">
+                      <a:extLst>
+                        <a:ext uri="{28A0092B-C50C-407E-A947-70E740481C1C}">
+                          <a14:useLocalDpi xmlns:a14="http://schemas.microsoft.com/office/drawing/2010/main" val="0"/>
+                        </a:ext>
+                      </a:extLst>
+                    </a:blip>
+                    <a:srcRect l="520" t="497" r="504" b="826"/>
+                    <a:stretch>
+                      <a:fillRect/>
+                    </a:stretch>
+                  </pic:blipFill>
+                  <pic:spPr bwMode="auto">
+                    <a:xfrm>
+                      <a:off x="0" y="0"/>
+                      <a:ext cx="5062428" cy="3558868"/>
+                    </a:xfrm>
+                    <a:prstGeom prst="rect">
+                      <a:avLst/>
+                    </a:prstGeom>
+                    <a:noFill/>
+                    <a:ln>
+                      <a:noFill/>
+                    </a:ln>
+                    <a:effectLst>
+                      <a:outerShdw blurRad="63500" sx="102000" sy="102000" algn="ctr" rotWithShape="0">
+                        <a:prstClr val="black">
+                          <a:alpha val="40000"/>
+                        </a:prstClr>
+                      </a:outerShdw>
+                    </a:effectLst>
+                    <a:extLst>
+                      <a:ext uri="{53640926-AAD7-44D8-BBD7-CCE9431645EC}">
+                        <a14:shadowObscured xmlns:a14="http://schemas.microsoft.com/office/drawing/2010/main"/>
+                      </a:ext>
+                    </a:extLst>
+                  </pic:spPr>
+                </pic:pic>
+              </a:graphicData>
+            </a:graphic>
+          </wp:inline>
+        </w:drawing>
+      </w:r>
+    </w:p>
+    <w:p>
+      <w:pPr>
+        <w:pStyle w:val="Didascalia"/>
+        <w:jc w:val="center"/>
+        <w:rPr>
+          <w:i/>
+          <w:iCs/>
+          <w:lang w:val="it-IT"/>
+        </w:rPr>
+      </w:pPr>
+      <w:r>
+        <w:rPr>
+          <w:i/>
+          <w:iCs/>
+        </w:rPr>
+        <w:t xml:space="preserve">Figura </w:t>
+      </w:r>
+      <w:r>
+        <w:rPr>
+          <w:i/>
+          <w:iCs/>
+        </w:rPr>
+        <w:fldChar w:fldCharType="begin"/>
+      </w:r>
+      <w:r>
+        <w:rPr>
+          <w:i/>
+          <w:iCs/>
+        </w:rPr>
+        <w:instrText xml:space="preserve"> SEQ Figura \* ARABIC </w:instrText>
+      </w:r>
+      <w:r>
+        <w:rPr>
+          <w:i/>
+          <w:iCs/>
+        </w:rPr>
+        <w:fldChar w:fldCharType="separate"/>
+      </w:r>
+      <w:r>
+        <w:rPr>
+          <w:i/>
+          <w:iCs/>
+          <w:noProof/>
+        </w:rPr>
+        <w:t>7</w:t>
+      </w:r>
+      <w:r>
+        <w:rPr>
+          <w:i/>
+          <w:iCs/>
+        </w:rPr>
+        <w:fldChar w:fldCharType="end"/>
+      </w:r>
+      <w:r>
+        <w:rPr>
+          <w:i/>
+          <w:iCs/>
+        </w:rPr>
+        <w:t xml:space="preserve"> - Diagramma di architettura</w:t>
+      </w:r>
+    </w:p>
+    <w:p>
+      <w:pPr>
+        <w:spacing w:before="240"/>
+        <w:rPr>
+          <w:lang w:val="it-IT"/>
+        </w:rPr>
+      </w:pPr>
+      <w:r>
+        <w:rPr>
+          <w:lang w:val="it-IT"/>
+        </w:rPr>
+        <w:t>Le porte di comunicazione utilizzate sono le seguenti:</w:t>
+      </w:r>
+    </w:p>
+    <w:p>
+      <w:pPr>
+        <w:pStyle w:val="Paragrafoelenco"/>
         <w:numPr>
           <w:ilvl w:val="0"/>
-          <w:numId w:val="10"/>
+          <w:numId w:val="32"/>
         </w:numPr>
-        <w:rPr>
-          <w:lang w:val="it-IT"/>
-        </w:rPr>
-      </w:pPr>
-      <w:r>
-        <w:rPr>
-          <w:lang w:val="it-IT"/>
-        </w:rPr>
-        <w:t>La struttura del programma/sistema lo schema di rete...</w:t>
-      </w:r>
-    </w:p>
-    <w:p>
-      <w:pPr>
+        <w:spacing w:before="240"/>
+        <w:rPr>
+          <w:lang w:val="it-IT"/>
+        </w:rPr>
+      </w:pPr>
+      <w:r>
+        <w:rPr>
+          <w:lang w:val="it-IT"/>
+        </w:rPr>
+        <w:t>443: per il traffico HTTPS verso il web server</w:t>
+      </w:r>
+      <w:r>
+        <w:rPr>
+          <w:lang w:val="it-IT"/>
+        </w:rPr>
+        <w:t>.</w:t>
+      </w:r>
+    </w:p>
+    <w:p>
+      <w:pPr>
+        <w:pStyle w:val="Paragrafoelenco"/>
         <w:numPr>
           <w:ilvl w:val="0"/>
-          <w:numId w:val="10"/>
+          <w:numId w:val="32"/>
         </w:numPr>
-        <w:rPr>
-          <w:lang w:val="it-IT"/>
-        </w:rPr>
-      </w:pPr>
-      <w:r>
-        <w:rPr>
-          <w:lang w:val="it-IT"/>
-        </w:rPr>
-        <w:t>G</w:t>
-      </w:r>
-      <w:r>
-        <w:rPr>
-          <w:lang w:val="it-IT"/>
-        </w:rPr>
-        <w:t>li o</w:t>
-      </w:r>
-      <w:r>
-        <w:rPr>
-          <w:lang w:val="it-IT"/>
-        </w:rPr>
-        <w:t>ggetti/moduli/componenti che lo compongono.</w:t>
-      </w:r>
-    </w:p>
-    <w:p>
-      <w:pPr>
+        <w:spacing w:before="240"/>
+        <w:rPr>
+          <w:lang w:val="it-IT"/>
+        </w:rPr>
+      </w:pPr>
+      <w:r>
+        <w:rPr>
+          <w:lang w:val="it-IT"/>
+        </w:rPr>
+        <w:t>8080: per l'accesso al servizio in ambiente di test.</w:t>
+      </w:r>
+    </w:p>
+    <w:p>
+      <w:pPr>
+        <w:pStyle w:val="Paragrafoelenco"/>
         <w:numPr>
           <w:ilvl w:val="0"/>
-          <w:numId w:val="10"/>
+          <w:numId w:val="32"/>
         </w:numPr>
-        <w:rPr>
-          <w:lang w:val="it-IT"/>
-        </w:rPr>
-      </w:pPr>
-      <w:r>
-        <w:rPr>
-          <w:lang w:val="it-IT"/>
-        </w:rPr>
-        <w:t>I</w:t>
-      </w:r>
-      <w:r>
-        <w:rPr>
-          <w:lang w:val="it-IT"/>
-        </w:rPr>
-        <w:t xml:space="preserve"> flussi di informazione in ingresso ed in uscita e le relative elaborazioni. Pu</w:t>
-      </w:r>
-      <w:r>
-        <w:rPr>
-          <w:lang w:val="it-IT"/>
-        </w:rPr>
-        <w:t>ò</w:t>
-      </w:r>
-      <w:r>
-        <w:rPr>
-          <w:lang w:val="it-IT"/>
-        </w:rPr>
-        <w:t xml:space="preserve"> utilizzare </w:t>
+        <w:spacing w:before="240"/>
+        <w:rPr>
+          <w:lang w:val="it-IT"/>
+        </w:rPr>
+      </w:pPr>
+      <w:r>
+        <w:rPr>
+          <w:lang w:val="it-IT"/>
+        </w:rPr>
+        <w:t xml:space="preserve">443/API: per la comunicazione sicura tra i dispositivi </w:t>
+      </w:r>
+      <w:r>
+        <w:rPr>
+          <w:lang w:val="it-IT"/>
+        </w:rPr>
+        <w:t xml:space="preserve">dell’utente </w:t>
+      </w:r>
+      <w:r>
+        <w:rPr>
+          <w:lang w:val="it-IT"/>
+        </w:rPr>
+        <w:t xml:space="preserve">e il </w:t>
+      </w:r>
+      <w:r>
+        <w:rPr>
+          <w:lang w:val="it-IT"/>
+        </w:rPr>
+        <w:t>database</w:t>
+      </w:r>
+      <w:r>
+        <w:rPr>
+          <w:lang w:val="it-IT"/>
+        </w:rPr>
+        <w:t xml:space="preserve"> di Google Firebase.</w:t>
+      </w:r>
+    </w:p>
+    <w:p>
+      <w:pPr>
+        <w:spacing w:before="240"/>
+        <w:rPr>
+          <w:lang w:val="it-IT"/>
+        </w:rPr>
+      </w:pPr>
+      <w:r>
+        <w:rPr>
+          <w:lang w:val="it-IT"/>
+        </w:rPr>
+        <w:t>L’applicativo web viene ospitato su un server fornito dalla scuola con le seguenti caratteristiche:</w:t>
+      </w:r>
+      <w:r>
+        <w:rPr>
+          <w:lang w:val="it-IT"/>
+        </w:rPr>
+        <w:t xml:space="preserve"> </w:t>
       </w:r>
       <w:r>
         <w:rPr>
           <w:i/>
-          <w:lang w:val="it-IT"/>
-        </w:rPr>
-        <w:t>diagrammi di flusso dei dati</w:t>
-      </w:r>
-      <w:r>
-        <w:rPr>
-          <w:lang w:val="it-IT"/>
-        </w:rPr>
-        <w:t xml:space="preserve"> (DFD).</w:t>
-      </w:r>
-    </w:p>
-    <w:p>
-      <w:pPr>
-        <w:numPr>
-          <w:ilvl w:val="0"/>
-          <w:numId w:val="10"/>
-        </w:numPr>
-        <w:rPr>
-          <w:lang w:val="it-IT"/>
-        </w:rPr>
-      </w:pPr>
-      <w:r>
-        <w:rPr>
-          <w:lang w:val="it-IT"/>
-        </w:rPr>
-        <w:t>Eventuale sitemap</w:t>
+          <w:iCs/>
+          <w:lang w:val="it-IT"/>
+        </w:rPr>
+        <w:t>da definire</w:t>
+      </w:r>
+    </w:p>
+    <w:p>
+      <w:pPr>
+        <w:spacing w:before="240"/>
+        <w:rPr>
+          <w:lang w:val="it-IT"/>
+        </w:rPr>
+      </w:pPr>
+      <w:r>
+        <w:rPr>
+          <w:lang w:val="it-IT"/>
+        </w:rPr>
+        <w:t xml:space="preserve">Per il database </w:t>
+      </w:r>
+      <w:r>
+        <w:t>viene utilizzato Google Firestore. Essendo un database NoSQL cloud-based, la comunicazione avviene via HTTPS</w:t>
+      </w:r>
+      <w:r>
+        <w:t>.</w:t>
       </w:r>
     </w:p>
     <w:p>
@@ -9557,7 +9810,7 @@
                     </pic:cNvPicPr>
                   </pic:nvPicPr>
                   <pic:blipFill>
-                    <a:blip r:embed="rId14">
+                    <a:blip r:embed="rId15">
                       <a:extLst>
                         <a:ext uri="{28A0092B-C50C-407E-A947-70E740481C1C}">
                           <a14:useLocalDpi xmlns:a14="http://schemas.microsoft.com/office/drawing/2010/main" val="0"/>
@@ -9642,7 +9895,7 @@
           <w:iCs/>
           <w:noProof/>
         </w:rPr>
-        <w:t>7</w:t>
+        <w:t>8</w:t>
       </w:r>
       <w:r>
         <w:rPr>
@@ -9719,7 +9972,7 @@
                     </pic:cNvPicPr>
                   </pic:nvPicPr>
                   <pic:blipFill>
-                    <a:blip r:embed="rId15">
+                    <a:blip r:embed="rId16">
                       <a:extLst>
                         <a:ext uri="{28A0092B-C50C-407E-A947-70E740481C1C}">
                           <a14:useLocalDpi xmlns:a14="http://schemas.microsoft.com/office/drawing/2010/main" val="0"/>
@@ -9802,7 +10055,7 @@
           <w:iCs/>
           <w:noProof/>
         </w:rPr>
-        <w:t>8</w:t>
+        <w:t>9</w:t>
       </w:r>
       <w:r>
         <w:rPr>
@@ -9849,7 +10102,7 @@
           <w:lang w:val="it-IT"/>
         </w:rPr>
         <w:drawing>
-          <wp:inline distT="0" distB="0" distL="0" distR="0" wp14:anchorId="69450BF3" wp14:editId="3583AC92">
+          <wp:inline distT="0" distB="0" distL="0" distR="0" wp14:anchorId="69450BF3" wp14:editId="7D1C7538">
             <wp:extent cx="5657850" cy="1946023"/>
             <wp:effectExtent l="114300" t="95250" r="114300" b="92710"/>
             <wp:docPr id="11" name="Immagine 11"/>
@@ -9866,7 +10119,7 @@
                     </pic:cNvPicPr>
                   </pic:nvPicPr>
                   <pic:blipFill>
-                    <a:blip r:embed="rId16" cstate="print">
+                    <a:blip r:embed="rId17" cstate="print">
                       <a:extLst>
                         <a:ext uri="{28A0092B-C50C-407E-A947-70E740481C1C}">
                           <a14:useLocalDpi xmlns:a14="http://schemas.microsoft.com/office/drawing/2010/main" val="0"/>
@@ -9949,7 +10202,7 @@
           <w:iCs/>
           <w:noProof/>
         </w:rPr>
-        <w:t>9</w:t>
+        <w:t>10</w:t>
       </w:r>
       <w:r>
         <w:rPr>
@@ -12124,10 +12377,10 @@
       </w:pPr>
     </w:p>
     <w:sectPr>
-      <w:headerReference w:type="default" r:id="rId17"/>
-      <w:footerReference w:type="default" r:id="rId18"/>
-      <w:headerReference w:type="first" r:id="rId19"/>
-      <w:footerReference w:type="first" r:id="rId20"/>
+      <w:headerReference w:type="default" r:id="rId18"/>
+      <w:footerReference w:type="default" r:id="rId19"/>
+      <w:headerReference w:type="first" r:id="rId20"/>
+      <w:footerReference w:type="first" r:id="rId21"/>
       <w:pgSz w:w="11906" w:h="16838"/>
       <w:pgMar w:top="1985" w:right="1134" w:bottom="1418" w:left="1134" w:header="567" w:footer="567" w:gutter="0"/>
       <w:pgNumType w:start="1"/>
@@ -12139,7 +12392,7 @@
 </file>
 
 <file path=word/endnotes.xml><?xml version="1.0" encoding="utf-8"?>
-<w:endnotes xmlns:wpc="http://schemas.microsoft.com/office/word/2010/wordprocessingCanvas" xmlns:cx="http://schemas.microsoft.com/office/drawing/2014/chartex" xmlns:cx1="http://schemas.microsoft.com/office/drawing/2015/9/8/chartex" xmlns:cx2="http://schemas.microsoft.com/office/drawing/2015/10/21/chartex" xmlns:cx3="http://schemas.microsoft.com/office/drawing/2016/5/9/chartex" xmlns:cx4="http://schemas.microsoft.com/office/drawing/2016/5/10/chartex" xmlns:cx5="http://schemas.microsoft.com/office/drawing/2016/5/11/chartex" xmlns:cx6="http://schemas.microsoft.com/office/drawing/2016/5/12/chartex" xmlns:cx7="http://schemas.microsoft.com/office/drawing/2016/5/13/chartex" xmlns:cx8="http://schemas.microsoft.com/office/drawing/2016/5/14/chartex" xmlns:mc="http://schemas.openxmlformats.org/markup-compatibility/2006" xmlns:aink="http://schemas.microsoft.com/office/drawing/2016/ink" xmlns:am3d="http://schemas.microsoft.com/office/drawing/2017/model3d" xmlns:o="urn:schemas-microsoft-com:office:office" xmlns:oel="http://schemas.microsoft.com/office/2019/extlst" xmlns:r="http://schemas.openxmlformats.org/officeDocument/2006/relationships" xmlns:m="http://schemas.openxmlformats.org/officeDocument/2006/math" xmlns:v="urn:schemas-microsoft-com:vml" xmlns:wp14="http://schemas.microsoft.com/office/word/2010/wordprocessingDrawing" xmlns:wp="http://schemas.openxmlformats.org/drawingml/2006/wordprocessingDrawing" xmlns:w10="urn:schemas-microsoft-com:office:word" xmlns:w="http://schemas.openxmlformats.org/wordprocessingml/2006/main" xmlns:w14="http://schemas.microsoft.com/office/word/2010/wordml" xmlns:w15="http://schemas.microsoft.com/office/word/2012/wordml" xmlns:w16cex="http://schemas.microsoft.com/office/word/2018/wordml/cex" xmlns:w16cid="http://schemas.microsoft.com/office/word/2016/wordml/cid" xmlns:w16="http://schemas.microsoft.com/office/word/2018/wordml" xmlns:w16sdtdh="http://schemas.microsoft.com/office/word/2020/wordml/sdtdatahash" xmlns:w16se="http://schemas.microsoft.com/office/word/2015/wordml/symex" xmlns:wpg="http://schemas.microsoft.com/office/word/2010/wordprocessingGroup" xmlns:wpi="http://schemas.microsoft.com/office/word/2010/wordprocessingInk" xmlns:wne="http://schemas.microsoft.com/office/word/2006/wordml" xmlns:wps="http://schemas.microsoft.com/office/word/2010/wordprocessingShape" mc:Ignorable="w14 w15 w16se w16cid w16 w16cex w16sdtdh wp14">
+<w:endnotes xmlns:wpc="http://schemas.microsoft.com/office/word/2010/wordprocessingCanvas" xmlns:cx="http://schemas.microsoft.com/office/drawing/2014/chartex" xmlns:cx1="http://schemas.microsoft.com/office/drawing/2015/9/8/chartex" xmlns:cx2="http://schemas.microsoft.com/office/drawing/2015/10/21/chartex" xmlns:cx3="http://schemas.microsoft.com/office/drawing/2016/5/9/chartex" xmlns:cx4="http://schemas.microsoft.com/office/drawing/2016/5/10/chartex" xmlns:cx5="http://schemas.microsoft.com/office/drawing/2016/5/11/chartex" xmlns:cx6="http://schemas.microsoft.com/office/drawing/2016/5/12/chartex" xmlns:cx7="http://schemas.microsoft.com/office/drawing/2016/5/13/chartex" xmlns:cx8="http://schemas.microsoft.com/office/drawing/2016/5/14/chartex" xmlns:mc="http://schemas.openxmlformats.org/markup-compatibility/2006" xmlns:aink="http://schemas.microsoft.com/office/drawing/2016/ink" xmlns:am3d="http://schemas.microsoft.com/office/drawing/2017/model3d" xmlns:o="urn:schemas-microsoft-com:office:office" xmlns:oel="http://schemas.microsoft.com/office/2019/extlst" xmlns:r="http://schemas.openxmlformats.org/officeDocument/2006/relationships" xmlns:m="http://schemas.openxmlformats.org/officeDocument/2006/math" xmlns:v="urn:schemas-microsoft-com:vml" xmlns:wp14="http://schemas.microsoft.com/office/word/2010/wordprocessingDrawing" xmlns:wp="http://schemas.openxmlformats.org/drawingml/2006/wordprocessingDrawing" xmlns:w10="urn:schemas-microsoft-com:office:word" xmlns:w="http://schemas.openxmlformats.org/wordprocessingml/2006/main" xmlns:w14="http://schemas.microsoft.com/office/word/2010/wordml" xmlns:w15="http://schemas.microsoft.com/office/word/2012/wordml" xmlns:w16cex="http://schemas.microsoft.com/office/word/2018/wordml/cex" xmlns:w16cid="http://schemas.microsoft.com/office/word/2016/wordml/cid" xmlns:w16="http://schemas.microsoft.com/office/word/2018/wordml" xmlns:w16du="http://schemas.microsoft.com/office/word/2023/wordml/word16du" xmlns:w16sdtdh="http://schemas.microsoft.com/office/word/2020/wordml/sdtdatahash" xmlns:w16sdtfl="http://schemas.microsoft.com/office/word/2024/wordml/sdtformatlock" xmlns:w16se="http://schemas.microsoft.com/office/word/2015/wordml/symex" xmlns:wpg="http://schemas.microsoft.com/office/word/2010/wordprocessingGroup" xmlns:wpi="http://schemas.microsoft.com/office/word/2010/wordprocessingInk" xmlns:wne="http://schemas.microsoft.com/office/word/2006/wordml" xmlns:wps="http://schemas.microsoft.com/office/word/2010/wordprocessingShape" mc:Ignorable="w14 w15 w16se w16cid w16 w16cex w16sdtdh w16sdtfl w16du wp14">
   <w:endnote w:type="separator" w:id="-1">
     <w:p>
       <w:r>
@@ -12158,7 +12411,7 @@
 </file>
 
 <file path=word/footer1.xml><?xml version="1.0" encoding="utf-8"?>
-<w:ftr xmlns:wpc="http://schemas.microsoft.com/office/word/2010/wordprocessingCanvas" xmlns:cx="http://schemas.microsoft.com/office/drawing/2014/chartex" xmlns:cx1="http://schemas.microsoft.com/office/drawing/2015/9/8/chartex" xmlns:cx2="http://schemas.microsoft.com/office/drawing/2015/10/21/chartex" xmlns:cx3="http://schemas.microsoft.com/office/drawing/2016/5/9/chartex" xmlns:cx4="http://schemas.microsoft.com/office/drawing/2016/5/10/chartex" xmlns:cx5="http://schemas.microsoft.com/office/drawing/2016/5/11/chartex" xmlns:cx6="http://schemas.microsoft.com/office/drawing/2016/5/12/chartex" xmlns:cx7="http://schemas.microsoft.com/office/drawing/2016/5/13/chartex" xmlns:cx8="http://schemas.microsoft.com/office/drawing/2016/5/14/chartex" xmlns:mc="http://schemas.openxmlformats.org/markup-compatibility/2006" xmlns:aink="http://schemas.microsoft.com/office/drawing/2016/ink" xmlns:am3d="http://schemas.microsoft.com/office/drawing/2017/model3d" xmlns:o="urn:schemas-microsoft-com:office:office" xmlns:oel="http://schemas.microsoft.com/office/2019/extlst" xmlns:r="http://schemas.openxmlformats.org/officeDocument/2006/relationships" xmlns:m="http://schemas.openxmlformats.org/officeDocument/2006/math" xmlns:v="urn:schemas-microsoft-com:vml" xmlns:wp14="http://schemas.microsoft.com/office/word/2010/wordprocessingDrawing" xmlns:wp="http://schemas.openxmlformats.org/drawingml/2006/wordprocessingDrawing" xmlns:w10="urn:schemas-microsoft-com:office:word" xmlns:w="http://schemas.openxmlformats.org/wordprocessingml/2006/main" xmlns:w14="http://schemas.microsoft.com/office/word/2010/wordml" xmlns:w15="http://schemas.microsoft.com/office/word/2012/wordml" xmlns:w16cex="http://schemas.microsoft.com/office/word/2018/wordml/cex" xmlns:w16cid="http://schemas.microsoft.com/office/word/2016/wordml/cid" xmlns:w16="http://schemas.microsoft.com/office/word/2018/wordml" xmlns:w16sdtdh="http://schemas.microsoft.com/office/word/2020/wordml/sdtdatahash" xmlns:w16se="http://schemas.microsoft.com/office/word/2015/wordml/symex" xmlns:wpg="http://schemas.microsoft.com/office/word/2010/wordprocessingGroup" xmlns:wpi="http://schemas.microsoft.com/office/word/2010/wordprocessingInk" xmlns:wne="http://schemas.microsoft.com/office/word/2006/wordml" xmlns:wps="http://schemas.microsoft.com/office/word/2010/wordprocessingShape" mc:Ignorable="w14 w15 w16se w16cid w16 w16cex w16sdtdh wp14">
+<w:ftr xmlns:wpc="http://schemas.microsoft.com/office/word/2010/wordprocessingCanvas" xmlns:cx="http://schemas.microsoft.com/office/drawing/2014/chartex" xmlns:cx1="http://schemas.microsoft.com/office/drawing/2015/9/8/chartex" xmlns:cx2="http://schemas.microsoft.com/office/drawing/2015/10/21/chartex" xmlns:cx3="http://schemas.microsoft.com/office/drawing/2016/5/9/chartex" xmlns:cx4="http://schemas.microsoft.com/office/drawing/2016/5/10/chartex" xmlns:cx5="http://schemas.microsoft.com/office/drawing/2016/5/11/chartex" xmlns:cx6="http://schemas.microsoft.com/office/drawing/2016/5/12/chartex" xmlns:cx7="http://schemas.microsoft.com/office/drawing/2016/5/13/chartex" xmlns:cx8="http://schemas.microsoft.com/office/drawing/2016/5/14/chartex" xmlns:mc="http://schemas.openxmlformats.org/markup-compatibility/2006" xmlns:aink="http://schemas.microsoft.com/office/drawing/2016/ink" xmlns:am3d="http://schemas.microsoft.com/office/drawing/2017/model3d" xmlns:o="urn:schemas-microsoft-com:office:office" xmlns:oel="http://schemas.microsoft.com/office/2019/extlst" xmlns:r="http://schemas.openxmlformats.org/officeDocument/2006/relationships" xmlns:m="http://schemas.openxmlformats.org/officeDocument/2006/math" xmlns:v="urn:schemas-microsoft-com:vml" xmlns:wp14="http://schemas.microsoft.com/office/word/2010/wordprocessingDrawing" xmlns:wp="http://schemas.openxmlformats.org/drawingml/2006/wordprocessingDrawing" xmlns:w10="urn:schemas-microsoft-com:office:word" xmlns:w="http://schemas.openxmlformats.org/wordprocessingml/2006/main" xmlns:w14="http://schemas.microsoft.com/office/word/2010/wordml" xmlns:w15="http://schemas.microsoft.com/office/word/2012/wordml" xmlns:w16cex="http://schemas.microsoft.com/office/word/2018/wordml/cex" xmlns:w16cid="http://schemas.microsoft.com/office/word/2016/wordml/cid" xmlns:w16="http://schemas.microsoft.com/office/word/2018/wordml" xmlns:w16du="http://schemas.microsoft.com/office/word/2023/wordml/word16du" xmlns:w16sdtdh="http://schemas.microsoft.com/office/word/2020/wordml/sdtdatahash" xmlns:w16sdtfl="http://schemas.microsoft.com/office/word/2024/wordml/sdtformatlock" xmlns:w16se="http://schemas.microsoft.com/office/word/2015/wordml/symex" xmlns:wpg="http://schemas.microsoft.com/office/word/2010/wordprocessingGroup" xmlns:wpi="http://schemas.microsoft.com/office/word/2010/wordprocessingInk" xmlns:wne="http://schemas.microsoft.com/office/word/2006/wordml" xmlns:wps="http://schemas.microsoft.com/office/word/2010/wordprocessingShape" mc:Ignorable="w14 w15 w16se w16cid w16 w16cex w16sdtdh w16sdtfl w16du wp14">
   <w:p>
     <w:pPr>
       <w:pStyle w:val="Pidipagina"/>
@@ -12196,7 +12449,7 @@
 </file>
 
 <file path=word/footer2.xml><?xml version="1.0" encoding="utf-8"?>
-<w:ftr xmlns:wpc="http://schemas.microsoft.com/office/word/2010/wordprocessingCanvas" xmlns:cx="http://schemas.microsoft.com/office/drawing/2014/chartex" xmlns:cx1="http://schemas.microsoft.com/office/drawing/2015/9/8/chartex" xmlns:cx2="http://schemas.microsoft.com/office/drawing/2015/10/21/chartex" xmlns:cx3="http://schemas.microsoft.com/office/drawing/2016/5/9/chartex" xmlns:cx4="http://schemas.microsoft.com/office/drawing/2016/5/10/chartex" xmlns:cx5="http://schemas.microsoft.com/office/drawing/2016/5/11/chartex" xmlns:cx6="http://schemas.microsoft.com/office/drawing/2016/5/12/chartex" xmlns:cx7="http://schemas.microsoft.com/office/drawing/2016/5/13/chartex" xmlns:cx8="http://schemas.microsoft.com/office/drawing/2016/5/14/chartex" xmlns:mc="http://schemas.openxmlformats.org/markup-compatibility/2006" xmlns:aink="http://schemas.microsoft.com/office/drawing/2016/ink" xmlns:am3d="http://schemas.microsoft.com/office/drawing/2017/model3d" xmlns:o="urn:schemas-microsoft-com:office:office" xmlns:oel="http://schemas.microsoft.com/office/2019/extlst" xmlns:r="http://schemas.openxmlformats.org/officeDocument/2006/relationships" xmlns:m="http://schemas.openxmlformats.org/officeDocument/2006/math" xmlns:v="urn:schemas-microsoft-com:vml" xmlns:wp14="http://schemas.microsoft.com/office/word/2010/wordprocessingDrawing" xmlns:wp="http://schemas.openxmlformats.org/drawingml/2006/wordprocessingDrawing" xmlns:w10="urn:schemas-microsoft-com:office:word" xmlns:w="http://schemas.openxmlformats.org/wordprocessingml/2006/main" xmlns:w14="http://schemas.microsoft.com/office/word/2010/wordml" xmlns:w15="http://schemas.microsoft.com/office/word/2012/wordml" xmlns:w16cex="http://schemas.microsoft.com/office/word/2018/wordml/cex" xmlns:w16cid="http://schemas.microsoft.com/office/word/2016/wordml/cid" xmlns:w16="http://schemas.microsoft.com/office/word/2018/wordml" xmlns:w16sdtdh="http://schemas.microsoft.com/office/word/2020/wordml/sdtdatahash" xmlns:w16se="http://schemas.microsoft.com/office/word/2015/wordml/symex" xmlns:wpg="http://schemas.microsoft.com/office/word/2010/wordprocessingGroup" xmlns:wpi="http://schemas.microsoft.com/office/word/2010/wordprocessingInk" xmlns:wne="http://schemas.microsoft.com/office/word/2006/wordml" xmlns:wps="http://schemas.microsoft.com/office/word/2010/wordprocessingShape" mc:Ignorable="w14 w15 w16se w16cid w16 w16cex w16sdtdh wp14">
+<w:ftr xmlns:wpc="http://schemas.microsoft.com/office/word/2010/wordprocessingCanvas" xmlns:cx="http://schemas.microsoft.com/office/drawing/2014/chartex" xmlns:cx1="http://schemas.microsoft.com/office/drawing/2015/9/8/chartex" xmlns:cx2="http://schemas.microsoft.com/office/drawing/2015/10/21/chartex" xmlns:cx3="http://schemas.microsoft.com/office/drawing/2016/5/9/chartex" xmlns:cx4="http://schemas.microsoft.com/office/drawing/2016/5/10/chartex" xmlns:cx5="http://schemas.microsoft.com/office/drawing/2016/5/11/chartex" xmlns:cx6="http://schemas.microsoft.com/office/drawing/2016/5/12/chartex" xmlns:cx7="http://schemas.microsoft.com/office/drawing/2016/5/13/chartex" xmlns:cx8="http://schemas.microsoft.com/office/drawing/2016/5/14/chartex" xmlns:mc="http://schemas.openxmlformats.org/markup-compatibility/2006" xmlns:aink="http://schemas.microsoft.com/office/drawing/2016/ink" xmlns:am3d="http://schemas.microsoft.com/office/drawing/2017/model3d" xmlns:o="urn:schemas-microsoft-com:office:office" xmlns:oel="http://schemas.microsoft.com/office/2019/extlst" xmlns:r="http://schemas.openxmlformats.org/officeDocument/2006/relationships" xmlns:m="http://schemas.openxmlformats.org/officeDocument/2006/math" xmlns:v="urn:schemas-microsoft-com:vml" xmlns:wp14="http://schemas.microsoft.com/office/word/2010/wordprocessingDrawing" xmlns:wp="http://schemas.openxmlformats.org/drawingml/2006/wordprocessingDrawing" xmlns:w10="urn:schemas-microsoft-com:office:word" xmlns:w="http://schemas.openxmlformats.org/wordprocessingml/2006/main" xmlns:w14="http://schemas.microsoft.com/office/word/2010/wordml" xmlns:w15="http://schemas.microsoft.com/office/word/2012/wordml" xmlns:w16cex="http://schemas.microsoft.com/office/word/2018/wordml/cex" xmlns:w16cid="http://schemas.microsoft.com/office/word/2016/wordml/cid" xmlns:w16="http://schemas.microsoft.com/office/word/2018/wordml" xmlns:w16du="http://schemas.microsoft.com/office/word/2023/wordml/word16du" xmlns:w16sdtdh="http://schemas.microsoft.com/office/word/2020/wordml/sdtdatahash" xmlns:w16sdtfl="http://schemas.microsoft.com/office/word/2024/wordml/sdtformatlock" xmlns:w16se="http://schemas.microsoft.com/office/word/2015/wordml/symex" xmlns:wpg="http://schemas.microsoft.com/office/word/2010/wordprocessingGroup" xmlns:wpi="http://schemas.microsoft.com/office/word/2010/wordprocessingInk" xmlns:wne="http://schemas.microsoft.com/office/word/2006/wordml" xmlns:wps="http://schemas.microsoft.com/office/word/2010/wordprocessingShape" mc:Ignorable="w14 w15 w16se w16cid w16 w16cex w16sdtdh w16sdtfl w16du wp14">
   <w:tbl>
     <w:tblPr>
       <w:tblW w:w="0" w:type="auto"/>
@@ -12210,7 +12463,6 @@
       <w:tc>
         <w:tcPr>
           <w:tcW w:w="2464" w:type="dxa"/>
-          <w:shd w:val="clear" w:color="auto" w:fill="auto"/>
         </w:tcPr>
         <w:p>
           <w:pPr>
@@ -12231,7 +12483,6 @@
       <w:tc>
         <w:tcPr>
           <w:tcW w:w="7390" w:type="dxa"/>
-          <w:shd w:val="clear" w:color="auto" w:fill="auto"/>
         </w:tcPr>
         <w:p>
           <w:pPr>
@@ -12252,7 +12503,6 @@
       <w:tc>
         <w:tcPr>
           <w:tcW w:w="2464" w:type="dxa"/>
-          <w:shd w:val="clear" w:color="auto" w:fill="auto"/>
         </w:tcPr>
         <w:p>
           <w:pPr>
@@ -12273,7 +12523,6 @@
       <w:tc>
         <w:tcPr>
           <w:tcW w:w="7390" w:type="dxa"/>
-          <w:shd w:val="clear" w:color="auto" w:fill="auto"/>
         </w:tcPr>
         <w:p>
           <w:pPr>
@@ -12294,7 +12543,6 @@
       <w:tc>
         <w:tcPr>
           <w:tcW w:w="2464" w:type="dxa"/>
-          <w:shd w:val="clear" w:color="auto" w:fill="auto"/>
         </w:tcPr>
         <w:p>
           <w:pPr>
@@ -12315,7 +12563,6 @@
       <w:tc>
         <w:tcPr>
           <w:tcW w:w="7390" w:type="dxa"/>
-          <w:shd w:val="clear" w:color="auto" w:fill="auto"/>
         </w:tcPr>
         <w:p>
           <w:pPr>
@@ -12342,7 +12589,6 @@
       <w:tc>
         <w:tcPr>
           <w:tcW w:w="2464" w:type="dxa"/>
-          <w:shd w:val="clear" w:color="auto" w:fill="auto"/>
         </w:tcPr>
         <w:p>
           <w:pPr>
@@ -12363,7 +12609,6 @@
       <w:tc>
         <w:tcPr>
           <w:tcW w:w="7390" w:type="dxa"/>
-          <w:shd w:val="clear" w:color="auto" w:fill="auto"/>
         </w:tcPr>
         <w:p>
           <w:pPr>
@@ -12414,7 +12659,6 @@
       <w:tc>
         <w:tcPr>
           <w:tcW w:w="2464" w:type="dxa"/>
-          <w:shd w:val="clear" w:color="auto" w:fill="auto"/>
         </w:tcPr>
         <w:p>
           <w:pPr>
@@ -12435,7 +12679,6 @@
       <w:tc>
         <w:tcPr>
           <w:tcW w:w="7390" w:type="dxa"/>
-          <w:shd w:val="clear" w:color="auto" w:fill="auto"/>
         </w:tcPr>
         <w:p>
           <w:pPr>
@@ -12465,7 +12708,7 @@
 </file>
 
 <file path=word/footnotes.xml><?xml version="1.0" encoding="utf-8"?>
-<w:footnotes xmlns:wpc="http://schemas.microsoft.com/office/word/2010/wordprocessingCanvas" xmlns:cx="http://schemas.microsoft.com/office/drawing/2014/chartex" xmlns:cx1="http://schemas.microsoft.com/office/drawing/2015/9/8/chartex" xmlns:cx2="http://schemas.microsoft.com/office/drawing/2015/10/21/chartex" xmlns:cx3="http://schemas.microsoft.com/office/drawing/2016/5/9/chartex" xmlns:cx4="http://schemas.microsoft.com/office/drawing/2016/5/10/chartex" xmlns:cx5="http://schemas.microsoft.com/office/drawing/2016/5/11/chartex" xmlns:cx6="http://schemas.microsoft.com/office/drawing/2016/5/12/chartex" xmlns:cx7="http://schemas.microsoft.com/office/drawing/2016/5/13/chartex" xmlns:cx8="http://schemas.microsoft.com/office/drawing/2016/5/14/chartex" xmlns:mc="http://schemas.openxmlformats.org/markup-compatibility/2006" xmlns:aink="http://schemas.microsoft.com/office/drawing/2016/ink" xmlns:am3d="http://schemas.microsoft.com/office/drawing/2017/model3d" xmlns:o="urn:schemas-microsoft-com:office:office" xmlns:oel="http://schemas.microsoft.com/office/2019/extlst" xmlns:r="http://schemas.openxmlformats.org/officeDocument/2006/relationships" xmlns:m="http://schemas.openxmlformats.org/officeDocument/2006/math" xmlns:v="urn:schemas-microsoft-com:vml" xmlns:wp14="http://schemas.microsoft.com/office/word/2010/wordprocessingDrawing" xmlns:wp="http://schemas.openxmlformats.org/drawingml/2006/wordprocessingDrawing" xmlns:w10="urn:schemas-microsoft-com:office:word" xmlns:w="http://schemas.openxmlformats.org/wordprocessingml/2006/main" xmlns:w14="http://schemas.microsoft.com/office/word/2010/wordml" xmlns:w15="http://schemas.microsoft.com/office/word/2012/wordml" xmlns:w16cex="http://schemas.microsoft.com/office/word/2018/wordml/cex" xmlns:w16cid="http://schemas.microsoft.com/office/word/2016/wordml/cid" xmlns:w16="http://schemas.microsoft.com/office/word/2018/wordml" xmlns:w16sdtdh="http://schemas.microsoft.com/office/word/2020/wordml/sdtdatahash" xmlns:w16se="http://schemas.microsoft.com/office/word/2015/wordml/symex" xmlns:wpg="http://schemas.microsoft.com/office/word/2010/wordprocessingGroup" xmlns:wpi="http://schemas.microsoft.com/office/word/2010/wordprocessingInk" xmlns:wne="http://schemas.microsoft.com/office/word/2006/wordml" xmlns:wps="http://schemas.microsoft.com/office/word/2010/wordprocessingShape" mc:Ignorable="w14 w15 w16se w16cid w16 w16cex w16sdtdh wp14">
+<w:footnotes xmlns:wpc="http://schemas.microsoft.com/office/word/2010/wordprocessingCanvas" xmlns:cx="http://schemas.microsoft.com/office/drawing/2014/chartex" xmlns:cx1="http://schemas.microsoft.com/office/drawing/2015/9/8/chartex" xmlns:cx2="http://schemas.microsoft.com/office/drawing/2015/10/21/chartex" xmlns:cx3="http://schemas.microsoft.com/office/drawing/2016/5/9/chartex" xmlns:cx4="http://schemas.microsoft.com/office/drawing/2016/5/10/chartex" xmlns:cx5="http://schemas.microsoft.com/office/drawing/2016/5/11/chartex" xmlns:cx6="http://schemas.microsoft.com/office/drawing/2016/5/12/chartex" xmlns:cx7="http://schemas.microsoft.com/office/drawing/2016/5/13/chartex" xmlns:cx8="http://schemas.microsoft.com/office/drawing/2016/5/14/chartex" xmlns:mc="http://schemas.openxmlformats.org/markup-compatibility/2006" xmlns:aink="http://schemas.microsoft.com/office/drawing/2016/ink" xmlns:am3d="http://schemas.microsoft.com/office/drawing/2017/model3d" xmlns:o="urn:schemas-microsoft-com:office:office" xmlns:oel="http://schemas.microsoft.com/office/2019/extlst" xmlns:r="http://schemas.openxmlformats.org/officeDocument/2006/relationships" xmlns:m="http://schemas.openxmlformats.org/officeDocument/2006/math" xmlns:v="urn:schemas-microsoft-com:vml" xmlns:wp14="http://schemas.microsoft.com/office/word/2010/wordprocessingDrawing" xmlns:wp="http://schemas.openxmlformats.org/drawingml/2006/wordprocessingDrawing" xmlns:w10="urn:schemas-microsoft-com:office:word" xmlns:w="http://schemas.openxmlformats.org/wordprocessingml/2006/main" xmlns:w14="http://schemas.microsoft.com/office/word/2010/wordml" xmlns:w15="http://schemas.microsoft.com/office/word/2012/wordml" xmlns:w16cex="http://schemas.microsoft.com/office/word/2018/wordml/cex" xmlns:w16cid="http://schemas.microsoft.com/office/word/2016/wordml/cid" xmlns:w16="http://schemas.microsoft.com/office/word/2018/wordml" xmlns:w16du="http://schemas.microsoft.com/office/word/2023/wordml/word16du" xmlns:w16sdtdh="http://schemas.microsoft.com/office/word/2020/wordml/sdtdatahash" xmlns:w16sdtfl="http://schemas.microsoft.com/office/word/2024/wordml/sdtformatlock" xmlns:w16se="http://schemas.microsoft.com/office/word/2015/wordml/symex" xmlns:wpg="http://schemas.microsoft.com/office/word/2010/wordprocessingGroup" xmlns:wpi="http://schemas.microsoft.com/office/word/2010/wordprocessingInk" xmlns:wne="http://schemas.microsoft.com/office/word/2006/wordml" xmlns:wps="http://schemas.microsoft.com/office/word/2010/wordprocessingShape" mc:Ignorable="w14 w15 w16se w16cid w16 w16cex w16sdtdh w16sdtfl w16du wp14">
   <w:footnote w:type="separator" w:id="-1">
     <w:p>
       <w:r>
@@ -12484,7 +12727,7 @@
 </file>
 
 <file path=word/header1.xml><?xml version="1.0" encoding="utf-8"?>
-<w:hdr xmlns:wpc="http://schemas.microsoft.com/office/word/2010/wordprocessingCanvas" xmlns:cx="http://schemas.microsoft.com/office/drawing/2014/chartex" xmlns:cx1="http://schemas.microsoft.com/office/drawing/2015/9/8/chartex" xmlns:cx2="http://schemas.microsoft.com/office/drawing/2015/10/21/chartex" xmlns:cx3="http://schemas.microsoft.com/office/drawing/2016/5/9/chartex" xmlns:cx4="http://schemas.microsoft.com/office/drawing/2016/5/10/chartex" xmlns:cx5="http://schemas.microsoft.com/office/drawing/2016/5/11/chartex" xmlns:cx6="http://schemas.microsoft.com/office/drawing/2016/5/12/chartex" xmlns:cx7="http://schemas.microsoft.com/office/drawing/2016/5/13/chartex" xmlns:cx8="http://schemas.microsoft.com/office/drawing/2016/5/14/chartex" xmlns:mc="http://schemas.openxmlformats.org/markup-compatibility/2006" xmlns:aink="http://schemas.microsoft.com/office/drawing/2016/ink" xmlns:am3d="http://schemas.microsoft.com/office/drawing/2017/model3d" xmlns:o="urn:schemas-microsoft-com:office:office" xmlns:oel="http://schemas.microsoft.com/office/2019/extlst" xmlns:r="http://schemas.openxmlformats.org/officeDocument/2006/relationships" xmlns:m="http://schemas.openxmlformats.org/officeDocument/2006/math" xmlns:v="urn:schemas-microsoft-com:vml" xmlns:wp14="http://schemas.microsoft.com/office/word/2010/wordprocessingDrawing" xmlns:wp="http://schemas.openxmlformats.org/drawingml/2006/wordprocessingDrawing" xmlns:w10="urn:schemas-microsoft-com:office:word" xmlns:w="http://schemas.openxmlformats.org/wordprocessingml/2006/main" xmlns:w14="http://schemas.microsoft.com/office/word/2010/wordml" xmlns:w15="http://schemas.microsoft.com/office/word/2012/wordml" xmlns:w16cex="http://schemas.microsoft.com/office/word/2018/wordml/cex" xmlns:w16cid="http://schemas.microsoft.com/office/word/2016/wordml/cid" xmlns:w16="http://schemas.microsoft.com/office/word/2018/wordml" xmlns:w16sdtdh="http://schemas.microsoft.com/office/word/2020/wordml/sdtdatahash" xmlns:w16se="http://schemas.microsoft.com/office/word/2015/wordml/symex" xmlns:wpg="http://schemas.microsoft.com/office/word/2010/wordprocessingGroup" xmlns:wpi="http://schemas.microsoft.com/office/word/2010/wordprocessingInk" xmlns:wne="http://schemas.microsoft.com/office/word/2006/wordml" xmlns:wps="http://schemas.microsoft.com/office/word/2010/wordprocessingShape" mc:Ignorable="w14 w15 w16se w16cid w16 w16cex w16sdtdh wp14">
+<w:hdr xmlns:wpc="http://schemas.microsoft.com/office/word/2010/wordprocessingCanvas" xmlns:cx="http://schemas.microsoft.com/office/drawing/2014/chartex" xmlns:cx1="http://schemas.microsoft.com/office/drawing/2015/9/8/chartex" xmlns:cx2="http://schemas.microsoft.com/office/drawing/2015/10/21/chartex" xmlns:cx3="http://schemas.microsoft.com/office/drawing/2016/5/9/chartex" xmlns:cx4="http://schemas.microsoft.com/office/drawing/2016/5/10/chartex" xmlns:cx5="http://schemas.microsoft.com/office/drawing/2016/5/11/chartex" xmlns:cx6="http://schemas.microsoft.com/office/drawing/2016/5/12/chartex" xmlns:cx7="http://schemas.microsoft.com/office/drawing/2016/5/13/chartex" xmlns:cx8="http://schemas.microsoft.com/office/drawing/2016/5/14/chartex" xmlns:mc="http://schemas.openxmlformats.org/markup-compatibility/2006" xmlns:aink="http://schemas.microsoft.com/office/drawing/2016/ink" xmlns:am3d="http://schemas.microsoft.com/office/drawing/2017/model3d" xmlns:o="urn:schemas-microsoft-com:office:office" xmlns:oel="http://schemas.microsoft.com/office/2019/extlst" xmlns:r="http://schemas.openxmlformats.org/officeDocument/2006/relationships" xmlns:m="http://schemas.openxmlformats.org/officeDocument/2006/math" xmlns:v="urn:schemas-microsoft-com:vml" xmlns:wp14="http://schemas.microsoft.com/office/word/2010/wordprocessingDrawing" xmlns:wp="http://schemas.openxmlformats.org/drawingml/2006/wordprocessingDrawing" xmlns:w10="urn:schemas-microsoft-com:office:word" xmlns:w="http://schemas.openxmlformats.org/wordprocessingml/2006/main" xmlns:w14="http://schemas.microsoft.com/office/word/2010/wordml" xmlns:w15="http://schemas.microsoft.com/office/word/2012/wordml" xmlns:w16cex="http://schemas.microsoft.com/office/word/2018/wordml/cex" xmlns:w16cid="http://schemas.microsoft.com/office/word/2016/wordml/cid" xmlns:w16="http://schemas.microsoft.com/office/word/2018/wordml" xmlns:w16du="http://schemas.microsoft.com/office/word/2023/wordml/word16du" xmlns:w16sdtdh="http://schemas.microsoft.com/office/word/2020/wordml/sdtdatahash" xmlns:w16sdtfl="http://schemas.microsoft.com/office/word/2024/wordml/sdtformatlock" xmlns:w16se="http://schemas.microsoft.com/office/word/2015/wordml/symex" xmlns:wpg="http://schemas.microsoft.com/office/word/2010/wordprocessingGroup" xmlns:wpi="http://schemas.microsoft.com/office/word/2010/wordprocessingInk" xmlns:wne="http://schemas.microsoft.com/office/word/2006/wordml" xmlns:wps="http://schemas.microsoft.com/office/word/2010/wordprocessingShape" mc:Ignorable="w14 w15 w16se w16cid w16 w16cex w16sdtdh w16sdtfl w16du wp14">
   <w:tbl>
     <w:tblPr>
       <w:tblW w:w="9639" w:type="dxa"/>
@@ -12853,7 +13096,7 @@
 </file>
 
 <file path=word/header2.xml><?xml version="1.0" encoding="utf-8"?>
-<w:hdr xmlns:wpc="http://schemas.microsoft.com/office/word/2010/wordprocessingCanvas" xmlns:cx="http://schemas.microsoft.com/office/drawing/2014/chartex" xmlns:cx1="http://schemas.microsoft.com/office/drawing/2015/9/8/chartex" xmlns:cx2="http://schemas.microsoft.com/office/drawing/2015/10/21/chartex" xmlns:cx3="http://schemas.microsoft.com/office/drawing/2016/5/9/chartex" xmlns:cx4="http://schemas.microsoft.com/office/drawing/2016/5/10/chartex" xmlns:cx5="http://schemas.microsoft.com/office/drawing/2016/5/11/chartex" xmlns:cx6="http://schemas.microsoft.com/office/drawing/2016/5/12/chartex" xmlns:cx7="http://schemas.microsoft.com/office/drawing/2016/5/13/chartex" xmlns:cx8="http://schemas.microsoft.com/office/drawing/2016/5/14/chartex" xmlns:mc="http://schemas.openxmlformats.org/markup-compatibility/2006" xmlns:aink="http://schemas.microsoft.com/office/drawing/2016/ink" xmlns:am3d="http://schemas.microsoft.com/office/drawing/2017/model3d" xmlns:o="urn:schemas-microsoft-com:office:office" xmlns:oel="http://schemas.microsoft.com/office/2019/extlst" xmlns:r="http://schemas.openxmlformats.org/officeDocument/2006/relationships" xmlns:m="http://schemas.openxmlformats.org/officeDocument/2006/math" xmlns:v="urn:schemas-microsoft-com:vml" xmlns:wp14="http://schemas.microsoft.com/office/word/2010/wordprocessingDrawing" xmlns:wp="http://schemas.openxmlformats.org/drawingml/2006/wordprocessingDrawing" xmlns:w10="urn:schemas-microsoft-com:office:word" xmlns:w="http://schemas.openxmlformats.org/wordprocessingml/2006/main" xmlns:w14="http://schemas.microsoft.com/office/word/2010/wordml" xmlns:w15="http://schemas.microsoft.com/office/word/2012/wordml" xmlns:w16cex="http://schemas.microsoft.com/office/word/2018/wordml/cex" xmlns:w16cid="http://schemas.microsoft.com/office/word/2016/wordml/cid" xmlns:w16="http://schemas.microsoft.com/office/word/2018/wordml" xmlns:w16sdtdh="http://schemas.microsoft.com/office/word/2020/wordml/sdtdatahash" xmlns:w16se="http://schemas.microsoft.com/office/word/2015/wordml/symex" xmlns:wpg="http://schemas.microsoft.com/office/word/2010/wordprocessingGroup" xmlns:wpi="http://schemas.microsoft.com/office/word/2010/wordprocessingInk" xmlns:wne="http://schemas.microsoft.com/office/word/2006/wordml" xmlns:wps="http://schemas.microsoft.com/office/word/2010/wordprocessingShape" mc:Ignorable="w14 w15 w16se w16cid w16 w16cex w16sdtdh wp14">
+<w:hdr xmlns:wpc="http://schemas.microsoft.com/office/word/2010/wordprocessingCanvas" xmlns:cx="http://schemas.microsoft.com/office/drawing/2014/chartex" xmlns:cx1="http://schemas.microsoft.com/office/drawing/2015/9/8/chartex" xmlns:cx2="http://schemas.microsoft.com/office/drawing/2015/10/21/chartex" xmlns:cx3="http://schemas.microsoft.com/office/drawing/2016/5/9/chartex" xmlns:cx4="http://schemas.microsoft.com/office/drawing/2016/5/10/chartex" xmlns:cx5="http://schemas.microsoft.com/office/drawing/2016/5/11/chartex" xmlns:cx6="http://schemas.microsoft.com/office/drawing/2016/5/12/chartex" xmlns:cx7="http://schemas.microsoft.com/office/drawing/2016/5/13/chartex" xmlns:cx8="http://schemas.microsoft.com/office/drawing/2016/5/14/chartex" xmlns:mc="http://schemas.openxmlformats.org/markup-compatibility/2006" xmlns:aink="http://schemas.microsoft.com/office/drawing/2016/ink" xmlns:am3d="http://schemas.microsoft.com/office/drawing/2017/model3d" xmlns:o="urn:schemas-microsoft-com:office:office" xmlns:oel="http://schemas.microsoft.com/office/2019/extlst" xmlns:r="http://schemas.openxmlformats.org/officeDocument/2006/relationships" xmlns:m="http://schemas.openxmlformats.org/officeDocument/2006/math" xmlns:v="urn:schemas-microsoft-com:vml" xmlns:wp14="http://schemas.microsoft.com/office/word/2010/wordprocessingDrawing" xmlns:wp="http://schemas.openxmlformats.org/drawingml/2006/wordprocessingDrawing" xmlns:w10="urn:schemas-microsoft-com:office:word" xmlns:w="http://schemas.openxmlformats.org/wordprocessingml/2006/main" xmlns:w14="http://schemas.microsoft.com/office/word/2010/wordml" xmlns:w15="http://schemas.microsoft.com/office/word/2012/wordml" xmlns:w16cex="http://schemas.microsoft.com/office/word/2018/wordml/cex" xmlns:w16cid="http://schemas.microsoft.com/office/word/2016/wordml/cid" xmlns:w16="http://schemas.microsoft.com/office/word/2018/wordml" xmlns:w16du="http://schemas.microsoft.com/office/word/2023/wordml/word16du" xmlns:w16sdtdh="http://schemas.microsoft.com/office/word/2020/wordml/sdtdatahash" xmlns:w16sdtfl="http://schemas.microsoft.com/office/word/2024/wordml/sdtformatlock" xmlns:w16se="http://schemas.microsoft.com/office/word/2015/wordml/symex" xmlns:wpg="http://schemas.microsoft.com/office/word/2010/wordprocessingGroup" xmlns:wpi="http://schemas.microsoft.com/office/word/2010/wordprocessingInk" xmlns:wne="http://schemas.microsoft.com/office/word/2006/wordml" xmlns:wps="http://schemas.microsoft.com/office/word/2010/wordprocessingShape" mc:Ignorable="w14 w15 w16se w16cid w16 w16cex w16sdtdh w16sdtfl w16du wp14">
   <w:tbl>
     <w:tblPr>
       <w:tblW w:w="9644" w:type="dxa"/>
@@ -13076,7 +13319,7 @@
 </file>
 
 <file path=word/numbering.xml><?xml version="1.0" encoding="utf-8"?>
-<w:numbering xmlns:wpc="http://schemas.microsoft.com/office/word/2010/wordprocessingCanvas" xmlns:cx="http://schemas.microsoft.com/office/drawing/2014/chartex" xmlns:cx1="http://schemas.microsoft.com/office/drawing/2015/9/8/chartex" xmlns:cx2="http://schemas.microsoft.com/office/drawing/2015/10/21/chartex" xmlns:cx3="http://schemas.microsoft.com/office/drawing/2016/5/9/chartex" xmlns:cx4="http://schemas.microsoft.com/office/drawing/2016/5/10/chartex" xmlns:cx5="http://schemas.microsoft.com/office/drawing/2016/5/11/chartex" xmlns:cx6="http://schemas.microsoft.com/office/drawing/2016/5/12/chartex" xmlns:cx7="http://schemas.microsoft.com/office/drawing/2016/5/13/chartex" xmlns:cx8="http://schemas.microsoft.com/office/drawing/2016/5/14/chartex" xmlns:mc="http://schemas.openxmlformats.org/markup-compatibility/2006" xmlns:aink="http://schemas.microsoft.com/office/drawing/2016/ink" xmlns:am3d="http://schemas.microsoft.com/office/drawing/2017/model3d" xmlns:o="urn:schemas-microsoft-com:office:office" xmlns:oel="http://schemas.microsoft.com/office/2019/extlst" xmlns:r="http://schemas.openxmlformats.org/officeDocument/2006/relationships" xmlns:m="http://schemas.openxmlformats.org/officeDocument/2006/math" xmlns:v="urn:schemas-microsoft-com:vml" xmlns:wp14="http://schemas.microsoft.com/office/word/2010/wordprocessingDrawing" xmlns:wp="http://schemas.openxmlformats.org/drawingml/2006/wordprocessingDrawing" xmlns:w10="urn:schemas-microsoft-com:office:word" xmlns:w="http://schemas.openxmlformats.org/wordprocessingml/2006/main" xmlns:w14="http://schemas.microsoft.com/office/word/2010/wordml" xmlns:w15="http://schemas.microsoft.com/office/word/2012/wordml" xmlns:w16cex="http://schemas.microsoft.com/office/word/2018/wordml/cex" xmlns:w16cid="http://schemas.microsoft.com/office/word/2016/wordml/cid" xmlns:w16="http://schemas.microsoft.com/office/word/2018/wordml" xmlns:w16sdtdh="http://schemas.microsoft.com/office/word/2020/wordml/sdtdatahash" xmlns:w16se="http://schemas.microsoft.com/office/word/2015/wordml/symex" xmlns:wpg="http://schemas.microsoft.com/office/word/2010/wordprocessingGroup" xmlns:wpi="http://schemas.microsoft.com/office/word/2010/wordprocessingInk" xmlns:wne="http://schemas.microsoft.com/office/word/2006/wordml" xmlns:wps="http://schemas.microsoft.com/office/word/2010/wordprocessingShape" mc:Ignorable="w14 w15 w16se w16cid w16 w16cex w16sdtdh wp14">
+<w:numbering xmlns:wpc="http://schemas.microsoft.com/office/word/2010/wordprocessingCanvas" xmlns:cx="http://schemas.microsoft.com/office/drawing/2014/chartex" xmlns:cx1="http://schemas.microsoft.com/office/drawing/2015/9/8/chartex" xmlns:cx2="http://schemas.microsoft.com/office/drawing/2015/10/21/chartex" xmlns:cx3="http://schemas.microsoft.com/office/drawing/2016/5/9/chartex" xmlns:cx4="http://schemas.microsoft.com/office/drawing/2016/5/10/chartex" xmlns:cx5="http://schemas.microsoft.com/office/drawing/2016/5/11/chartex" xmlns:cx6="http://schemas.microsoft.com/office/drawing/2016/5/12/chartex" xmlns:cx7="http://schemas.microsoft.com/office/drawing/2016/5/13/chartex" xmlns:cx8="http://schemas.microsoft.com/office/drawing/2016/5/14/chartex" xmlns:mc="http://schemas.openxmlformats.org/markup-compatibility/2006" xmlns:aink="http://schemas.microsoft.com/office/drawing/2016/ink" xmlns:am3d="http://schemas.microsoft.com/office/drawing/2017/model3d" xmlns:o="urn:schemas-microsoft-com:office:office" xmlns:oel="http://schemas.microsoft.com/office/2019/extlst" xmlns:r="http://schemas.openxmlformats.org/officeDocument/2006/relationships" xmlns:m="http://schemas.openxmlformats.org/officeDocument/2006/math" xmlns:v="urn:schemas-microsoft-com:vml" xmlns:wp14="http://schemas.microsoft.com/office/word/2010/wordprocessingDrawing" xmlns:wp="http://schemas.openxmlformats.org/drawingml/2006/wordprocessingDrawing" xmlns:w10="urn:schemas-microsoft-com:office:word" xmlns:w="http://schemas.openxmlformats.org/wordprocessingml/2006/main" xmlns:w14="http://schemas.microsoft.com/office/word/2010/wordml" xmlns:w15="http://schemas.microsoft.com/office/word/2012/wordml" xmlns:w16cex="http://schemas.microsoft.com/office/word/2018/wordml/cex" xmlns:w16cid="http://schemas.microsoft.com/office/word/2016/wordml/cid" xmlns:w16="http://schemas.microsoft.com/office/word/2018/wordml" xmlns:w16du="http://schemas.microsoft.com/office/word/2023/wordml/word16du" xmlns:w16sdtdh="http://schemas.microsoft.com/office/word/2020/wordml/sdtdatahash" xmlns:w16sdtfl="http://schemas.microsoft.com/office/word/2024/wordml/sdtformatlock" xmlns:w16se="http://schemas.microsoft.com/office/word/2015/wordml/symex" xmlns:wpg="http://schemas.microsoft.com/office/word/2010/wordprocessingGroup" xmlns:wpi="http://schemas.microsoft.com/office/word/2010/wordprocessingInk" xmlns:wne="http://schemas.microsoft.com/office/word/2006/wordml" xmlns:wps="http://schemas.microsoft.com/office/word/2010/wordprocessingShape" mc:Ignorable="w14 w15 w16se w16cid w16 w16cex w16sdtdh w16sdtfl w16du wp14">
   <w:abstractNum w:abstractNumId="0" w15:restartNumberingAfterBreak="0">
     <w:nsid w:val="0801489A"/>
     <w:multiLevelType w:val="hybridMultilevel"/>
@@ -14724,6 +14967,119 @@
     </w:lvl>
   </w:abstractNum>
   <w:abstractNum w:abstractNumId="13" w15:restartNumberingAfterBreak="0">
+    <w:nsid w:val="553064EF"/>
+    <w:multiLevelType w:val="hybridMultilevel"/>
+    <w:tmpl w:val="F886AEFE"/>
+    <w:lvl w:ilvl="0" w:tplc="04100001">
+      <w:start w:val="1"/>
+      <w:numFmt w:val="bullet"/>
+      <w:lvlText w:val=""/>
+      <w:lvlJc w:val="left"/>
+      <w:pPr>
+        <w:ind w:left="720" w:hanging="360"/>
+      </w:pPr>
+      <w:rPr>
+        <w:rFonts w:ascii="Symbol" w:hAnsi="Symbol" w:hint="default"/>
+      </w:rPr>
+    </w:lvl>
+    <w:lvl w:ilvl="1" w:tplc="04100003" w:tentative="1">
+      <w:start w:val="1"/>
+      <w:numFmt w:val="bullet"/>
+      <w:lvlText w:val="o"/>
+      <w:lvlJc w:val="left"/>
+      <w:pPr>
+        <w:ind w:left="1440" w:hanging="360"/>
+      </w:pPr>
+      <w:rPr>
+        <w:rFonts w:ascii="Courier New" w:hAnsi="Courier New" w:cs="Courier New" w:hint="default"/>
+      </w:rPr>
+    </w:lvl>
+    <w:lvl w:ilvl="2" w:tplc="04100005" w:tentative="1">
+      <w:start w:val="1"/>
+      <w:numFmt w:val="bullet"/>
+      <w:lvlText w:val=""/>
+      <w:lvlJc w:val="left"/>
+      <w:pPr>
+        <w:ind w:left="2160" w:hanging="360"/>
+      </w:pPr>
+      <w:rPr>
+        <w:rFonts w:ascii="Wingdings" w:hAnsi="Wingdings" w:hint="default"/>
+      </w:rPr>
+    </w:lvl>
+    <w:lvl w:ilvl="3" w:tplc="04100001" w:tentative="1">
+      <w:start w:val="1"/>
+      <w:numFmt w:val="bullet"/>
+      <w:lvlText w:val=""/>
+      <w:lvlJc w:val="left"/>
+      <w:pPr>
+        <w:ind w:left="2880" w:hanging="360"/>
+      </w:pPr>
+      <w:rPr>
+        <w:rFonts w:ascii="Symbol" w:hAnsi="Symbol" w:hint="default"/>
+      </w:rPr>
+    </w:lvl>
+    <w:lvl w:ilvl="4" w:tplc="04100003" w:tentative="1">
+      <w:start w:val="1"/>
+      <w:numFmt w:val="bullet"/>
+      <w:lvlText w:val="o"/>
+      <w:lvlJc w:val="left"/>
+      <w:pPr>
+        <w:ind w:left="3600" w:hanging="360"/>
+      </w:pPr>
+      <w:rPr>
+        <w:rFonts w:ascii="Courier New" w:hAnsi="Courier New" w:cs="Courier New" w:hint="default"/>
+      </w:rPr>
+    </w:lvl>
+    <w:lvl w:ilvl="5" w:tplc="04100005" w:tentative="1">
+      <w:start w:val="1"/>
+      <w:numFmt w:val="bullet"/>
+      <w:lvlText w:val=""/>
+      <w:lvlJc w:val="left"/>
+      <w:pPr>
+        <w:ind w:left="4320" w:hanging="360"/>
+      </w:pPr>
+      <w:rPr>
+        <w:rFonts w:ascii="Wingdings" w:hAnsi="Wingdings" w:hint="default"/>
+      </w:rPr>
+    </w:lvl>
+    <w:lvl w:ilvl="6" w:tplc="04100001" w:tentative="1">
+      <w:start w:val="1"/>
+      <w:numFmt w:val="bullet"/>
+      <w:lvlText w:val=""/>
+      <w:lvlJc w:val="left"/>
+      <w:pPr>
+        <w:ind w:left="5040" w:hanging="360"/>
+      </w:pPr>
+      <w:rPr>
+        <w:rFonts w:ascii="Symbol" w:hAnsi="Symbol" w:hint="default"/>
+      </w:rPr>
+    </w:lvl>
+    <w:lvl w:ilvl="7" w:tplc="04100003" w:tentative="1">
+      <w:start w:val="1"/>
+      <w:numFmt w:val="bullet"/>
+      <w:lvlText w:val="o"/>
+      <w:lvlJc w:val="left"/>
+      <w:pPr>
+        <w:ind w:left="5760" w:hanging="360"/>
+      </w:pPr>
+      <w:rPr>
+        <w:rFonts w:ascii="Courier New" w:hAnsi="Courier New" w:cs="Courier New" w:hint="default"/>
+      </w:rPr>
+    </w:lvl>
+    <w:lvl w:ilvl="8" w:tplc="04100005" w:tentative="1">
+      <w:start w:val="1"/>
+      <w:numFmt w:val="bullet"/>
+      <w:lvlText w:val=""/>
+      <w:lvlJc w:val="left"/>
+      <w:pPr>
+        <w:ind w:left="6480" w:hanging="360"/>
+      </w:pPr>
+      <w:rPr>
+        <w:rFonts w:ascii="Wingdings" w:hAnsi="Wingdings" w:hint="default"/>
+      </w:rPr>
+    </w:lvl>
+  </w:abstractNum>
+  <w:abstractNum w:abstractNumId="14" w15:restartNumberingAfterBreak="0">
     <w:nsid w:val="57C86EE7"/>
     <w:multiLevelType w:val="multilevel"/>
     <w:tmpl w:val="4DE6CDEC"/>
@@ -14872,7 +15228,7 @@
       </w:rPr>
     </w:lvl>
   </w:abstractNum>
-  <w:abstractNum w:abstractNumId="14" w15:restartNumberingAfterBreak="0">
+  <w:abstractNum w:abstractNumId="15" w15:restartNumberingAfterBreak="0">
     <w:nsid w:val="652809B9"/>
     <w:multiLevelType w:val="hybridMultilevel"/>
     <w:tmpl w:val="C10EC632"/>
@@ -14985,7 +15341,7 @@
       </w:rPr>
     </w:lvl>
   </w:abstractNum>
-  <w:abstractNum w:abstractNumId="15" w15:restartNumberingAfterBreak="0">
+  <w:abstractNum w:abstractNumId="16" w15:restartNumberingAfterBreak="0">
     <w:nsid w:val="66871ECE"/>
     <w:multiLevelType w:val="hybridMultilevel"/>
     <w:tmpl w:val="7F74FC56"/>
@@ -15101,7 +15457,7 @@
       </w:pPr>
     </w:lvl>
   </w:abstractNum>
-  <w:abstractNum w:abstractNumId="16" w15:restartNumberingAfterBreak="0">
+  <w:abstractNum w:abstractNumId="17" w15:restartNumberingAfterBreak="0">
     <w:nsid w:val="685C5D5D"/>
     <w:multiLevelType w:val="hybridMultilevel"/>
     <w:tmpl w:val="26F286B8"/>
@@ -15214,7 +15570,7 @@
       </w:rPr>
     </w:lvl>
   </w:abstractNum>
-  <w:abstractNum w:abstractNumId="17" w15:restartNumberingAfterBreak="0">
+  <w:abstractNum w:abstractNumId="18" w15:restartNumberingAfterBreak="0">
     <w:nsid w:val="6ABE5228"/>
     <w:multiLevelType w:val="hybridMultilevel"/>
     <w:tmpl w:val="089EE6D8"/>
@@ -15330,7 +15686,7 @@
       </w:pPr>
     </w:lvl>
   </w:abstractNum>
-  <w:abstractNum w:abstractNumId="18" w15:restartNumberingAfterBreak="0">
+  <w:abstractNum w:abstractNumId="19" w15:restartNumberingAfterBreak="0">
     <w:nsid w:val="6C1D7334"/>
     <w:multiLevelType w:val="hybridMultilevel"/>
     <w:tmpl w:val="7F20929C"/>
@@ -15446,7 +15802,7 @@
       </w:pPr>
     </w:lvl>
   </w:abstractNum>
-  <w:abstractNum w:abstractNumId="19" w15:restartNumberingAfterBreak="0">
+  <w:abstractNum w:abstractNumId="20" w15:restartNumberingAfterBreak="0">
     <w:nsid w:val="72904C79"/>
     <w:multiLevelType w:val="hybridMultilevel"/>
     <w:tmpl w:val="EB328896"/>
@@ -15586,7 +15942,7 @@
       </w:rPr>
     </w:lvl>
   </w:abstractNum>
-  <w:abstractNum w:abstractNumId="20" w15:restartNumberingAfterBreak="0">
+  <w:abstractNum w:abstractNumId="21" w15:restartNumberingAfterBreak="0">
     <w:nsid w:val="7ACC392C"/>
     <w:multiLevelType w:val="hybridMultilevel"/>
     <w:tmpl w:val="F282F7F0"/>
@@ -15726,7 +16082,7 @@
       </w:rPr>
     </w:lvl>
   </w:abstractNum>
-  <w:abstractNum w:abstractNumId="21" w15:restartNumberingAfterBreak="0">
+  <w:abstractNum w:abstractNumId="22" w15:restartNumberingAfterBreak="0">
     <w:nsid w:val="7CD54937"/>
     <w:multiLevelType w:val="hybridMultilevel"/>
     <w:tmpl w:val="1AB0305A"/>
@@ -15866,7 +16222,7 @@
       </w:rPr>
     </w:lvl>
   </w:abstractNum>
-  <w:abstractNum w:abstractNumId="22" w15:restartNumberingAfterBreak="0">
+  <w:abstractNum w:abstractNumId="23" w15:restartNumberingAfterBreak="0">
     <w:nsid w:val="7D5574AA"/>
     <w:multiLevelType w:val="hybridMultilevel"/>
     <w:tmpl w:val="D5A0E058"/>
@@ -15980,7 +16336,7 @@
     </w:lvl>
   </w:abstractNum>
   <w:num w:numId="1" w16cid:durableId="1807433898">
-    <w:abstractNumId w:val="13"/>
+    <w:abstractNumId w:val="14"/>
   </w:num>
   <w:num w:numId="2" w16cid:durableId="1229416228">
     <w:abstractNumId w:val="3"/>
@@ -15995,22 +16351,22 @@
     <w:abstractNumId w:val="4"/>
   </w:num>
   <w:num w:numId="6" w16cid:durableId="716659202">
-    <w:abstractNumId w:val="15"/>
+    <w:abstractNumId w:val="16"/>
   </w:num>
   <w:num w:numId="7" w16cid:durableId="231933957">
     <w:abstractNumId w:val="8"/>
   </w:num>
   <w:num w:numId="8" w16cid:durableId="633213171">
-    <w:abstractNumId w:val="17"/>
+    <w:abstractNumId w:val="18"/>
   </w:num>
   <w:num w:numId="9" w16cid:durableId="11107505">
     <w:abstractNumId w:val="0"/>
   </w:num>
   <w:num w:numId="10" w16cid:durableId="789469116">
-    <w:abstractNumId w:val="19"/>
+    <w:abstractNumId w:val="20"/>
   </w:num>
   <w:num w:numId="11" w16cid:durableId="329798610">
-    <w:abstractNumId w:val="20"/>
+    <w:abstractNumId w:val="21"/>
   </w:num>
   <w:num w:numId="12" w16cid:durableId="1410468206">
     <w:abstractNumId w:val="5"/>
@@ -16019,40 +16375,40 @@
     <w:abstractNumId w:val="2"/>
   </w:num>
   <w:num w:numId="14" w16cid:durableId="2015449096">
-    <w:abstractNumId w:val="21"/>
+    <w:abstractNumId w:val="22"/>
   </w:num>
   <w:num w:numId="15" w16cid:durableId="735469310">
     <w:abstractNumId w:val="6"/>
   </w:num>
   <w:num w:numId="16" w16cid:durableId="1502694927">
-    <w:abstractNumId w:val="13"/>
+    <w:abstractNumId w:val="14"/>
   </w:num>
   <w:num w:numId="17" w16cid:durableId="1431507366">
-    <w:abstractNumId w:val="18"/>
+    <w:abstractNumId w:val="19"/>
   </w:num>
   <w:num w:numId="18" w16cid:durableId="1965844199">
-    <w:abstractNumId w:val="13"/>
+    <w:abstractNumId w:val="14"/>
   </w:num>
   <w:num w:numId="19" w16cid:durableId="1358971171">
-    <w:abstractNumId w:val="13"/>
+    <w:abstractNumId w:val="14"/>
   </w:num>
   <w:num w:numId="20" w16cid:durableId="356810042">
-    <w:abstractNumId w:val="13"/>
+    <w:abstractNumId w:val="14"/>
   </w:num>
   <w:num w:numId="21" w16cid:durableId="1186866037">
-    <w:abstractNumId w:val="13"/>
+    <w:abstractNumId w:val="14"/>
   </w:num>
   <w:num w:numId="22" w16cid:durableId="2096321288">
-    <w:abstractNumId w:val="13"/>
+    <w:abstractNumId w:val="14"/>
   </w:num>
   <w:num w:numId="23" w16cid:durableId="1157069902">
+    <w:abstractNumId w:val="15"/>
+  </w:num>
+  <w:num w:numId="24" w16cid:durableId="65689514">
     <w:abstractNumId w:val="14"/>
   </w:num>
-  <w:num w:numId="24" w16cid:durableId="65689514">
-    <w:abstractNumId w:val="13"/>
-  </w:num>
   <w:num w:numId="25" w16cid:durableId="716979287">
-    <w:abstractNumId w:val="13"/>
+    <w:abstractNumId w:val="14"/>
   </w:num>
   <w:num w:numId="26" w16cid:durableId="1218320756">
     <w:abstractNumId w:val="10"/>
@@ -16064,20 +16420,23 @@
     <w:abstractNumId w:val="11"/>
   </w:num>
   <w:num w:numId="29" w16cid:durableId="1416171833">
-    <w:abstractNumId w:val="16"/>
+    <w:abstractNumId w:val="17"/>
   </w:num>
   <w:num w:numId="30" w16cid:durableId="1380089303">
-    <w:abstractNumId w:val="22"/>
+    <w:abstractNumId w:val="23"/>
   </w:num>
   <w:num w:numId="31" w16cid:durableId="1125347636">
     <w:abstractNumId w:val="9"/>
+  </w:num>
+  <w:num w:numId="32" w16cid:durableId="1662657560">
+    <w:abstractNumId w:val="13"/>
   </w:num>
   <w:numIdMacAtCleanup w:val="14"/>
 </w:numbering>
 </file>
 
 <file path=word/styles.xml><?xml version="1.0" encoding="utf-8"?>
-<w:styles xmlns:mc="http://schemas.openxmlformats.org/markup-compatibility/2006" xmlns:r="http://schemas.openxmlformats.org/officeDocument/2006/relationships" xmlns:w="http://schemas.openxmlformats.org/wordprocessingml/2006/main" xmlns:w14="http://schemas.microsoft.com/office/word/2010/wordml" xmlns:w15="http://schemas.microsoft.com/office/word/2012/wordml" xmlns:w16cex="http://schemas.microsoft.com/office/word/2018/wordml/cex" xmlns:w16cid="http://schemas.microsoft.com/office/word/2016/wordml/cid" xmlns:w16="http://schemas.microsoft.com/office/word/2018/wordml" xmlns:w16sdtdh="http://schemas.microsoft.com/office/word/2020/wordml/sdtdatahash" xmlns:w16se="http://schemas.microsoft.com/office/word/2015/wordml/symex" mc:Ignorable="w14 w15 w16se w16cid w16 w16cex w16sdtdh">
+<w:styles xmlns:mc="http://schemas.openxmlformats.org/markup-compatibility/2006" xmlns:r="http://schemas.openxmlformats.org/officeDocument/2006/relationships" xmlns:w="http://schemas.openxmlformats.org/wordprocessingml/2006/main" xmlns:w14="http://schemas.microsoft.com/office/word/2010/wordml" xmlns:w15="http://schemas.microsoft.com/office/word/2012/wordml" xmlns:w16cex="http://schemas.microsoft.com/office/word/2018/wordml/cex" xmlns:w16cid="http://schemas.microsoft.com/office/word/2016/wordml/cid" xmlns:w16="http://schemas.microsoft.com/office/word/2018/wordml" xmlns:w16du="http://schemas.microsoft.com/office/word/2023/wordml/word16du" xmlns:w16sdtdh="http://schemas.microsoft.com/office/word/2020/wordml/sdtdatahash" xmlns:w16sdtfl="http://schemas.microsoft.com/office/word/2024/wordml/sdtformatlock" xmlns:w16se="http://schemas.microsoft.com/office/word/2015/wordml/symex" mc:Ignorable="w14 w15 w16se w16cid w16 w16cex w16sdtdh w16sdtfl w16du">
   <w:docDefaults>
     <w:rPrDefault>
       <w:rPr>
@@ -16672,7 +17031,6 @@
   <w:style w:type="character" w:default="1" w:styleId="Carpredefinitoparagrafo">
     <w:name w:val="Default Paragraph Font"/>
     <w:uiPriority w:val="1"/>
-    <w:semiHidden/>
     <w:unhideWhenUsed/>
   </w:style>
   <w:style w:type="table" w:default="1" w:styleId="Tabellanormale">

</xml_diff>

<commit_message>
doc: phase final balance gantt
</commit_message>
<xml_diff>
--- a/3_Documentazione/Documentazione_X2SevenVault_Christian_Arzani.docx
+++ b/3_Documentazione/Documentazione_X2SevenVault_Christian_Arzani.docx
@@ -4483,7 +4483,15 @@
         <w:t xml:space="preserve">piccolo/medio </w:t>
       </w:r>
       <w:r>
-        <w:t xml:space="preserve">magazzino scolastico o aziendale, organizzato in scaffali/magazzini fisici con oggetti etichettati manualmente, dove attualmente il problema è risolto tramite liste cartacee o fogli Excel, causando errori di posizionamento e perdite di tempo. Non esistono soluzioni AI integrate pronte per questo ambito, anche se app commerciali come Google Lens offrono riconoscimento generico senza </w:t>
+        <w:t xml:space="preserve">magazzino scolastico o aziendale, organizzato in scaffali/magazzini fisici con oggetti etichettati manualmente, dove attualmente il problema è risolto tramite liste cartacee o fogli Excel, causando errori di posizionamento e perdite di tempo. Non esistono soluzioni </w:t>
+      </w:r>
+      <w:proofErr w:type="gramStart"/>
+      <w:r>
+        <w:t>AI integrate</w:t>
+      </w:r>
+      <w:proofErr w:type="gramEnd"/>
+      <w:r>
+        <w:t xml:space="preserve"> pronte per questo ambito, anche se app commerciali come Google Lens offrono riconoscimento generico senza </w:t>
       </w:r>
       <w:r>
         <w:t xml:space="preserve">però </w:t>
@@ -8781,6 +8789,9 @@
         <w:jc w:val="center"/>
       </w:pPr>
       <w:r>
+        <w:rPr>
+          <w:noProof/>
+        </w:rPr>
         <w:drawing>
           <wp:inline distT="0" distB="0" distL="0" distR="0" wp14:anchorId="7ADB9A4B" wp14:editId="6E085D92">
             <wp:extent cx="5895833" cy="2774186"/>
@@ -10229,7 +10240,21 @@
         <w:rPr>
           <w:lang w:val="it-IT"/>
         </w:rPr>
-        <w:t>CPU: Intel(R) Core(TM) i7-9700 CPU @ 3.00GHz</w:t>
+        <w:t xml:space="preserve">CPU: Intel(R) </w:t>
+      </w:r>
+      <w:proofErr w:type="gramStart"/>
+      <w:r>
+        <w:rPr>
+          <w:lang w:val="it-IT"/>
+        </w:rPr>
+        <w:t>Core(</w:t>
+      </w:r>
+      <w:proofErr w:type="gramEnd"/>
+      <w:r>
+        <w:rPr>
+          <w:lang w:val="it-IT"/>
+        </w:rPr>
+        <w:t>TM) i7-9700 CPU @ 3.00GHz</w:t>
       </w:r>
     </w:p>
     <w:p>
@@ -10308,58 +10333,70 @@
           <w:bCs/>
           <w:lang w:val="fr-CH"/>
         </w:rPr>
-        <w:t xml:space="preserve"> Mobile Test:</w:t>
-      </w:r>
-    </w:p>
-    <w:p>
-      <w:pPr>
-        <w:spacing w:before="240"/>
-        <w:rPr>
-          <w:lang w:val="fr-CH"/>
-        </w:rPr>
-      </w:pPr>
-      <w:r>
-        <w:rPr>
-          <w:lang w:val="fr-CH"/>
-        </w:rPr>
-        <w:t>Samsung Galaxy Tab A8 (10.5")</w:t>
-      </w:r>
-    </w:p>
-    <w:p>
-      <w:pPr>
-        <w:spacing w:before="240"/>
+        <w:t xml:space="preserve"> Mobile </w:t>
+      </w:r>
+      <w:proofErr w:type="gramStart"/>
+      <w:r>
         <w:rPr>
           <w:b/>
           <w:bCs/>
           <w:lang w:val="fr-CH"/>
         </w:rPr>
-      </w:pPr>
-      <w:r>
+        <w:t>Test:</w:t>
+      </w:r>
+      <w:proofErr w:type="gramEnd"/>
+    </w:p>
+    <w:p>
+      <w:pPr>
+        <w:spacing w:before="240"/>
+        <w:rPr>
+          <w:lang w:val="fr-CH"/>
+        </w:rPr>
+      </w:pPr>
+      <w:r>
+        <w:rPr>
+          <w:lang w:val="fr-CH"/>
+        </w:rPr>
+        <w:t>Samsung Galaxy Tab A8 (10.5")</w:t>
+      </w:r>
+    </w:p>
+    <w:p>
+      <w:pPr>
+        <w:spacing w:before="240"/>
         <w:rPr>
           <w:b/>
           <w:bCs/>
           <w:lang w:val="fr-CH"/>
         </w:rPr>
-        <w:t xml:space="preserve">VR </w:t>
-      </w:r>
-      <w:proofErr w:type="spellStart"/>
+      </w:pPr>
       <w:r>
         <w:rPr>
           <w:b/>
           <w:bCs/>
           <w:lang w:val="fr-CH"/>
         </w:rPr>
-        <w:t>Development</w:t>
-      </w:r>
-      <w:proofErr w:type="spellEnd"/>
+        <w:t xml:space="preserve">VR </w:t>
+      </w:r>
+      <w:proofErr w:type="spellStart"/>
+      <w:proofErr w:type="gramStart"/>
       <w:r>
         <w:rPr>
           <w:b/>
           <w:bCs/>
           <w:lang w:val="fr-CH"/>
         </w:rPr>
+        <w:t>Development</w:t>
+      </w:r>
+      <w:proofErr w:type="spellEnd"/>
+      <w:r>
+        <w:rPr>
+          <w:b/>
+          <w:bCs/>
+          <w:lang w:val="fr-CH"/>
+        </w:rPr>
         <w:t>:</w:t>
       </w:r>
+      <w:proofErr w:type="gramEnd"/>
     </w:p>
     <w:p>
       <w:pPr>
@@ -11661,7 +11698,7 @@
           <w:lang w:val="it-IT"/>
         </w:rPr>
         <w:drawing>
-          <wp:inline distT="0" distB="0" distL="0" distR="0" wp14:anchorId="6C9D2013" wp14:editId="148D4631">
+          <wp:inline distT="0" distB="0" distL="0" distR="0" wp14:anchorId="6C9D2013" wp14:editId="240B3639">
             <wp:extent cx="5890609" cy="3283993"/>
             <wp:effectExtent l="114300" t="114300" r="110490" b="107315"/>
             <wp:docPr id="16" name="Immagine 16"/>
@@ -12005,7 +12042,7 @@
           <w:noProof/>
         </w:rPr>
         <w:drawing>
-          <wp:inline distT="0" distB="0" distL="0" distR="0" wp14:anchorId="6E89449D" wp14:editId="4894EE78">
+          <wp:inline distT="0" distB="0" distL="0" distR="0" wp14:anchorId="6E89449D" wp14:editId="54FA5E94">
             <wp:extent cx="5924835" cy="3303074"/>
             <wp:effectExtent l="114300" t="114300" r="114300" b="107315"/>
             <wp:docPr id="17" name="Immagine 17"/>
@@ -12209,28 +12246,7 @@
           <w:szCs w:val="24"/>
           <w:lang w:val="it-IT"/>
         </w:rPr>
-        <w:t xml:space="preserve">Questa pagina e la pagina dedicata </w:t>
-      </w:r>
-      <w:r>
-        <w:rPr>
-          <w:szCs w:val="24"/>
-          <w:lang w:val="it-IT"/>
-        </w:rPr>
-        <w:t>agli oggetti</w:t>
-      </w:r>
-      <w:r>
-        <w:rPr>
-          <w:szCs w:val="24"/>
-          <w:lang w:val="it-IT"/>
-        </w:rPr>
-        <w:t xml:space="preserve"> saranno le uniche visualizzabili agli utenti guest</w:t>
-      </w:r>
-      <w:r>
-        <w:rPr>
-          <w:szCs w:val="24"/>
-          <w:lang w:val="it-IT"/>
-        </w:rPr>
-        <w:t>.</w:t>
+        <w:t>Questa pagina e la pagina dedicata agli oggetti saranno le uniche visualizzabili agli utenti guest.</w:t>
       </w:r>
     </w:p>
     <w:p>
@@ -12246,7 +12262,7 @@
           <w:lang w:val="it-IT"/>
         </w:rPr>
         <w:drawing>
-          <wp:inline distT="0" distB="0" distL="0" distR="0" wp14:anchorId="27CDE4C3" wp14:editId="3CEF6F7D">
+          <wp:inline distT="0" distB="0" distL="0" distR="0" wp14:anchorId="27CDE4C3" wp14:editId="31B702FC">
             <wp:extent cx="5902657" cy="3284573"/>
             <wp:effectExtent l="114300" t="114300" r="117475" b="106680"/>
             <wp:docPr id="18" name="Immagine 18"/>
@@ -12421,7 +12437,7 @@
           <w:lang w:val="it-IT"/>
         </w:rPr>
         <w:drawing>
-          <wp:inline distT="0" distB="0" distL="0" distR="0" wp14:anchorId="7D3D65F1" wp14:editId="0BED1233">
+          <wp:inline distT="0" distB="0" distL="0" distR="0" wp14:anchorId="7D3D65F1" wp14:editId="677940C7">
             <wp:extent cx="5962932" cy="3318112"/>
             <wp:effectExtent l="114300" t="114300" r="114300" b="111125"/>
             <wp:docPr id="19" name="Immagine 19"/>
@@ -12596,7 +12612,7 @@
           <w:lang w:val="it-IT"/>
         </w:rPr>
         <w:drawing>
-          <wp:inline distT="0" distB="0" distL="0" distR="0" wp14:anchorId="52636AA0" wp14:editId="06FF21E7">
+          <wp:inline distT="0" distB="0" distL="0" distR="0" wp14:anchorId="52636AA0" wp14:editId="5F5F5629">
             <wp:extent cx="5866334" cy="3277169"/>
             <wp:effectExtent l="114300" t="114300" r="115570" b="114300"/>
             <wp:docPr id="21" name="Immagine 21"/>
@@ -12920,10 +12936,7 @@
       <w:bookmarkStart w:id="44" w:name="_Toc221715539"/>
       <w:r>
         <w:lastRenderedPageBreak/>
-        <w:t xml:space="preserve">Applicativo </w:t>
-      </w:r>
-      <w:r>
-        <w:t>mobile</w:t>
+        <w:t>Applicativo mobile</w:t>
       </w:r>
       <w:bookmarkEnd w:id="44"/>
     </w:p>
@@ -12937,19 +12950,7 @@
         <w:rPr>
           <w:lang w:val="it-IT"/>
         </w:rPr>
-        <w:t xml:space="preserve">Le seguenti interfacce riguardano unicamente l’applicativo </w:t>
-      </w:r>
-      <w:r>
-        <w:rPr>
-          <w:lang w:val="it-IT"/>
-        </w:rPr>
-        <w:t>mobile</w:t>
-      </w:r>
-      <w:r>
-        <w:rPr>
-          <w:lang w:val="it-IT"/>
-        </w:rPr>
-        <w:t>.</w:t>
+        <w:t>Le seguenti interfacce riguardano unicamente l’applicativo mobile.</w:t>
       </w:r>
     </w:p>
     <w:p>
@@ -13002,6 +13003,9 @@
         <w:jc w:val="center"/>
       </w:pPr>
       <w:r>
+        <w:rPr>
+          <w:noProof/>
+        </w:rPr>
         <w:drawing>
           <wp:inline distT="0" distB="0" distL="0" distR="0" wp14:anchorId="22AC2C4F" wp14:editId="6CE0F0E2">
             <wp:extent cx="2536919" cy="5121038"/>
@@ -13161,19 +13165,7 @@
         <w:rPr>
           <w:lang w:val="it-IT"/>
         </w:rPr>
-        <w:t xml:space="preserve">Questa pagina mostra i risultati e le informazioni ritornate dalla scansione di un oggetto. Il design riprende lo stile a box della web dashboard per rendere il </w:t>
-      </w:r>
-      <w:r>
-        <w:rPr>
-          <w:lang w:val="it-IT"/>
-        </w:rPr>
-        <w:t xml:space="preserve">risultato </w:t>
-      </w:r>
-      <w:r>
-        <w:rPr>
-          <w:lang w:val="it-IT"/>
-        </w:rPr>
-        <w:t>più chiaro possibile all’utente</w:t>
+        <w:t>Questa pagina mostra i risultati e le informazioni ritornate dalla scansione di un oggetto. Il design riprende lo stile a box della web dashboard per rendere il risultato più chiaro possibile all’utente</w:t>
       </w:r>
       <w:r>
         <w:rPr>
@@ -13189,6 +13181,9 @@
         <w:jc w:val="center"/>
       </w:pPr>
       <w:r>
+        <w:rPr>
+          <w:noProof/>
+        </w:rPr>
         <w:drawing>
           <wp:inline distT="0" distB="0" distL="0" distR="0" wp14:anchorId="65586A1F" wp14:editId="468287E7">
             <wp:extent cx="2658786" cy="6507707"/>
@@ -15998,6 +15993,19 @@
     </w:p>
     <w:p>
       <w:pPr>
+        <w:rPr>
+          <w:lang w:val="it-IT"/>
+        </w:rPr>
+      </w:pPr>
+      <w:r>
+        <w:rPr>
+          <w:lang w:val="it-IT"/>
+        </w:rPr>
+        <w:br w:type="page"/>
+      </w:r>
+    </w:p>
+    <w:p>
+      <w:pPr>
         <w:pStyle w:val="Titolo1"/>
         <w:rPr>
           <w:lang w:val="it-IT"/>
@@ -16010,6 +16018,7 @@
         <w:rPr>
           <w:lang w:val="it-IT"/>
         </w:rPr>
+        <w:lastRenderedPageBreak/>
         <w:t>Consuntivo</w:t>
       </w:r>
       <w:bookmarkEnd w:id="65"/>
@@ -16018,39 +16027,211 @@
     </w:p>
     <w:p>
       <w:pPr>
-        <w:rPr>
-          <w:lang w:val="it-IT"/>
-        </w:rPr>
-      </w:pPr>
-      <w:r>
-        <w:rPr>
-          <w:lang w:val="it-IT"/>
-        </w:rPr>
-        <w:t>Consuntivo del tempo di lavoro effettivo e considerazioni riguardo le differenze rispetto alla pianificazione (cap</w:t>
-      </w:r>
-      <w:r>
-        <w:rPr>
-          <w:lang w:val="it-IT"/>
-        </w:rPr>
-        <w:t>.</w:t>
-      </w:r>
-      <w:r>
-        <w:rPr>
-          <w:lang w:val="it-IT"/>
-        </w:rPr>
-        <w:t xml:space="preserve"> 1.7) (ad esempio Gan</w:t>
-      </w:r>
-      <w:r>
-        <w:rPr>
-          <w:lang w:val="it-IT"/>
-        </w:rPr>
-        <w:t>t</w:t>
-      </w:r>
-      <w:r>
-        <w:rPr>
-          <w:lang w:val="it-IT"/>
-        </w:rPr>
-        <w:t>t consuntivo).</w:t>
+        <w:pStyle w:val="Titolo3"/>
+      </w:pPr>
+      <w:r>
+        <w:t>Fase preliminare – Analisi e progettazione</w:t>
+      </w:r>
+    </w:p>
+    <w:p>
+      <w:pPr>
+        <w:spacing w:after="240"/>
+        <w:rPr>
+          <w:lang w:val="it-IT"/>
+        </w:rPr>
+      </w:pPr>
+      <w:r>
+        <w:rPr>
+          <w:lang w:val="it-IT"/>
+        </w:rPr>
+        <w:t xml:space="preserve">La prima fase del progetto è andata prevalentemente tutta come avevo pianificato, ho impiegato meno tempo del previsto per gli schemi Use Case e quello di architettura mentre gli </w:t>
+      </w:r>
+      <w:proofErr w:type="spellStart"/>
+      <w:r>
+        <w:rPr>
+          <w:lang w:val="it-IT"/>
+        </w:rPr>
+        <w:t>swimlanes</w:t>
+      </w:r>
+      <w:proofErr w:type="spellEnd"/>
+      <w:r>
+        <w:rPr>
+          <w:lang w:val="it-IT"/>
+        </w:rPr>
+        <w:t xml:space="preserve"> e i diagrammi ER mi hanno richiesto un po’ più tempo rispetto a quello che avevo pianificato a discapito delle ore dedicat</w:t>
+      </w:r>
+      <w:r>
+        <w:rPr>
+          <w:lang w:val="it-IT"/>
+        </w:rPr>
+        <w:t>e</w:t>
+      </w:r>
+      <w:r>
+        <w:rPr>
+          <w:lang w:val="it-IT"/>
+        </w:rPr>
+        <w:t xml:space="preserve"> alla ricerca sulla tecnologia di sviluppo mobile (React).</w:t>
+      </w:r>
+      <w:r>
+        <w:rPr>
+          <w:lang w:val="it-IT"/>
+        </w:rPr>
+        <w:t xml:space="preserve"> Durante la progettazione dei vari diagrammi ho eseguito la ricerca di informazioni sull’AI Learning questo perché per fare una progettazione completa avevo bisogno delle nozioni necessarie e quindi ho eseguito </w:t>
+      </w:r>
+      <w:r>
+        <w:rPr>
+          <w:lang w:val="it-IT"/>
+        </w:rPr>
+        <w:t>i task</w:t>
+      </w:r>
+      <w:r>
+        <w:rPr>
+          <w:lang w:val="it-IT"/>
+        </w:rPr>
+        <w:t xml:space="preserve"> dei diagrammi in parallelo.</w:t>
+      </w:r>
+    </w:p>
+    <w:p>
+      <w:pPr>
+        <w:keepNext/>
+        <w:jc w:val="center"/>
+      </w:pPr>
+      <w:r>
+        <w:rPr>
+          <w:lang w:val="it-IT"/>
+        </w:rPr>
+        <w:drawing>
+          <wp:inline distT="0" distB="0" distL="0" distR="0" wp14:anchorId="4BF275D0" wp14:editId="057B227A">
+            <wp:extent cx="5842660" cy="3121380"/>
+            <wp:effectExtent l="114300" t="95250" r="120015" b="98425"/>
+            <wp:docPr id="10" name="Immagine 10"/>
+            <wp:cNvGraphicFramePr>
+              <a:graphicFrameLocks xmlns:a="http://schemas.openxmlformats.org/drawingml/2006/main" noChangeAspect="1"/>
+            </wp:cNvGraphicFramePr>
+            <a:graphic xmlns:a="http://schemas.openxmlformats.org/drawingml/2006/main">
+              <a:graphicData uri="http://schemas.openxmlformats.org/drawingml/2006/picture">
+                <pic:pic xmlns:pic="http://schemas.openxmlformats.org/drawingml/2006/picture">
+                  <pic:nvPicPr>
+                    <pic:cNvPr id="1" name=""/>
+                    <pic:cNvPicPr/>
+                  </pic:nvPicPr>
+                  <pic:blipFill>
+                    <a:blip r:embed="rId34"/>
+                    <a:stretch>
+                      <a:fillRect/>
+                    </a:stretch>
+                  </pic:blipFill>
+                  <pic:spPr>
+                    <a:xfrm>
+                      <a:off x="0" y="0"/>
+                      <a:ext cx="5847539" cy="3123986"/>
+                    </a:xfrm>
+                    <a:prstGeom prst="rect">
+                      <a:avLst/>
+                    </a:prstGeom>
+                    <a:effectLst>
+                      <a:outerShdw blurRad="63500" sx="102000" sy="102000" algn="ctr" rotWithShape="0">
+                        <a:prstClr val="black">
+                          <a:alpha val="40000"/>
+                        </a:prstClr>
+                      </a:outerShdw>
+                    </a:effectLst>
+                  </pic:spPr>
+                </pic:pic>
+              </a:graphicData>
+            </a:graphic>
+          </wp:inline>
+        </w:drawing>
+      </w:r>
+    </w:p>
+    <w:p>
+      <w:pPr>
+        <w:pStyle w:val="Didascalia"/>
+        <w:jc w:val="center"/>
+        <w:rPr>
+          <w:i/>
+          <w:iCs/>
+          <w:lang w:val="it-IT"/>
+        </w:rPr>
+      </w:pPr>
+      <w:r>
+        <w:rPr>
+          <w:i/>
+          <w:iCs/>
+        </w:rPr>
+        <w:t xml:space="preserve">Figura </w:t>
+      </w:r>
+      <w:r>
+        <w:rPr>
+          <w:i/>
+          <w:iCs/>
+        </w:rPr>
+        <w:fldChar w:fldCharType="begin"/>
+      </w:r>
+      <w:r>
+        <w:rPr>
+          <w:i/>
+          <w:iCs/>
+        </w:rPr>
+        <w:instrText xml:space="preserve"> SEQ Figura \* ARABIC </w:instrText>
+      </w:r>
+      <w:r>
+        <w:rPr>
+          <w:i/>
+          <w:iCs/>
+        </w:rPr>
+        <w:fldChar w:fldCharType="separate"/>
+      </w:r>
+      <w:r>
+        <w:rPr>
+          <w:i/>
+          <w:iCs/>
+          <w:noProof/>
+        </w:rPr>
+        <w:t>27</w:t>
+      </w:r>
+      <w:r>
+        <w:rPr>
+          <w:i/>
+          <w:iCs/>
+        </w:rPr>
+        <w:fldChar w:fldCharType="end"/>
+      </w:r>
+      <w:r>
+        <w:rPr>
+          <w:i/>
+          <w:iCs/>
+        </w:rPr>
+        <w:t xml:space="preserve"> - </w:t>
+      </w:r>
+      <w:proofErr w:type="spellStart"/>
+      <w:r>
+        <w:rPr>
+          <w:i/>
+          <w:iCs/>
+        </w:rPr>
+        <w:t>Gantt</w:t>
+      </w:r>
+      <w:proofErr w:type="spellEnd"/>
+      <w:r>
+        <w:rPr>
+          <w:i/>
+          <w:iCs/>
+        </w:rPr>
+        <w:t xml:space="preserve"> consuntivo, Fase preliminare</w:t>
+      </w:r>
+    </w:p>
+    <w:p>
+      <w:pPr>
+        <w:rPr>
+          <w:lang w:val="it-IT"/>
+        </w:rPr>
+      </w:pPr>
+      <w:r>
+        <w:rPr>
+          <w:lang w:val="it-IT"/>
+        </w:rPr>
+        <w:br w:type="page"/>
       </w:r>
     </w:p>
     <w:p>
@@ -16067,6 +16248,7 @@
         <w:rPr>
           <w:lang w:val="it-IT"/>
         </w:rPr>
+        <w:lastRenderedPageBreak/>
         <w:t>Conclusioni</w:t>
       </w:r>
       <w:bookmarkEnd w:id="68"/>
@@ -16226,8 +16408,8 @@
         </w:rPr>
       </w:pPr>
       <w:bookmarkStart w:id="77" w:name="_Toc94790468"/>
-      <w:bookmarkStart w:id="78" w:name="_Toc461179232"/>
-      <w:bookmarkStart w:id="79" w:name="_Toc221715552"/>
+      <w:bookmarkStart w:id="78" w:name="_Toc221715552"/>
+      <w:bookmarkStart w:id="79" w:name="_Toc461179232"/>
       <w:r>
         <w:rPr>
           <w:lang w:val="it-IT"/>
@@ -16235,7 +16417,7 @@
         <w:t>Glossario</w:t>
       </w:r>
       <w:bookmarkEnd w:id="77"/>
-      <w:bookmarkEnd w:id="79"/>
+      <w:bookmarkEnd w:id="78"/>
     </w:p>
     <w:p>
       <w:pPr>
@@ -16496,7 +16678,7 @@
       <w:r>
         <w:t>Bibliografia per articoli di riviste:</w:t>
       </w:r>
-      <w:bookmarkEnd w:id="78"/>
+      <w:bookmarkEnd w:id="79"/>
       <w:bookmarkEnd w:id="82"/>
       <w:bookmarkEnd w:id="83"/>
     </w:p>
@@ -17103,10 +17285,10 @@
       </w:pPr>
     </w:p>
     <w:sectPr>
-      <w:headerReference w:type="default" r:id="rId34"/>
-      <w:footerReference w:type="default" r:id="rId35"/>
-      <w:headerReference w:type="first" r:id="rId36"/>
-      <w:footerReference w:type="first" r:id="rId37"/>
+      <w:headerReference w:type="default" r:id="rId35"/>
+      <w:footerReference w:type="default" r:id="rId36"/>
+      <w:headerReference w:type="first" r:id="rId37"/>
+      <w:footerReference w:type="first" r:id="rId38"/>
       <w:pgSz w:w="11906" w:h="16838"/>
       <w:pgMar w:top="1985" w:right="1134" w:bottom="1418" w:left="1134" w:header="567" w:footer="567" w:gutter="0"/>
       <w:pgNumType w:start="1"/>
@@ -21757,6 +21939,7 @@
   <w:style w:type="character" w:default="1" w:styleId="Carpredefinitoparagrafo">
     <w:name w:val="Default Paragraph Font"/>
     <w:uiPriority w:val="1"/>
+    <w:semiHidden/>
     <w:unhideWhenUsed/>
   </w:style>
   <w:style w:type="table" w:default="1" w:styleId="Tabellanormale">

</xml_diff>

<commit_message>
doc: diagrams and documentation small changes
</commit_message>
<xml_diff>
--- a/3_Documentazione/Documentazione_X2SevenVault_Christian_Arzani.docx
+++ b/3_Documentazione/Documentazione_X2SevenVault_Christian_Arzani.docx
@@ -4347,16 +4347,8 @@
         <w:rPr>
           <w:lang w:val="it-IT"/>
         </w:rPr>
-        <w:t xml:space="preserve">mobile o </w:t>
-      </w:r>
-      <w:proofErr w:type="spellStart"/>
-      <w:r>
-        <w:rPr>
-          <w:lang w:val="it-IT"/>
-        </w:rPr>
-        <w:t>headset</w:t>
-      </w:r>
-      <w:proofErr w:type="spellEnd"/>
+        <w:t>mobile o headset</w:t>
+      </w:r>
       <w:r>
         <w:rPr>
           <w:lang w:val="it-IT"/>
@@ -4483,15 +4475,7 @@
         <w:t xml:space="preserve">piccolo/medio </w:t>
       </w:r>
       <w:r>
-        <w:t xml:space="preserve">magazzino scolastico o aziendale, organizzato in scaffali/magazzini fisici con oggetti etichettati manualmente, dove attualmente il problema è risolto tramite liste cartacee o fogli Excel, causando errori di posizionamento e perdite di tempo. Non esistono soluzioni </w:t>
-      </w:r>
-      <w:proofErr w:type="gramStart"/>
-      <w:r>
-        <w:t>AI integrate</w:t>
-      </w:r>
-      <w:proofErr w:type="gramEnd"/>
-      <w:r>
-        <w:t xml:space="preserve"> pronte per questo ambito, anche se app commerciali come Google Lens offrono riconoscimento generico senza </w:t>
+        <w:t xml:space="preserve">magazzino scolastico o aziendale, organizzato in scaffali/magazzini fisici con oggetti etichettati manualmente, dove attualmente il problema è risolto tramite liste cartacee o fogli Excel, causando errori di posizionamento e perdite di tempo. Non esistono soluzioni AI integrate pronte per questo ambito, anche se app commerciali come Google Lens offrono riconoscimento generico senza </w:t>
       </w:r>
       <w:r>
         <w:t xml:space="preserve">però </w:t>
@@ -4684,13 +4668,8 @@
       <w:r>
         <w:t xml:space="preserve">un </w:t>
       </w:r>
-      <w:proofErr w:type="spellStart"/>
-      <w:r>
-        <w:t>bounding</w:t>
-      </w:r>
-      <w:proofErr w:type="spellEnd"/>
-      <w:r>
-        <w:t xml:space="preserve"> box colorato sull'oggetto</w:t>
+      <w:r>
+        <w:t>bounding box colorato sull'oggetto</w:t>
       </w:r>
       <w:r>
         <w:t xml:space="preserve"> e del </w:t>
@@ -5623,36 +5602,8 @@
                 <w:szCs w:val="16"/>
                 <w:lang w:val="fr-CH"/>
               </w:rPr>
-              <w:t xml:space="preserve">Training </w:t>
-            </w:r>
-            <w:proofErr w:type="spellStart"/>
-            <w:r>
-              <w:rPr>
-                <w:sz w:val="16"/>
-                <w:szCs w:val="16"/>
-                <w:lang w:val="fr-CH"/>
-              </w:rPr>
-              <w:t>dell’AI</w:t>
-            </w:r>
-            <w:proofErr w:type="spellEnd"/>
-            <w:r>
-              <w:rPr>
-                <w:sz w:val="16"/>
-                <w:szCs w:val="16"/>
-                <w:lang w:val="fr-CH"/>
-              </w:rPr>
-              <w:t xml:space="preserve"> su </w:t>
-            </w:r>
-            <w:proofErr w:type="spellStart"/>
-            <w:r>
-              <w:rPr>
-                <w:sz w:val="16"/>
-                <w:szCs w:val="16"/>
-                <w:lang w:val="fr-CH"/>
-              </w:rPr>
-              <w:t>Colab</w:t>
-            </w:r>
-            <w:proofErr w:type="spellEnd"/>
+              <w:t>Training dell’AI su Colab</w:t>
+            </w:r>
           </w:p>
         </w:tc>
       </w:tr>
@@ -6719,41 +6670,13 @@
                 <w:lang w:val="fr-CH"/>
               </w:rPr>
             </w:pPr>
-            <w:proofErr w:type="spellStart"/>
             <w:r>
               <w:rPr>
                 <w:sz w:val="16"/>
                 <w:szCs w:val="16"/>
                 <w:lang w:val="fr-CH"/>
               </w:rPr>
-              <w:t>Visualizzazione</w:t>
-            </w:r>
-            <w:proofErr w:type="spellEnd"/>
-            <w:r>
-              <w:rPr>
-                <w:sz w:val="16"/>
-                <w:szCs w:val="16"/>
-                <w:lang w:val="fr-CH"/>
-              </w:rPr>
-              <w:t xml:space="preserve"> su </w:t>
-            </w:r>
-            <w:proofErr w:type="spellStart"/>
-            <w:r>
-              <w:rPr>
-                <w:sz w:val="16"/>
-                <w:szCs w:val="16"/>
-                <w:lang w:val="fr-CH"/>
-              </w:rPr>
-              <w:t>applicazione</w:t>
-            </w:r>
-            <w:proofErr w:type="spellEnd"/>
-            <w:r>
-              <w:rPr>
-                <w:sz w:val="16"/>
-                <w:szCs w:val="16"/>
-                <w:lang w:val="fr-CH"/>
-              </w:rPr>
-              <w:t xml:space="preserve"> mobile</w:t>
+              <w:t>Visualizzazione su applicazione mobile</w:t>
             </w:r>
           </w:p>
         </w:tc>
@@ -6842,44 +6765,19 @@
                 <w:szCs w:val="16"/>
               </w:rPr>
             </w:pPr>
-            <w:proofErr w:type="spellStart"/>
-            <w:r>
-              <w:rPr>
-                <w:sz w:val="16"/>
-                <w:szCs w:val="16"/>
-              </w:rPr>
-              <w:t>Bounding</w:t>
-            </w:r>
-            <w:proofErr w:type="spellEnd"/>
-            <w:r>
-              <w:rPr>
-                <w:sz w:val="16"/>
-                <w:szCs w:val="16"/>
-              </w:rPr>
-              <w:t xml:space="preserve"> box colorati </w:t>
-            </w:r>
-            <w:r>
-              <w:rPr>
-                <w:sz w:val="16"/>
-                <w:szCs w:val="16"/>
-              </w:rPr>
-              <w:t xml:space="preserve">in fase di test e </w:t>
-            </w:r>
-            <w:proofErr w:type="spellStart"/>
-            <w:r>
-              <w:rPr>
-                <w:sz w:val="16"/>
-                <w:szCs w:val="16"/>
-              </w:rPr>
-              <w:t>view</w:t>
-            </w:r>
-            <w:proofErr w:type="spellEnd"/>
-            <w:r>
-              <w:rPr>
-                <w:sz w:val="16"/>
-                <w:szCs w:val="16"/>
-              </w:rPr>
-              <w:t xml:space="preserve"> con </w:t>
+            <w:r>
+              <w:rPr>
+                <w:sz w:val="16"/>
+                <w:szCs w:val="16"/>
+              </w:rPr>
+              <w:t xml:space="preserve">Bounding box colorati </w:t>
+            </w:r>
+            <w:r>
+              <w:rPr>
+                <w:sz w:val="16"/>
+                <w:szCs w:val="16"/>
+              </w:rPr>
+              <w:t xml:space="preserve">in fase di test e view con </w:t>
             </w:r>
             <w:r>
               <w:rPr>
@@ -8749,34 +8647,13 @@
         <w:t>In particolare,</w:t>
       </w:r>
       <w:r>
-        <w:t xml:space="preserve"> si utilizza </w:t>
-      </w:r>
-      <w:proofErr w:type="spellStart"/>
-      <w:r>
-        <w:t>Kanban</w:t>
-      </w:r>
-      <w:proofErr w:type="spellEnd"/>
-      <w:r>
-        <w:t xml:space="preserve">, con una board visuale divisa in colonne (Backlog, To Do, In Progress, </w:t>
-      </w:r>
-      <w:r>
-        <w:t xml:space="preserve">Testing, Review, </w:t>
-      </w:r>
-      <w:proofErr w:type="spellStart"/>
-      <w:r>
-        <w:t>Blocking</w:t>
-      </w:r>
-      <w:proofErr w:type="spellEnd"/>
-      <w:r>
-        <w:t xml:space="preserve">, </w:t>
-      </w:r>
-      <w:proofErr w:type="spellStart"/>
-      <w:r>
-        <w:t>Done</w:t>
-      </w:r>
-      <w:proofErr w:type="spellEnd"/>
-      <w:r>
-        <w:t xml:space="preserve">) dove i task </w:t>
+        <w:t xml:space="preserve"> si utilizza Kanban, con una board visuale divisa in colonne (Backlog, To Do, In Progress, </w:t>
+      </w:r>
+      <w:r>
+        <w:t xml:space="preserve">Testing, Review, Blocking, </w:t>
+      </w:r>
+      <w:r>
+        <w:t xml:space="preserve">Done) dove i task </w:t>
       </w:r>
       <w:r>
         <w:t>sono rappresentati da carte con etichette che definiscono lo sprint e la categoria del task (Implementazione, Documentazione, Test, etc..).</w:t>
@@ -8893,23 +8770,7 @@
           <w:i/>
           <w:iCs/>
         </w:rPr>
-        <w:t xml:space="preserve"> - </w:t>
-      </w:r>
-      <w:proofErr w:type="spellStart"/>
-      <w:r>
-        <w:rPr>
-          <w:i/>
-          <w:iCs/>
-        </w:rPr>
-        <w:t>Trello</w:t>
-      </w:r>
-      <w:proofErr w:type="spellEnd"/>
-      <w:r>
-        <w:rPr>
-          <w:i/>
-          <w:iCs/>
-        </w:rPr>
-        <w:t xml:space="preserve"> board</w:t>
+        <w:t xml:space="preserve"> - Trello board</w:t>
       </w:r>
     </w:p>
     <w:p>
@@ -9619,18 +9480,8 @@
           <w:iCs/>
           <w:lang w:val="de-CH"/>
         </w:rPr>
-        <w:t xml:space="preserve"> - Gantt Sprint 3, Web </w:t>
-      </w:r>
-      <w:proofErr w:type="spellStart"/>
-      <w:r>
-        <w:rPr>
-          <w:i/>
-          <w:iCs/>
-          <w:lang w:val="de-CH"/>
-        </w:rPr>
-        <w:t>dashboard</w:t>
-      </w:r>
-      <w:proofErr w:type="spellEnd"/>
+        <w:t xml:space="preserve"> - Gantt Sprint 3, Web dashboard</w:t>
+      </w:r>
     </w:p>
     <w:p>
       <w:pPr>
@@ -9853,35 +9704,7 @@
         <w:rPr>
           <w:lang w:val="fr-CH"/>
         </w:rPr>
-        <w:t xml:space="preserve">Google </w:t>
-      </w:r>
-      <w:proofErr w:type="spellStart"/>
-      <w:r>
-        <w:rPr>
-          <w:lang w:val="fr-CH"/>
-        </w:rPr>
-        <w:t>Colab</w:t>
-      </w:r>
-      <w:proofErr w:type="spellEnd"/>
-      <w:r>
-        <w:rPr>
-          <w:lang w:val="fr-CH"/>
-        </w:rPr>
-        <w:t xml:space="preserve"> (Training YOLOv8/</w:t>
-      </w:r>
-      <w:proofErr w:type="spellStart"/>
-      <w:r>
-        <w:rPr>
-          <w:lang w:val="fr-CH"/>
-        </w:rPr>
-        <w:t>TensorFlow</w:t>
-      </w:r>
-      <w:proofErr w:type="spellEnd"/>
-      <w:r>
-        <w:rPr>
-          <w:lang w:val="fr-CH"/>
-        </w:rPr>
-        <w:t xml:space="preserve"> Lite)</w:t>
+        <w:t>Google Colab (Training YOLOv8/TensorFlow Lite)</w:t>
       </w:r>
     </w:p>
     <w:p>
@@ -9895,19 +9718,11 @@
           <w:lang w:val="it-IT"/>
         </w:rPr>
       </w:pPr>
-      <w:proofErr w:type="spellStart"/>
-      <w:r>
-        <w:rPr>
-          <w:lang w:val="it-IT"/>
-        </w:rPr>
-        <w:t>Roboflow</w:t>
-      </w:r>
-      <w:proofErr w:type="spellEnd"/>
-      <w:r>
-        <w:rPr>
-          <w:lang w:val="it-IT"/>
-        </w:rPr>
-        <w:t xml:space="preserve"> (Annotazione dataset)</w:t>
+      <w:r>
+        <w:rPr>
+          <w:lang w:val="it-IT"/>
+        </w:rPr>
+        <w:t>Roboflow (Annotazione dataset)</w:t>
       </w:r>
     </w:p>
     <w:p>
@@ -9921,33 +9736,11 @@
           <w:lang w:val="it-IT"/>
         </w:rPr>
       </w:pPr>
-      <w:proofErr w:type="spellStart"/>
-      <w:r>
-        <w:rPr>
-          <w:lang w:val="it-IT"/>
-        </w:rPr>
-        <w:t>Git</w:t>
-      </w:r>
-      <w:proofErr w:type="spellEnd"/>
-      <w:r>
-        <w:rPr>
-          <w:lang w:val="it-IT"/>
-        </w:rPr>
-        <w:t>/GitHub (</w:t>
-      </w:r>
-      <w:proofErr w:type="spellStart"/>
-      <w:r>
-        <w:rPr>
-          <w:lang w:val="it-IT"/>
-        </w:rPr>
-        <w:t>Versionamento</w:t>
-      </w:r>
-      <w:proofErr w:type="spellEnd"/>
-      <w:r>
-        <w:rPr>
-          <w:lang w:val="it-IT"/>
-        </w:rPr>
-        <w:t xml:space="preserve"> codice)</w:t>
+      <w:r>
+        <w:rPr>
+          <w:lang w:val="it-IT"/>
+        </w:rPr>
+        <w:t>Git/GitHub (Versionamento codice)</w:t>
       </w:r>
     </w:p>
     <w:p>
@@ -9961,19 +9754,11 @@
           <w:lang w:val="it-IT"/>
         </w:rPr>
       </w:pPr>
-      <w:proofErr w:type="spellStart"/>
-      <w:r>
-        <w:rPr>
-          <w:lang w:val="it-IT"/>
-        </w:rPr>
-        <w:t>Jupyter</w:t>
-      </w:r>
-      <w:proofErr w:type="spellEnd"/>
-      <w:r>
-        <w:rPr>
-          <w:lang w:val="it-IT"/>
-        </w:rPr>
-        <w:t xml:space="preserve"> Notebook (Documentazione esperimenti ML)</w:t>
+      <w:r>
+        <w:rPr>
+          <w:lang w:val="it-IT"/>
+        </w:rPr>
+        <w:t>Jupyter Notebook (Documentazione esperimenti ML)</w:t>
       </w:r>
     </w:p>
     <w:p>
@@ -10044,33 +9829,11 @@
           <w:lang w:val="it-IT"/>
         </w:rPr>
       </w:pPr>
-      <w:proofErr w:type="spellStart"/>
-      <w:r>
-        <w:rPr>
-          <w:lang w:val="it-IT"/>
-        </w:rPr>
-        <w:t>Firebase</w:t>
-      </w:r>
-      <w:proofErr w:type="spellEnd"/>
-      <w:r>
-        <w:rPr>
-          <w:lang w:val="it-IT"/>
-        </w:rPr>
-        <w:t xml:space="preserve"> Console (</w:t>
-      </w:r>
-      <w:proofErr w:type="spellStart"/>
-      <w:r>
-        <w:rPr>
-          <w:lang w:val="it-IT"/>
-        </w:rPr>
-        <w:t>Firestore</w:t>
-      </w:r>
-      <w:proofErr w:type="spellEnd"/>
-      <w:r>
-        <w:rPr>
-          <w:lang w:val="it-IT"/>
-        </w:rPr>
-        <w:t xml:space="preserve"> + Authentication)</w:t>
+      <w:r>
+        <w:rPr>
+          <w:lang w:val="it-IT"/>
+        </w:rPr>
+        <w:t>Firebase Console (Firestore + Authentication)</w:t>
       </w:r>
     </w:p>
     <w:p>
@@ -10107,35 +9870,7 @@
         <w:rPr>
           <w:lang w:val="fr-CH"/>
         </w:rPr>
-        <w:t xml:space="preserve">Vite + </w:t>
-      </w:r>
-      <w:proofErr w:type="spellStart"/>
-      <w:r>
-        <w:rPr>
-          <w:lang w:val="fr-CH"/>
-        </w:rPr>
-        <w:t>React</w:t>
-      </w:r>
-      <w:proofErr w:type="spellEnd"/>
-      <w:r>
-        <w:rPr>
-          <w:lang w:val="fr-CH"/>
-        </w:rPr>
-        <w:t xml:space="preserve"> v18.3.1 + </w:t>
-      </w:r>
-      <w:proofErr w:type="spellStart"/>
-      <w:r>
-        <w:rPr>
-          <w:lang w:val="fr-CH"/>
-        </w:rPr>
-        <w:t>TailwindCSS</w:t>
-      </w:r>
-      <w:proofErr w:type="spellEnd"/>
-      <w:r>
-        <w:rPr>
-          <w:lang w:val="fr-CH"/>
-        </w:rPr>
-        <w:t xml:space="preserve"> v3.4.10</w:t>
+        <w:t>Vite + React v18.3.1 + TailwindCSS v3.4.10</w:t>
       </w:r>
     </w:p>
     <w:p>
@@ -10150,47 +9885,11 @@
           <w:lang w:val="fr-CH"/>
         </w:rPr>
       </w:pPr>
-      <w:proofErr w:type="spellStart"/>
       <w:r>
         <w:rPr>
           <w:lang w:val="fr-CH"/>
         </w:rPr>
-        <w:t>Firebase</w:t>
-      </w:r>
-      <w:proofErr w:type="spellEnd"/>
-      <w:r>
-        <w:rPr>
-          <w:lang w:val="fr-CH"/>
-        </w:rPr>
-        <w:t xml:space="preserve"> </w:t>
-      </w:r>
-      <w:proofErr w:type="spellStart"/>
-      <w:r>
-        <w:rPr>
-          <w:lang w:val="fr-CH"/>
-        </w:rPr>
-        <w:t>Hosting</w:t>
-      </w:r>
-      <w:proofErr w:type="spellEnd"/>
-      <w:r>
-        <w:rPr>
-          <w:lang w:val="fr-CH"/>
-        </w:rPr>
-        <w:t xml:space="preserve"> (</w:t>
-      </w:r>
-      <w:proofErr w:type="spellStart"/>
-      <w:r>
-        <w:rPr>
-          <w:lang w:val="fr-CH"/>
-        </w:rPr>
-        <w:t>Deploy</w:t>
-      </w:r>
-      <w:proofErr w:type="spellEnd"/>
-      <w:r>
-        <w:rPr>
-          <w:lang w:val="fr-CH"/>
-        </w:rPr>
-        <w:t xml:space="preserve"> production)</w:t>
+        <w:t>Firebase Hosting (Deploy production)</w:t>
       </w:r>
     </w:p>
     <w:p>
@@ -10240,21 +9939,7 @@
         <w:rPr>
           <w:lang w:val="it-IT"/>
         </w:rPr>
-        <w:t xml:space="preserve">CPU: Intel(R) </w:t>
-      </w:r>
-      <w:proofErr w:type="gramStart"/>
-      <w:r>
-        <w:rPr>
-          <w:lang w:val="it-IT"/>
-        </w:rPr>
-        <w:t>Core(</w:t>
-      </w:r>
-      <w:proofErr w:type="gramEnd"/>
-      <w:r>
-        <w:rPr>
-          <w:lang w:val="it-IT"/>
-        </w:rPr>
-        <w:t>TM) i7-9700 CPU @ 3.00GHz</w:t>
+        <w:t>CPU: Intel(R) Core(TM) i7-9700 CPU @ 3.00GHz</w:t>
       </w:r>
     </w:p>
     <w:p>
@@ -10292,21 +9977,7 @@
         <w:rPr>
           <w:lang w:val="it-IT"/>
         </w:rPr>
-        <w:t xml:space="preserve">GPU: NVIDIA </w:t>
-      </w:r>
-      <w:proofErr w:type="spellStart"/>
-      <w:r>
-        <w:rPr>
-          <w:lang w:val="it-IT"/>
-        </w:rPr>
-        <w:t>GeForce</w:t>
-      </w:r>
-      <w:proofErr w:type="spellEnd"/>
-      <w:r>
-        <w:rPr>
-          <w:lang w:val="it-IT"/>
-        </w:rPr>
-        <w:t xml:space="preserve"> RTX 2060</w:t>
+        <w:t>GPU: NVIDIA GeForce RTX 2060</w:t>
       </w:r>
     </w:p>
     <w:p>
@@ -10317,86 +9988,46 @@
           <w:lang w:val="fr-CH"/>
         </w:rPr>
       </w:pPr>
-      <w:proofErr w:type="spellStart"/>
       <w:r>
         <w:rPr>
           <w:b/>
           <w:bCs/>
           <w:lang w:val="fr-CH"/>
         </w:rPr>
-        <w:t>Dispositivi</w:t>
-      </w:r>
-      <w:proofErr w:type="spellEnd"/>
-      <w:r>
+        <w:t>Dispositivi Mobile Test:</w:t>
+      </w:r>
+    </w:p>
+    <w:p>
+      <w:pPr>
+        <w:spacing w:before="240"/>
+        <w:rPr>
+          <w:lang w:val="fr-CH"/>
+        </w:rPr>
+      </w:pPr>
+      <w:r>
+        <w:rPr>
+          <w:lang w:val="fr-CH"/>
+        </w:rPr>
+        <w:t>Samsung Galaxy Tab A8 (10.5")</w:t>
+      </w:r>
+    </w:p>
+    <w:p>
+      <w:pPr>
+        <w:spacing w:before="240"/>
         <w:rPr>
           <w:b/>
           <w:bCs/>
           <w:lang w:val="fr-CH"/>
         </w:rPr>
-        <w:t xml:space="preserve"> Mobile </w:t>
-      </w:r>
-      <w:proofErr w:type="gramStart"/>
+      </w:pPr>
       <w:r>
         <w:rPr>
           <w:b/>
           <w:bCs/>
           <w:lang w:val="fr-CH"/>
         </w:rPr>
-        <w:t>Test:</w:t>
-      </w:r>
-      <w:proofErr w:type="gramEnd"/>
-    </w:p>
-    <w:p>
-      <w:pPr>
-        <w:spacing w:before="240"/>
-        <w:rPr>
-          <w:lang w:val="fr-CH"/>
-        </w:rPr>
-      </w:pPr>
-      <w:r>
-        <w:rPr>
-          <w:lang w:val="fr-CH"/>
-        </w:rPr>
-        <w:t>Samsung Galaxy Tab A8 (10.5")</w:t>
-      </w:r>
-    </w:p>
-    <w:p>
-      <w:pPr>
-        <w:spacing w:before="240"/>
-        <w:rPr>
-          <w:b/>
-          <w:bCs/>
-          <w:lang w:val="fr-CH"/>
-        </w:rPr>
-      </w:pPr>
-      <w:r>
-        <w:rPr>
-          <w:b/>
-          <w:bCs/>
-          <w:lang w:val="fr-CH"/>
-        </w:rPr>
-        <w:t xml:space="preserve">VR </w:t>
-      </w:r>
-      <w:proofErr w:type="spellStart"/>
-      <w:proofErr w:type="gramStart"/>
-      <w:r>
-        <w:rPr>
-          <w:b/>
-          <w:bCs/>
-          <w:lang w:val="fr-CH"/>
-        </w:rPr>
-        <w:t>Development</w:t>
-      </w:r>
-      <w:proofErr w:type="spellEnd"/>
-      <w:r>
-        <w:rPr>
-          <w:b/>
-          <w:bCs/>
-          <w:lang w:val="fr-CH"/>
-        </w:rPr>
-        <w:t>:</w:t>
-      </w:r>
-      <w:proofErr w:type="gramEnd"/>
+        <w:t>VR Development:</w:t>
+      </w:r>
     </w:p>
     <w:p>
       <w:pPr>
@@ -10524,21 +10155,7 @@
         <w:rPr>
           <w:lang w:val="it-IT"/>
         </w:rPr>
-        <w:t xml:space="preserve">un database </w:t>
-      </w:r>
-      <w:proofErr w:type="spellStart"/>
-      <w:r>
-        <w:rPr>
-          <w:lang w:val="it-IT"/>
-        </w:rPr>
-        <w:t>NoSQL</w:t>
-      </w:r>
-      <w:proofErr w:type="spellEnd"/>
-      <w:r>
-        <w:rPr>
-          <w:lang w:val="it-IT"/>
-        </w:rPr>
-        <w:t>.</w:t>
+        <w:t>un database NoSQL.</w:t>
       </w:r>
     </w:p>
     <w:p>
@@ -10591,10 +10208,10 @@
           <w:lang w:val="it-IT"/>
         </w:rPr>
         <w:drawing>
-          <wp:inline distT="0" distB="0" distL="0" distR="0" wp14:anchorId="76E23DFB" wp14:editId="48424B3C">
-            <wp:extent cx="5041900" cy="3544437"/>
-            <wp:effectExtent l="114300" t="114300" r="120650" b="113665"/>
-            <wp:docPr id="26652517" name="Immagine 1"/>
+          <wp:inline distT="0" distB="0" distL="0" distR="0" wp14:anchorId="7F8B98C9" wp14:editId="4F7741C3">
+            <wp:extent cx="5615544" cy="3964838"/>
+            <wp:effectExtent l="114300" t="114300" r="118745" b="112395"/>
+            <wp:docPr id="14" name="Immagine 14"/>
             <wp:cNvGraphicFramePr>
               <a:graphicFrameLocks xmlns:a="http://schemas.openxmlformats.org/drawingml/2006/main" noChangeAspect="1"/>
             </wp:cNvGraphicFramePr>
@@ -10602,12 +10219,12 @@
               <a:graphicData uri="http://schemas.openxmlformats.org/drawingml/2006/picture">
                 <pic:pic xmlns:pic="http://schemas.openxmlformats.org/drawingml/2006/picture">
                   <pic:nvPicPr>
-                    <pic:cNvPr id="0" name="Picture 1"/>
+                    <pic:cNvPr id="0" name="Picture 2"/>
                     <pic:cNvPicPr>
                       <a:picLocks noChangeAspect="1" noChangeArrowheads="1"/>
                     </pic:cNvPicPr>
                   </pic:nvPicPr>
-                  <pic:blipFill rotWithShape="1">
+                  <pic:blipFill>
                     <a:blip r:embed="rId15">
                       <a:extLst>
                         <a:ext uri="{28A0092B-C50C-407E-A947-70E740481C1C}">
@@ -10615,7 +10232,7 @@
                         </a:ext>
                       </a:extLst>
                     </a:blip>
-                    <a:srcRect l="520" t="497" r="504" b="826"/>
+                    <a:srcRect/>
                     <a:stretch>
                       <a:fillRect/>
                     </a:stretch>
@@ -10623,7 +10240,7 @@
                   <pic:spPr bwMode="auto">
                     <a:xfrm>
                       <a:off x="0" y="0"/>
-                      <a:ext cx="5062428" cy="3558868"/>
+                      <a:ext cx="5626417" cy="3972515"/>
                     </a:xfrm>
                     <a:prstGeom prst="rect">
                       <a:avLst/>
@@ -10639,11 +10256,6 @@
                         </a:prstClr>
                       </a:outerShdw>
                     </a:effectLst>
-                    <a:extLst>
-                      <a:ext uri="{53640926-AAD7-44D8-BBD7-CCE9431645EC}">
-                        <a14:shadowObscured xmlns:a14="http://schemas.microsoft.com/office/drawing/2010/main"/>
-                      </a:ext>
-                    </a:extLst>
                   </pic:spPr>
                 </pic:pic>
               </a:graphicData>
@@ -10811,21 +10423,7 @@
         <w:rPr>
           <w:lang w:val="it-IT"/>
         </w:rPr>
-        <w:t xml:space="preserve"> di Google </w:t>
-      </w:r>
-      <w:proofErr w:type="spellStart"/>
-      <w:r>
-        <w:rPr>
-          <w:lang w:val="it-IT"/>
-        </w:rPr>
-        <w:t>Firebase</w:t>
-      </w:r>
-      <w:proofErr w:type="spellEnd"/>
-      <w:r>
-        <w:rPr>
-          <w:lang w:val="it-IT"/>
-        </w:rPr>
-        <w:t>.</w:t>
+        <w:t xml:space="preserve"> di Google Firebase.</w:t>
       </w:r>
     </w:p>
     <w:p>
@@ -10870,31 +10468,7 @@
         <w:t xml:space="preserve">Per il database </w:t>
       </w:r>
       <w:r>
-        <w:t xml:space="preserve">viene utilizzato Google </w:t>
-      </w:r>
-      <w:proofErr w:type="spellStart"/>
-      <w:r>
-        <w:t>Firestore</w:t>
-      </w:r>
-      <w:proofErr w:type="spellEnd"/>
-      <w:r>
-        <w:t xml:space="preserve">. Essendo un database </w:t>
-      </w:r>
-      <w:proofErr w:type="spellStart"/>
-      <w:r>
-        <w:t>NoSQL</w:t>
-      </w:r>
-      <w:proofErr w:type="spellEnd"/>
-      <w:r>
-        <w:t xml:space="preserve"> cloud-</w:t>
-      </w:r>
-      <w:proofErr w:type="spellStart"/>
-      <w:r>
-        <w:t>based</w:t>
-      </w:r>
-      <w:proofErr w:type="spellEnd"/>
-      <w:r>
-        <w:t>, la comunicazione avviene via HTTPS</w:t>
+        <w:t>viene utilizzato Google Firestore. Essendo un database NoSQL cloud-based, la comunicazione avviene via HTTPS</w:t>
       </w:r>
       <w:r>
         <w:t>.</w:t>
@@ -10941,35 +10515,7 @@
         <w:rPr>
           <w:lang w:val="it-IT"/>
         </w:rPr>
-        <w:t xml:space="preserve">Per la gestione dei dati è stato adottato </w:t>
-      </w:r>
-      <w:proofErr w:type="spellStart"/>
-      <w:r>
-        <w:rPr>
-          <w:lang w:val="it-IT"/>
-        </w:rPr>
-        <w:t>Firestore</w:t>
-      </w:r>
-      <w:proofErr w:type="spellEnd"/>
-      <w:r>
-        <w:rPr>
-          <w:lang w:val="it-IT"/>
-        </w:rPr>
-        <w:t xml:space="preserve">, ovvero un database non relazionale a oggetti. Inizialmente, in fase di progettazione, la struttura del database è stata concepita come relazionale definendo uno schema ER per poi passare a un diagramma di classi, siccome </w:t>
-      </w:r>
-      <w:proofErr w:type="spellStart"/>
-      <w:r>
-        <w:rPr>
-          <w:lang w:val="it-IT"/>
-        </w:rPr>
-        <w:t>Firestore</w:t>
-      </w:r>
-      <w:proofErr w:type="spellEnd"/>
-      <w:r>
-        <w:rPr>
-          <w:lang w:val="it-IT"/>
-        </w:rPr>
-        <w:t xml:space="preserve"> lavora con file JSON e quindi a oggetti.</w:t>
+        <w:t>Per la gestione dei dati è stato adottato Firestore, ovvero un database non relazionale a oggetti. Inizialmente, in fase di progettazione, la struttura del database è stata concepita come relazionale definendo uno schema ER per poi passare a un diagramma di classi, siccome Firestore lavora con file JSON e quindi a oggetti.</w:t>
       </w:r>
     </w:p>
     <w:p>
@@ -11115,17 +10661,8 @@
           <w:i/>
           <w:iCs/>
         </w:rPr>
-        <w:t xml:space="preserve"> - Diagramma ER </w:t>
-      </w:r>
-      <w:proofErr w:type="spellStart"/>
-      <w:r>
-        <w:rPr>
-          <w:i/>
-          <w:iCs/>
-        </w:rPr>
-        <w:t>NoSQL</w:t>
-      </w:r>
-      <w:proofErr w:type="spellEnd"/>
+        <w:t xml:space="preserve"> - Diagramma ER NoSQL</w:t>
+      </w:r>
     </w:p>
     <w:p>
       <w:pPr>
@@ -11147,14 +10684,9 @@
       <w:bookmarkStart w:id="38" w:name="_Toc221715535"/>
       <w:r>
         <w:lastRenderedPageBreak/>
-        <w:t xml:space="preserve">Diagramma per database </w:t>
-      </w:r>
-      <w:proofErr w:type="spellStart"/>
-      <w:r>
-        <w:t>NoSQL</w:t>
+        <w:t>Diagramma per database NoSQL</w:t>
       </w:r>
       <w:bookmarkEnd w:id="38"/>
-      <w:proofErr w:type="spellEnd"/>
     </w:p>
     <w:p>
       <w:pPr>
@@ -11282,17 +10814,8 @@
           <w:i/>
           <w:iCs/>
         </w:rPr>
-        <w:t xml:space="preserve"> - Diagramma a classi </w:t>
-      </w:r>
-      <w:proofErr w:type="spellStart"/>
-      <w:r>
-        <w:rPr>
-          <w:i/>
-          <w:iCs/>
-        </w:rPr>
-        <w:t>NoSQL</w:t>
-      </w:r>
-      <w:proofErr w:type="spellEnd"/>
+        <w:t xml:space="preserve"> - Diagramma a classi NoSQL</w:t>
+      </w:r>
     </w:p>
     <w:p>
       <w:pPr>
@@ -11669,21 +11192,7 @@
         <w:rPr>
           <w:lang w:val="it-IT"/>
         </w:rPr>
-        <w:t xml:space="preserve">La dashboard è la pagina principale del sito dove gli utenti autenticati si trovano una volta fatto l’accesso. La pagina contiene una </w:t>
-      </w:r>
-      <w:proofErr w:type="spellStart"/>
-      <w:r>
-        <w:rPr>
-          <w:lang w:val="it-IT"/>
-        </w:rPr>
-        <w:t>overview</w:t>
-      </w:r>
-      <w:proofErr w:type="spellEnd"/>
-      <w:r>
-        <w:rPr>
-          <w:lang w:val="it-IT"/>
-        </w:rPr>
-        <w:t xml:space="preserve"> generale sui dati del magazzino.</w:t>
+        <w:t>La dashboard è la pagina principale del sito dove gli utenti autenticati si trovano una volta fatto l’accesso. La pagina contiene una overview generale sui dati del magazzino.</w:t>
       </w:r>
     </w:p>
     <w:p>
@@ -11698,10 +11207,10 @@
           <w:lang w:val="it-IT"/>
         </w:rPr>
         <w:drawing>
-          <wp:inline distT="0" distB="0" distL="0" distR="0" wp14:anchorId="6C9D2013" wp14:editId="240B3639">
-            <wp:extent cx="5890609" cy="3283993"/>
-            <wp:effectExtent l="114300" t="114300" r="110490" b="107315"/>
-            <wp:docPr id="16" name="Immagine 16"/>
+          <wp:inline distT="0" distB="0" distL="0" distR="0" wp14:anchorId="5BAC6B3A" wp14:editId="44E47286">
+            <wp:extent cx="5866411" cy="3282781"/>
+            <wp:effectExtent l="114300" t="114300" r="115570" b="108585"/>
+            <wp:docPr id="15" name="Immagine 15"/>
             <wp:cNvGraphicFramePr>
               <a:graphicFrameLocks xmlns:a="http://schemas.openxmlformats.org/drawingml/2006/main" noChangeAspect="1"/>
             </wp:cNvGraphicFramePr>
@@ -11709,7 +11218,7 @@
               <a:graphicData uri="http://schemas.openxmlformats.org/drawingml/2006/picture">
                 <pic:pic xmlns:pic="http://schemas.openxmlformats.org/drawingml/2006/picture">
                   <pic:nvPicPr>
-                    <pic:cNvPr id="0" name="Picture 10"/>
+                    <pic:cNvPr id="0" name="Picture 3"/>
                     <pic:cNvPicPr>
                       <a:picLocks noChangeAspect="1" noChangeArrowheads="1"/>
                     </pic:cNvPicPr>
@@ -11730,7 +11239,7 @@
                   <pic:spPr bwMode="auto">
                     <a:xfrm>
                       <a:off x="0" y="0"/>
-                      <a:ext cx="5893833" cy="3285790"/>
+                      <a:ext cx="5870418" cy="3285023"/>
                     </a:xfrm>
                     <a:prstGeom prst="rect">
                       <a:avLst/>
@@ -12036,16 +11545,17 @@
     <w:p>
       <w:pPr>
         <w:keepNext/>
+        <w:jc w:val="center"/>
       </w:pPr>
       <w:r>
         <w:rPr>
           <w:noProof/>
         </w:rPr>
         <w:drawing>
-          <wp:inline distT="0" distB="0" distL="0" distR="0" wp14:anchorId="6E89449D" wp14:editId="54FA5E94">
-            <wp:extent cx="5924835" cy="3303074"/>
-            <wp:effectExtent l="114300" t="114300" r="114300" b="107315"/>
-            <wp:docPr id="17" name="Immagine 17"/>
+          <wp:inline distT="0" distB="0" distL="0" distR="0" wp14:anchorId="1DFD0CCD" wp14:editId="79337832">
+            <wp:extent cx="5789221" cy="3228777"/>
+            <wp:effectExtent l="114300" t="114300" r="116840" b="105410"/>
+            <wp:docPr id="20" name="Immagine 20"/>
             <wp:cNvGraphicFramePr>
               <a:graphicFrameLocks xmlns:a="http://schemas.openxmlformats.org/drawingml/2006/main" noChangeAspect="1"/>
             </wp:cNvGraphicFramePr>
@@ -12053,7 +11563,7 @@
               <a:graphicData uri="http://schemas.openxmlformats.org/drawingml/2006/picture">
                 <pic:pic xmlns:pic="http://schemas.openxmlformats.org/drawingml/2006/picture">
                   <pic:nvPicPr>
-                    <pic:cNvPr id="0" name="Picture 11"/>
+                    <pic:cNvPr id="0" name="Picture 4"/>
                     <pic:cNvPicPr>
                       <a:picLocks noChangeAspect="1" noChangeArrowheads="1"/>
                     </pic:cNvPicPr>
@@ -12074,7 +11584,7 @@
                   <pic:spPr bwMode="auto">
                     <a:xfrm>
                       <a:off x="0" y="0"/>
-                      <a:ext cx="5931200" cy="3306622"/>
+                      <a:ext cx="5793137" cy="3230961"/>
                     </a:xfrm>
                     <a:prstGeom prst="rect">
                       <a:avLst/>
@@ -12262,10 +11772,10 @@
           <w:lang w:val="it-IT"/>
         </w:rPr>
         <w:drawing>
-          <wp:inline distT="0" distB="0" distL="0" distR="0" wp14:anchorId="27CDE4C3" wp14:editId="31B702FC">
-            <wp:extent cx="5902657" cy="3284573"/>
-            <wp:effectExtent l="114300" t="114300" r="117475" b="106680"/>
-            <wp:docPr id="18" name="Immagine 18"/>
+          <wp:inline distT="0" distB="0" distL="0" distR="0" wp14:anchorId="0C0E325F" wp14:editId="2FA6C6A2">
+            <wp:extent cx="5967351" cy="3321935"/>
+            <wp:effectExtent l="114300" t="114300" r="109855" b="107315"/>
+            <wp:docPr id="23" name="Immagine 23"/>
             <wp:cNvGraphicFramePr>
               <a:graphicFrameLocks xmlns:a="http://schemas.openxmlformats.org/drawingml/2006/main" noChangeAspect="1"/>
             </wp:cNvGraphicFramePr>
@@ -12273,7 +11783,7 @@
               <a:graphicData uri="http://schemas.openxmlformats.org/drawingml/2006/picture">
                 <pic:pic xmlns:pic="http://schemas.openxmlformats.org/drawingml/2006/picture">
                   <pic:nvPicPr>
-                    <pic:cNvPr id="0" name="Picture 12"/>
+                    <pic:cNvPr id="0" name="Picture 5"/>
                     <pic:cNvPicPr>
                       <a:picLocks noChangeAspect="1" noChangeArrowheads="1"/>
                     </pic:cNvPicPr>
@@ -12294,7 +11804,7 @@
                   <pic:spPr bwMode="auto">
                     <a:xfrm>
                       <a:off x="0" y="0"/>
-                      <a:ext cx="5905335" cy="3286063"/>
+                      <a:ext cx="5970685" cy="3323791"/>
                     </a:xfrm>
                     <a:prstGeom prst="rect">
                       <a:avLst/>
@@ -12437,10 +11947,10 @@
           <w:lang w:val="it-IT"/>
         </w:rPr>
         <w:drawing>
-          <wp:inline distT="0" distB="0" distL="0" distR="0" wp14:anchorId="7D3D65F1" wp14:editId="677940C7">
-            <wp:extent cx="5962932" cy="3318112"/>
-            <wp:effectExtent l="114300" t="114300" r="114300" b="111125"/>
-            <wp:docPr id="19" name="Immagine 19"/>
+          <wp:inline distT="0" distB="0" distL="0" distR="0" wp14:anchorId="50A09DF4" wp14:editId="25CA27FD">
+            <wp:extent cx="5872348" cy="3281606"/>
+            <wp:effectExtent l="114300" t="114300" r="109855" b="109855"/>
+            <wp:docPr id="25" name="Immagine 25"/>
             <wp:cNvGraphicFramePr>
               <a:graphicFrameLocks xmlns:a="http://schemas.openxmlformats.org/drawingml/2006/main" noChangeAspect="1"/>
             </wp:cNvGraphicFramePr>
@@ -12448,7 +11958,7 @@
               <a:graphicData uri="http://schemas.openxmlformats.org/drawingml/2006/picture">
                 <pic:pic xmlns:pic="http://schemas.openxmlformats.org/drawingml/2006/picture">
                   <pic:nvPicPr>
-                    <pic:cNvPr id="0" name="Picture 13"/>
+                    <pic:cNvPr id="0" name="Picture 6"/>
                     <pic:cNvPicPr>
                       <a:picLocks noChangeAspect="1" noChangeArrowheads="1"/>
                     </pic:cNvPicPr>
@@ -12469,7 +11979,7 @@
                   <pic:spPr bwMode="auto">
                     <a:xfrm>
                       <a:off x="0" y="0"/>
-                      <a:ext cx="5999509" cy="3338465"/>
+                      <a:ext cx="5878596" cy="3285098"/>
                     </a:xfrm>
                     <a:prstGeom prst="rect">
                       <a:avLst/>
@@ -12612,7 +12122,7 @@
           <w:lang w:val="it-IT"/>
         </w:rPr>
         <w:drawing>
-          <wp:inline distT="0" distB="0" distL="0" distR="0" wp14:anchorId="52636AA0" wp14:editId="5F5F5629">
+          <wp:inline distT="0" distB="0" distL="0" distR="0" wp14:anchorId="52636AA0" wp14:editId="4B702409">
             <wp:extent cx="5866334" cy="3277169"/>
             <wp:effectExtent l="114300" t="114300" r="115570" b="114300"/>
             <wp:docPr id="21" name="Immagine 21"/>
@@ -13351,21 +12861,7 @@
         <w:rPr>
           <w:lang w:val="it-IT"/>
         </w:rPr>
-        <w:t xml:space="preserve">sono degli </w:t>
-      </w:r>
-      <w:proofErr w:type="spellStart"/>
-      <w:r>
-        <w:rPr>
-          <w:lang w:val="it-IT"/>
-        </w:rPr>
-        <w:t>Swimlane</w:t>
-      </w:r>
-      <w:proofErr w:type="spellEnd"/>
-      <w:r>
-        <w:rPr>
-          <w:lang w:val="it-IT"/>
-        </w:rPr>
-        <w:t xml:space="preserve"> suddivisi in due parti</w:t>
+        <w:t>sono degli Swimlane suddivisi in due parti</w:t>
       </w:r>
       <w:r>
         <w:rPr>
@@ -13577,23 +13073,7 @@
           <w:i/>
           <w:iCs/>
         </w:rPr>
-        <w:t xml:space="preserve"> - </w:t>
-      </w:r>
-      <w:proofErr w:type="spellStart"/>
-      <w:r>
-        <w:rPr>
-          <w:i/>
-          <w:iCs/>
-        </w:rPr>
-        <w:t>Swimlane</w:t>
-      </w:r>
-      <w:proofErr w:type="spellEnd"/>
-      <w:r>
-        <w:rPr>
-          <w:i/>
-          <w:iCs/>
-        </w:rPr>
-        <w:t>, Raccolta dati e annotazione</w:t>
+        <w:t xml:space="preserve"> - Swimlane, Raccolta dati e annotazione</w:t>
       </w:r>
     </w:p>
     <w:p>
@@ -13755,23 +13235,7 @@
           <w:i/>
           <w:iCs/>
         </w:rPr>
-        <w:t xml:space="preserve"> - </w:t>
-      </w:r>
-      <w:proofErr w:type="spellStart"/>
-      <w:r>
-        <w:rPr>
-          <w:i/>
-          <w:iCs/>
-        </w:rPr>
-        <w:t>Swimlane</w:t>
-      </w:r>
-      <w:proofErr w:type="spellEnd"/>
-      <w:r>
-        <w:rPr>
-          <w:i/>
-          <w:iCs/>
-        </w:rPr>
-        <w:t>, Training modello YOLO</w:t>
+        <w:t xml:space="preserve"> - Swimlane, Training modello YOLO</w:t>
       </w:r>
     </w:p>
     <w:p>
@@ -13944,23 +13408,7 @@
           <w:i/>
           <w:iCs/>
         </w:rPr>
-        <w:t xml:space="preserve"> - </w:t>
-      </w:r>
-      <w:proofErr w:type="spellStart"/>
-      <w:r>
-        <w:rPr>
-          <w:i/>
-          <w:iCs/>
-        </w:rPr>
-        <w:t>Swimlane</w:t>
-      </w:r>
-      <w:proofErr w:type="spellEnd"/>
-      <w:r>
-        <w:rPr>
-          <w:i/>
-          <w:iCs/>
-        </w:rPr>
-        <w:t>, Riconoscimento oggetti (versione non dinamica)</w:t>
+        <w:t xml:space="preserve"> - Swimlane, Riconoscimento oggetti (versione non dinamica)</w:t>
       </w:r>
     </w:p>
     <w:p>
@@ -14141,23 +13589,7 @@
           <w:i/>
           <w:iCs/>
         </w:rPr>
-        <w:t xml:space="preserve"> - </w:t>
-      </w:r>
-      <w:proofErr w:type="spellStart"/>
-      <w:r>
-        <w:rPr>
-          <w:i/>
-          <w:iCs/>
-        </w:rPr>
-        <w:t>Swimlane</w:t>
-      </w:r>
-      <w:proofErr w:type="spellEnd"/>
-      <w:r>
-        <w:rPr>
-          <w:i/>
-          <w:iCs/>
-        </w:rPr>
-        <w:t>, Riconoscimento oggetti (versione dinamica)</w:t>
+        <w:t xml:space="preserve"> - Swimlane, Riconoscimento oggetti (versione dinamica)</w:t>
       </w:r>
     </w:p>
     <w:p>
@@ -14175,7 +13607,13 @@
       </w:pPr>
       <w:r>
         <w:lastRenderedPageBreak/>
-        <w:t>Login</w:t>
+        <w:t xml:space="preserve">Gestione </w:t>
+      </w:r>
+      <w:r>
+        <w:t xml:space="preserve">utenti e </w:t>
+      </w:r>
+      <w:r>
+        <w:t>magazzino</w:t>
       </w:r>
     </w:p>
     <w:p>
@@ -14189,31 +13627,55 @@
         <w:rPr>
           <w:lang w:val="it-IT"/>
         </w:rPr>
-        <w:t>Descrive le operazioni che deve intraprendere</w:t>
-      </w:r>
-      <w:r>
-        <w:rPr>
-          <w:lang w:val="it-IT"/>
-        </w:rPr>
-        <w:t xml:space="preserve"> l’utente </w:t>
-      </w:r>
-      <w:r>
-        <w:rPr>
-          <w:lang w:val="it-IT"/>
-        </w:rPr>
-        <w:t>per poter effettuare il login</w:t>
-      </w:r>
-      <w:r>
-        <w:rPr>
-          <w:lang w:val="it-IT"/>
-        </w:rPr>
-        <w:t xml:space="preserve"> alla web dashboard</w:t>
-      </w:r>
-      <w:r>
-        <w:rPr>
-          <w:lang w:val="it-IT"/>
-        </w:rPr>
-        <w:t>.</w:t>
+        <w:t xml:space="preserve">Descrive le operazioni </w:t>
+      </w:r>
+      <w:r>
+        <w:rPr>
+          <w:lang w:val="it-IT"/>
+        </w:rPr>
+        <w:t xml:space="preserve">di gestione </w:t>
+      </w:r>
+      <w:r>
+        <w:rPr>
+          <w:lang w:val="it-IT"/>
+        </w:rPr>
+        <w:t xml:space="preserve">che </w:t>
+      </w:r>
+      <w:r>
+        <w:rPr>
+          <w:lang w:val="it-IT"/>
+        </w:rPr>
+        <w:t xml:space="preserve">possono </w:t>
+      </w:r>
+      <w:r>
+        <w:rPr>
+          <w:lang w:val="it-IT"/>
+        </w:rPr>
+        <w:t>svolgere</w:t>
+      </w:r>
+      <w:r>
+        <w:rPr>
+          <w:lang w:val="it-IT"/>
+        </w:rPr>
+        <w:t xml:space="preserve"> </w:t>
+      </w:r>
+      <w:r>
+        <w:rPr>
+          <w:lang w:val="it-IT"/>
+        </w:rPr>
+        <w:t>l'admin</w:t>
+      </w:r>
+      <w:r>
+        <w:rPr>
+          <w:lang w:val="it-IT"/>
+        </w:rPr>
+        <w:t xml:space="preserve"> e il magazziniere.</w:t>
+      </w:r>
+      <w:r>
+        <w:rPr>
+          <w:lang w:val="it-IT"/>
+        </w:rPr>
+        <w:t xml:space="preserve"> Il magazziniere gestirà tutto quello che concerne il magazzino mentre l’admin oltre a questo potrà anche gestire gli utenti.</w:t>
       </w:r>
     </w:p>
     <w:p>
@@ -14224,12 +13686,13 @@
       <w:r>
         <w:rPr>
           <w:noProof/>
+          <w:lang w:val="it-IT"/>
         </w:rPr>
         <w:drawing>
-          <wp:inline distT="0" distB="0" distL="0" distR="0" wp14:anchorId="587876AD" wp14:editId="45BD65C7">
-            <wp:extent cx="4603054" cy="5581403"/>
-            <wp:effectExtent l="95250" t="133350" r="102870" b="133985"/>
-            <wp:docPr id="264836172" name="Immagine 6"/>
+          <wp:inline distT="0" distB="0" distL="0" distR="0" wp14:anchorId="74766D14" wp14:editId="2C2A53D1">
+            <wp:extent cx="4429496" cy="6444823"/>
+            <wp:effectExtent l="95250" t="133350" r="104775" b="127635"/>
+            <wp:docPr id="13" name="Immagine 13"/>
             <wp:cNvGraphicFramePr>
               <a:graphicFrameLocks xmlns:a="http://schemas.openxmlformats.org/drawingml/2006/main" noChangeAspect="1"/>
             </wp:cNvGraphicFramePr>
@@ -14237,230 +13700,13 @@
               <a:graphicData uri="http://schemas.openxmlformats.org/drawingml/2006/picture">
                 <pic:pic xmlns:pic="http://schemas.openxmlformats.org/drawingml/2006/picture">
                   <pic:nvPicPr>
-                    <pic:cNvPr id="0" name="Picture 11"/>
-                    <pic:cNvPicPr>
-                      <a:picLocks noChangeAspect="1" noChangeArrowheads="1"/>
-                    </pic:cNvPicPr>
-                  </pic:nvPicPr>
-                  <pic:blipFill rotWithShape="1">
-                    <a:blip r:embed="rId31">
-                      <a:extLst>
-                        <a:ext uri="{28A0092B-C50C-407E-A947-70E740481C1C}">
-                          <a14:useLocalDpi xmlns:a14="http://schemas.microsoft.com/office/drawing/2010/main" val="0"/>
-                        </a:ext>
-                      </a:extLst>
-                    </a:blip>
-                    <a:srcRect b="16663"/>
-                    <a:stretch>
-                      <a:fillRect/>
-                    </a:stretch>
-                  </pic:blipFill>
-                  <pic:spPr bwMode="auto">
-                    <a:xfrm>
-                      <a:off x="0" y="0"/>
-                      <a:ext cx="4603054" cy="5581403"/>
-                    </a:xfrm>
-                    <a:prstGeom prst="rect">
-                      <a:avLst/>
-                    </a:prstGeom>
-                    <a:noFill/>
-                    <a:ln>
-                      <a:noFill/>
-                    </a:ln>
-                    <a:effectLst>
-                      <a:outerShdw blurRad="63500" sx="102000" sy="102000" algn="ctr" rotWithShape="0">
-                        <a:prstClr val="black">
-                          <a:alpha val="40000"/>
-                        </a:prstClr>
-                      </a:outerShdw>
-                    </a:effectLst>
-                    <a:extLst>
-                      <a:ext uri="{53640926-AAD7-44D8-BBD7-CCE9431645EC}">
-                        <a14:shadowObscured xmlns:a14="http://schemas.microsoft.com/office/drawing/2010/main"/>
-                      </a:ext>
-                    </a:extLst>
-                  </pic:spPr>
-                </pic:pic>
-              </a:graphicData>
-            </a:graphic>
-          </wp:inline>
-        </w:drawing>
-      </w:r>
-    </w:p>
-    <w:p>
-      <w:pPr>
-        <w:pStyle w:val="Didascalia"/>
-        <w:jc w:val="center"/>
-        <w:rPr>
-          <w:i/>
-          <w:iCs/>
-        </w:rPr>
-      </w:pPr>
-      <w:r>
-        <w:rPr>
-          <w:i/>
-          <w:iCs/>
-        </w:rPr>
-        <w:t xml:space="preserve">Figura </w:t>
-      </w:r>
-      <w:r>
-        <w:rPr>
-          <w:i/>
-          <w:iCs/>
-        </w:rPr>
-        <w:fldChar w:fldCharType="begin"/>
-      </w:r>
-      <w:r>
-        <w:rPr>
-          <w:i/>
-          <w:iCs/>
-        </w:rPr>
-        <w:instrText xml:space="preserve"> SEQ Figura \* ARABIC </w:instrText>
-      </w:r>
-      <w:r>
-        <w:rPr>
-          <w:i/>
-          <w:iCs/>
-        </w:rPr>
-        <w:fldChar w:fldCharType="separate"/>
-      </w:r>
-      <w:r>
-        <w:rPr>
-          <w:i/>
-          <w:iCs/>
-          <w:noProof/>
-        </w:rPr>
-        <w:t>24</w:t>
-      </w:r>
-      <w:r>
-        <w:rPr>
-          <w:i/>
-          <w:iCs/>
-        </w:rPr>
-        <w:fldChar w:fldCharType="end"/>
-      </w:r>
-      <w:r>
-        <w:rPr>
-          <w:i/>
-          <w:iCs/>
-        </w:rPr>
-        <w:t xml:space="preserve"> - </w:t>
-      </w:r>
-      <w:proofErr w:type="spellStart"/>
-      <w:r>
-        <w:rPr>
-          <w:i/>
-          <w:iCs/>
-        </w:rPr>
-        <w:t>Swimlane</w:t>
-      </w:r>
-      <w:proofErr w:type="spellEnd"/>
-      <w:r>
-        <w:rPr>
-          <w:i/>
-          <w:iCs/>
-        </w:rPr>
-        <w:t>, Login</w:t>
-      </w:r>
-    </w:p>
-    <w:p>
-      <w:r>
-        <w:br w:type="page"/>
-      </w:r>
-    </w:p>
-    <w:p>
-      <w:pPr>
-        <w:pStyle w:val="Titolo4"/>
-        <w:numPr>
-          <w:ilvl w:val="0"/>
-          <w:numId w:val="0"/>
-        </w:numPr>
-      </w:pPr>
-      <w:r>
-        <w:lastRenderedPageBreak/>
-        <w:t>Gestione utenti</w:t>
-      </w:r>
-    </w:p>
-    <w:p>
-      <w:pPr>
-        <w:spacing w:after="240" w:line="360" w:lineRule="auto"/>
-        <w:rPr>
-          <w:lang w:val="it-IT"/>
-        </w:rPr>
-      </w:pPr>
-      <w:r>
-        <w:rPr>
-          <w:lang w:val="it-IT"/>
-        </w:rPr>
-        <w:t xml:space="preserve">Descrive le operazioni </w:t>
-      </w:r>
-      <w:r>
-        <w:rPr>
-          <w:lang w:val="it-IT"/>
-        </w:rPr>
-        <w:t xml:space="preserve">di gestione degli utenti </w:t>
-      </w:r>
-      <w:r>
-        <w:rPr>
-          <w:lang w:val="it-IT"/>
-        </w:rPr>
-        <w:t>che può svolgere</w:t>
-      </w:r>
-      <w:r>
-        <w:rPr>
-          <w:lang w:val="it-IT"/>
-        </w:rPr>
-        <w:t xml:space="preserve"> </w:t>
-      </w:r>
-      <w:r>
-        <w:rPr>
-          <w:lang w:val="it-IT"/>
-        </w:rPr>
-        <w:t>l'admin</w:t>
-      </w:r>
-      <w:r>
-        <w:rPr>
-          <w:lang w:val="it-IT"/>
-        </w:rPr>
-        <w:t>. L’admin può eseguire operazioni di gestione solo sugli utenti non admin</w:t>
-      </w:r>
-      <w:r>
-        <w:rPr>
-          <w:lang w:val="it-IT"/>
-        </w:rPr>
-        <w:t>.</w:t>
-      </w:r>
-    </w:p>
-    <w:p>
-      <w:pPr>
-        <w:keepNext/>
-        <w:spacing w:line="360" w:lineRule="auto"/>
-        <w:jc w:val="center"/>
-      </w:pPr>
-      <w:r>
-        <w:rPr>
-          <w:noProof/>
-          <w:lang w:val="it-IT"/>
-        </w:rPr>
-        <w:drawing>
-          <wp:inline distT="0" distB="0" distL="0" distR="0" wp14:anchorId="17BE9630" wp14:editId="6276F372">
-            <wp:extent cx="4148432" cy="6035881"/>
-            <wp:effectExtent l="95250" t="133350" r="100330" b="136525"/>
-            <wp:docPr id="697413728" name="Immagine 7"/>
-            <wp:cNvGraphicFramePr>
-              <a:graphicFrameLocks xmlns:a="http://schemas.openxmlformats.org/drawingml/2006/main" noChangeAspect="1"/>
-            </wp:cNvGraphicFramePr>
-            <a:graphic xmlns:a="http://schemas.openxmlformats.org/drawingml/2006/main">
-              <a:graphicData uri="http://schemas.openxmlformats.org/drawingml/2006/picture">
-                <pic:pic xmlns:pic="http://schemas.openxmlformats.org/drawingml/2006/picture">
-                  <pic:nvPicPr>
-                    <pic:cNvPr id="0" name="Picture 12"/>
+                    <pic:cNvPr id="0" name="Picture 1"/>
                     <pic:cNvPicPr>
                       <a:picLocks noChangeAspect="1" noChangeArrowheads="1"/>
                     </pic:cNvPicPr>
                   </pic:nvPicPr>
                   <pic:blipFill>
-                    <a:blip r:embed="rId32">
+                    <a:blip r:embed="rId31">
                       <a:extLst>
                         <a:ext uri="{28A0092B-C50C-407E-A947-70E740481C1C}">
                           <a14:useLocalDpi xmlns:a14="http://schemas.microsoft.com/office/drawing/2010/main" val="0"/>
@@ -14475,7 +13721,7 @@
                   <pic:spPr bwMode="auto">
                     <a:xfrm>
                       <a:off x="0" y="0"/>
-                      <a:ext cx="4159244" cy="6051612"/>
+                      <a:ext cx="4446747" cy="6469923"/>
                     </a:xfrm>
                     <a:prstGeom prst="rect">
                       <a:avLst/>
@@ -14543,7 +13789,7 @@
           <w:iCs/>
           <w:noProof/>
         </w:rPr>
-        <w:t>25</w:t>
+        <w:t>26</w:t>
       </w:r>
       <w:r>
         <w:rPr>
@@ -14557,229 +13803,21 @@
           <w:i/>
           <w:iCs/>
         </w:rPr>
-        <w:t xml:space="preserve"> - </w:t>
-      </w:r>
-      <w:proofErr w:type="spellStart"/>
-      <w:r>
-        <w:rPr>
-          <w:i/>
-          <w:iCs/>
-        </w:rPr>
-        <w:t>Swimlane</w:t>
-      </w:r>
-      <w:proofErr w:type="spellEnd"/>
-      <w:r>
-        <w:rPr>
-          <w:i/>
-          <w:iCs/>
-        </w:rPr>
-        <w:t>, Gestione utenti</w:t>
-      </w:r>
-    </w:p>
-    <w:p>
-      <w:r>
-        <w:br w:type="page"/>
-      </w:r>
-    </w:p>
-    <w:p>
-      <w:pPr>
-        <w:pStyle w:val="Titolo4"/>
-        <w:numPr>
-          <w:ilvl w:val="0"/>
-          <w:numId w:val="0"/>
-        </w:numPr>
-      </w:pPr>
-      <w:r>
-        <w:lastRenderedPageBreak/>
-        <w:t>Gestione magazzino</w:t>
-      </w:r>
-    </w:p>
-    <w:p>
-      <w:pPr>
-        <w:spacing w:after="240" w:line="360" w:lineRule="auto"/>
-        <w:rPr>
-          <w:lang w:val="it-IT"/>
-        </w:rPr>
-      </w:pPr>
-      <w:r>
-        <w:rPr>
-          <w:lang w:val="it-IT"/>
-        </w:rPr>
-        <w:t xml:space="preserve">Descrive le operazioni </w:t>
-      </w:r>
-      <w:r>
-        <w:rPr>
-          <w:lang w:val="it-IT"/>
-        </w:rPr>
-        <w:t xml:space="preserve">di gestione del magazzino </w:t>
-      </w:r>
-      <w:r>
-        <w:rPr>
-          <w:lang w:val="it-IT"/>
-        </w:rPr>
-        <w:t>che può svolgere</w:t>
-      </w:r>
-      <w:r>
-        <w:rPr>
-          <w:lang w:val="it-IT"/>
-        </w:rPr>
-        <w:t xml:space="preserve"> </w:t>
-      </w:r>
-      <w:r>
-        <w:rPr>
-          <w:lang w:val="it-IT"/>
-        </w:rPr>
-        <w:t>l'admin</w:t>
-      </w:r>
-      <w:r>
-        <w:rPr>
-          <w:lang w:val="it-IT"/>
-        </w:rPr>
-        <w:t xml:space="preserve"> e il magazziniere.</w:t>
-      </w:r>
-    </w:p>
-    <w:p>
-      <w:pPr>
-        <w:keepNext/>
-        <w:jc w:val="center"/>
-      </w:pPr>
-      <w:r>
-        <w:rPr>
-          <w:noProof/>
-          <w:lang w:val="it-IT"/>
-        </w:rPr>
-        <w:drawing>
-          <wp:inline distT="0" distB="0" distL="0" distR="0" wp14:anchorId="5F13380D" wp14:editId="01D6665A">
-            <wp:extent cx="4378890" cy="6287985"/>
-            <wp:effectExtent l="95250" t="133350" r="98425" b="132080"/>
-            <wp:docPr id="1445829522" name="Immagine 9"/>
-            <wp:cNvGraphicFramePr>
-              <a:graphicFrameLocks xmlns:a="http://schemas.openxmlformats.org/drawingml/2006/main" noChangeAspect="1"/>
-            </wp:cNvGraphicFramePr>
-            <a:graphic xmlns:a="http://schemas.openxmlformats.org/drawingml/2006/main">
-              <a:graphicData uri="http://schemas.openxmlformats.org/drawingml/2006/picture">
-                <pic:pic xmlns:pic="http://schemas.openxmlformats.org/drawingml/2006/picture">
-                  <pic:nvPicPr>
-                    <pic:cNvPr id="0" name="Picture 18"/>
-                    <pic:cNvPicPr>
-                      <a:picLocks noChangeAspect="1" noChangeArrowheads="1"/>
-                    </pic:cNvPicPr>
-                  </pic:nvPicPr>
-                  <pic:blipFill>
-                    <a:blip r:embed="rId33">
-                      <a:extLst>
-                        <a:ext uri="{28A0092B-C50C-407E-A947-70E740481C1C}">
-                          <a14:useLocalDpi xmlns:a14="http://schemas.microsoft.com/office/drawing/2010/main" val="0"/>
-                        </a:ext>
-                      </a:extLst>
-                    </a:blip>
-                    <a:srcRect/>
-                    <a:stretch>
-                      <a:fillRect/>
-                    </a:stretch>
-                  </pic:blipFill>
-                  <pic:spPr bwMode="auto">
-                    <a:xfrm>
-                      <a:off x="0" y="0"/>
-                      <a:ext cx="4384139" cy="6295522"/>
-                    </a:xfrm>
-                    <a:prstGeom prst="rect">
-                      <a:avLst/>
-                    </a:prstGeom>
-                    <a:noFill/>
-                    <a:ln>
-                      <a:noFill/>
-                    </a:ln>
-                    <a:effectLst>
-                      <a:outerShdw blurRad="63500" sx="102000" sy="102000" algn="ctr" rotWithShape="0">
-                        <a:prstClr val="black">
-                          <a:alpha val="40000"/>
-                        </a:prstClr>
-                      </a:outerShdw>
-                    </a:effectLst>
-                  </pic:spPr>
-                </pic:pic>
-              </a:graphicData>
-            </a:graphic>
-          </wp:inline>
-        </w:drawing>
-      </w:r>
-    </w:p>
-    <w:p>
-      <w:pPr>
-        <w:pStyle w:val="Didascalia"/>
-        <w:jc w:val="center"/>
-        <w:rPr>
-          <w:i/>
-          <w:iCs/>
-          <w:lang w:val="it-IT"/>
-        </w:rPr>
-      </w:pPr>
-      <w:r>
-        <w:rPr>
-          <w:i/>
-          <w:iCs/>
-        </w:rPr>
-        <w:t xml:space="preserve">Figura </w:t>
-      </w:r>
-      <w:r>
-        <w:rPr>
-          <w:i/>
-          <w:iCs/>
-        </w:rPr>
-        <w:fldChar w:fldCharType="begin"/>
-      </w:r>
-      <w:r>
-        <w:rPr>
-          <w:i/>
-          <w:iCs/>
-        </w:rPr>
-        <w:instrText xml:space="preserve"> SEQ Figura \* ARABIC </w:instrText>
-      </w:r>
-      <w:r>
-        <w:rPr>
-          <w:i/>
-          <w:iCs/>
-        </w:rPr>
-        <w:fldChar w:fldCharType="separate"/>
-      </w:r>
-      <w:r>
-        <w:rPr>
-          <w:i/>
-          <w:iCs/>
-          <w:noProof/>
-        </w:rPr>
-        <w:t>26</w:t>
-      </w:r>
-      <w:r>
-        <w:rPr>
-          <w:i/>
-          <w:iCs/>
-        </w:rPr>
-        <w:fldChar w:fldCharType="end"/>
-      </w:r>
-      <w:r>
-        <w:rPr>
-          <w:i/>
-          <w:iCs/>
-        </w:rPr>
-        <w:t xml:space="preserve"> - </w:t>
-      </w:r>
-      <w:proofErr w:type="spellStart"/>
-      <w:r>
-        <w:rPr>
-          <w:i/>
-          <w:iCs/>
-        </w:rPr>
-        <w:t>Swimlane</w:t>
-      </w:r>
-      <w:proofErr w:type="spellEnd"/>
-      <w:r>
-        <w:rPr>
-          <w:i/>
-          <w:iCs/>
-        </w:rPr>
-        <w:t>, Gestione magazzino</w:t>
+        <w:t xml:space="preserve"> - Swimlane, Gestione </w:t>
+      </w:r>
+      <w:r>
+        <w:rPr>
+          <w:i/>
+          <w:iCs/>
+        </w:rPr>
+        <w:t xml:space="preserve">utenti e </w:t>
+      </w:r>
+      <w:r>
+        <w:rPr>
+          <w:i/>
+          <w:iCs/>
+        </w:rPr>
+        <w:t>magazzino</w:t>
       </w:r>
     </w:p>
     <w:p/>
@@ -14971,7 +14009,6 @@
                 <w:lang w:val="en-GB" w:eastAsia="en-US"/>
               </w:rPr>
             </w:pPr>
-            <w:proofErr w:type="spellStart"/>
             <w:r>
               <w:rPr>
                 <w:b/>
@@ -14981,7 +14018,6 @@
               </w:rPr>
               <w:t>Riferimento</w:t>
             </w:r>
-            <w:proofErr w:type="spellEnd"/>
             <w:r>
               <w:rPr>
                 <w:sz w:val="18"/>
@@ -15113,7 +14149,6 @@
                 <w:szCs w:val="18"/>
               </w:rPr>
             </w:pPr>
-            <w:proofErr w:type="spellStart"/>
             <w:r>
               <w:rPr>
                 <w:b/>
@@ -15122,7 +14157,6 @@
               </w:rPr>
               <w:t>Descrizione</w:t>
             </w:r>
-            <w:proofErr w:type="spellEnd"/>
             <w:r>
               <w:rPr>
                 <w:b/>
@@ -15177,7 +14211,6 @@
                 <w:szCs w:val="18"/>
               </w:rPr>
             </w:pPr>
-            <w:proofErr w:type="spellStart"/>
             <w:r>
               <w:rPr>
                 <w:b/>
@@ -15186,7 +14219,6 @@
               </w:rPr>
               <w:t>Prerequisiti</w:t>
             </w:r>
-            <w:proofErr w:type="spellEnd"/>
             <w:r>
               <w:rPr>
                 <w:b/>
@@ -15220,7 +14252,6 @@
               </w:rPr>
               <w:t xml:space="preserve">Store on local PC: Profile_1.2.001.xml (appendix </w:t>
             </w:r>
-            <w:proofErr w:type="spellStart"/>
             <w:r>
               <w:rPr>
                 <w:sz w:val="18"/>
@@ -15229,7 +14260,6 @@
               </w:rPr>
               <w:t>n_n</w:t>
             </w:r>
-            <w:proofErr w:type="spellEnd"/>
             <w:r>
               <w:rPr>
                 <w:sz w:val="18"/>
@@ -15237,7 +14267,6 @@
               </w:rPr>
               <w:t xml:space="preserve">) and Cards_1.2.001.txt (appendix </w:t>
             </w:r>
-            <w:proofErr w:type="spellStart"/>
             <w:r>
               <w:rPr>
                 <w:sz w:val="18"/>
@@ -15246,7 +14275,6 @@
               </w:rPr>
               <w:t>n_n</w:t>
             </w:r>
-            <w:proofErr w:type="spellEnd"/>
             <w:r>
               <w:rPr>
                 <w:sz w:val="18"/>
@@ -15291,7 +14319,6 @@
                 <w:szCs w:val="18"/>
               </w:rPr>
             </w:pPr>
-            <w:proofErr w:type="spellStart"/>
             <w:r>
               <w:rPr>
                 <w:b/>
@@ -15300,7 +14327,6 @@
               </w:rPr>
               <w:t>Procedura</w:t>
             </w:r>
-            <w:proofErr w:type="spellEnd"/>
             <w:r>
               <w:rPr>
                 <w:b/>
@@ -15467,23 +14493,7 @@
                 <w:szCs w:val="18"/>
               </w:rPr>
               <w:br/>
-              <w:t xml:space="preserve">Click the </w:t>
-            </w:r>
-            <w:proofErr w:type="spellStart"/>
-            <w:r>
-              <w:rPr>
-                <w:sz w:val="18"/>
-                <w:szCs w:val="18"/>
-              </w:rPr>
-              <w:t>imsi</w:t>
-            </w:r>
-            <w:proofErr w:type="spellEnd"/>
-            <w:r>
-              <w:rPr>
-                <w:sz w:val="18"/>
-                <w:szCs w:val="18"/>
-              </w:rPr>
-              <w:t xml:space="preserve"> card link</w:t>
+              <w:t>Click the imsi card link</w:t>
             </w:r>
             <w:r>
               <w:rPr>
@@ -15531,287 +14541,7 @@
                 <w:szCs w:val="16"/>
                 <w:lang w:eastAsia="ja-JP"/>
               </w:rPr>
-              <w:t xml:space="preserve">SELECT </w:t>
-            </w:r>
-            <w:proofErr w:type="spellStart"/>
-            <w:r>
-              <w:rPr>
-                <w:rFonts w:ascii="Courier New" w:eastAsia="MS Mincho" w:hAnsi="Courier New" w:cs="Courier New"/>
-                <w:sz w:val="16"/>
-                <w:szCs w:val="16"/>
-                <w:lang w:eastAsia="ja-JP"/>
-              </w:rPr>
-              <w:t>imsi</w:t>
-            </w:r>
-            <w:proofErr w:type="spellEnd"/>
-            <w:r>
-              <w:rPr>
-                <w:rFonts w:ascii="Courier New" w:eastAsia="MS Mincho" w:hAnsi="Courier New" w:cs="Courier New"/>
-                <w:sz w:val="16"/>
-                <w:szCs w:val="16"/>
-                <w:lang w:eastAsia="ja-JP"/>
-              </w:rPr>
-              <w:t xml:space="preserve">, </w:t>
-            </w:r>
-            <w:proofErr w:type="spellStart"/>
-            <w:r>
-              <w:rPr>
-                <w:rFonts w:ascii="Courier New" w:eastAsia="MS Mincho" w:hAnsi="Courier New" w:cs="Courier New"/>
-                <w:sz w:val="16"/>
-                <w:szCs w:val="16"/>
-                <w:lang w:eastAsia="ja-JP"/>
-              </w:rPr>
-              <w:t>dir</w:t>
-            </w:r>
-            <w:proofErr w:type="spellEnd"/>
-            <w:r>
-              <w:rPr>
-                <w:rFonts w:ascii="Courier New" w:eastAsia="MS Mincho" w:hAnsi="Courier New" w:cs="Courier New"/>
-                <w:sz w:val="16"/>
-                <w:szCs w:val="16"/>
-                <w:lang w:eastAsia="ja-JP"/>
-              </w:rPr>
-              <w:t xml:space="preserve">, keyset, </w:t>
-            </w:r>
-            <w:proofErr w:type="spellStart"/>
-            <w:r>
-              <w:rPr>
-                <w:rFonts w:ascii="Courier New" w:eastAsia="MS Mincho" w:hAnsi="Courier New" w:cs="Courier New"/>
-                <w:sz w:val="16"/>
-                <w:szCs w:val="16"/>
-                <w:lang w:eastAsia="ja-JP"/>
-              </w:rPr>
-              <w:t>cntr</w:t>
-            </w:r>
-            <w:proofErr w:type="spellEnd"/>
-            <w:r>
-              <w:rPr>
-                <w:rFonts w:ascii="Courier New" w:eastAsia="MS Mincho" w:hAnsi="Courier New" w:cs="Courier New"/>
-                <w:sz w:val="16"/>
-                <w:szCs w:val="16"/>
-                <w:lang w:eastAsia="ja-JP"/>
-              </w:rPr>
-              <w:t xml:space="preserve">, </w:t>
-            </w:r>
-            <w:proofErr w:type="spellStart"/>
-            <w:r>
-              <w:rPr>
-                <w:rFonts w:ascii="Courier New" w:eastAsia="MS Mincho" w:hAnsi="Courier New" w:cs="Courier New"/>
-                <w:sz w:val="16"/>
-                <w:szCs w:val="16"/>
-                <w:lang w:eastAsia="ja-JP"/>
-              </w:rPr>
-              <w:t>rawtohex</w:t>
-            </w:r>
-            <w:proofErr w:type="spellEnd"/>
-            <w:r>
-              <w:rPr>
-                <w:rFonts w:ascii="Courier New" w:eastAsia="MS Mincho" w:hAnsi="Courier New" w:cs="Courier New"/>
-                <w:sz w:val="16"/>
-                <w:szCs w:val="16"/>
-                <w:lang w:eastAsia="ja-JP"/>
-              </w:rPr>
-              <w:t>(</w:t>
-            </w:r>
-            <w:proofErr w:type="spellStart"/>
-            <w:r>
-              <w:rPr>
-                <w:rFonts w:ascii="Courier New" w:eastAsia="MS Mincho" w:hAnsi="Courier New" w:cs="Courier New"/>
-                <w:sz w:val="16"/>
-                <w:szCs w:val="16"/>
-                <w:lang w:eastAsia="ja-JP"/>
-              </w:rPr>
-              <w:t>kickey</w:t>
-            </w:r>
-            <w:proofErr w:type="spellEnd"/>
-            <w:r>
-              <w:rPr>
-                <w:rFonts w:ascii="Courier New" w:eastAsia="MS Mincho" w:hAnsi="Courier New" w:cs="Courier New"/>
-                <w:sz w:val="16"/>
-                <w:szCs w:val="16"/>
-                <w:lang w:eastAsia="ja-JP"/>
-              </w:rPr>
-              <w:t xml:space="preserve">), </w:t>
-            </w:r>
-            <w:proofErr w:type="spellStart"/>
-            <w:r>
-              <w:rPr>
-                <w:rFonts w:ascii="Courier New" w:eastAsia="MS Mincho" w:hAnsi="Courier New" w:cs="Courier New"/>
-                <w:sz w:val="16"/>
-                <w:szCs w:val="16"/>
-                <w:lang w:eastAsia="ja-JP"/>
-              </w:rPr>
-              <w:t>rawtohex</w:t>
-            </w:r>
-            <w:proofErr w:type="spellEnd"/>
-            <w:r>
-              <w:rPr>
-                <w:rFonts w:ascii="Courier New" w:eastAsia="MS Mincho" w:hAnsi="Courier New" w:cs="Courier New"/>
-                <w:sz w:val="16"/>
-                <w:szCs w:val="16"/>
-                <w:lang w:eastAsia="ja-JP"/>
-              </w:rPr>
-              <w:t>(</w:t>
-            </w:r>
-            <w:proofErr w:type="spellStart"/>
-            <w:r>
-              <w:rPr>
-                <w:rFonts w:ascii="Courier New" w:eastAsia="MS Mincho" w:hAnsi="Courier New" w:cs="Courier New"/>
-                <w:sz w:val="16"/>
-                <w:szCs w:val="16"/>
-                <w:lang w:eastAsia="ja-JP"/>
-              </w:rPr>
-              <w:t>kidkey</w:t>
-            </w:r>
-            <w:proofErr w:type="spellEnd"/>
-            <w:r>
-              <w:rPr>
-                <w:rFonts w:ascii="Courier New" w:eastAsia="MS Mincho" w:hAnsi="Courier New" w:cs="Courier New"/>
-                <w:sz w:val="16"/>
-                <w:szCs w:val="16"/>
-                <w:lang w:eastAsia="ja-JP"/>
-              </w:rPr>
-              <w:t xml:space="preserve">), </w:t>
-            </w:r>
-            <w:proofErr w:type="spellStart"/>
-            <w:r>
-              <w:rPr>
-                <w:rFonts w:ascii="Courier New" w:eastAsia="MS Mincho" w:hAnsi="Courier New" w:cs="Courier New"/>
-                <w:sz w:val="16"/>
-                <w:szCs w:val="16"/>
-                <w:lang w:eastAsia="ja-JP"/>
-              </w:rPr>
-              <w:t>rawtohex</w:t>
-            </w:r>
-            <w:proofErr w:type="spellEnd"/>
-            <w:r>
-              <w:rPr>
-                <w:rFonts w:ascii="Courier New" w:eastAsia="MS Mincho" w:hAnsi="Courier New" w:cs="Courier New"/>
-                <w:sz w:val="16"/>
-                <w:szCs w:val="16"/>
-                <w:lang w:eastAsia="ja-JP"/>
-              </w:rPr>
-              <w:t>(</w:t>
-            </w:r>
-            <w:proofErr w:type="spellStart"/>
-            <w:r>
-              <w:rPr>
-                <w:rFonts w:ascii="Courier New" w:eastAsia="MS Mincho" w:hAnsi="Courier New" w:cs="Courier New"/>
-                <w:sz w:val="16"/>
-                <w:szCs w:val="16"/>
-                <w:lang w:eastAsia="ja-JP"/>
-              </w:rPr>
-              <w:t>kikkey</w:t>
-            </w:r>
-            <w:proofErr w:type="spellEnd"/>
-            <w:r>
-              <w:rPr>
-                <w:rFonts w:ascii="Courier New" w:eastAsia="MS Mincho" w:hAnsi="Courier New" w:cs="Courier New"/>
-                <w:sz w:val="16"/>
-                <w:szCs w:val="16"/>
-                <w:lang w:eastAsia="ja-JP"/>
-              </w:rPr>
-              <w:t xml:space="preserve">), </w:t>
-            </w:r>
-            <w:proofErr w:type="spellStart"/>
-            <w:r>
-              <w:rPr>
-                <w:rFonts w:ascii="Courier New" w:eastAsia="MS Mincho" w:hAnsi="Courier New" w:cs="Courier New"/>
-                <w:sz w:val="16"/>
-                <w:szCs w:val="16"/>
-                <w:lang w:eastAsia="ja-JP"/>
-              </w:rPr>
-              <w:t>rawtohex</w:t>
-            </w:r>
-            <w:proofErr w:type="spellEnd"/>
-            <w:r>
-              <w:rPr>
-                <w:rFonts w:ascii="Courier New" w:eastAsia="MS Mincho" w:hAnsi="Courier New" w:cs="Courier New"/>
-                <w:sz w:val="16"/>
-                <w:szCs w:val="16"/>
-                <w:lang w:eastAsia="ja-JP"/>
-              </w:rPr>
-              <w:t>(</w:t>
-            </w:r>
-            <w:proofErr w:type="spellStart"/>
-            <w:r>
-              <w:rPr>
-                <w:rFonts w:ascii="Courier New" w:eastAsia="MS Mincho" w:hAnsi="Courier New" w:cs="Courier New"/>
-                <w:sz w:val="16"/>
-                <w:szCs w:val="16"/>
-                <w:lang w:eastAsia="ja-JP"/>
-              </w:rPr>
-              <w:t>chv</w:t>
-            </w:r>
-            <w:proofErr w:type="spellEnd"/>
-            <w:r>
-              <w:rPr>
-                <w:rFonts w:ascii="Courier New" w:eastAsia="MS Mincho" w:hAnsi="Courier New" w:cs="Courier New"/>
-                <w:sz w:val="16"/>
-                <w:szCs w:val="16"/>
-                <w:lang w:eastAsia="ja-JP"/>
-              </w:rPr>
-              <w:t xml:space="preserve">), </w:t>
-            </w:r>
-            <w:proofErr w:type="spellStart"/>
-            <w:r>
-              <w:rPr>
-                <w:rFonts w:ascii="Courier New" w:eastAsia="MS Mincho" w:hAnsi="Courier New" w:cs="Courier New"/>
-                <w:sz w:val="16"/>
-                <w:szCs w:val="16"/>
-                <w:lang w:eastAsia="ja-JP"/>
-              </w:rPr>
-              <w:t>rawtohex</w:t>
-            </w:r>
-            <w:proofErr w:type="spellEnd"/>
-            <w:r>
-              <w:rPr>
-                <w:rFonts w:ascii="Courier New" w:eastAsia="MS Mincho" w:hAnsi="Courier New" w:cs="Courier New"/>
-                <w:sz w:val="16"/>
-                <w:szCs w:val="16"/>
-                <w:lang w:eastAsia="ja-JP"/>
-              </w:rPr>
-              <w:t xml:space="preserve">(dap)FROM </w:t>
-            </w:r>
-            <w:proofErr w:type="spellStart"/>
-            <w:r>
-              <w:rPr>
-                <w:rFonts w:ascii="Courier New" w:eastAsia="MS Mincho" w:hAnsi="Courier New" w:cs="Courier New"/>
-                <w:sz w:val="16"/>
-                <w:szCs w:val="16"/>
-                <w:lang w:eastAsia="ja-JP"/>
-              </w:rPr>
-              <w:t>otacardkey</w:t>
-            </w:r>
-            <w:proofErr w:type="spellEnd"/>
-            <w:r>
-              <w:rPr>
-                <w:rFonts w:ascii="Courier New" w:eastAsia="MS Mincho" w:hAnsi="Courier New" w:cs="Courier New"/>
-                <w:sz w:val="16"/>
-                <w:szCs w:val="16"/>
-                <w:lang w:eastAsia="ja-JP"/>
-              </w:rPr>
-              <w:t xml:space="preserve"> a where </w:t>
-            </w:r>
-            <w:proofErr w:type="spellStart"/>
-            <w:r>
-              <w:rPr>
-                <w:rFonts w:ascii="Courier New" w:eastAsia="MS Mincho" w:hAnsi="Courier New" w:cs="Courier New"/>
-                <w:sz w:val="16"/>
-                <w:szCs w:val="16"/>
-                <w:lang w:eastAsia="ja-JP"/>
-              </w:rPr>
-              <w:t>imsi</w:t>
-            </w:r>
-            <w:proofErr w:type="spellEnd"/>
-            <w:r>
-              <w:rPr>
-                <w:rFonts w:ascii="Courier New" w:eastAsia="MS Mincho" w:hAnsi="Courier New" w:cs="Courier New"/>
-                <w:sz w:val="16"/>
-                <w:szCs w:val="16"/>
-                <w:lang w:eastAsia="ja-JP"/>
-              </w:rPr>
-              <w:t>='340041795924770' ORDER BY keyset;</w:t>
+              <w:t>SELECT imsi, dir, keyset, cntr, rawtohex(kickey), rawtohex(kidkey), rawtohex(kikkey), rawtohex(chv), rawtohex(dap)FROM otacardkey a where imsi='340041795924770' ORDER BY keyset;</w:t>
             </w:r>
           </w:p>
         </w:tc>
@@ -15834,34 +14564,14 @@
                 <w:szCs w:val="18"/>
               </w:rPr>
             </w:pPr>
-            <w:proofErr w:type="spellStart"/>
             <w:r>
               <w:rPr>
                 <w:b/>
                 <w:sz w:val="18"/>
                 <w:szCs w:val="18"/>
               </w:rPr>
-              <w:t>Risultati</w:t>
-            </w:r>
-            <w:proofErr w:type="spellEnd"/>
-            <w:r>
-              <w:rPr>
-                <w:b/>
-                <w:sz w:val="18"/>
-                <w:szCs w:val="18"/>
-              </w:rPr>
-              <w:t xml:space="preserve"> </w:t>
-            </w:r>
-            <w:proofErr w:type="spellStart"/>
-            <w:r>
-              <w:rPr>
-                <w:b/>
-                <w:sz w:val="18"/>
-                <w:szCs w:val="18"/>
-              </w:rPr>
-              <w:t>attesi</w:t>
-            </w:r>
-            <w:proofErr w:type="spellEnd"/>
+              <w:t>Risultati attesi</w:t>
+            </w:r>
             <w:r>
               <w:rPr>
                 <w:b/>
@@ -15893,23 +14603,7 @@
                 <w:sz w:val="18"/>
                 <w:szCs w:val="18"/>
               </w:rPr>
-              <w:t>Keys visible in the DB (</w:t>
-            </w:r>
-            <w:proofErr w:type="spellStart"/>
-            <w:r>
-              <w:rPr>
-                <w:sz w:val="18"/>
-                <w:szCs w:val="18"/>
-              </w:rPr>
-              <w:t>OtaCardKey</w:t>
-            </w:r>
-            <w:proofErr w:type="spellEnd"/>
-            <w:r>
-              <w:rPr>
-                <w:sz w:val="18"/>
-                <w:szCs w:val="18"/>
-              </w:rPr>
-              <w:t>) but not visible in the GUI (Card details)</w:t>
+              <w:t>Keys visible in the DB (OtaCardKey) but not visible in the GUI (Card details)</w:t>
             </w:r>
           </w:p>
         </w:tc>
@@ -16044,21 +14738,7 @@
         <w:rPr>
           <w:lang w:val="it-IT"/>
         </w:rPr>
-        <w:t xml:space="preserve">La prima fase del progetto è andata prevalentemente tutta come avevo pianificato, ho impiegato meno tempo del previsto per gli schemi Use Case e quello di architettura mentre gli </w:t>
-      </w:r>
-      <w:proofErr w:type="spellStart"/>
-      <w:r>
-        <w:rPr>
-          <w:lang w:val="it-IT"/>
-        </w:rPr>
-        <w:t>swimlanes</w:t>
-      </w:r>
-      <w:proofErr w:type="spellEnd"/>
-      <w:r>
-        <w:rPr>
-          <w:lang w:val="it-IT"/>
-        </w:rPr>
-        <w:t xml:space="preserve"> e i diagrammi ER mi hanno richiesto un po’ più tempo rispetto a quello che avevo pianificato a discapito delle ore dedicat</w:t>
+        <w:t>La prima fase del progetto è andata prevalentemente tutta come avevo pianificato, ho impiegato meno tempo del previsto per gli schemi Use Case e quello di architettura mentre gli swimlanes e i diagrammi ER mi hanno richiesto un po’ più tempo rispetto a quello che avevo pianificato a discapito delle ore dedicat</w:t>
       </w:r>
       <w:r>
         <w:rPr>
@@ -16098,6 +14778,7 @@
       </w:pPr>
       <w:r>
         <w:rPr>
+          <w:noProof/>
           <w:lang w:val="it-IT"/>
         </w:rPr>
         <w:drawing>
@@ -16116,7 +14797,7 @@
                     <pic:cNvPicPr/>
                   </pic:nvPicPr>
                   <pic:blipFill>
-                    <a:blip r:embed="rId34"/>
+                    <a:blip r:embed="rId32"/>
                     <a:stretch>
                       <a:fillRect/>
                     </a:stretch>
@@ -16202,23 +14883,7 @@
           <w:i/>
           <w:iCs/>
         </w:rPr>
-        <w:t xml:space="preserve"> - </w:t>
-      </w:r>
-      <w:proofErr w:type="spellStart"/>
-      <w:r>
-        <w:rPr>
-          <w:i/>
-          <w:iCs/>
-        </w:rPr>
-        <w:t>Gantt</w:t>
-      </w:r>
-      <w:proofErr w:type="spellEnd"/>
-      <w:r>
-        <w:rPr>
-          <w:i/>
-          <w:iCs/>
-        </w:rPr>
-        <w:t xml:space="preserve"> consuntivo, Fase preliminare</w:t>
+        <w:t xml:space="preserve"> - Gantt consuntivo, Fase preliminare</w:t>
       </w:r>
     </w:p>
     <w:p>
@@ -16537,7 +15202,6 @@
             <w:pPr>
               <w:jc w:val="both"/>
             </w:pPr>
-            <w:proofErr w:type="spellStart"/>
             <w:r>
               <w:rPr>
                 <w:b/>
@@ -16545,7 +15209,6 @@
               </w:rPr>
               <w:t>Asynchronous</w:t>
             </w:r>
-            <w:proofErr w:type="spellEnd"/>
             <w:r>
               <w:rPr>
                 <w:b/>
@@ -16591,31 +15254,13 @@
                 <w:bCs/>
               </w:rPr>
             </w:pPr>
-            <w:proofErr w:type="spellStart"/>
             <w:r>
               <w:rPr>
                 <w:b/>
                 <w:bCs/>
               </w:rPr>
-              <w:t>Cascading</w:t>
-            </w:r>
-            <w:proofErr w:type="spellEnd"/>
-            <w:r>
-              <w:rPr>
-                <w:b/>
-                <w:bCs/>
-              </w:rPr>
-              <w:t xml:space="preserve"> Style </w:t>
-            </w:r>
-            <w:proofErr w:type="spellStart"/>
-            <w:r>
-              <w:rPr>
-                <w:b/>
-                <w:bCs/>
-              </w:rPr>
-              <w:t>Sheets</w:t>
-            </w:r>
-            <w:proofErr w:type="spellEnd"/>
+              <w:t>Cascading Style Sheets</w:t>
+            </w:r>
             <w:r>
               <w:t>: linguaggio che per</w:t>
             </w:r>
@@ -16843,19 +15488,11 @@
           <w:lang w:val="it-IT"/>
         </w:rPr>
       </w:pPr>
-      <w:proofErr w:type="spellStart"/>
-      <w:r>
-        <w:rPr>
-          <w:lang w:val="it-IT"/>
-        </w:rPr>
-        <w:t>ev</w:t>
-      </w:r>
-      <w:proofErr w:type="spellEnd"/>
-      <w:r>
-        <w:rPr>
-          <w:lang w:val="it-IT"/>
-        </w:rPr>
-        <w:t>. Numero di edizione,</w:t>
+      <w:r>
+        <w:rPr>
+          <w:lang w:val="it-IT"/>
+        </w:rPr>
+        <w:t>ev. Numero di edizione,</w:t>
       </w:r>
     </w:p>
     <w:p>
@@ -16957,21 +15594,7 @@
         <w:rPr>
           <w:lang w:val="it-IT"/>
         </w:rPr>
-        <w:t xml:space="preserve"> (se troppo lungo solo dominio, </w:t>
-      </w:r>
-      <w:proofErr w:type="spellStart"/>
-      <w:r>
-        <w:rPr>
-          <w:lang w:val="it-IT"/>
-        </w:rPr>
-        <w:t>evt</w:t>
-      </w:r>
-      <w:proofErr w:type="spellEnd"/>
-      <w:r>
-        <w:rPr>
-          <w:lang w:val="it-IT"/>
-        </w:rPr>
-        <w:t xml:space="preserve"> completo nel diario)</w:t>
+        <w:t xml:space="preserve"> (se troppo lungo solo dominio, evt completo nel diario)</w:t>
       </w:r>
       <w:r>
         <w:rPr>
@@ -17236,14 +15859,7 @@
         <w:rPr>
           <w:lang w:val="it-IT"/>
         </w:rPr>
-        <w:t xml:space="preserve">Mandato e/o </w:t>
-      </w:r>
-      <w:proofErr w:type="spellStart"/>
-      <w:r>
-        <w:rPr>
-          <w:lang w:val="it-IT"/>
-        </w:rPr>
-        <w:t>Qd</w:t>
+        <w:t>Mandato e/o Qd</w:t>
       </w:r>
       <w:r>
         <w:rPr>
@@ -17251,7 +15867,6 @@
         </w:rPr>
         <w:t>C</w:t>
       </w:r>
-      <w:proofErr w:type="spellEnd"/>
     </w:p>
     <w:p>
       <w:pPr>
@@ -17285,10 +15900,10 @@
       </w:pPr>
     </w:p>
     <w:sectPr>
-      <w:headerReference w:type="default" r:id="rId35"/>
-      <w:footerReference w:type="default" r:id="rId36"/>
-      <w:headerReference w:type="first" r:id="rId37"/>
-      <w:footerReference w:type="first" r:id="rId38"/>
+      <w:headerReference w:type="default" r:id="rId33"/>
+      <w:footerReference w:type="default" r:id="rId34"/>
+      <w:headerReference w:type="first" r:id="rId35"/>
+      <w:footerReference w:type="first" r:id="rId36"/>
       <w:pgSz w:w="11906" w:h="16838"/>
       <w:pgMar w:top="1985" w:right="1134" w:bottom="1418" w:left="1134" w:header="567" w:footer="567" w:gutter="0"/>
       <w:pgNumType w:start="1"/>

</xml_diff>

<commit_message>
doc: Machine Learning, Computer Vision and CNN chapthers
</commit_message>
<xml_diff>
--- a/3_Documentazione/Documentazione_X2SevenVault_Christian_Arzani.docx
+++ b/3_Documentazione/Documentazione_X2SevenVault_Christian_Arzani.docx
@@ -4684,19 +4684,8 @@
       <w:r>
         <w:t xml:space="preserve">un </w:t>
       </w:r>
-      <w:proofErr w:type="spellStart"/>
-      <w:r>
-        <w:t>bounding</w:t>
-      </w:r>
-      <w:proofErr w:type="spellEnd"/>
-      <w:r>
-        <w:t xml:space="preserve"> box colorato sull'oggetto</w:t>
-      </w:r>
-      <w:r>
-        <w:t xml:space="preserve"> e del </w:t>
-      </w:r>
-      <w:r>
-        <w:t>testo overlay</w:t>
+      <w:r>
+        <w:t>una pagina dedicata alle informazioni tratte dal riconoscimento dell’oggetto</w:t>
       </w:r>
       <w:r>
         <w:t>. S</w:t>
@@ -6413,6 +6402,9 @@
       </w:tr>
     </w:tbl>
     <w:p>
+      <w:pPr>
+        <w:jc w:val="both"/>
+      </w:pPr>
       <w:r>
         <w:br w:type="page"/>
       </w:r>
@@ -11693,7 +11685,7 @@
           <w:lang w:val="it-IT"/>
         </w:rPr>
         <w:drawing>
-          <wp:inline distT="0" distB="0" distL="0" distR="0" wp14:anchorId="5BAC6B3A" wp14:editId="44E47286">
+          <wp:inline distT="0" distB="0" distL="0" distR="0" wp14:anchorId="5BAC6B3A" wp14:editId="7CF4D7D5">
             <wp:extent cx="5866411" cy="3282781"/>
             <wp:effectExtent l="114300" t="114300" r="115570" b="108585"/>
             <wp:docPr id="15" name="Immagine 15"/>
@@ -12038,7 +12030,7 @@
           <w:noProof/>
         </w:rPr>
         <w:drawing>
-          <wp:inline distT="0" distB="0" distL="0" distR="0" wp14:anchorId="1DFD0CCD" wp14:editId="79337832">
+          <wp:inline distT="0" distB="0" distL="0" distR="0" wp14:anchorId="1DFD0CCD" wp14:editId="5D89725A">
             <wp:extent cx="5789221" cy="3228777"/>
             <wp:effectExtent l="114300" t="114300" r="116840" b="105410"/>
             <wp:docPr id="20" name="Immagine 20"/>
@@ -12258,7 +12250,7 @@
           <w:lang w:val="it-IT"/>
         </w:rPr>
         <w:drawing>
-          <wp:inline distT="0" distB="0" distL="0" distR="0" wp14:anchorId="0C0E325F" wp14:editId="2FA6C6A2">
+          <wp:inline distT="0" distB="0" distL="0" distR="0" wp14:anchorId="0C0E325F" wp14:editId="65D95471">
             <wp:extent cx="5967351" cy="3321935"/>
             <wp:effectExtent l="114300" t="114300" r="109855" b="107315"/>
             <wp:docPr id="23" name="Immagine 23"/>
@@ -12433,7 +12425,7 @@
           <w:lang w:val="it-IT"/>
         </w:rPr>
         <w:drawing>
-          <wp:inline distT="0" distB="0" distL="0" distR="0" wp14:anchorId="50A09DF4" wp14:editId="25CA27FD">
+          <wp:inline distT="0" distB="0" distL="0" distR="0" wp14:anchorId="50A09DF4" wp14:editId="71A86FE3">
             <wp:extent cx="5872348" cy="3281606"/>
             <wp:effectExtent l="114300" t="114300" r="109855" b="109855"/>
             <wp:docPr id="25" name="Immagine 25"/>
@@ -12608,7 +12600,7 @@
           <w:lang w:val="it-IT"/>
         </w:rPr>
         <w:drawing>
-          <wp:inline distT="0" distB="0" distL="0" distR="0" wp14:anchorId="52636AA0" wp14:editId="4B702409">
+          <wp:inline distT="0" distB="0" distL="0" distR="0" wp14:anchorId="52636AA0" wp14:editId="5CACF10D">
             <wp:extent cx="5866334" cy="3277169"/>
             <wp:effectExtent l="114300" t="114300" r="115570" b="114300"/>
             <wp:docPr id="21" name="Immagine 21"/>
@@ -14353,7 +14345,7 @@
           <w:iCs/>
           <w:noProof/>
         </w:rPr>
-        <w:t>26</w:t>
+        <w:t>24</w:t>
       </w:r>
       <w:r>
         <w:rPr>
@@ -14425,57 +14417,718 @@
       <w:bookmarkEnd w:id="52"/>
     </w:p>
     <w:p>
-      <w:r>
-        <w:t>In questo capitolo dovrà essere mostrato come è stato realizzato il lavoro. Questa parte può differenziarsi dalla progettazione in quanto il risultato ottenuto non per forza può essere come era stato progettato.</w:t>
-      </w:r>
-    </w:p>
-    <w:p>
-      <w:r>
-        <w:t xml:space="preserve">Sulla base di queste informazioni il lavoro svolto dovrà essere riproducibile. </w:t>
-      </w:r>
-    </w:p>
-    <w:p>
-      <w:r>
-        <w:t>In questa parte è richiesto l’inserimento di codice sorgente</w:t>
-      </w:r>
-      <w:r>
+      <w:pPr>
+        <w:pStyle w:val="Titolo2"/>
+      </w:pPr>
+      <w:r>
+        <w:t xml:space="preserve">Sistema di Object </w:t>
+      </w:r>
+      <w:proofErr w:type="spellStart"/>
+      <w:r>
+        <w:t>Detection</w:t>
+      </w:r>
+      <w:proofErr w:type="spellEnd"/>
+    </w:p>
+    <w:p>
+      <w:r>
+        <w:t xml:space="preserve">Questo capitolo illustra </w:t>
+      </w:r>
+      <w:r>
+        <w:t xml:space="preserve">l’implementazione del sistema di Object </w:t>
+      </w:r>
+      <w:proofErr w:type="spellStart"/>
+      <w:r>
+        <w:t>Detection</w:t>
+      </w:r>
+      <w:proofErr w:type="spellEnd"/>
+      <w:r>
+        <w:t xml:space="preserve"> sviluppato per il riconoscimento automatico degli oggetti del magazzino</w:t>
+      </w:r>
+      <w:r>
+        <w:t xml:space="preserve"> e il suo funzionamento tecnico</w:t>
+      </w:r>
+      <w:r>
+        <w:t xml:space="preserve">. Verranno illustrate le scelte tecniche, </w:t>
+      </w:r>
+      <w:r>
+        <w:t xml:space="preserve">la raccolta dei dati, </w:t>
+      </w:r>
+      <w:r>
+        <w:t>il processo di training del modello</w:t>
+      </w:r>
+      <w:r>
+        <w:t xml:space="preserve"> e le metriche di valutazione del modello.</w:t>
+      </w:r>
+    </w:p>
+    <w:p>
+      <w:pPr>
+        <w:pStyle w:val="Titolo3"/>
+        <w:rPr>
+          <w:lang w:val="it-CH"/>
+        </w:rPr>
+      </w:pPr>
+      <w:r>
+        <w:rPr>
+          <w:bCs/>
+          <w:lang w:val="it-CH"/>
+        </w:rPr>
+        <w:t>Fondamenti di Machine Learning e Computer Vision</w:t>
+      </w:r>
+      <w:r>
+        <w:rPr>
+          <w:lang w:val="it-CH"/>
+        </w:rPr>
+        <w:t>.</w:t>
+      </w:r>
+    </w:p>
+    <w:p>
+      <w:r>
+        <w:t xml:space="preserve">Prima di partire con la spiegazione </w:t>
+      </w:r>
+      <w:r>
+        <w:t xml:space="preserve">tecnica vorrei dedicare </w:t>
+      </w:r>
+      <w:r>
+        <w:t>questo capitolo</w:t>
+      </w:r>
+      <w:r>
+        <w:t xml:space="preserve"> alla spiegazione dei concetti fondamentali del machine learning e del computer vision, questo per facilitare la lettura dei capitoli seguenti che esprimono concetti più dettagliati.</w:t>
+      </w:r>
+    </w:p>
+    <w:p>
+      <w:pPr>
+        <w:pStyle w:val="Titolo4"/>
+        <w:numPr>
+          <w:ilvl w:val="0"/>
+          <w:numId w:val="0"/>
+        </w:numPr>
+      </w:pPr>
+      <w:r>
+        <w:t>Cos’è il Machine Learning?</w:t>
+      </w:r>
+    </w:p>
+    <w:p>
+      <w:r>
+        <w:t xml:space="preserve">Il Machine Learning </w:t>
+      </w:r>
+      <w:r>
+        <w:t>è un ramo dell’intelligenza artificiale che studia algoritmi capaci di apprendere dei dati e migliorare le proprie prestazioni nel tempo, senza essere programmati esplicitamente con regole rigide. Nel Machine Learning si forniscono al sistema molti dati e l’algoritmo individua autonomamente schemi e relazioni, costruendo un modello automatico in grado di fare previsioni su nuovi dati</w:t>
+      </w:r>
+      <w:r>
+        <w:t>, ben diverso rispetto alla programmazione tradizionale dove si scrivono regole esplicite</w:t>
+      </w:r>
+      <w:r>
+        <w:t>.</w:t>
+      </w:r>
+    </w:p>
+    <w:p>
+      <w:pPr>
+        <w:spacing w:before="240"/>
+      </w:pPr>
+      <w:r>
+        <w:t xml:space="preserve">Il processo di apprendimento è suddiviso in </w:t>
+      </w:r>
+      <w:r>
+        <w:t>tre</w:t>
+      </w:r>
+      <w:r>
+        <w:t xml:space="preserve"> categorie che dipendono molto dai casi di utilizzo.</w:t>
+      </w:r>
+    </w:p>
+    <w:p>
+      <w:pPr>
+        <w:spacing w:before="240"/>
+      </w:pPr>
+      <w:r>
+        <w:t>Apprendimento non supervisionato</w:t>
+      </w:r>
+      <w:r>
+        <w:t>: Il sistema riceve solo dati di input e deve individuare autonomamente strutture o pattern nascosti. Questo tipo di apprendimento viene usato molto per il rilevamento di anomalie e sistemi di suggerimenti.</w:t>
+      </w:r>
+    </w:p>
+    <w:p>
+      <w:pPr>
+        <w:spacing w:before="240"/>
+      </w:pPr>
+      <w:r>
+        <w:t xml:space="preserve">Apprendimento con rinforzo: </w:t>
+      </w:r>
+      <w:r>
+        <w:t>L’algoritmo impara tramite tentativi ed errori, ricevendo ricompense o penalità.</w:t>
+      </w:r>
+      <w:r>
+        <w:t xml:space="preserve"> Questo tipo di apprendimento viene usato molto per i veicoli autonomi e nella previsione di prezzi azionari.</w:t>
+      </w:r>
+    </w:p>
+    <w:p>
+      <w:pPr>
+        <w:spacing w:before="240"/>
+      </w:pPr>
+      <w:r>
+        <w:t>Apprendimento supervisionato</w:t>
+      </w:r>
+      <w:r>
+        <w:t xml:space="preserve"> (utilizzato in questo progetto)</w:t>
+      </w:r>
+      <w:r>
+        <w:t>: Utilizza dataset etichettati fornendo al modello un contesto per prevedere output specifici.</w:t>
+      </w:r>
+      <w:r>
+        <w:t xml:space="preserve"> Questo tipo di apprendimento viene usato molto per il</w:t>
+      </w:r>
+      <w:r>
+        <w:t xml:space="preserve"> </w:t>
+      </w:r>
+      <w:r>
+        <w:t>riconoscimento di immagini</w:t>
+      </w:r>
+      <w:r>
+        <w:t>.</w:t>
+      </w:r>
+    </w:p>
+    <w:p>
+      <w:r>
+        <w:br w:type="page"/>
+      </w:r>
+    </w:p>
+    <w:p>
+      <w:pPr>
+        <w:pStyle w:val="Titolo4"/>
+        <w:numPr>
+          <w:ilvl w:val="0"/>
+          <w:numId w:val="0"/>
+        </w:numPr>
+      </w:pPr>
+      <w:r>
+        <w:lastRenderedPageBreak/>
+        <w:t>Cos’è la Computer Vision?</w:t>
+      </w:r>
+    </w:p>
+    <w:p>
+      <w:r>
+        <w:t xml:space="preserve">La Computer Vision è un ramo dell’intelligenza artificiale </w:t>
+      </w:r>
+      <w:r>
+        <w:t>che si occupa di analizzare, interpretare e comprendere immagini o video, simulando in parte il funzionamento della visione umana.</w:t>
+      </w:r>
+      <w:r>
+        <w:t xml:space="preserve"> U</w:t>
+      </w:r>
+      <w:r>
+        <w:t>n’immagine digitale è composta da una matrice di pixel, dove ogni pixel è rappresentato da valori numerici (ad esempio RGB)</w:t>
+      </w:r>
+      <w:r>
+        <w:t xml:space="preserve"> e tramite il </w:t>
+      </w:r>
+      <w:r>
+        <w:t xml:space="preserve">Machine Learning </w:t>
+      </w:r>
+      <w:r>
+        <w:t>si riesce ad estrarre</w:t>
+      </w:r>
+      <w:r>
+        <w:t xml:space="preserve"> da questi numeri caratteristiche, come forme, colori, bordi e pattern.</w:t>
+      </w:r>
+      <w:r>
+        <w:t xml:space="preserve"> </w:t>
+      </w:r>
+      <w:r>
+        <w:t>Il processo di Computer Vision ha due applicazioni principali</w:t>
+      </w:r>
+      <w:r>
+        <w:t>:</w:t>
+      </w:r>
+    </w:p>
+    <w:p>
+      <w:pPr>
+        <w:spacing w:before="240"/>
+      </w:pPr>
+      <w:r>
+        <w:t xml:space="preserve">Image </w:t>
+      </w:r>
+      <w:proofErr w:type="spellStart"/>
+      <w:r>
+        <w:t>Classification</w:t>
+      </w:r>
+      <w:proofErr w:type="spellEnd"/>
+      <w:r>
+        <w:t>: assegna una singola classe all’intera immagine</w:t>
+      </w:r>
+    </w:p>
+    <w:p>
+      <w:pPr>
+        <w:spacing w:before="240"/>
+      </w:pPr>
+      <w:r>
+        <w:t xml:space="preserve">Object </w:t>
+      </w:r>
+      <w:proofErr w:type="spellStart"/>
+      <w:r>
+        <w:t>Detection</w:t>
+      </w:r>
+      <w:proofErr w:type="spellEnd"/>
+      <w:r>
+        <w:t>: identifica e localizza uno</w:t>
+      </w:r>
+      <w:r>
+        <w:t xml:space="preserve"> o più oggetti all’interno dell’immagine, restituendo sia la classe che la posizione.</w:t>
+      </w:r>
+    </w:p>
+    <w:p>
+      <w:pPr>
+        <w:keepNext/>
+        <w:spacing w:before="240"/>
+        <w:jc w:val="center"/>
+      </w:pPr>
+      <w:r>
+        <w:drawing>
+          <wp:inline distT="0" distB="0" distL="0" distR="0" wp14:anchorId="359CB987" wp14:editId="7BB1A437">
+            <wp:extent cx="5494930" cy="2284518"/>
+            <wp:effectExtent l="114300" t="95250" r="106045" b="97155"/>
+            <wp:docPr id="19" name="Immagine 19"/>
+            <wp:cNvGraphicFramePr>
+              <a:graphicFrameLocks xmlns:a="http://schemas.openxmlformats.org/drawingml/2006/main" noChangeAspect="1"/>
+            </wp:cNvGraphicFramePr>
+            <a:graphic xmlns:a="http://schemas.openxmlformats.org/drawingml/2006/main">
+              <a:graphicData uri="http://schemas.openxmlformats.org/drawingml/2006/picture">
+                <pic:pic xmlns:pic="http://schemas.openxmlformats.org/drawingml/2006/picture">
+                  <pic:nvPicPr>
+                    <pic:cNvPr id="1" name=""/>
+                    <pic:cNvPicPr/>
+                  </pic:nvPicPr>
+                  <pic:blipFill>
+                    <a:blip r:embed="rId32"/>
+                    <a:stretch>
+                      <a:fillRect/>
+                    </a:stretch>
+                  </pic:blipFill>
+                  <pic:spPr>
+                    <a:xfrm>
+                      <a:off x="0" y="0"/>
+                      <a:ext cx="5507134" cy="2289592"/>
+                    </a:xfrm>
+                    <a:prstGeom prst="rect">
+                      <a:avLst/>
+                    </a:prstGeom>
+                    <a:effectLst>
+                      <a:outerShdw blurRad="63500" sx="102000" sy="102000" algn="ctr" rotWithShape="0">
+                        <a:prstClr val="black">
+                          <a:alpha val="40000"/>
+                        </a:prstClr>
+                      </a:outerShdw>
+                    </a:effectLst>
+                  </pic:spPr>
+                </pic:pic>
+              </a:graphicData>
+            </a:graphic>
+          </wp:inline>
+        </w:drawing>
+      </w:r>
+    </w:p>
+    <w:p>
+      <w:pPr>
+        <w:pStyle w:val="Didascalia"/>
+        <w:jc w:val="center"/>
+        <w:rPr>
+          <w:i/>
+          <w:iCs/>
+        </w:rPr>
+      </w:pPr>
+      <w:r>
+        <w:rPr>
+          <w:i/>
+          <w:iCs/>
+        </w:rPr>
+        <w:t xml:space="preserve">Figura </w:t>
+      </w:r>
+      <w:r>
+        <w:rPr>
+          <w:i/>
+          <w:iCs/>
+        </w:rPr>
+        <w:fldChar w:fldCharType="begin"/>
+      </w:r>
+      <w:r>
+        <w:rPr>
+          <w:i/>
+          <w:iCs/>
+        </w:rPr>
+        <w:instrText xml:space="preserve"> SEQ Figura \* ARABIC </w:instrText>
+      </w:r>
+      <w:r>
+        <w:rPr>
+          <w:i/>
+          <w:iCs/>
+        </w:rPr>
+        <w:fldChar w:fldCharType="separate"/>
+      </w:r>
+      <w:r>
+        <w:rPr>
+          <w:i/>
+          <w:iCs/>
+          <w:noProof/>
+        </w:rPr>
+        <w:t>25</w:t>
+      </w:r>
+      <w:r>
+        <w:rPr>
+          <w:i/>
+          <w:iCs/>
+        </w:rPr>
+        <w:fldChar w:fldCharType="end"/>
+      </w:r>
+      <w:r>
+        <w:rPr>
+          <w:i/>
+          <w:iCs/>
+        </w:rPr>
         <w:t xml:space="preserve"> - </w:t>
       </w:r>
       <w:r>
-        <w:t>P</w:t>
-      </w:r>
-      <w:r>
-        <w:t xml:space="preserve">rint </w:t>
-      </w:r>
-      <w:r>
-        <w:t>S</w:t>
-      </w:r>
-      <w:r>
-        <w:t xml:space="preserve">creen </w:t>
-      </w:r>
-      <w:r>
-        <w:t xml:space="preserve">- </w:t>
-      </w:r>
-      <w:r>
-        <w:t>di maschere solamente per quei passaggi particolarmente significativi e/o critici.</w:t>
-      </w:r>
-    </w:p>
-    <w:p>
-      <w:r>
-        <w:t>Inoltre,</w:t>
-      </w:r>
-      <w:r>
-        <w:t xml:space="preserve"> dovranno essere descritte eventuali varianti di soluzione o scelte di prodotti con motivazione delle scelte.</w:t>
-      </w:r>
-    </w:p>
-    <w:p>
-      <w:r>
-        <w:t>Non deve apparire nessuna forma di guida d’uso di librerie o di componenti utilizzati. Eventualmente questa va allegata.</w:t>
-      </w:r>
-    </w:p>
-    <w:p>
-      <w:r>
-        <w:t>Per eventuali dettagli si possono inserire riferimenti ai diari.</w:t>
+        <w:rPr>
+          <w:i/>
+          <w:iCs/>
+        </w:rPr>
+        <w:t>D</w:t>
+      </w:r>
+      <w:r>
+        <w:rPr>
+          <w:i/>
+          <w:iCs/>
+        </w:rPr>
+        <w:t xml:space="preserve">ifferenza tra </w:t>
+      </w:r>
+      <w:proofErr w:type="spellStart"/>
+      <w:r>
+        <w:rPr>
+          <w:i/>
+          <w:iCs/>
+        </w:rPr>
+        <w:t>classification</w:t>
+      </w:r>
+      <w:proofErr w:type="spellEnd"/>
+      <w:r>
+        <w:rPr>
+          <w:i/>
+          <w:iCs/>
+        </w:rPr>
+        <w:t xml:space="preserve"> e </w:t>
+      </w:r>
+      <w:proofErr w:type="spellStart"/>
+      <w:r>
+        <w:rPr>
+          <w:i/>
+          <w:iCs/>
+        </w:rPr>
+        <w:t>object</w:t>
+      </w:r>
+      <w:proofErr w:type="spellEnd"/>
+      <w:r>
+        <w:rPr>
+          <w:i/>
+          <w:iCs/>
+        </w:rPr>
+        <w:t xml:space="preserve"> </w:t>
+      </w:r>
+      <w:proofErr w:type="spellStart"/>
+      <w:r>
+        <w:rPr>
+          <w:i/>
+          <w:iCs/>
+        </w:rPr>
+        <w:t>detection</w:t>
+      </w:r>
+      <w:proofErr w:type="spellEnd"/>
+    </w:p>
+    <w:p>
+      <w:pPr>
+        <w:rPr>
+          <w:i/>
+          <w:iCs/>
+          <w:sz w:val="16"/>
+        </w:rPr>
+      </w:pPr>
+      <w:r>
+        <w:rPr>
+          <w:i/>
+          <w:iCs/>
+        </w:rPr>
+        <w:br w:type="page"/>
+      </w:r>
+    </w:p>
+    <w:p>
+      <w:pPr>
+        <w:pStyle w:val="Titolo4"/>
+        <w:numPr>
+          <w:ilvl w:val="0"/>
+          <w:numId w:val="0"/>
+        </w:numPr>
+      </w:pPr>
+      <w:r>
+        <w:lastRenderedPageBreak/>
+        <w:t>Reti</w:t>
+      </w:r>
+      <w:r>
+        <w:t xml:space="preserve"> neurali </w:t>
+      </w:r>
+      <w:proofErr w:type="spellStart"/>
+      <w:r>
+        <w:t>convoluzionali</w:t>
+      </w:r>
+      <w:proofErr w:type="spellEnd"/>
+      <w:r>
+        <w:t xml:space="preserve"> (CNN)</w:t>
+      </w:r>
+    </w:p>
+    <w:p>
+      <w:r>
+        <w:t xml:space="preserve">Le reti neurali </w:t>
+      </w:r>
+      <w:proofErr w:type="spellStart"/>
+      <w:r>
+        <w:t>convoluzionali</w:t>
+      </w:r>
+      <w:proofErr w:type="spellEnd"/>
+      <w:r>
+        <w:t xml:space="preserve"> (</w:t>
+      </w:r>
+      <w:proofErr w:type="spellStart"/>
+      <w:r>
+        <w:t>Convolutional</w:t>
+      </w:r>
+      <w:proofErr w:type="spellEnd"/>
+      <w:r>
+        <w:t xml:space="preserve"> </w:t>
+      </w:r>
+      <w:proofErr w:type="spellStart"/>
+      <w:r>
+        <w:t>Neural</w:t>
+      </w:r>
+      <w:proofErr w:type="spellEnd"/>
+      <w:r>
+        <w:t xml:space="preserve"> Networks, CNN) sono un tipo di rete neurale progettato specificamente per l’elaborazione di immagini. A differenza delle reti neurali tradizionali, le CNN sono in grado di sfruttare la struttura delle immagini, analizzando le relazioni tra pixel vicini.</w:t>
+      </w:r>
+    </w:p>
+    <w:p>
+      <w:pPr>
+        <w:spacing w:before="240"/>
+      </w:pPr>
+      <w:r>
+        <w:t xml:space="preserve">Il principio fondamentale su cui si basano è l’utilizzo di filtri </w:t>
+      </w:r>
+      <w:proofErr w:type="spellStart"/>
+      <w:r>
+        <w:t>convoluzionali</w:t>
+      </w:r>
+      <w:proofErr w:type="spellEnd"/>
+      <w:r>
+        <w:t>, ovvero piccole matrici di pesi che scorrono sull’immagine per individuare caratteristiche locali come bordi, texture, forme e variazioni di colore. Ogni filtro è specializzato nell’estrazione di un determinato tipo di informazione.</w:t>
+      </w:r>
+    </w:p>
+    <w:p>
+      <w:pPr>
+        <w:spacing w:before="240"/>
+      </w:pPr>
+      <w:r>
+        <w:t>La struttura di una CNN è composta da più livelli successivi. Nei primi strati vengono riconosciute caratteristiche semplici (ad esempio linee e contorni), mentre negli strati più profondi vengono combinate queste informazioni per individuare pattern sempre più complessi, fino a riconoscere oggetti completi.</w:t>
+      </w:r>
+    </w:p>
+    <w:p>
+      <w:pPr>
+        <w:keepNext/>
+        <w:spacing w:before="240"/>
+        <w:jc w:val="center"/>
+      </w:pPr>
+      <w:r>
+        <w:rPr>
+          <w:noProof/>
+        </w:rPr>
+        <w:drawing>
+          <wp:inline distT="0" distB="0" distL="0" distR="0" wp14:anchorId="1565E698" wp14:editId="3937199C">
+            <wp:extent cx="5636526" cy="3169157"/>
+            <wp:effectExtent l="133350" t="95250" r="116840" b="88900"/>
+            <wp:docPr id="28" name="Immagine 28"/>
+            <wp:cNvGraphicFramePr>
+              <a:graphicFrameLocks xmlns:a="http://schemas.openxmlformats.org/drawingml/2006/main" noChangeAspect="1"/>
+            </wp:cNvGraphicFramePr>
+            <a:graphic xmlns:a="http://schemas.openxmlformats.org/drawingml/2006/main">
+              <a:graphicData uri="http://schemas.openxmlformats.org/drawingml/2006/picture">
+                <pic:pic xmlns:pic="http://schemas.openxmlformats.org/drawingml/2006/picture">
+                  <pic:nvPicPr>
+                    <pic:cNvPr id="0" name="Picture 5"/>
+                    <pic:cNvPicPr>
+                      <a:picLocks noChangeAspect="1" noChangeArrowheads="1"/>
+                    </pic:cNvPicPr>
+                  </pic:nvPicPr>
+                  <pic:blipFill>
+                    <a:blip r:embed="rId33" cstate="print">
+                      <a:extLst>
+                        <a:ext uri="{28A0092B-C50C-407E-A947-70E740481C1C}">
+                          <a14:useLocalDpi xmlns:a14="http://schemas.microsoft.com/office/drawing/2010/main" val="0"/>
+                        </a:ext>
+                      </a:extLst>
+                    </a:blip>
+                    <a:srcRect/>
+                    <a:stretch>
+                      <a:fillRect/>
+                    </a:stretch>
+                  </pic:blipFill>
+                  <pic:spPr bwMode="auto">
+                    <a:xfrm>
+                      <a:off x="0" y="0"/>
+                      <a:ext cx="5640543" cy="3171415"/>
+                    </a:xfrm>
+                    <a:prstGeom prst="rect">
+                      <a:avLst/>
+                    </a:prstGeom>
+                    <a:noFill/>
+                    <a:ln>
+                      <a:noFill/>
+                    </a:ln>
+                    <a:effectLst>
+                      <a:outerShdw blurRad="63500" sx="102000" sy="102000" algn="ctr" rotWithShape="0">
+                        <a:prstClr val="black">
+                          <a:alpha val="40000"/>
+                        </a:prstClr>
+                      </a:outerShdw>
+                    </a:effectLst>
+                  </pic:spPr>
+                </pic:pic>
+              </a:graphicData>
+            </a:graphic>
+          </wp:inline>
+        </w:drawing>
+      </w:r>
+    </w:p>
+    <w:p>
+      <w:pPr>
+        <w:pStyle w:val="Didascalia"/>
+        <w:jc w:val="center"/>
+        <w:rPr>
+          <w:i/>
+          <w:iCs/>
+        </w:rPr>
+      </w:pPr>
+      <w:r>
+        <w:rPr>
+          <w:i/>
+          <w:iCs/>
+        </w:rPr>
+        <w:t xml:space="preserve">Figura </w:t>
+      </w:r>
+      <w:r>
+        <w:rPr>
+          <w:i/>
+          <w:iCs/>
+        </w:rPr>
+        <w:fldChar w:fldCharType="begin"/>
+      </w:r>
+      <w:r>
+        <w:rPr>
+          <w:i/>
+          <w:iCs/>
+        </w:rPr>
+        <w:instrText xml:space="preserve"> SEQ Figura \* ARABIC </w:instrText>
+      </w:r>
+      <w:r>
+        <w:rPr>
+          <w:i/>
+          <w:iCs/>
+        </w:rPr>
+        <w:fldChar w:fldCharType="separate"/>
+      </w:r>
+      <w:r>
+        <w:rPr>
+          <w:i/>
+          <w:iCs/>
+          <w:noProof/>
+        </w:rPr>
+        <w:t>26</w:t>
+      </w:r>
+      <w:r>
+        <w:rPr>
+          <w:i/>
+          <w:iCs/>
+        </w:rPr>
+        <w:fldChar w:fldCharType="end"/>
+      </w:r>
+      <w:r>
+        <w:rPr>
+          <w:i/>
+          <w:iCs/>
+        </w:rPr>
+        <w:t xml:space="preserve"> - Reti neurali </w:t>
+      </w:r>
+      <w:proofErr w:type="spellStart"/>
+      <w:r>
+        <w:rPr>
+          <w:i/>
+          <w:iCs/>
+        </w:rPr>
+        <w:t>convoluzionali</w:t>
+      </w:r>
+      <w:proofErr w:type="spellEnd"/>
+      <w:r>
+        <w:rPr>
+          <w:i/>
+          <w:iCs/>
+        </w:rPr>
+        <w:t xml:space="preserve"> CNN</w:t>
+      </w:r>
+    </w:p>
+    <w:p>
+      <w:r>
+        <w:t>In questo diagramma viene rappresentato il funzionamento, l</w:t>
+      </w:r>
+      <w:r>
+        <w:t xml:space="preserve">'immagine di input (in </w:t>
+      </w:r>
+      <w:r>
+        <w:t>grigio</w:t>
+      </w:r>
+      <w:r>
+        <w:t xml:space="preserve">) passa attraverso strati </w:t>
+      </w:r>
+      <w:proofErr w:type="spellStart"/>
+      <w:r>
+        <w:t>convoluzionali</w:t>
+      </w:r>
+      <w:proofErr w:type="spellEnd"/>
+      <w:r>
+        <w:t xml:space="preserve"> (blu), che </w:t>
+      </w:r>
+      <w:r>
+        <w:t>sarebbero dei</w:t>
+      </w:r>
+      <w:r>
+        <w:t xml:space="preserve"> filtri per estrarre pattern come bordi e texture da regioni locali. Successivamente, gli strati di pooling (rosso) riducono le dimensioni delle mappe di feature, mantenendo le informazioni più rilevanti e riducendo il calcolo.</w:t>
+      </w:r>
+      <w:r>
+        <w:t xml:space="preserve"> </w:t>
+      </w:r>
+      <w:r>
+        <w:t xml:space="preserve">Le feature estratte vengono appiattite e immesse in strati </w:t>
+      </w:r>
+      <w:proofErr w:type="spellStart"/>
+      <w:r>
+        <w:t>fully</w:t>
+      </w:r>
+      <w:proofErr w:type="spellEnd"/>
+      <w:r>
+        <w:t xml:space="preserve"> </w:t>
+      </w:r>
+      <w:proofErr w:type="spellStart"/>
+      <w:r>
+        <w:t>connected</w:t>
+      </w:r>
+      <w:proofErr w:type="spellEnd"/>
+      <w:r>
+        <w:t xml:space="preserve"> (viola), che integrano le informazioni globali per produrre l'output finale (nodi viola), come probabilità di classi (es. "cane" o "gatto").</w:t>
+      </w:r>
+    </w:p>
+    <w:p>
+      <w:r>
+        <w:br w:type="page"/>
       </w:r>
     </w:p>
     <w:p>
@@ -14492,6 +15145,7 @@
         <w:rPr>
           <w:lang w:val="it-IT"/>
         </w:rPr>
+        <w:lastRenderedPageBreak/>
         <w:t>Test</w:t>
       </w:r>
       <w:bookmarkEnd w:id="53"/>
@@ -15735,7 +16389,7 @@
                     <pic:cNvPicPr/>
                   </pic:nvPicPr>
                   <pic:blipFill>
-                    <a:blip r:embed="rId32"/>
+                    <a:blip r:embed="rId34"/>
                     <a:stretch>
                       <a:fillRect/>
                     </a:stretch>
@@ -16904,10 +17558,10 @@
       </w:pPr>
     </w:p>
     <w:sectPr>
-      <w:headerReference w:type="default" r:id="rId33"/>
-      <w:footerReference w:type="default" r:id="rId34"/>
-      <w:headerReference w:type="first" r:id="rId35"/>
-      <w:footerReference w:type="first" r:id="rId36"/>
+      <w:headerReference w:type="default" r:id="rId35"/>
+      <w:footerReference w:type="default" r:id="rId36"/>
+      <w:headerReference w:type="first" r:id="rId37"/>
+      <w:footerReference w:type="first" r:id="rId38"/>
       <w:pgSz w:w="11906" w:h="16838"/>
       <w:pgMar w:top="1985" w:right="1134" w:bottom="1418" w:left="1134" w:header="567" w:footer="567" w:gutter="0"/>
       <w:pgNumType w:start="1"/>
@@ -21558,7 +22212,6 @@
   <w:style w:type="character" w:default="1" w:styleId="Carpredefinitoparagrafo">
     <w:name w:val="Default Paragraph Font"/>
     <w:uiPriority w:val="1"/>
-    <w:semiHidden/>
     <w:unhideWhenUsed/>
   </w:style>
   <w:style w:type="table" w:default="1" w:styleId="Tabellanormale">

</xml_diff>